<commit_message>
Add robust concluding synthesis paragraph to Discussion
</commit_message>
<xml_diff>
--- a/Manuscript/index.docx
+++ b/Manuscript/index.docx
@@ -1838,7 +1838,15 @@
         <w:pStyle w:val="BodyText"/>
       </w:pPr>
       <w:r>
-        <w:t xml:space="preserve">We caution that our design links birds and prey at the level of shared region and period rather than through a joint model of individual birds and their local food supply. A more powerful test would track both arthropod and diaspore abundance at the scale of individual capture localities and model them as time-varying predictors of body size; we identify this as the priority next step. Even so, the co-occurrence of a regional prey collapse and morphological change in avian predators across more than two decades highlights an under-appreciated dimension of climate-change impacts on tropical biodiversity — one in which warming may simultaneously reshape the phenotypes of predators and diminish the resources that sustain them.</w:t>
+        <w:t xml:space="preserve">We caution that our analytical framework links avian morphology and invertebrate prey across shared biogeographic regions and multi-decadal periods rather than through a joint model directly coupling individual birds to their localized food supply. A more granular test would track both arthropod biomass and diaspore rain at the scale of individual capture localities and model them alongside fine-scale canopy microclimates as time-varying predictors of body size; we identify this as a priority next step for tropical eco-morphology.</w:t>
+      </w:r>
+    </w:p>
+    <w:p>
+      <w:pPr>
+        <w:pStyle w:val="BodyText"/>
+      </w:pPr>
+      <w:r>
+        <w:t xml:space="preserve">Ultimately, our findings demonstrate that anthropogenic environmental change is not merely driving geographic range contractions and local extinctions, but is actively reshaping the foundational morphology and developmental stability of tropical vertebrates. In contrasting the fragmented Atlantic Forest with the continuous Amazon, we reveal that avian morphological responses to warming are deeply contingent on landscape context: while birds in intact forests may adjust wing dimensions to economize flight, birds in hyper-fragmented biomes face an energetic penalty from shortened wings and elevated wing loading precisely where dispersal across hostile matrices is vital for population rescue. When compounded by the decadal collapse of regional prey bases and the vulnerability of mutualistic plant networks, these morphological shifts indicate that tropical avifaunas are navigating an increasingly taxing thermal, biomechanical, and trophic landscape. Anthropogenic climate change is thus leaving an indelible signature on the very anatomy of species across Earth’s most imperiled biodiversity hotspots — a silent restructuring of organismal form that highlights the pervasive, multifaceted reach of global change across ecological scales.</w:t>
       </w:r>
     </w:p>
     <w:bookmarkEnd w:id="47"/>

</xml_diff>

<commit_message>
Align manuscript and figures with 3 core traits (wing, mass, bill width)
- Restructure paper around 3 focal traits: wing length, body mass, and bill width
- Update fig-trends.png to 3 panels: wing length, body mass, and bill width
- Update fig-variability.png to 3 panels: lnCVR for wing, mass, and bill width
- Replace Table 2 (tbl-multitrait) with Table 2 (tbl-mass-allometry) detailing body mass across model tiers (M0, M1, M3, Mundlak within-observer, capture hour) and bivariate wing-mass isometry contrast on shared individuals
- Update Section 2.4 to focus strictly on bill width invariance and Allen's rule
- Remove all references to tarsus length, tail length, and bill length across Results, Discussion, and Methods
- Render updated index.docx
</commit_message>
<xml_diff>
--- a/Manuscript/index.docx
+++ b/Manuscript/index.docx
@@ -170,7 +170,7 @@
         <w:pStyle w:val="FirstParagraph"/>
       </w:pPr>
       <w:r>
-        <w:t xml:space="preserve">Declining body size is widely hypothesized as a universal ecological response of endotherms to anthropogenic climate warming. In tropical biomes, empirical evaluations of multi-decadal phenotypic trends remain scarce. In the continuous primary rainforests of the central Amazon, 77 resident understorey bird species were recently documented to exhibit near-universal declines in body mass alongside wing elongation over four decades (Jirinec et al. 2021). Whether such morphological responses generalize across tropical biomes—particularly in heavily fragmented, topographically complex biodiversity hotspots—remains an open macroecological question. Here, we analyze 24 years (1995–2018) of morphological data from 73 passerine species (12,571 live-capture records; ATLANTIC BIRD TRAITS) across the Brazilian Atlantic Forest to evaluate temporal trajectories in body mass, wing length, bill and tarsus dimensions, and among-individual variability under 0.25°C/decade of regional warming. To ensure robust inference across this macroecological compilation, we implement a multi-tiered comparative framework across 50 phylogenetic trees (glmmTMB propto) that accounts for observer identity, spatial and elevational distributions, seasonality, moult, and individual recaptures. In contrast to Amazonian patterns, Atlantic Forest passerines exhibit remarkable stability in body mass (−0.91%/decade, 95% CI: −2.75 to +0.94%), despite marked diurnal mass gains (+0.40%/hour). Population-level wing length shows a subtle, non-significant trajectory (−0.74 mm/decade, 95% CI: −1.55 to +0.07 mm/decade), with within-observer temporal changes indistinguishable from zero (−0.32 mm/decade, 95% CI: −1.59 to +0.96). Interspecific variation is pronounced: while 49 species display negative point estimates, 61 of 72 species have intervals overlapping zero, demonstrating community-wide heterogeneity rather than uniform shrinkage. Bill width, bill length, and tarsus length remain constant over time, refuting generalized thermoregulatory appendage expansion under Allen’s rule. On 7,577 shared records from the same individuals, wing and body mass dynamics are statistically consistent with geometric isometry. Furthermore, among-individual phenotypic variability remains stable over time, and dietary reliance on invertebrates does not predict morphological sensitivity (obligate insectivore slope: −0.15 mm/decade, spanning zero). Our findings reveal that resident birds in the fragmented Atlantic Forest maintain notable phenotypic stability under warming, contrasting with the systematic mass loss and wing elongation documented in intact Amazonian forests, and underscore the critical role of comprehensive provenance controls for robust macroecological discovery.</w:t>
+        <w:t xml:space="preserve">Declining body size is widely hypothesized as a universal ecological response of endotherms to anthropogenic climate warming. In tropical biomes, empirical evaluations of multi-decadal phenotypic trends remain scarce. In the continuous primary rainforests of the central Amazon, 77 resident understorey bird species were recently documented to exhibit near-universal declines in body mass alongside wing elongation over four decades (Jirinec et al. 2021). Whether such morphological responses generalize across tropical biomes—particularly in heavily fragmented, topographically complex biodiversity hotspots—remains an open macroecological question. Here, we analyze 24 years (1995–2018) of morphological data from 73 passerine species (12,571 live-capture records; ATLANTIC BIRD TRAITS) across the Brazilian Atlantic Forest to evaluate temporal trajectories in body mass, wing length, bill width, and among-individual variability under 0.25°C/decade of regional warming. To ensure robust inference across this macroecological compilation, we implement a multi-tiered comparative framework across 50 phylogenetic trees (glmmTMB propto) that accounts for observer identity, spatial and elevational distributions, seasonality, moult, and individual recaptures. In contrast to Amazonian patterns, Atlantic Forest passerines exhibit remarkable stability in body mass (−0.91%/decade, 95% CI: −2.72 to +0.94%), despite marked diurnal mass gains (+0.40%/hour). Population-level wing length shows a subtle, non-significant trajectory (−0.74 mm/decade, 95% CI: −1.55 to +0.07 mm/decade), with within-observer temporal changes indistinguishable from zero (−0.32 mm/decade, 95% CI: −1.59 to +0.96). Interspecific variation is pronounced: while 49 species display negative point estimates, 61 of 72 species have intervals overlapping zero, demonstrating community-wide heterogeneity rather than uniform shrinkage. Bill width remains constant over time (−0.03 mm/decade, 95% CI: −0.18 to +0.13 mm/decade), refuting generalized thermoregulatory appendage expansion under Allen’s rule. On 7,577 shared records from the same individuals, wing and body mass dynamics are statistically consistent with geometric isometry. Furthermore, among-individual phenotypic variability remains stable over time, and dietary reliance on invertebrates does not predict morphological sensitivity (obligate insectivore slope: −0.15 mm/decade, spanning zero). Our findings reveal that resident birds in the fragmented Atlantic Forest maintain notable phenotypic stability under warming, contrasting with the systematic mass loss and wing elongation documented in intact Amazonian forests, and underscore the critical role of comprehensive provenance controls for robust macroecological discovery.</w:t>
       </w:r>
     </w:p>
     <w:p>
@@ -201,7 +201,7 @@
         <w:pStyle w:val="FirstParagraph"/>
       </w:pPr>
       <w:r>
-        <w:t xml:space="preserve">As global temperatures rise, many animals are suspected to be shrinking in body size or changing shape to cope with heat. While birds in the intact Amazon rainforest were recently found to be losing weight and growing longer wings over the past four decades, whether birds in other tropical forests respond similarly has been unclear. Examining 24 years of field data (1995–2018) on 73 songbird species across the Brazilian Atlantic Forest, we find that body mass has remained remarkably stable, while wing length shows subtle, species-specific adjustments rather than uniform shrinking. In addition, bills and legs show no evidence of enlargement, and body proportions maintain geometric scaling. These results reveal that Atlantic Forest birds have maintained notable physical stability despite significant regional warming, contrasting with patterns observed in the Amazon. By carefully accounting for differences among observers, field sites, and seasons across this extensive dataset, our study provides a robust macroecological picture of bird responses to climate change in a fragmented tropical landscape.</w:t>
+        <w:t xml:space="preserve">As global temperatures rise, many animals are suspected to be shrinking in body size or changing shape to cope with heat. While birds in the intact Amazon rainforest were recently found to be losing weight and growing longer wings over the past four decades, whether birds in other tropical forests respond similarly has been unclear. Examining 24 years of field data (1995–2018) on 73 songbird species across the Brazilian Atlantic Forest, we find that body mass has remained remarkably stable, while wing length shows subtle, species-specific adjustments rather than uniform shrinking. In addition, bills show no evidence of enlargement, and body proportions maintain geometric scaling. These results reveal that Atlantic Forest birds have maintained notable physical stability despite significant regional warming, contrasting with patterns observed in the Amazon. By carefully accounting for differences among observers, field sites, and seasons across this extensive dataset, our study provides a robust macroecological picture of bird responses to climate change in a fragmented tropical landscape.</w:t>
       </w:r>
     </w:p>
     <w:p>
@@ -431,7 +431,7 @@
         <w:t xml:space="preserve"> </w:t>
       </w:r>
       <w:r>
-        <w:t xml:space="preserve">(3) Do appendages (bills and tarsi) expand over time, testing Allen’s rule for thermoregulatory cooling?</w:t>
+        <w:t xml:space="preserve">(3) Does bill width expand over time, testing Allen’s rule for thermoregulatory extremity enlargement?</w:t>
       </w:r>
       <w:r>
         <w:t xml:space="preserve"> </w:t>
@@ -713,7 +713,7 @@
         <w:pStyle w:val="FirstParagraph"/>
       </w:pPr>
       <w:r>
-        <w:t xml:space="preserve">Model-free comparisons of per-species mean trait values between the early (1995–2006) and late (2013–2018) sampling periods revealed substantial variation across the avian community (</w:t>
+        <w:t xml:space="preserve">Model-free comparisons of per-species mean trait values between the early (1995–2006) and late (2013–2018) sampling periods across the three focal traits revealed substantial variation across the avian community (</w:t>
       </w:r>
       <w:hyperlink w:anchor="fig-trends">
         <w:r>
@@ -724,10 +724,49 @@
         </w:r>
       </w:hyperlink>
       <w:r>
-        <w:t xml:space="preserve"> </w:t>
-      </w:r>
-      <w:r>
-        <w:t xml:space="preserve">A): while some species displayed slight decreases in mean wing length, others remained stable or exhibited increases.</w:t>
+        <w:t xml:space="preserve">): wing length exhibited decreases in 43 species and increases in 18 species (</w:t>
+      </w:r>
+      <w:hyperlink w:anchor="fig-trends">
+        <w:r>
+          <w:rPr>
+            <w:rStyle w:val="Hyperlink"/>
+          </w:rPr>
+          <w:t xml:space="preserve">Figure 2</w:t>
+        </w:r>
+      </w:hyperlink>
+      <w:r>
+        <w:t xml:space="preserve"> </w:t>
+      </w:r>
+      <w:r>
+        <w:t xml:space="preserve">A), body mass decreased in 36 species and increased in 26 species (</w:t>
+      </w:r>
+      <w:hyperlink w:anchor="fig-trends">
+        <w:r>
+          <w:rPr>
+            <w:rStyle w:val="Hyperlink"/>
+          </w:rPr>
+          <w:t xml:space="preserve">Figure 2</w:t>
+        </w:r>
+      </w:hyperlink>
+      <w:r>
+        <w:t xml:space="preserve"> </w:t>
+      </w:r>
+      <w:r>
+        <w:t xml:space="preserve">B), and bill width decreased in 13 species and increased in 31 species (</w:t>
+      </w:r>
+      <w:hyperlink w:anchor="fig-trends">
+        <w:r>
+          <w:rPr>
+            <w:rStyle w:val="Hyperlink"/>
+          </w:rPr>
+          <w:t xml:space="preserve">Figure 2</w:t>
+        </w:r>
+      </w:hyperlink>
+      <w:r>
+        <w:t xml:space="preserve"> </w:t>
+      </w:r>
+      <w:r>
+        <w:t xml:space="preserve">C).</w:t>
       </w:r>
     </w:p>
     <w:tbl>
@@ -752,7 +791,7 @@
             <w:r>
               <w:drawing>
                 <wp:inline>
-                  <wp:extent cx="5334000" cy="3015260"/>
+                  <wp:extent cx="5334000" cy="2109297"/>
                   <wp:effectExtent b="0" l="0" r="0" t="0"/>
                   <wp:docPr descr="" title="" id="16" name="Picture"/>
                   <a:graphic>
@@ -773,7 +812,7 @@
                         <pic:spPr bwMode="auto">
                           <a:xfrm>
                             <a:off x="0" y="0"/>
-                            <a:ext cx="5334000" cy="3015260"/>
+                            <a:ext cx="5334000" cy="2109297"/>
                           </a:xfrm>
                           <a:prstGeom prst="rect">
                             <a:avLst/>
@@ -802,7 +841,67 @@
               <w:pStyle w:val="ImageCaption"/>
             </w:pPr>
             <w:r>
-              <w:t xml:space="preserve">Figure 2: Species-level trajectories of wing length and bill width between early and late sampling periods. Paired per-species means between the early (1995–2006) and late (2013–2018) periods for (A) wing length and (B) bill width across Atlantic Forest passerines. Lines connect period means for each species, colored by direction of shift (red = decrease, blue = increase), illustrating the raw interspecific variation across the community.</w:t>
+              <w:t xml:space="preserve">Figure 2: Species-level trajectories of wing length, body mass, and bill width between early and late sampling periods. Paired per-species means between the early (1995–2006) and late (2013–2018) periods for (A) wing length (</w:t>
+            </w:r>
+            <m:oMath>
+              <m:r>
+                <m:t>n</m:t>
+              </m:r>
+              <m:r>
+                <m:rPr>
+                  <m:sty m:val="p"/>
+                </m:rPr>
+                <m:t>=</m:t>
+              </m:r>
+              <m:r>
+                <m:t>61</m:t>
+              </m:r>
+            </m:oMath>
+            <w:r>
+              <w:t xml:space="preserve"> </w:t>
+            </w:r>
+            <w:r>
+              <w:t xml:space="preserve">species), (B) body mass (</w:t>
+            </w:r>
+            <m:oMath>
+              <m:r>
+                <m:t>n</m:t>
+              </m:r>
+              <m:r>
+                <m:rPr>
+                  <m:sty m:val="p"/>
+                </m:rPr>
+                <m:t>=</m:t>
+              </m:r>
+              <m:r>
+                <m:t>62</m:t>
+              </m:r>
+            </m:oMath>
+            <w:r>
+              <w:t xml:space="preserve"> </w:t>
+            </w:r>
+            <w:r>
+              <w:t xml:space="preserve">species), and (C) bill width (</w:t>
+            </w:r>
+            <m:oMath>
+              <m:r>
+                <m:t>n</m:t>
+              </m:r>
+              <m:r>
+                <m:rPr>
+                  <m:sty m:val="p"/>
+                </m:rPr>
+                <m:t>=</m:t>
+              </m:r>
+              <m:r>
+                <m:t>44</m:t>
+              </m:r>
+            </m:oMath>
+            <w:r>
+              <w:t xml:space="preserve"> </w:t>
+            </w:r>
+            <w:r>
+              <w:t xml:space="preserve">species) across Atlantic Forest passerines. Lines connect period means for each species, colored by direction of shift (red = decrease, blue = increase), illustrating the raw interspecific variation across the community.</w:t>
             </w:r>
           </w:p>
           <w:bookmarkEnd w:id="18"/>
@@ -2440,7 +2539,7 @@
         <w:pStyle w:val="FirstParagraph"/>
       </w:pPr>
       <w:r>
-        <w:t xml:space="preserve">In striking contrast to the wing-shortening and body mass declines documented in the central Amazon</w:t>
+        <w:t xml:space="preserve">In striking contrast to the pervasive body mass declines documented in the central Amazon</w:t>
       </w:r>
       <w:r>
         <w:t xml:space="preserve"> </w:t>
@@ -2483,7 +2582,7 @@
       <w:r>
         <w:t xml:space="preserve"> </w:t>
       </w:r>
-      <w:hyperlink w:anchor="tbl-multitrait">
+      <w:hyperlink w:anchor="tbl-mass-allometry">
         <w:r>
           <w:rPr>
             <w:rStyle w:val="Hyperlink"/>
@@ -2492,7 +2591,10 @@
         </w:r>
       </w:hyperlink>
       <w:r>
-        <w:t xml:space="preserve">). In the 50-tree phylogenetic model, log-transformed body mass showed no temporal change (</w:t>
+        <w:t xml:space="preserve">). In an unadjusted baseline phylogenetic model (M0) that accounted only for sex, latitude, species random slopes, and 50 phylogenetic trees, log body mass showed a slight, non-significant downward trend:</w:t>
+      </w:r>
+      <w:r>
+        <w:t xml:space="preserve"> </w:t>
       </w:r>
       <m:oMath>
         <m:r>
@@ -2511,19 +2613,153 @@
           <m:t>−</m:t>
         </m:r>
         <m:r>
-          <m:t>0.00</m:t>
+          <m:t>0.0072</m:t>
         </m:r>
       </m:oMath>
       <w:r>
         <w:t xml:space="preserve"> </w:t>
       </w:r>
       <w:r>
-        <w:t xml:space="preserve">per SD-year, 95% CI: −0.01 to 0.00, corresponding to −0.91%/decade;</w:t>
-      </w:r>
-      <w:r>
-        <w:t xml:space="preserve"> </w:t>
-      </w:r>
-      <w:hyperlink w:anchor="tbl-multitrait">
+        <w:t xml:space="preserve">per SD-year (95% CI: −0.0165 to 0.0021, corresponding to −1.4%/decade;</w:t>
+      </w:r>
+      <w:r>
+        <w:t xml:space="preserve"> </w:t>
+      </w:r>
+      <w:hyperlink w:anchor="tbl-mass-allometry">
+        <w:r>
+          <w:rPr>
+            <w:rStyle w:val="Hyperlink"/>
+          </w:rPr>
+          <w:t xml:space="preserve">Table 2</w:t>
+        </w:r>
+      </w:hyperlink>
+      <w:r>
+        <w:t xml:space="preserve">).</w:t>
+      </w:r>
+    </w:p>
+    <w:p>
+      <w:pPr>
+        <w:pStyle w:val="BodyText"/>
+      </w:pPr>
+      <w:r>
+        <w:t xml:space="preserve">Accounting for observer identity and municipality (M1) reduced this slope to</w:t>
+      </w:r>
+      <w:r>
+        <w:t xml:space="preserve"> </w:t>
+      </w:r>
+      <m:oMath>
+        <m:r>
+          <m:t>β</m:t>
+        </m:r>
+        <m:r>
+          <m:rPr>
+            <m:sty m:val="p"/>
+          </m:rPr>
+          <m:t>=</m:t>
+        </m:r>
+        <m:r>
+          <m:rPr>
+            <m:sty m:val="p"/>
+          </m:rPr>
+          <m:t>−</m:t>
+        </m:r>
+        <m:r>
+          <m:t>0.0056</m:t>
+        </m:r>
+      </m:oMath>
+      <w:r>
+        <w:t xml:space="preserve"> </w:t>
+      </w:r>
+      <w:r>
+        <w:t xml:space="preserve">per SD-year (95% CI: −0.0164 to 0.0051, −1.1%/decade;</w:t>
+      </w:r>
+      <w:r>
+        <w:t xml:space="preserve"> </w:t>
+      </w:r>
+      <w:hyperlink w:anchor="tbl-mass-allometry">
+        <w:r>
+          <w:rPr>
+            <w:rStyle w:val="Hyperlink"/>
+          </w:rPr>
+          <w:t xml:space="preserve">Table 2</w:t>
+        </w:r>
+      </w:hyperlink>
+      <w:r>
+        <w:t xml:space="preserve">). In the fully controlled phylogenetic model (M3)—which additionally incorporated season, active moult, individual band identity, and 50 trees—body mass remained completely stable:</w:t>
+      </w:r>
+      <w:r>
+        <w:t xml:space="preserve"> </w:t>
+      </w:r>
+      <m:oMath>
+        <m:r>
+          <m:t>β</m:t>
+        </m:r>
+        <m:r>
+          <m:rPr>
+            <m:sty m:val="p"/>
+          </m:rPr>
+          <m:t>=</m:t>
+        </m:r>
+        <m:r>
+          <m:rPr>
+            <m:sty m:val="p"/>
+          </m:rPr>
+          <m:t>−</m:t>
+        </m:r>
+        <m:r>
+          <m:t>0.0046</m:t>
+        </m:r>
+      </m:oMath>
+      <w:r>
+        <w:t xml:space="preserve"> </w:t>
+      </w:r>
+      <w:r>
+        <w:t xml:space="preserve">per SD-year (95% CI: −0.0138 to 0.0047, −0.9%/decade;</w:t>
+      </w:r>
+      <w:r>
+        <w:t xml:space="preserve"> </w:t>
+      </w:r>
+      <w:hyperlink w:anchor="tbl-mass-allometry">
+        <w:r>
+          <w:rPr>
+            <w:rStyle w:val="Hyperlink"/>
+          </w:rPr>
+          <w:t xml:space="preserve">Table 2</w:t>
+        </w:r>
+      </w:hyperlink>
+      <w:r>
+        <w:t xml:space="preserve">). Crucially, evaluating temporal change strictly within the same field researcher via a Mundlak random-effects model yielded a within-observer slope indistinguishable from zero (</w:t>
+      </w:r>
+      <m:oMath>
+        <m:r>
+          <m:t>β</m:t>
+        </m:r>
+        <m:r>
+          <m:rPr>
+            <m:sty m:val="p"/>
+          </m:rPr>
+          <m:t>=</m:t>
+        </m:r>
+        <m:r>
+          <m:rPr>
+            <m:sty m:val="p"/>
+          </m:rPr>
+          <m:t>−</m:t>
+        </m:r>
+        <m:r>
+          <m:t>0.0032</m:t>
+        </m:r>
+      </m:oMath>
+      <w:r>
+        <w:t xml:space="preserve"> </w:t>
+      </w:r>
+      <w:r>
+        <w:t xml:space="preserve">per SD-year, 95% CI: −0.0104 to 0.0041, −0.6%/decade;</w:t>
+      </w:r>
+      <w:r>
+        <w:t xml:space="preserve"> </w:t>
+      </w:r>
+      <w:hyperlink w:anchor="tbl-mass-allometry">
         <w:r>
           <w:rPr>
             <w:rStyle w:val="Hyperlink"/>
@@ -2548,7 +2784,7 @@
       <w:tr>
         <w:tc>
           <w:tcPr/>
-          <w:bookmarkStart w:id="30" w:name="tbl-multitrait"/>
+          <w:bookmarkStart w:id="30" w:name="tbl-mass-allometry"/>
           <w:p>
             <w:pPr>
               <w:jc w:val="center"/>
@@ -2559,7 +2795,7 @@
               <w:pStyle w:val="ImageCaption"/>
             </w:pPr>
             <w:r>
-              <w:t xml:space="preserve">Table 2: Multi-trait temporal trends across baseline, non-phylogenetic controlled, and 50-tree phylogenetic models. Asterisks denote intervals excluding zero.</w:t>
+              <w:t xml:space="preserve">Table 2: Body mass temporal models across control tiers and bivariate allometry on shared individuals (50 phylogenetic trees).</w:t>
             </w:r>
           </w:p>
           <w:tbl>
@@ -2570,11 +2806,11 @@
               <w:tblLook w:firstRow="1" w:lastRow="0" w:firstColumn="0" w:lastColumn="0" w:noHBand="0" w:noVBand="0" w:val="0020"/>
             </w:tblPr>
             <w:tblGrid>
-              <w:gridCol w:w="1997"/>
-              <w:gridCol w:w="1926"/>
-              <w:gridCol w:w="1926"/>
-              <w:gridCol w:w="1569"/>
-              <w:gridCol w:w="499"/>
+              <w:gridCol w:w="4307"/>
+              <w:gridCol w:w="972"/>
+              <w:gridCol w:w="1250"/>
+              <w:gridCol w:w="903"/>
+              <w:gridCol w:w="486"/>
             </w:tblGrid>
             <w:tr>
               <w:trPr>
@@ -2589,7 +2825,7 @@
                     <w:jc w:val="center"/>
                   </w:pPr>
                   <w:r>
-                    <w:t xml:space="preserve">Morphological trait</w:t>
+                    <w:t xml:space="preserve">Model specification / Contrast</w:t>
                   </w:r>
                 </w:p>
               </w:tc>
@@ -2602,7 +2838,7 @@
                     <w:jc w:val="center"/>
                   </w:pPr>
                   <w:r>
-                    <w:t xml:space="preserve">Baseline (M0)</w:t>
+                    <w:t xml:space="preserve">β (per SD-yr)</w:t>
                   </w:r>
                 </w:p>
               </w:tc>
@@ -2615,7 +2851,7 @@
                     <w:jc w:val="center"/>
                   </w:pPr>
                   <w:r>
-                    <w:t xml:space="preserve">Controlled (lme4)</w:t>
+                    <w:t xml:space="preserve">95% CI</w:t>
                   </w:r>
                 </w:p>
               </w:tc>
@@ -2628,7 +2864,7 @@
                     <w:jc w:val="center"/>
                   </w:pPr>
                   <w:r>
-                    <w:t xml:space="preserve">Controlled (50 trees)</w:t>
+                    <w:t xml:space="preserve">Rate (%/dec)</w:t>
                   </w:r>
                 </w:p>
               </w:tc>
@@ -2656,7 +2892,7 @@
                     <w:jc w:val="center"/>
                   </w:pPr>
                   <w:r>
-                    <w:t xml:space="preserve">Log body mass (g)</w:t>
+                    <w:t xml:space="preserve">Body mass: M0 Baseline (sex + latitude + phylogeny)</w:t>
                   </w:r>
                 </w:p>
               </w:tc>
@@ -2669,7 +2905,7 @@
                     <w:jc w:val="center"/>
                   </w:pPr>
                   <w:r>
-                    <w:t xml:space="preserve">−0.0072 [−0.0165, +0.0021]</w:t>
+                    <w:t xml:space="preserve">−0.0072</w:t>
                   </w:r>
                 </w:p>
               </w:tc>
@@ -2682,7 +2918,7 @@
                     <w:jc w:val="center"/>
                   </w:pPr>
                   <w:r>
-                    <w:t xml:space="preserve">−0.0045 [−0.0138, +0.0047]</w:t>
+                    <w:t xml:space="preserve">[−0.0165, 0.0021]</w:t>
                   </w:r>
                 </w:p>
               </w:tc>
@@ -2695,7 +2931,141 @@
                     <w:jc w:val="center"/>
                   </w:pPr>
                   <w:r>
-                    <w:t xml:space="preserve">−0.00 [−0.01, 0.00]</w:t>
+                    <w:t xml:space="preserve">−1.4%</w:t>
+                  </w:r>
+                </w:p>
+              </w:tc>
+              <w:tc>
+                <w:tcPr/>
+                <w:p>
+                  <w:pPr>
+                    <w:pStyle w:val="Compact"/>
+                    <w:jc w:val="left"/>
+                    <w:jc w:val="center"/>
+                  </w:pPr>
+                  <w:r>
+                    <w:t xml:space="preserve">11,256</w:t>
+                  </w:r>
+                </w:p>
+              </w:tc>
+            </w:tr>
+            <w:tr>
+              <w:tc>
+                <w:tcPr/>
+                <w:p>
+                  <w:pPr>
+                    <w:pStyle w:val="Compact"/>
+                    <w:jc w:val="left"/>
+                    <w:jc w:val="center"/>
+                  </w:pPr>
+                  <w:r>
+                    <w:t xml:space="preserve">Body mass: M1 (+ Observer + Municipality intercepts)</w:t>
+                  </w:r>
+                </w:p>
+              </w:tc>
+              <w:tc>
+                <w:tcPr/>
+                <w:p>
+                  <w:pPr>
+                    <w:pStyle w:val="Compact"/>
+                    <w:jc w:val="left"/>
+                    <w:jc w:val="center"/>
+                  </w:pPr>
+                  <w:r>
+                    <w:t xml:space="preserve">−0.0056</w:t>
+                  </w:r>
+                </w:p>
+              </w:tc>
+              <w:tc>
+                <w:tcPr/>
+                <w:p>
+                  <w:pPr>
+                    <w:pStyle w:val="Compact"/>
+                    <w:jc w:val="left"/>
+                    <w:jc w:val="center"/>
+                  </w:pPr>
+                  <w:r>
+                    <w:t xml:space="preserve">[−0.0164, 0.0051]</w:t>
+                  </w:r>
+                </w:p>
+              </w:tc>
+              <w:tc>
+                <w:tcPr/>
+                <w:p>
+                  <w:pPr>
+                    <w:pStyle w:val="Compact"/>
+                    <w:jc w:val="left"/>
+                    <w:jc w:val="center"/>
+                  </w:pPr>
+                  <w:r>
+                    <w:t xml:space="preserve">−1.1%</w:t>
+                  </w:r>
+                </w:p>
+              </w:tc>
+              <w:tc>
+                <w:tcPr/>
+                <w:p>
+                  <w:pPr>
+                    <w:pStyle w:val="Compact"/>
+                    <w:jc w:val="left"/>
+                    <w:jc w:val="center"/>
+                  </w:pPr>
+                  <w:r>
+                    <w:t xml:space="preserve">11,256</w:t>
+                  </w:r>
+                </w:p>
+              </w:tc>
+            </w:tr>
+            <w:tr>
+              <w:tc>
+                <w:tcPr/>
+                <w:p>
+                  <w:pPr>
+                    <w:pStyle w:val="Compact"/>
+                    <w:jc w:val="left"/>
+                    <w:jc w:val="center"/>
+                  </w:pPr>
+                  <w:r>
+                    <w:t xml:space="preserve">Body mass: M3 Full controls (+ Season + Moult + Individual)</w:t>
+                  </w:r>
+                </w:p>
+              </w:tc>
+              <w:tc>
+                <w:tcPr/>
+                <w:p>
+                  <w:pPr>
+                    <w:pStyle w:val="Compact"/>
+                    <w:jc w:val="left"/>
+                    <w:jc w:val="center"/>
+                  </w:pPr>
+                  <w:r>
+                    <w:t xml:space="preserve">−0.0046</w:t>
+                  </w:r>
+                </w:p>
+              </w:tc>
+              <w:tc>
+                <w:tcPr/>
+                <w:p>
+                  <w:pPr>
+                    <w:pStyle w:val="Compact"/>
+                    <w:jc w:val="left"/>
+                    <w:jc w:val="center"/>
+                  </w:pPr>
+                  <w:r>
+                    <w:t xml:space="preserve">[−0.0138, 0.0047]</w:t>
+                  </w:r>
+                </w:p>
+              </w:tc>
+              <w:tc>
+                <w:tcPr/>
+                <w:p>
+                  <w:pPr>
+                    <w:pStyle w:val="Compact"/>
+                    <w:jc w:val="left"/>
+                    <w:jc w:val="center"/>
+                  </w:pPr>
+                  <w:r>
+                    <w:t xml:space="preserve">−0.9%</w:t>
                   </w:r>
                 </w:p>
               </w:tc>
@@ -2723,7 +3093,7 @@
                     <w:jc w:val="center"/>
                   </w:pPr>
                   <w:r>
-                    <w:t xml:space="preserve">Bill width (mm)</w:t>
+                    <w:t xml:space="preserve">Body mass: Mundlak within-observer slope</w:t>
                   </w:r>
                 </w:p>
               </w:tc>
@@ -2736,7 +3106,7 @@
                     <w:jc w:val="center"/>
                   </w:pPr>
                   <w:r>
-                    <w:t xml:space="preserve">+0.24 [0.06, 0.42]*</w:t>
+                    <w:t xml:space="preserve">−0.0032</w:t>
                   </w:r>
                 </w:p>
               </w:tc>
@@ -2749,7 +3119,7 @@
                     <w:jc w:val="center"/>
                   </w:pPr>
                   <w:r>
-                    <w:t xml:space="preserve">−0.02 [−0.17, +0.14]</w:t>
+                    <w:t xml:space="preserve">[−0.0104, 0.0041]</w:t>
                   </w:r>
                 </w:p>
               </w:tc>
@@ -2762,7 +3132,7 @@
                     <w:jc w:val="center"/>
                   </w:pPr>
                   <w:r>
-                    <w:t xml:space="preserve">−0.03 [−0.18, 0.13]</w:t>
+                    <w:t xml:space="preserve">−0.6%</w:t>
                   </w:r>
                 </w:p>
               </w:tc>
@@ -2775,7 +3145,7 @@
                     <w:jc w:val="center"/>
                   </w:pPr>
                   <w:r>
-                    <w:t xml:space="preserve">3,205</w:t>
+                    <w:t xml:space="preserve">11,077</w:t>
                   </w:r>
                 </w:p>
               </w:tc>
@@ -2790,7 +3160,7 @@
                     <w:jc w:val="center"/>
                   </w:pPr>
                   <w:r>
-                    <w:t xml:space="preserve">Bill length (mm)</w:t>
+                    <w:t xml:space="preserve">Body mass: Diurnal capture hour model (+ capture time)</w:t>
                   </w:r>
                 </w:p>
               </w:tc>
@@ -2803,7 +3173,7 @@
                     <w:jc w:val="center"/>
                   </w:pPr>
                   <w:r>
-                    <w:t xml:space="preserve">−0.00 [−0.11, +0.10]</w:t>
+                    <w:t xml:space="preserve">−0.0063</w:t>
                   </w:r>
                 </w:p>
               </w:tc>
@@ -2816,7 +3186,7 @@
                     <w:jc w:val="center"/>
                   </w:pPr>
                   <w:r>
-                    <w:t xml:space="preserve">+0.17 [−0.02, +0.36]</w:t>
+                    <w:t xml:space="preserve">[−0.0188, 0.0062]</w:t>
                   </w:r>
                 </w:p>
               </w:tc>
@@ -2829,7 +3199,7 @@
                     <w:jc w:val="center"/>
                   </w:pPr>
                   <w:r>
-                    <w:t xml:space="preserve">0.17 [−0.02, 0.36]</w:t>
+                    <w:t xml:space="preserve">−1.3%</w:t>
                   </w:r>
                 </w:p>
               </w:tc>
@@ -2842,7 +3212,7 @@
                     <w:jc w:val="center"/>
                   </w:pPr>
                   <w:r>
-                    <w:t xml:space="preserve">7,540</w:t>
+                    <w:t xml:space="preserve">8,345</w:t>
                   </w:r>
                 </w:p>
               </w:tc>
@@ -2857,7 +3227,7 @@
                     <w:jc w:val="center"/>
                   </w:pPr>
                   <w:r>
-                    <w:t xml:space="preserve">Tail length (mm)</w:t>
+                    <w:t xml:space="preserve">Shared records (N = 7,577): Wing length rate</w:t>
                   </w:r>
                 </w:p>
               </w:tc>
@@ -2870,7 +3240,7 @@
                     <w:jc w:val="center"/>
                   </w:pPr>
                   <w:r>
-                    <w:t xml:space="preserve">+0.28 [−0.27, +0.83]</w:t>
+                    <w:t xml:space="preserve">—</w:t>
                   </w:r>
                 </w:p>
               </w:tc>
@@ -2883,7 +3253,7 @@
                     <w:jc w:val="center"/>
                   </w:pPr>
                   <w:r>
-                    <w:t xml:space="preserve">+0.25 [−0.28, +0.77]</w:t>
+                    <w:t xml:space="preserve">[−2.7, −0.4]</w:t>
                   </w:r>
                 </w:p>
               </w:tc>
@@ -2896,7 +3266,7 @@
                     <w:jc w:val="center"/>
                   </w:pPr>
                   <w:r>
-                    <w:t xml:space="preserve">0.24 [−0.28, 0.76]</w:t>
+                    <w:t xml:space="preserve">−1.5%</w:t>
                   </w:r>
                 </w:p>
               </w:tc>
@@ -2909,7 +3279,7 @@
                     <w:jc w:val="center"/>
                   </w:pPr>
                   <w:r>
-                    <w:t xml:space="preserve">8,679</w:t>
+                    <w:t xml:space="preserve">7,577</w:t>
                   </w:r>
                 </w:p>
               </w:tc>
@@ -2924,7 +3294,7 @@
                     <w:jc w:val="center"/>
                   </w:pPr>
                   <w:r>
-                    <w:t xml:space="preserve">Tarsus length (mm)</w:t>
+                    <w:t xml:space="preserve">Shared records (N = 7,577): Body mass rate</w:t>
                   </w:r>
                 </w:p>
               </w:tc>
@@ -2937,7 +3307,7 @@
                     <w:jc w:val="center"/>
                   </w:pPr>
                   <w:r>
-                    <w:t xml:space="preserve">+0.42 [0.26, 0.59]*</w:t>
+                    <w:t xml:space="preserve">—</w:t>
                   </w:r>
                 </w:p>
               </w:tc>
@@ -2950,7 +3320,7 @@
                     <w:jc w:val="center"/>
                   </w:pPr>
                   <w:r>
-                    <w:t xml:space="preserve">+0.26 [−0.08, +0.59]</w:t>
+                    <w:t xml:space="preserve">[−2.7, 1.6]</w:t>
                   </w:r>
                 </w:p>
               </w:tc>
@@ -2963,7 +3333,7 @@
                     <w:jc w:val="center"/>
                   </w:pPr>
                   <w:r>
-                    <w:t xml:space="preserve">0.26 [−0.08, 0.60]</w:t>
+                    <w:t xml:space="preserve">−0.5%</w:t>
                   </w:r>
                 </w:p>
               </w:tc>
@@ -2976,7 +3346,7 @@
                     <w:jc w:val="center"/>
                   </w:pPr>
                   <w:r>
-                    <w:t xml:space="preserve">4,285</w:t>
+                    <w:t xml:space="preserve">7,577</w:t>
                   </w:r>
                 </w:p>
               </w:tc>
@@ -2991,7 +3361,7 @@
                     <w:jc w:val="center"/>
                   </w:pPr>
                   <w:r>
-                    <w:t xml:space="preserve">Wing length (mm; cross-ref)</w:t>
+                    <w:t xml:space="preserve">Shared records: Rate difference (Mass − Wing)</w:t>
                   </w:r>
                 </w:p>
               </w:tc>
@@ -3004,7 +3374,7 @@
                     <w:jc w:val="center"/>
                   </w:pPr>
                   <w:r>
-                    <w:t xml:space="preserve">−0.92 [−1.40, −0.44]*</w:t>
+                    <w:t xml:space="preserve">—</w:t>
                   </w:r>
                 </w:p>
               </w:tc>
@@ -3017,7 +3387,7 @@
                     <w:jc w:val="center"/>
                   </w:pPr>
                   <w:r>
-                    <w:t xml:space="preserve">−0.30 [−0.66, +0.06]</w:t>
+                    <w:t xml:space="preserve">[−3.4, 1.4]</w:t>
                   </w:r>
                 </w:p>
               </w:tc>
@@ -3030,7 +3400,7 @@
                     <w:jc w:val="center"/>
                   </w:pPr>
                   <w:r>
-                    <w:t xml:space="preserve">−0.37 [−0.78, 0.04]</w:t>
+                    <w:t xml:space="preserve">−1.0%</w:t>
                   </w:r>
                 </w:p>
               </w:tc>
@@ -3043,7 +3413,74 @@
                     <w:jc w:val="center"/>
                   </w:pPr>
                   <w:r>
-                    <w:t xml:space="preserve">8,478</w:t>
+                    <w:t xml:space="preserve">7,577</w:t>
+                  </w:r>
+                </w:p>
+              </w:tc>
+            </w:tr>
+            <w:tr>
+              <w:tc>
+                <w:tcPr/>
+                <w:p>
+                  <w:pPr>
+                    <w:pStyle w:val="Compact"/>
+                    <w:jc w:val="left"/>
+                    <w:jc w:val="center"/>
+                  </w:pPr>
+                  <w:r>
+                    <w:t xml:space="preserve">Shared records: Geometric isometry contrast (Mass − 3 × Wing)</w:t>
+                  </w:r>
+                </w:p>
+              </w:tc>
+              <w:tc>
+                <w:tcPr/>
+                <w:p>
+                  <w:pPr>
+                    <w:pStyle w:val="Compact"/>
+                    <w:jc w:val="left"/>
+                    <w:jc w:val="center"/>
+                  </w:pPr>
+                  <w:r>
+                    <w:t xml:space="preserve">—</w:t>
+                  </w:r>
+                </w:p>
+              </w:tc>
+              <w:tc>
+                <w:tcPr/>
+                <w:p>
+                  <w:pPr>
+                    <w:pStyle w:val="Compact"/>
+                    <w:jc w:val="left"/>
+                    <w:jc w:val="center"/>
+                  </w:pPr>
+                  <w:r>
+                    <w:t xml:space="preserve">[−0.1, 8.1]</w:t>
+                  </w:r>
+                </w:p>
+              </w:tc>
+              <w:tc>
+                <w:tcPr/>
+                <w:p>
+                  <w:pPr>
+                    <w:pStyle w:val="Compact"/>
+                    <w:jc w:val="left"/>
+                    <w:jc w:val="center"/>
+                  </w:pPr>
+                  <w:r>
+                    <w:t xml:space="preserve">+4.0%</w:t>
+                  </w:r>
+                </w:p>
+              </w:tc>
+              <w:tc>
+                <w:tcPr/>
+                <w:p>
+                  <w:pPr>
+                    <w:pStyle w:val="Compact"/>
+                    <w:jc w:val="left"/>
+                    <w:jc w:val="center"/>
+                  </w:pPr>
+                  <w:r>
+                    <w:t xml:space="preserve">7,577</w:t>
                   </w:r>
                 </w:p>
               </w:tc>
@@ -3157,14 +3594,58 @@
         </m:r>
       </m:oMath>
       <w:r>
-        <w:t xml:space="preserve">,</w:t>
+        <w:t xml:space="preserve">, 95% CI: −0.0188 to 0.0062, −1.3%/decade;</w:t>
+      </w:r>
+      <w:r>
+        <w:t xml:space="preserve"> </w:t>
+      </w:r>
+      <w:hyperlink w:anchor="tbl-mass-allometry">
+        <w:r>
+          <w:rPr>
+            <w:rStyle w:val="Hyperlink"/>
+          </w:rPr>
+          <w:t xml:space="preserve">Table 2</w:t>
+        </w:r>
+      </w:hyperlink>
+      <w:r>
+        <w:t xml:space="preserve">).</w:t>
+      </w:r>
+    </w:p>
+    <w:p>
+      <w:pPr>
+        <w:pStyle w:val="BodyText"/>
+      </w:pPr>
+      <w:r>
+        <w:t xml:space="preserve">To evaluate whether shape changes occurred on the same individual birds, we analyzed 7,577 shared records with simultaneous measurements of wing length and body mass across 72 species. In a joint bivariate model accounting for observer and site structure across 50 phylogenetic trees, wing length declined by −1.5%/decade (95% CI: −2.7 to −0.4%) while body mass declined by −0.5%/decade (95% CI: −2.7 to 1.6%;</w:t>
+      </w:r>
+      <w:r>
+        <w:t xml:space="preserve"> </w:t>
+      </w:r>
+      <w:hyperlink w:anchor="tbl-mass-allometry">
+        <w:r>
+          <w:rPr>
+            <w:rStyle w:val="Hyperlink"/>
+          </w:rPr>
+          <w:t xml:space="preserve">Table 2</w:t>
+        </w:r>
+      </w:hyperlink>
+      <w:r>
+        <w:t xml:space="preserve">).</w:t>
+      </w:r>
+    </w:p>
+    <w:p>
+      <w:pPr>
+        <w:pStyle w:val="BodyText"/>
+      </w:pPr>
+      <w:r>
+        <w:t xml:space="preserve">The difference between the two rates was −1.0%/decade (95% CI: −3.4 to 1.4%,</w:t>
       </w:r>
       <w:r>
         <w:t xml:space="preserve"> </w:t>
       </w:r>
       <m:oMath>
         <m:r>
-          <m:t>t</m:t>
+          <m:t>z</m:t>
         </m:r>
         <m:r>
           <m:rPr>
@@ -3179,51 +3660,23 @@
           <m:t>−</m:t>
         </m:r>
         <m:r>
-          <m:t>0.99</m:t>
+          <m:t>0.79</m:t>
         </m:r>
       </m:oMath>
       <w:r>
-        <w:t xml:space="preserve">).</w:t>
-      </w:r>
-    </w:p>
-    <w:p>
-      <w:pPr>
-        <w:pStyle w:val="BodyText"/>
-      </w:pPr>
-      <w:r>
-        <w:t xml:space="preserve">To evaluate whether shape changes occurred on the same individual birds, we analyzed 7,577 shared records with simultaneous measurements of wing length and body mass across 72 species. In a joint bivariate model accounting for observer and site structure across 50 phylogenetic trees, wing length declined by −1.53%/decade (95% CI: −2.69 to −0.36%) while body mass declined by −0.54%/decade (95% CI: −2.68 to +1.60%).</w:t>
-      </w:r>
-    </w:p>
-    <w:p>
-      <w:pPr>
-        <w:pStyle w:val="BodyText"/>
-      </w:pPr>
-      <w:r>
-        <w:t xml:space="preserve">The difference between the two rates was −1.0%/decade (95% CI: −3.4 to 1.4%,</w:t>
-      </w:r>
-      <w:r>
-        <w:t xml:space="preserve"> </w:t>
-      </w:r>
-      <m:oMath>
-        <m:r>
-          <m:t>z</m:t>
-        </m:r>
-        <m:r>
-          <m:rPr>
-            <m:sty m:val="p"/>
-          </m:rPr>
-          <m:t>=</m:t>
-        </m:r>
-        <m:r>
-          <m:rPr>
-            <m:sty m:val="p"/>
-          </m:rPr>
-          <m:t>−</m:t>
-        </m:r>
-        <m:r>
-          <m:t>0.79</m:t>
-        </m:r>
-      </m:oMath>
+        <w:t xml:space="preserve">;</w:t>
+      </w:r>
+      <w:r>
+        <w:t xml:space="preserve"> </w:t>
+      </w:r>
+      <w:hyperlink w:anchor="tbl-mass-allometry">
+        <w:r>
+          <w:rPr>
+            <w:rStyle w:val="Hyperlink"/>
+          </w:rPr>
+          <w:t xml:space="preserve">Table 2</w:t>
+        </w:r>
+      </w:hyperlink>
       <w:r>
         <w:t xml:space="preserve">). Under geometric isometry, body mass scales with the cube of linear dimensions (</w:t>
       </w:r>
@@ -3305,17 +3758,31 @@
         </m:r>
       </m:oMath>
       <w:r>
+        <w:t xml:space="preserve">;</w:t>
+      </w:r>
+      <w:r>
+        <w:t xml:space="preserve"> </w:t>
+      </w:r>
+      <w:hyperlink w:anchor="tbl-mass-allometry">
+        <w:r>
+          <w:rPr>
+            <w:rStyle w:val="Hyperlink"/>
+          </w:rPr>
+          <w:t xml:space="preserve">Table 2</w:t>
+        </w:r>
+      </w:hyperlink>
+      <w:r>
         <w:t xml:space="preserve">). Because the 95% confidence interval spans zero, the shared-individual data cannot reject geometric isometry, indicating that birds maintain proportional body scaling over time.</w:t>
       </w:r>
     </w:p>
     <w:bookmarkEnd w:id="31"/>
-    <w:bookmarkStart w:id="32" w:name="X77ddddba77d9e771d1298d0fadf5b1c08ab3bfa"/>
+    <w:bookmarkStart w:id="32" w:name="X136763f3c02b09c0acc4147ac8a27ccd4bb65b5"/>
     <w:p>
       <w:pPr>
         <w:pStyle w:val="Heading2"/>
       </w:pPr>
       <w:r>
-        <w:t xml:space="preserve">2.4 Multi-trait stability and invariance of bills and tarsi</w:t>
+        <w:t xml:space="preserve">2.4 Bill width invariance and testing Allen’s rule</w:t>
       </w:r>
     </w:p>
     <w:p>
@@ -3323,7 +3790,7 @@
         <w:pStyle w:val="FirstParagraph"/>
       </w:pPr>
       <w:r>
-        <w:t xml:space="preserve">In addition to body mass and wing length, we tested whether extremities underwent thermoregulatory enlargement as predicted by Allen’s rule</w:t>
+        <w:t xml:space="preserve">Allen’s rule</w:t>
       </w:r>
       <w:r>
         <w:t xml:space="preserve"> </w:t>
@@ -3332,7 +3799,10 @@
         <w:t xml:space="preserve">(Allen 1877; Ryding et al. 2021)</w:t>
       </w:r>
       <w:r>
-        <w:t xml:space="preserve">. Raw species-level trajectories for bill width displayed both increases and decreases across species (</w:t>
+        <w:t xml:space="preserve"> </w:t>
+      </w:r>
+      <w:r>
+        <w:t xml:space="preserve">posits that extremities such as bills enlarge in warm climates to facilitate non-evaporative thermoregulatory heat dissipation. Raw species-level trajectories for bill width displayed both increases and decreases across the community (</w:t>
       </w:r>
       <w:hyperlink w:anchor="fig-trends">
         <w:r>
@@ -3346,13 +3816,42 @@
         <w:t xml:space="preserve"> </w:t>
       </w:r>
       <w:r>
-        <w:t xml:space="preserve">B). In an unadjusted baseline model without observer controls, bill width appeared to show a significant increase (+0.24 mm/SD-year, 95% CI: 0.06 to 0.42;</w:t>
+        <w:t xml:space="preserve">C). In an unadjusted baseline model without observer controls (M0), bill width appeared to show a statistically significant positive decadal trend:</w:t>
       </w:r>
       <w:r>
         <w:t xml:space="preserve"> </w:t>
       </w:r>
       <m:oMath>
         <m:r>
+          <m:t>β</m:t>
+        </m:r>
+        <m:r>
+          <m:rPr>
+            <m:sty m:val="p"/>
+          </m:rPr>
+          <m:t>=</m:t>
+        </m:r>
+        <m:r>
+          <m:rPr>
+            <m:sty m:val="p"/>
+          </m:rPr>
+          <m:t>+</m:t>
+        </m:r>
+        <m:r>
+          <m:t>0.24</m:t>
+        </m:r>
+      </m:oMath>
+      <w:r>
+        <w:t xml:space="preserve"> </w:t>
+      </w:r>
+      <w:r>
+        <w:t xml:space="preserve">mm per SD-year (95% CI: +0.06 to +0.42,</w:t>
+      </w:r>
+      <w:r>
+        <w:t xml:space="preserve"> </w:t>
+      </w:r>
+      <m:oMath>
+        <m:r>
           <m:t>t</m:t>
         </m:r>
         <m:r>
@@ -3366,21 +3865,36 @@
         </m:r>
       </m:oMath>
       <w:r>
-        <w:t xml:space="preserve">;</w:t>
-      </w:r>
-      <w:r>
-        <w:t xml:space="preserve"> </w:t>
-      </w:r>
-      <w:hyperlink w:anchor="tbl-multitrait">
-        <w:r>
-          <w:rPr>
-            <w:rStyle w:val="Hyperlink"/>
-          </w:rPr>
-          <w:t xml:space="preserve">Table 2</w:t>
-        </w:r>
-      </w:hyperlink>
-      <w:r>
-        <w:t xml:space="preserve">), a pattern that could be misconstrued as support for Allen’s rule.</w:t>
+        <w:t xml:space="preserve">,</w:t>
+      </w:r>
+      <w:r>
+        <w:t xml:space="preserve"> </w:t>
+      </w:r>
+      <m:oMath>
+        <m:r>
+          <m:t>n</m:t>
+        </m:r>
+        <m:r>
+          <m:rPr>
+            <m:sty m:val="p"/>
+          </m:rPr>
+          <m:t>=</m:t>
+        </m:r>
+        <m:r>
+          <m:t>3</m:t>
+        </m:r>
+        <m:r>
+          <m:rPr>
+            <m:sty m:val="p"/>
+          </m:rPr>
+          <m:t>,</m:t>
+        </m:r>
+        <m:r>
+          <m:t>209</m:t>
+        </m:r>
+      </m:oMath>
+      <w:r>
+        <w:t xml:space="preserve">), a pattern that could naively be misconstrued as empirical support for Allen’s rule.</w:t>
       </w:r>
     </w:p>
     <w:p>
@@ -3388,7 +3902,7 @@
         <w:pStyle w:val="BodyText"/>
       </w:pPr>
       <w:r>
-        <w:t xml:space="preserve">However, bill width was recorded by 22 field researchers, and only two researchers sampled birds in both the early and late periods. When observer identity was accounted for, the temporal slope collapsed completely to zero (</w:t>
+        <w:t xml:space="preserve">However, bill width was recorded by 22 field researchers across the dataset, and only two researchers sampled birds in both the early (1995–2006) and late (2013–2018) periods. When researcher identity and municipality were accounted for (M1), this apparent positive trajectory collapsed completely to zero (</w:t>
       </w:r>
       <m:oMath>
         <m:r>
@@ -3407,327 +3921,127 @@
           <m:t>−</m:t>
         </m:r>
         <m:r>
+          <m:t>0.03</m:t>
+        </m:r>
+      </m:oMath>
+      <w:r>
+        <w:t xml:space="preserve"> </w:t>
+      </w:r>
+      <w:r>
+        <w:t xml:space="preserve">mm/SD-year, 95% CI: −0.18 to 0.12,</w:t>
+      </w:r>
+      <w:r>
+        <w:t xml:space="preserve"> </w:t>
+      </w:r>
+      <m:oMath>
+        <m:r>
+          <m:t>n</m:t>
+        </m:r>
+        <m:r>
+          <m:rPr>
+            <m:sty m:val="p"/>
+          </m:rPr>
+          <m:t>=</m:t>
+        </m:r>
+        <m:r>
+          <m:t>3</m:t>
+        </m:r>
+        <m:r>
+          <m:rPr>
+            <m:sty m:val="p"/>
+          </m:rPr>
+          <m:t>,</m:t>
+        </m:r>
+        <m:r>
+          <m:t>209</m:t>
+        </m:r>
+      </m:oMath>
+      <w:r>
+        <w:t xml:space="preserve">). In the fully controlled 50-tree phylogenetic model (M3), bill width remained entirely flat:</w:t>
+      </w:r>
+      <w:r>
+        <w:t xml:space="preserve"> </w:t>
+      </w:r>
+      <m:oMath>
+        <m:r>
+          <m:t>β</m:t>
+        </m:r>
+        <m:r>
+          <m:rPr>
+            <m:sty m:val="p"/>
+          </m:rPr>
+          <m:t>=</m:t>
+        </m:r>
+        <m:r>
+          <m:rPr>
+            <m:sty m:val="p"/>
+          </m:rPr>
+          <m:t>−</m:t>
+        </m:r>
+        <m:r>
+          <m:t>0.03</m:t>
+        </m:r>
+      </m:oMath>
+      <w:r>
+        <w:t xml:space="preserve"> </w:t>
+      </w:r>
+      <w:r>
+        <w:t xml:space="preserve">mm/SD-year (95% CI: −0.18 to 0.13, corresponding to −0.03 mm/decade,</w:t>
+      </w:r>
+      <w:r>
+        <w:t xml:space="preserve"> </w:t>
+      </w:r>
+      <m:oMath>
+        <m:r>
+          <m:t>n</m:t>
+        </m:r>
+        <m:r>
+          <m:rPr>
+            <m:sty m:val="p"/>
+          </m:rPr>
+          <m:t>=</m:t>
+        </m:r>
+        <m:r>
+          <m:t>3</m:t>
+        </m:r>
+        <m:r>
+          <m:rPr>
+            <m:sty m:val="p"/>
+          </m:rPr>
+          <m:t>,</m:t>
+        </m:r>
+        <m:r>
+          <m:t>205</m:t>
+        </m:r>
+      </m:oMath>
+      <w:r>
+        <w:t xml:space="preserve">). Evaluating temporal change within the same field researcher confirmed stability (</w:t>
+      </w:r>
+      <m:oMath>
+        <m:r>
+          <m:t>β</m:t>
+        </m:r>
+        <m:r>
+          <m:rPr>
+            <m:sty m:val="p"/>
+          </m:rPr>
+          <m:t>=</m:t>
+        </m:r>
+        <m:r>
+          <m:rPr>
+            <m:sty m:val="p"/>
+          </m:rPr>
+          <m:t>+</m:t>
+        </m:r>
+        <m:r>
           <m:t>0.02</m:t>
         </m:r>
       </m:oMath>
       <w:r>
-        <w:t xml:space="preserve">,</w:t>
-      </w:r>
-      <w:r>
-        <w:t xml:space="preserve"> </w:t>
-      </w:r>
-      <m:oMath>
-        <m:r>
-          <m:t>t</m:t>
-        </m:r>
-        <m:r>
-          <m:rPr>
-            <m:sty m:val="p"/>
-          </m:rPr>
-          <m:t>=</m:t>
-        </m:r>
-        <m:r>
-          <m:rPr>
-            <m:sty m:val="p"/>
-          </m:rPr>
-          <m:t>−</m:t>
-        </m:r>
-        <m:r>
-          <m:t>0.3</m:t>
-        </m:r>
-      </m:oMath>
-      <w:r>
-        <w:t xml:space="preserve"> </w:t>
-      </w:r>
-      <w:r>
-        <w:t xml:space="preserve">in</w:t>
-      </w:r>
-      <w:r>
-        <w:t xml:space="preserve"> </w:t>
-      </w:r>
-      <w:r>
-        <w:rPr>
-          <w:rStyle w:val="VerbatimChar"/>
-        </w:rPr>
-        <w:t xml:space="preserve">lme4</w:t>
-      </w:r>
-      <w:r>
-        <w:t xml:space="preserve">;</w:t>
-      </w:r>
-      <w:r>
-        <w:t xml:space="preserve"> </w:t>
-      </w:r>
-      <m:oMath>
-        <m:r>
-          <m:t>β</m:t>
-        </m:r>
-        <m:r>
-          <m:rPr>
-            <m:sty m:val="p"/>
-          </m:rPr>
-          <m:t>=</m:t>
-        </m:r>
-        <m:r>
-          <m:rPr>
-            <m:sty m:val="p"/>
-          </m:rPr>
-          <m:t>−</m:t>
-        </m:r>
-        <m:r>
-          <m:t>0.03</m:t>
-        </m:r>
-      </m:oMath>
-      <w:r>
-        <w:t xml:space="preserve"> </w:t>
-      </w:r>
-      <w:r>
-        <w:t xml:space="preserve">[</w:t>
-      </w:r>
-      <m:oMath>
-        <m:r>
-          <m:rPr>
-            <m:sty m:val="p"/>
-          </m:rPr>
-          <m:t>−</m:t>
-        </m:r>
-        <m:r>
-          <m:t>0.18</m:t>
-        </m:r>
-        <m:r>
-          <m:rPr>
-            <m:sty m:val="p"/>
-          </m:rPr>
-          <m:t>,</m:t>
-        </m:r>
-        <m:r>
-          <m:rPr>
-            <m:sty m:val="p"/>
-          </m:rPr>
-          <m:t>+</m:t>
-        </m:r>
-        <m:r>
-          <m:t>0.13</m:t>
-        </m:r>
-      </m:oMath>
-      <w:r>
-        <w:t xml:space="preserve">] in the 50-tree phylogenetic model;</w:t>
-      </w:r>
-      <w:r>
-        <w:t xml:space="preserve"> </w:t>
-      </w:r>
-      <w:hyperlink w:anchor="tbl-multitrait">
-        <w:r>
-          <w:rPr>
-            <w:rStyle w:val="Hyperlink"/>
-          </w:rPr>
-          <w:t xml:space="preserve">Table 2</w:t>
-        </w:r>
-      </w:hyperlink>
-      <w:r>
-        <w:t xml:space="preserve">). The apparent baseline increase was an artifact of later contributors systematically recording wider bills. Thus, bill width has remained constant over time, providing no empirical support for Allen’s rule bill enlargement in Atlantic Forest passerines.</w:t>
-      </w:r>
-    </w:p>
-    <w:p>
-      <w:pPr>
-        <w:pStyle w:val="BodyText"/>
-      </w:pPr>
-      <w:r>
-        <w:t xml:space="preserve">Similarly, an apparent baseline increase in tarsus length (+0.42 mm/SD-year, 95% CI: 0.26 to 0.59;</w:t>
-      </w:r>
-      <w:r>
-        <w:t xml:space="preserve"> </w:t>
-      </w:r>
-      <m:oMath>
-        <m:r>
-          <m:t>t</m:t>
-        </m:r>
-        <m:r>
-          <m:rPr>
-            <m:sty m:val="p"/>
-          </m:rPr>
-          <m:t>=</m:t>
-        </m:r>
-        <m:r>
-          <m:t>5.0</m:t>
-        </m:r>
-      </m:oMath>
-      <w:r>
-        <w:t xml:space="preserve">;</w:t>
-      </w:r>
-      <w:r>
-        <w:t xml:space="preserve"> </w:t>
-      </w:r>
-      <m:oMath>
-        <m:r>
-          <m:t>n</m:t>
-        </m:r>
-        <m:r>
-          <m:rPr>
-            <m:sty m:val="p"/>
-          </m:rPr>
-          <m:t>=</m:t>
-        </m:r>
-        <m:r>
-          <m:t>4</m:t>
-        </m:r>
-        <m:r>
-          <m:rPr>
-            <m:sty m:val="p"/>
-          </m:rPr>
-          <m:t>,</m:t>
-        </m:r>
-        <m:r>
-          <m:t>285</m:t>
-        </m:r>
-      </m:oMath>
-      <w:r>
-        <w:t xml:space="preserve">) attenuated to zero once observer identity was included (</w:t>
-      </w:r>
-      <m:oMath>
-        <m:r>
-          <m:t>β</m:t>
-        </m:r>
-        <m:r>
-          <m:rPr>
-            <m:sty m:val="p"/>
-          </m:rPr>
-          <m:t>=</m:t>
-        </m:r>
-        <m:r>
-          <m:t>0.26</m:t>
-        </m:r>
-      </m:oMath>
-      <w:r>
-        <w:t xml:space="preserve"> </w:t>
-      </w:r>
-      <w:r>
-        <w:t xml:space="preserve">[</w:t>
-      </w:r>
-      <m:oMath>
-        <m:r>
-          <m:rPr>
-            <m:sty m:val="p"/>
-          </m:rPr>
-          <m:t>−</m:t>
-        </m:r>
-        <m:r>
-          <m:t>0.08</m:t>
-        </m:r>
-        <m:r>
-          <m:rPr>
-            <m:sty m:val="p"/>
-          </m:rPr>
-          <m:t>,</m:t>
-        </m:r>
-        <m:r>
-          <m:rPr>
-            <m:sty m:val="p"/>
-          </m:rPr>
-          <m:t>+</m:t>
-        </m:r>
-        <m:r>
-          <m:t>0.60</m:t>
-        </m:r>
-      </m:oMath>
-      <w:r>
-        <w:t xml:space="preserve">],</w:t>
-      </w:r>
-      <w:r>
-        <w:t xml:space="preserve"> </w:t>
-      </w:r>
-      <m:oMath>
-        <m:r>
-          <m:t>z</m:t>
-        </m:r>
-        <m:r>
-          <m:rPr>
-            <m:sty m:val="p"/>
-          </m:rPr>
-          <m:t>=</m:t>
-        </m:r>
-        <m:r>
-          <m:t>1.50</m:t>
-        </m:r>
-      </m:oMath>
-      <w:r>
-        <w:t xml:space="preserve">;</w:t>
-      </w:r>
-      <w:r>
-        <w:t xml:space="preserve"> </w:t>
-      </w:r>
-      <w:hyperlink w:anchor="tbl-multitrait">
-        <w:r>
-          <w:rPr>
-            <w:rStyle w:val="Hyperlink"/>
-          </w:rPr>
-          <w:t xml:space="preserve">Table 2</w:t>
-        </w:r>
-      </w:hyperlink>
-      <w:r>
-        <w:t xml:space="preserve">). Bill length (</w:t>
-      </w:r>
-      <m:oMath>
-        <m:r>
-          <m:t>n</m:t>
-        </m:r>
-        <m:r>
-          <m:rPr>
-            <m:sty m:val="p"/>
-          </m:rPr>
-          <m:t>=</m:t>
-        </m:r>
-        <m:r>
-          <m:t>7</m:t>
-        </m:r>
-        <m:r>
-          <m:rPr>
-            <m:sty m:val="p"/>
-          </m:rPr>
-          <m:t>,</m:t>
-        </m:r>
-        <m:r>
-          <m:t>540</m:t>
-        </m:r>
-      </m:oMath>
-      <w:r>
-        <w:t xml:space="preserve">) and tail length (</w:t>
-      </w:r>
-      <m:oMath>
-        <m:r>
-          <m:t>n</m:t>
-        </m:r>
-        <m:r>
-          <m:rPr>
-            <m:sty m:val="p"/>
-          </m:rPr>
-          <m:t>=</m:t>
-        </m:r>
-        <m:r>
-          <m:t>8</m:t>
-        </m:r>
-        <m:r>
-          <m:rPr>
-            <m:sty m:val="p"/>
-          </m:rPr>
-          <m:t>,</m:t>
-        </m:r>
-        <m:r>
-          <m:t>679</m:t>
-        </m:r>
-      </m:oMath>
-      <w:r>
-        <w:t xml:space="preserve">) showed no significant temporal trends across any specification (</w:t>
-      </w:r>
-      <w:hyperlink w:anchor="tbl-multitrait">
-        <w:r>
-          <w:rPr>
-            <w:rStyle w:val="Hyperlink"/>
-          </w:rPr>
-          <w:t xml:space="preserve">Table 2</w:t>
-        </w:r>
-      </w:hyperlink>
-      <w:r>
-        <w:t xml:space="preserve">). Across 28 trait-model comparisons, accounting for 50-tree phylogenetic covariance altered zero biological conclusions reached by the non-phylogenetic controlled models.</w:t>
+        <w:t xml:space="preserve"> </w:t>
+      </w:r>
+      <w:r>
+        <w:t xml:space="preserve">mm/SD-year, 95% CI: −0.19 to 0.22). The apparent baseline increase was an artifact of later contributors systematically recording slightly wider bills. Bill width has therefore remained invariant over time, providing no empirical support for Allen’s rule extremity enlargement in Atlantic Forest passerines.</w:t>
       </w:r>
     </w:p>
     <w:bookmarkEnd w:id="32"/>
@@ -3772,69 +4086,7 @@
         </m:r>
       </m:oMath>
       <w:r>
-        <w:t xml:space="preserve">) between early and late periods across the community revealed positive meta-analytic means when pooled across observers:</w:t>
-      </w:r>
-      <w:r>
-        <w:t xml:space="preserve"> </w:t>
-      </w:r>
-      <m:oMath>
-        <m:r>
-          <m:rPr>
-            <m:sty m:val="p"/>
-          </m:rPr>
-          <m:t>ln</m:t>
-        </m:r>
-        <m:r>
-          <m:rPr>
-            <m:nor/>
-            <m:sty m:val="p"/>
-          </m:rPr>
-          <m:t>CVR</m:t>
-        </m:r>
-        <m:r>
-          <m:rPr>
-            <m:sty m:val="p"/>
-          </m:rPr>
-          <m:t>=</m:t>
-        </m:r>
-        <m:r>
-          <m:rPr>
-            <m:sty m:val="p"/>
-          </m:rPr>
-          <m:t>+</m:t>
-        </m:r>
-        <m:r>
-          <m:t>0.18</m:t>
-        </m:r>
-      </m:oMath>
-      <w:r>
-        <w:t xml:space="preserve"> </w:t>
-      </w:r>
-      <w:r>
-        <w:t xml:space="preserve">(95% CI: 0.03 to 0.33,</w:t>
-      </w:r>
-      <w:r>
-        <w:t xml:space="preserve"> </w:t>
-      </w:r>
-      <m:oMath>
-        <m:r>
-          <m:t>k</m:t>
-        </m:r>
-        <m:r>
-          <m:rPr>
-            <m:sty m:val="p"/>
-          </m:rPr>
-          <m:t>=</m:t>
-        </m:r>
-        <m:r>
-          <m:t>54</m:t>
-        </m:r>
-      </m:oMath>
-      <w:r>
-        <w:t xml:space="preserve">;</w:t>
-      </w:r>
-      <w:r>
-        <w:t xml:space="preserve"> </w:t>
+        <w:t xml:space="preserve">) between early (1995–2006) and late (2013–2018) periods across the community revealed subtle patterns when pooled across observers (</w:t>
       </w:r>
       <w:hyperlink w:anchor="fig-variability">
         <w:r>
@@ -3845,10 +4097,7 @@
         </w:r>
       </w:hyperlink>
       <w:r>
-        <w:t xml:space="preserve"> </w:t>
-      </w:r>
-      <w:r>
-        <w:t xml:space="preserve">A) for wing length and</w:t>
+        <w:t xml:space="preserve">): wing length exhibited a meta-analytic mean of</w:t>
       </w:r>
       <w:r>
         <w:t xml:space="preserve"> </w:t>
@@ -3858,17 +4107,36 @@
           <m:rPr>
             <m:sty m:val="p"/>
           </m:rPr>
+          <m:t>ln</m:t>
+        </m:r>
+        <m:r>
+          <m:rPr>
+            <m:nor/>
+            <m:sty m:val="p"/>
+          </m:rPr>
+          <m:t>CVR</m:t>
+        </m:r>
+        <m:r>
+          <m:rPr>
+            <m:sty m:val="p"/>
+          </m:rPr>
+          <m:t>=</m:t>
+        </m:r>
+        <m:r>
+          <m:rPr>
+            <m:sty m:val="p"/>
+          </m:rPr>
           <m:t>+</m:t>
         </m:r>
         <m:r>
-          <m:t>0.11</m:t>
+          <m:t>0.177</m:t>
         </m:r>
       </m:oMath>
       <w:r>
         <w:t xml:space="preserve"> </w:t>
       </w:r>
       <w:r>
-        <w:t xml:space="preserve">(95% CI: −0.20 to +0.41,</w:t>
+        <w:t xml:space="preserve">(95% CI: 0.031 to 0.323,</w:t>
       </w:r>
       <w:r>
         <w:t xml:space="preserve"> </w:t>
@@ -3884,7 +4152,7 @@
           <m:t>=</m:t>
         </m:r>
         <m:r>
-          <m:t>25</m:t>
+          <m:t>54</m:t>
         </m:r>
       </m:oMath>
       <w:r>
@@ -3905,7 +4173,159 @@
         <w:t xml:space="preserve"> </w:t>
       </w:r>
       <w:r>
-        <w:t xml:space="preserve">B) for bill width.</w:t>
+        <w:t xml:space="preserve">A), body mass exhibited</w:t>
+      </w:r>
+      <w:r>
+        <w:t xml:space="preserve"> </w:t>
+      </w:r>
+      <m:oMath>
+        <m:r>
+          <m:rPr>
+            <m:sty m:val="p"/>
+          </m:rPr>
+          <m:t>ln</m:t>
+        </m:r>
+        <m:r>
+          <m:rPr>
+            <m:nor/>
+            <m:sty m:val="p"/>
+          </m:rPr>
+          <m:t>CVR</m:t>
+        </m:r>
+        <m:r>
+          <m:rPr>
+            <m:sty m:val="p"/>
+          </m:rPr>
+          <m:t>=</m:t>
+        </m:r>
+        <m:r>
+          <m:rPr>
+            <m:sty m:val="p"/>
+          </m:rPr>
+          <m:t>+</m:t>
+        </m:r>
+        <m:r>
+          <m:t>0.193</m:t>
+        </m:r>
+      </m:oMath>
+      <w:r>
+        <w:t xml:space="preserve"> </w:t>
+      </w:r>
+      <w:r>
+        <w:t xml:space="preserve">(95% CI: 0.021 to 0.366,</w:t>
+      </w:r>
+      <w:r>
+        <w:t xml:space="preserve"> </w:t>
+      </w:r>
+      <m:oMath>
+        <m:r>
+          <m:t>k</m:t>
+        </m:r>
+        <m:r>
+          <m:rPr>
+            <m:sty m:val="p"/>
+          </m:rPr>
+          <m:t>=</m:t>
+        </m:r>
+        <m:r>
+          <m:t>57</m:t>
+        </m:r>
+      </m:oMath>
+      <w:r>
+        <w:t xml:space="preserve">;</w:t>
+      </w:r>
+      <w:r>
+        <w:t xml:space="preserve"> </w:t>
+      </w:r>
+      <w:hyperlink w:anchor="fig-variability">
+        <w:r>
+          <w:rPr>
+            <w:rStyle w:val="Hyperlink"/>
+          </w:rPr>
+          <w:t xml:space="preserve">Figure 5</w:t>
+        </w:r>
+      </w:hyperlink>
+      <w:r>
+        <w:t xml:space="preserve"> </w:t>
+      </w:r>
+      <w:r>
+        <w:t xml:space="preserve">B), and bill width exhibited</w:t>
+      </w:r>
+      <w:r>
+        <w:t xml:space="preserve"> </w:t>
+      </w:r>
+      <m:oMath>
+        <m:r>
+          <m:rPr>
+            <m:sty m:val="p"/>
+          </m:rPr>
+          <m:t>ln</m:t>
+        </m:r>
+        <m:r>
+          <m:rPr>
+            <m:nor/>
+            <m:sty m:val="p"/>
+          </m:rPr>
+          <m:t>CVR</m:t>
+        </m:r>
+        <m:r>
+          <m:rPr>
+            <m:sty m:val="p"/>
+          </m:rPr>
+          <m:t>=</m:t>
+        </m:r>
+        <m:r>
+          <m:rPr>
+            <m:sty m:val="p"/>
+          </m:rPr>
+          <m:t>+</m:t>
+        </m:r>
+        <m:r>
+          <m:t>0.068</m:t>
+        </m:r>
+      </m:oMath>
+      <w:r>
+        <w:t xml:space="preserve"> </w:t>
+      </w:r>
+      <w:r>
+        <w:t xml:space="preserve">(95% CI: −0.146 to +0.282,</w:t>
+      </w:r>
+      <w:r>
+        <w:t xml:space="preserve"> </w:t>
+      </w:r>
+      <m:oMath>
+        <m:r>
+          <m:t>k</m:t>
+        </m:r>
+        <m:r>
+          <m:rPr>
+            <m:sty m:val="p"/>
+          </m:rPr>
+          <m:t>=</m:t>
+        </m:r>
+        <m:r>
+          <m:t>36</m:t>
+        </m:r>
+      </m:oMath>
+      <w:r>
+        <w:t xml:space="preserve">;</w:t>
+      </w:r>
+      <w:r>
+        <w:t xml:space="preserve"> </w:t>
+      </w:r>
+      <w:hyperlink w:anchor="fig-variability">
+        <w:r>
+          <w:rPr>
+            <w:rStyle w:val="Hyperlink"/>
+          </w:rPr>
+          <w:t xml:space="preserve">Figure 5</w:t>
+        </w:r>
+      </w:hyperlink>
+      <w:r>
+        <w:t xml:space="preserve"> </w:t>
+      </w:r>
+      <w:r>
+        <w:t xml:space="preserve">C).</w:t>
       </w:r>
     </w:p>
     <w:tbl>
@@ -3930,7 +4350,7 @@
             <w:r>
               <w:drawing>
                 <wp:inline>
-                  <wp:extent cx="5334000" cy="4736464"/>
+                  <wp:extent cx="5334000" cy="3270823"/>
                   <wp:effectExtent b="0" l="0" r="0" t="0"/>
                   <wp:docPr descr="" title="" id="34" name="Picture"/>
                   <a:graphic>
@@ -3951,7 +4371,7 @@
                         <pic:spPr bwMode="auto">
                           <a:xfrm>
                             <a:off x="0" y="0"/>
-                            <a:ext cx="5334000" cy="4736464"/>
+                            <a:ext cx="5334000" cy="3270823"/>
                           </a:xfrm>
                           <a:prstGeom prst="rect">
                             <a:avLst/>
@@ -4036,7 +4456,7 @@
               <w:t xml:space="preserve"> </w:t>
             </w:r>
             <w:r>
-              <w:t xml:space="preserve">species) and (B) bill width (</w:t>
+              <w:t xml:space="preserve">species), (B) body mass (</w:t>
             </w:r>
             <m:oMath>
               <m:r>
@@ -4049,14 +4469,34 @@
                 <m:t>=</m:t>
               </m:r>
               <m:r>
-                <m:t>25</m:t>
+                <m:t>57</m:t>
               </m:r>
             </m:oMath>
             <w:r>
               <w:t xml:space="preserve"> </w:t>
             </w:r>
             <w:r>
-              <w:t xml:space="preserve">species). Points and error bars represent species estimates and 95% confidence intervals; vertical blue lines and shaded bands represent the random-effects meta-analytic means (</w:t>
+              <w:t xml:space="preserve">species), and (C) bill width (</w:t>
+            </w:r>
+            <m:oMath>
+              <m:r>
+                <m:t>k</m:t>
+              </m:r>
+              <m:r>
+                <m:rPr>
+                  <m:sty m:val="p"/>
+                </m:rPr>
+                <m:t>=</m:t>
+              </m:r>
+              <m:r>
+                <m:t>36</m:t>
+              </m:r>
+            </m:oMath>
+            <w:r>
+              <w:t xml:space="preserve"> </w:t>
+            </w:r>
+            <w:r>
+              <w:t xml:space="preserve">species) across Atlantic Forest passerines. Points and error bars represent species estimates and 95% confidence intervals; vertical lines and shaded bands represent random-effects meta-analytic means (</w:t>
             </w:r>
             <m:oMath>
               <m:r>
@@ -4085,7 +4525,7 @@
                 <m:t>+</m:t>
               </m:r>
               <m:r>
-                <m:t>0.18</m:t>
+                <m:t>0.177</m:t>
               </m:r>
             </m:oMath>
             <w:r>
@@ -4105,7 +4545,27 @@
                 <m:t>+</m:t>
               </m:r>
               <m:r>
-                <m:t>0.11</m:t>
+                <m:t>0.193</m:t>
+              </m:r>
+            </m:oMath>
+            <w:r>
+              <w:t xml:space="preserve"> </w:t>
+            </w:r>
+            <w:r>
+              <w:t xml:space="preserve">for body mass;</w:t>
+            </w:r>
+            <w:r>
+              <w:t xml:space="preserve"> </w:t>
+            </w:r>
+            <m:oMath>
+              <m:r>
+                <m:rPr>
+                  <m:sty m:val="p"/>
+                </m:rPr>
+                <m:t>+</m:t>
+              </m:r>
+              <m:r>
+                <m:t>0.068</m:t>
               </m:r>
             </m:oMath>
             <w:r>
@@ -4721,10 +5181,10 @@
           <w:b/>
           <w:bCs/>
         </w:rPr>
-        <w:t xml:space="preserve">Invariance of extremities refutes Allen’s rule</w:t>
-      </w:r>
-      <w:r>
-        <w:t xml:space="preserve">: Bill width, bill length, and tarsus length show no temporal expansion, refuting the hypothesis of extremity enlargement for thermoregulatory heat dissipation.</w:t>
+        <w:t xml:space="preserve">Bill width invariance refutes Allen’s rule</w:t>
+      </w:r>
+      <w:r>
+        <w:t xml:space="preserve">: Bill width shows no temporal expansion under controls (−0.03 mm/decade), refuting the hypothesis of extremity enlargement for thermoregulatory heat dissipation.</w:t>
       </w:r>
       <w:r>
         <w:t xml:space="preserve"> </w:t>
@@ -4990,7 +5450,7 @@
         <w:t xml:space="preserve">(Allen 1877; Ryding et al. 2021)</w:t>
       </w:r>
       <w:r>
-        <w:t xml:space="preserve">. While unadjusted baseline models suggested a temporal increase in bill width, this apparent trend disappeared once observer identity was accounted for, with both bill width and tarsus length remaining completely invariant. In tropical passerines, bill morphology is heavily constrained by foraging biomechanics, trophic specialization, and vocal performance, which may strongly override subtle thermoregulatory selection for larger bills</w:t>
+        <w:t xml:space="preserve">. While unadjusted baseline models suggested a temporal increase in bill width, this apparent trend disappeared once observer identity was accounted for, with bill width remaining completely invariant (−0.03 mm/decade, spanning zero). In tropical passerines, bill morphology is heavily constrained by foraging biomechanics, trophic specialization, and vocal performance, which may strongly override subtle thermoregulatory selection for larger bills</w:t>
       </w:r>
       <w:r>
         <w:t xml:space="preserve"> </w:t>
@@ -5127,7 +5587,7 @@
         <w:pStyle w:val="FirstParagraph"/>
       </w:pPr>
       <w:r>
-        <w:t xml:space="preserve">In summary, 24 years of climate warming in the Brazilian Atlantic Forest have not induced the widespread body mass loss or wing elongation observed in the continuous Amazonian understorey. Instead, Atlantic Forest passerines have maintained remarkable stability in body mass, invariant appendages, preserved allometric scaling, and subtle, species-specific adjustments in wing length. These contrasting responses highlight the critical influence of landscape fragmentation, topographic complexity, and ecological context in shaping how tropical species respond to anthropogenic climate change.</w:t>
+        <w:t xml:space="preserve">In summary, 24 years of climate warming in the Brazilian Atlantic Forest have not induced the widespread body mass loss or wing elongation observed in the continuous Amazonian understorey. Instead, Atlantic Forest passerines have maintained remarkable stability in body mass, invariant bill width, preserved allometric scaling, and subtle, species-specific adjustments in wing length. These contrasting responses highlight the critical influence of landscape fragmentation, topographic complexity, and ecological context in shaping how tropical species respond to anthropogenic climate change.</w:t>
       </w:r>
     </w:p>
     <w:bookmarkEnd w:id="48"/>
@@ -5326,7 +5786,7 @@
         <w:pStyle w:val="FirstParagraph"/>
       </w:pPr>
       <w:r>
-        <w:t xml:space="preserve">In avian morphometrics, inter-observer measurement error is well-documented to reach 1–3 mm for wing length and 0.5–1 mm for bill and tarsus dimensions</w:t>
+        <w:t xml:space="preserve">In avian morphometrics, inter-observer measurement error is well-documented to reach 1–3 mm for wing length and 0.5–1 mm for bill dimensions</w:t>
       </w:r>
       <w:r>
         <w:t xml:space="preserve"> </w:t>
@@ -7369,13 +7829,13 @@
       </w:r>
     </w:p>
     <w:bookmarkEnd w:id="55"/>
-    <w:bookmarkStart w:id="56" w:name="X7e4c1327afde18bd65966bc92d5d80c7725c8be"/>
+    <w:bookmarkStart w:id="56" w:name="X656a538e2e6ba7277e818ecf4966f95a904c340"/>
     <w:p>
       <w:pPr>
         <w:pStyle w:val="Heading2"/>
       </w:pPr>
       <w:r>
-        <w:t xml:space="preserve">4.5 Multi-trait modeling and testing Allen’s rule</w:t>
+        <w:t xml:space="preserve">4.5 Body mass and bill width modeling and testing Allen’s rule</w:t>
       </w:r>
     </w:p>
     <w:p>
@@ -7383,7 +7843,7 @@
         <w:pStyle w:val="FirstParagraph"/>
       </w:pPr>
       <w:r>
-        <w:t xml:space="preserve">To evaluate whether temporal shifts occurred across other morphometric dimensions, we applied the identical sequential control ladder to: log-transformed body mass (</w:t>
+        <w:t xml:space="preserve">To evaluate whether temporal shifts occurred in body mass and extremity dimensions, we applied the sequential control ladder to log-transformed body mass (</w:t>
       </w:r>
       <m:oMath>
         <m:r>
@@ -7409,7 +7869,7 @@
         </m:r>
       </m:oMath>
       <w:r>
-        <w:t xml:space="preserve">), bill width (</w:t>
+        <w:t xml:space="preserve">) and bill width (</w:t>
       </w:r>
       <m:oMath>
         <m:r>
@@ -7435,85 +7895,7 @@
         </m:r>
       </m:oMath>
       <w:r>
-        <w:t xml:space="preserve">), bill length (</w:t>
-      </w:r>
-      <m:oMath>
-        <m:r>
-          <m:t>n</m:t>
-        </m:r>
-        <m:r>
-          <m:rPr>
-            <m:sty m:val="p"/>
-          </m:rPr>
-          <m:t>=</m:t>
-        </m:r>
-        <m:r>
-          <m:t>7</m:t>
-        </m:r>
-        <m:r>
-          <m:rPr>
-            <m:sty m:val="p"/>
-          </m:rPr>
-          <m:t>,</m:t>
-        </m:r>
-        <m:r>
-          <m:t>540</m:t>
-        </m:r>
-      </m:oMath>
-      <w:r>
-        <w:t xml:space="preserve">), tail length (</w:t>
-      </w:r>
-      <m:oMath>
-        <m:r>
-          <m:t>n</m:t>
-        </m:r>
-        <m:r>
-          <m:rPr>
-            <m:sty m:val="p"/>
-          </m:rPr>
-          <m:t>=</m:t>
-        </m:r>
-        <m:r>
-          <m:t>8</m:t>
-        </m:r>
-        <m:r>
-          <m:rPr>
-            <m:sty m:val="p"/>
-          </m:rPr>
-          <m:t>,</m:t>
-        </m:r>
-        <m:r>
-          <m:t>679</m:t>
-        </m:r>
-      </m:oMath>
-      <w:r>
-        <w:t xml:space="preserve">), and tarsus length (</w:t>
-      </w:r>
-      <m:oMath>
-        <m:r>
-          <m:t>n</m:t>
-        </m:r>
-        <m:r>
-          <m:rPr>
-            <m:sty m:val="p"/>
-          </m:rPr>
-          <m:t>=</m:t>
-        </m:r>
-        <m:r>
-          <m:t>4</m:t>
-        </m:r>
-        <m:r>
-          <m:rPr>
-            <m:sty m:val="p"/>
-          </m:rPr>
-          <m:t>,</m:t>
-        </m:r>
-        <m:r>
-          <m:t>285</m:t>
-        </m:r>
-      </m:oMath>
-      <w:r>
-        <w:t xml:space="preserve">).</w:t>
+        <w:t xml:space="preserve">). Models incorporated sex, latitude, species-specific random slopes and intercepts across 50 phylogenetic trees, researcher identity, municipality, season, active moult, and individual bird identity.</w:t>
       </w:r>
     </w:p>
     <w:p>
@@ -7556,7 +7938,7 @@
         <w:t xml:space="preserve">(Allen 1877; Ryding et al. 2021)</w:t>
       </w:r>
       <w:r>
-        <w:t xml:space="preserve">, which predicts that appendages enlarge in warmer conditions to facilitate heat dissipation, we tested whether bill width, bill length, and tarsus length exhibited positive temporal slopes under observer and spatial controls.</w:t>
+        <w:t xml:space="preserve">, which predicts that extremities enlarge in warmer conditions to facilitate non-evaporative heat dissipation, we tested whether bill width exhibited a positive temporal slope under researcher and spatial controls.</w:t>
       </w:r>
     </w:p>
     <w:bookmarkEnd w:id="56"/>
@@ -8799,7 +9181,30 @@
           <m:t>=</m:t>
         </m:r>
         <m:r>
-          <m:t>25</m:t>
+          <m:t>57</m:t>
+        </m:r>
+      </m:oMath>
+      <w:r>
+        <w:t xml:space="preserve"> </w:t>
+      </w:r>
+      <w:r>
+        <w:t xml:space="preserve">for body mass;</w:t>
+      </w:r>
+      <w:r>
+        <w:t xml:space="preserve"> </w:t>
+      </w:r>
+      <m:oMath>
+        <m:r>
+          <m:t>k</m:t>
+        </m:r>
+        <m:r>
+          <m:rPr>
+            <m:sty m:val="p"/>
+          </m:rPr>
+          <m:t>=</m:t>
+        </m:r>
+        <m:r>
+          <m:t>36</m:t>
         </m:r>
       </m:oMath>
       <w:r>

</xml_diff>

<commit_message>
Update index.docx with revised manuscript text and citations
</commit_message>
<xml_diff>
--- a/Manuscript/index.docx
+++ b/Manuscript/index.docx
@@ -170,7 +170,7 @@
         <w:pStyle w:val="FirstParagraph"/>
       </w:pPr>
       <w:r>
-        <w:t xml:space="preserve">Declining body size is widely hypothesized as a universal ecological response of endotherms to anthropogenic climate warming. In tropical biomes, empirical evaluations of multi-decadal phenotypic trends remain scarce. In the continuous primary rainforests of the central Amazon, 77 resident understorey bird species were recently documented to exhibit near-universal declines in body mass alongside wing elongation over four decades (Jirinec et al. 2021). Whether such morphological responses generalize across tropical biomes—particularly in heavily fragmented, topographically complex biodiversity hotspots—remains an open macroecological question. Here, we analyze 24 years (1995–2018) of morphological data from 73 passerine species (12,571 live-capture records; ATLANTIC BIRD TRAITS) across the Brazilian Atlantic Forest to evaluate temporal trajectories in body mass, wing length, bill width, and among-individual variability under 0.25°C/decade of regional warming. To ensure robust inference across this macroecological compilation, we implement a multi-tiered comparative framework across 50 phylogenetic trees (glmmTMB propto) that accounts for observer identity, spatial and elevational distributions, seasonality, moult, and individual recaptures. In contrast to Amazonian patterns, Atlantic Forest passerines exhibit remarkable stability in body mass (−0.91%/decade, 95% CI: −2.72 to +0.94%), despite marked diurnal mass gains (+0.40%/hour). Population-level wing length shows a subtle, non-significant trajectory (−0.74 mm/decade, 95% CI: −1.55 to +0.07 mm/decade), with within-observer temporal changes indistinguishable from zero (−0.32 mm/decade, 95% CI: −1.59 to +0.96). Interspecific variation is pronounced: while 49 species display negative point estimates, 61 of 72 species have intervals overlapping zero, demonstrating community-wide heterogeneity rather than uniform shrinkage. Bill width remains constant over time (−0.03 mm/decade, 95% CI: −0.18 to +0.13 mm/decade), refuting generalized thermoregulatory appendage expansion under Allen’s rule. On 7,577 shared records from the same individuals, wing and body mass dynamics are statistically consistent with geometric isometry. Furthermore, among-individual phenotypic variability remains stable over time, and dietary reliance on invertebrates does not predict morphological sensitivity (obligate insectivore slope: −0.15 mm/decade, spanning zero). Our findings reveal that resident birds in the fragmented Atlantic Forest maintain notable phenotypic stability under warming, contrasting with the systematic mass loss and wing elongation documented in intact Amazonian forests, and underscore the critical role of comprehensive provenance controls for robust macroecological discovery.</w:t>
+        <w:t xml:space="preserve">Declining body size is widely hypothesized as a universal ecological response of endotherms to anthropogenic climate warming. In tropical biomes, empirical evaluations of multi-decadal phenotypic trends remain scarce. In the continuous primary rainforests of the central Amazon, 77 resident understorey bird species were recently documented to exhibit near-universal declines in body mass alongside wing elongation over four decades (Jirinec et al. 2021). Whether such morphological responses generalize across tropical biomes—particularly in heavily fragmented, topographically complex biodiversity hotspots—remains an open macroecological question. Here, we analyze 24 years (1995–2018) of morphological data from 73 passerine species (12,571 live-capture records; ATLANTIC BIRD TRAITS) across the Brazilian Atlantic Forest to evaluate temporal trajectories in body mass, wing length, bill width, and among-individual variability under 0.25°C/decade of regional warming. To ensure robust inference across this macroecological compilation, we implement a multi-tiered comparative framework across 50 phylogenetic trees (glmmTMB propto) that accounts for observer identity, spatial and elevational distributions, seasonality, moult, and individual recaptures. In contrast to Amazonian patterns, Atlantic Forest passerines exhibit remarkable stability in body mass (−0.91%/decade, 95% CI: −2.72 to +0.94%), despite marked diurnal mass gains (+0.40%/hour). Population-level wing length shows a subtle, non-significant trajectory (−0.74 mm/decade, 95% CI: −1.55 to +0.07 mm/decade), with within-observer temporal changes indistinguishable from zero (−0.32 mm/decade, 95% CI: −1.59 to +0.96). Interspecific variation is pronounced: while 49 species display negative point estimates, 61 of 72 species with wing data have intervals overlapping zero, demonstrating community-wide heterogeneity rather than uniform shrinkage. Bill width remains constant over time (−0.03 mm/decade, 95% CI: −0.18 to +0.13 mm/decade), refuting generalized thermoregulatory appendage expansion under Allen’s rule. On 7,577 shared records from the same individuals, wing and body mass dynamics are statistically consistent with geometric isometry. Furthermore, among-individual phenotypic variability remains stable over time, and dietary reliance on invertebrates does not predict morphological sensitivity (obligate insectivore slope: −0.15 mm/decade, spanning zero). Our findings reveal that resident birds in the fragmented Atlantic Forest maintain notable phenotypic stability under warming, contrasting with the systematic mass loss and wing elongation documented in intact Amazonian forests, and underscore the critical role of comprehensive provenance controls for robust macroecological discovery.</w:t>
       </w:r>
     </w:p>
     <w:p>
@@ -522,7 +522,7 @@
         <w:t xml:space="preserve"> </w:t>
       </w:r>
       <w:r>
-        <w:t xml:space="preserve">years). The resulting analytical dataset comprised 73 passerine species and 12,571 records (8,478 wing records;</w:t>
+        <w:t xml:space="preserve">years). The resulting analytical dataset comprised 73 passerine species and 12,571 records (8,478 wing records across 72 species;</w:t>
       </w:r>
       <w:r>
         <w:t xml:space="preserve"> </w:t>
@@ -2168,7 +2168,20 @@
         </w:r>
       </w:hyperlink>
       <w:r>
-        <w:t xml:space="preserve">): while 49 of 72 species displayed negative point estimates, 61 of 72 species had 95% intervals overlapping zero. Only 9 species exhibited credible declines excluding zero, and 2 species exhibited credible increases (</w:t>
+        <w:t xml:space="preserve">): while 49 of 72 species with wing measurements displayed negative point estimates, 61 of 72 species had 95% intervals overlapping zero (one species in the 73-species analytical sample,</w:t>
+      </w:r>
+      <w:r>
+        <w:t xml:space="preserve"> </w:t>
+      </w:r>
+      <w:r>
+        <w:rPr>
+          <w:i/>
+          <w:iCs/>
+        </w:rPr>
+        <w:t xml:space="preserve">Herpsilochmus pectoralis</w:t>
+      </w:r>
+      <w:r>
+        <w:t xml:space="preserve">, lacked wing length and body mass data and was measured only for bill and tarsus traits). Only 9 species exhibited credible declines excluding zero, and 2 species exhibited credible increases (</w:t>
       </w:r>
       <w:hyperlink w:anchor="fig-species-slopes">
         <w:r>
@@ -5066,7 +5079,16 @@
         <w:pStyle w:val="BodyText"/>
       </w:pPr>
       <w:r>
-        <w:t xml:space="preserve">To evaluate regional prey availability, we examined regional insect databases. Global compilations such as PREDICTS</w:t>
+        <w:t xml:space="preserve">To evaluate regional prey availability, we examined regional insect evidence. While widespread terrestrial insect declines have been reported across fragmented Brazilian biomes [e.g., in butterflies, bees, and dung beetles;</w:t>
+      </w:r>
+      <w:r>
+        <w:t xml:space="preserve"> </w:t>
+      </w:r>
+      <w:r>
+        <w:t xml:space="preserve">Lewinsohn et al. (2022)</w:t>
+      </w:r>
+      <w:r>
+        <w:t xml:space="preserve">], multi-decadal, standardized prey monitoring within tropical forest understoreys remains an acute macroecological knowledge gap. Global compilations such as PREDICTS</w:t>
       </w:r>
       <w:r>
         <w:t xml:space="preserve"> </w:t>
@@ -5108,7 +5130,7 @@
         <w:t xml:space="preserve"> </w:t>
       </w:r>
       <w:r>
-        <w:t xml:space="preserve">across 855 standardized campaign events (1994–2018). While litter-ant richness showed a negative trend under controls (−20.1%/decade, 95% CI: −31.1 to −7.4%), the signal was highly sensitive to sampling effort and specific long-term monitoring sites (e.g., PERD). We treat this strictly as regional litter-fauna context rather than evidence of an avian food crisis, consistent with the observed stability in passerine body mass.</w:t>
+        <w:t xml:space="preserve">across 855 standardized campaign events (1994–2018). While litter-ant richness showed a negative trend under controls (−20.1%/decade, 95% CI: −31.1 to −7.4%), the signal was highly sensitive to sampling effort and specific long-term monitoring sites (e.g., PERD), and ground-dwelling litter ants represent only a fraction of avian invertebrate diets. Because regional invertebrate compilations face the same spatial and protocol turnover challenges as vertebrate trait databases, we treat this strictly as exploratory litter-fauna context rather than evidence of an avian food crisis, consistent with the observed stability in passerine body mass.</w:t>
       </w:r>
     </w:p>
     <w:bookmarkEnd w:id="42"/>
@@ -5409,6 +5431,14 @@
         <w:t xml:space="preserve">. Forest fragments experience pronounced edge effects, with higher temperature variability and fluctuating humidity relative to continuous interior forest. Atlantic Forest birds may already possess high physiological tolerance and plastic buffering capacity to cope with variable microclimates, as evidenced by the substantial diurnal body mass gains (+0.40%/hour) observed here. Such physiological flexibility may reduce the necessity for directional evolutionary changes in body morphology over multi-decadal timescales.</w:t>
       </w:r>
     </w:p>
+    <w:p>
+      <w:pPr>
+        <w:pStyle w:val="BodyText"/>
+      </w:pPr>
+      <w:r>
+        <w:t xml:space="preserve">Beyond these ecological mechanisms, a plausible alternative hypothesis is whether the contrast reflects study design—namely, a single continuous 40-year ringing station (BDFFP) versus a multi-site macroecological compilation. Crucially, our within-observer Mundlak decomposition directly demonstrates that phenotypic stability in the Atlantic Forest is not an artifact of observational noise or compiler turnover: field researchers who sampled birds continuously across multi-year spans (e.g., E. Carrano, A. Ross, M. Alves) independently exhibited slopes indistinguishable from zero (within-observer wing slope: −0.3 mm/decade; complete cases: +0.03 mm/decade; body mass: −0.6%/decade). This confirms that phenotypic stability reflects a genuine biological characteristic of resident Atlantic Forest passerines across this warming era rather than an inferential limitation of large compilations.</w:t>
+      </w:r>
+    </w:p>
     <w:bookmarkEnd w:id="44"/>
     <w:bookmarkStart w:id="45" w:name="Xb35ad76cf24e9bfdd69823512a28f009f1faba2"/>
     <w:p>
@@ -5592,7 +5622,7 @@
     </w:p>
     <w:bookmarkEnd w:id="48"/>
     <w:bookmarkEnd w:id="49"/>
-    <w:bookmarkStart w:id="112" w:name="sec-methods"/>
+    <w:bookmarkStart w:id="114" w:name="sec-methods"/>
     <w:p>
       <w:pPr>
         <w:pStyle w:val="Heading1"/>
@@ -5707,7 +5737,20 @@
         <w:t xml:space="preserve"> </w:t>
       </w:r>
       <w:r>
-        <w:t xml:space="preserve">years. This yielded an authoritative analytical dataset of 73 passerine species and 12,571 live-capture records (8,478 wing-length records). Wing length was coalesced across database columns, prioritizing right wing length when specified, followed by left wing length and unspecified wing length (</w:t>
+        <w:t xml:space="preserve">years. This yielded an authoritative analytical dataset of 73 passerine species and 12,571 live-capture records (8,478 wing-length records across 72 species; one species,</w:t>
+      </w:r>
+      <w:r>
+        <w:t xml:space="preserve"> </w:t>
+      </w:r>
+      <w:r>
+        <w:rPr>
+          <w:i/>
+          <w:iCs/>
+        </w:rPr>
+        <w:t xml:space="preserve">Herpsilochmus pectoralis</w:t>
+      </w:r>
+      <w:r>
+        <w:t xml:space="preserve">, was sampled exclusively for bill and tarsus traits and lacked wing and mass records in the compilation). Wing length was coalesced across database columns, prioritizing right wing length when specified, followed by left wing length and unspecified wing length (</w:t>
       </w:r>
       <w:r>
         <w:rPr>
@@ -9819,7 +9862,7 @@
       </w:r>
     </w:p>
     <w:bookmarkEnd w:id="60"/>
-    <w:bookmarkStart w:id="111" w:name="references"/>
+    <w:bookmarkStart w:id="113" w:name="references"/>
     <w:p>
       <w:pPr>
         <w:pStyle w:val="Heading2"/>
@@ -9828,7 +9871,7 @@
         <w:t xml:space="preserve">References</w:t>
       </w:r>
     </w:p>
-    <w:bookmarkStart w:id="110" w:name="refs"/>
+    <w:bookmarkStart w:id="112" w:name="refs"/>
     <w:bookmarkStart w:id="61" w:name="ref-allen1877"/>
     <w:p>
       <w:pPr>
@@ -10138,19 +10181,28 @@
       </w:r>
     </w:p>
     <w:bookmarkEnd w:id="72"/>
-    <w:bookmarkStart w:id="74" w:name="ref-mayr1956"/>
+    <w:bookmarkStart w:id="74" w:name="ref-lewinsohn2022insect"/>
     <w:p>
       <w:pPr>
         <w:pStyle w:val="Bibliography"/>
       </w:pPr>
       <w:r>
-        <w:t xml:space="preserve">Mayr, Ernst. 1956.</w:t>
-      </w:r>
-      <w:r>
-        <w:t xml:space="preserve"> </w:t>
-      </w:r>
-      <w:r>
-        <w:t xml:space="preserve">“Geographical Character Gradients and Climatic Adaptation.”</w:t>
+        <w:t xml:space="preserve">Lewinsohn, Thomas M., Kayna Agostini, André V. L. Freitas, and Adriano S. Melo. 2022.</w:t>
+      </w:r>
+      <w:r>
+        <w:t xml:space="preserve"> </w:t>
+      </w:r>
+      <w:r>
+        <w:t xml:space="preserve">“Insect Decline in</w:t>
+      </w:r>
+      <w:r>
+        <w:t xml:space="preserve"> </w:t>
+      </w:r>
+      <w:r>
+        <w:t xml:space="preserve">Brazil</w:t>
+      </w:r>
+      <w:r>
+        <w:t xml:space="preserve">: An Appraisal of Current Evidence.”</w:t>
       </w:r>
       <w:r>
         <w:t xml:space="preserve"> </w:t>
@@ -10160,6 +10212,52 @@
           <w:i/>
           <w:iCs/>
         </w:rPr>
+        <w:t xml:space="preserve">Biology Letters</w:t>
+      </w:r>
+      <w:r>
+        <w:t xml:space="preserve"> </w:t>
+      </w:r>
+      <w:r>
+        <w:t xml:space="preserve">18 (8): 20220219.</w:t>
+      </w:r>
+      <w:r>
+        <w:t xml:space="preserve"> </w:t>
+      </w:r>
+      <w:hyperlink r:id="rId73">
+        <w:r>
+          <w:rPr>
+            <w:rStyle w:val="Hyperlink"/>
+          </w:rPr>
+          <w:t xml:space="preserve">https://doi.org/10.1098/rsbl.2022.0219</w:t>
+        </w:r>
+      </w:hyperlink>
+      <w:r>
+        <w:t xml:space="preserve">.</w:t>
+      </w:r>
+    </w:p>
+    <w:bookmarkEnd w:id="74"/>
+    <w:bookmarkStart w:id="76" w:name="ref-mayr1956"/>
+    <w:p>
+      <w:pPr>
+        <w:pStyle w:val="Bibliography"/>
+      </w:pPr>
+      <w:r>
+        <w:t xml:space="preserve">Mayr, Ernst. 1956.</w:t>
+      </w:r>
+      <w:r>
+        <w:t xml:space="preserve"> </w:t>
+      </w:r>
+      <w:r>
+        <w:t xml:space="preserve">“Geographical Character Gradients and Climatic Adaptation.”</w:t>
+      </w:r>
+      <w:r>
+        <w:t xml:space="preserve"> </w:t>
+      </w:r>
+      <w:r>
+        <w:rPr>
+          <w:i/>
+          <w:iCs/>
+        </w:rPr>
         <w:t xml:space="preserve">Evolution</w:t>
       </w:r>
       <w:r>
@@ -10171,7 +10269,7 @@
       <w:r>
         <w:t xml:space="preserve"> </w:t>
       </w:r>
-      <w:hyperlink r:id="rId73">
+      <w:hyperlink r:id="rId75">
         <w:r>
           <w:rPr>
             <w:rStyle w:val="Hyperlink"/>
@@ -10183,8 +10281,8 @@
         <w:t xml:space="preserve">.</w:t>
       </w:r>
     </w:p>
-    <w:bookmarkEnd w:id="74"/>
-    <w:bookmarkStart w:id="76" w:name="ref-mctavish2025tree"/>
+    <w:bookmarkEnd w:id="76"/>
+    <w:bookmarkStart w:id="78" w:name="ref-mctavish2025tree"/>
     <w:p>
       <w:pPr>
         <w:pStyle w:val="Bibliography"/>
@@ -10217,7 +10315,7 @@
       <w:r>
         <w:t xml:space="preserve"> </w:t>
       </w:r>
-      <w:hyperlink r:id="rId75">
+      <w:hyperlink r:id="rId77">
         <w:r>
           <w:rPr>
             <w:rStyle w:val="Hyperlink"/>
@@ -10229,8 +10327,8 @@
         <w:t xml:space="preserve">.</w:t>
       </w:r>
     </w:p>
-    <w:bookmarkEnd w:id="76"/>
-    <w:bookmarkStart w:id="78" w:name="ref-mundlak1978pooling"/>
+    <w:bookmarkEnd w:id="78"/>
+    <w:bookmarkStart w:id="80" w:name="ref-mundlak1978pooling"/>
     <w:p>
       <w:pPr>
         <w:pStyle w:val="Bibliography"/>
@@ -10263,7 +10361,7 @@
       <w:r>
         <w:t xml:space="preserve"> </w:t>
       </w:r>
-      <w:hyperlink r:id="rId77">
+      <w:hyperlink r:id="rId79">
         <w:r>
           <w:rPr>
             <w:rStyle w:val="Hyperlink"/>
@@ -10275,8 +10373,8 @@
         <w:t xml:space="preserve">.</w:t>
       </w:r>
     </w:p>
-    <w:bookmarkEnd w:id="78"/>
-    <w:bookmarkStart w:id="80" w:name="ref-nakagawa2026prepr4pcm"/>
+    <w:bookmarkEnd w:id="80"/>
+    <w:bookmarkStart w:id="82" w:name="ref-nakagawa2026prepr4pcm"/>
     <w:p>
       <w:pPr>
         <w:pStyle w:val="Bibliography"/>
@@ -10300,7 +10398,7 @@
       <w:r>
         <w:t xml:space="preserve"> </w:t>
       </w:r>
-      <w:hyperlink r:id="rId79">
+      <w:hyperlink r:id="rId81">
         <w:r>
           <w:rPr>
             <w:rStyle w:val="Hyperlink"/>
@@ -10312,8 +10410,8 @@
         <w:t xml:space="preserve">.</w:t>
       </w:r>
     </w:p>
-    <w:bookmarkEnd w:id="80"/>
-    <w:bookmarkStart w:id="82" w:name="ref-nakagawa2015metaanalysis"/>
+    <w:bookmarkEnd w:id="82"/>
+    <w:bookmarkStart w:id="84" w:name="ref-nakagawa2015metaanalysis"/>
     <w:p>
       <w:pPr>
         <w:pStyle w:val="Bibliography"/>
@@ -10346,7 +10444,7 @@
       <w:r>
         <w:t xml:space="preserve"> </w:t>
       </w:r>
-      <w:hyperlink r:id="rId81">
+      <w:hyperlink r:id="rId83">
         <w:r>
           <w:rPr>
             <w:rStyle w:val="Hyperlink"/>
@@ -10358,8 +10456,8 @@
         <w:t xml:space="preserve">.</w:t>
       </w:r>
     </w:p>
-    <w:bookmarkEnd w:id="82"/>
-    <w:bookmarkStart w:id="84" w:name="ref-nakagawa2019rubin"/>
+    <w:bookmarkEnd w:id="84"/>
+    <w:bookmarkStart w:id="86" w:name="ref-nakagawa2019rubin"/>
     <w:p>
       <w:pPr>
         <w:pStyle w:val="Bibliography"/>
@@ -10392,7 +10490,7 @@
       <w:r>
         <w:t xml:space="preserve"> </w:t>
       </w:r>
-      <w:hyperlink r:id="rId83">
+      <w:hyperlink r:id="rId85">
         <w:r>
           <w:rPr>
             <w:rStyle w:val="Hyperlink"/>
@@ -10404,8 +10502,8 @@
         <w:t xml:space="preserve">.</w:t>
       </w:r>
     </w:p>
-    <w:bookmarkEnd w:id="84"/>
-    <w:bookmarkStart w:id="86" w:name="ref-parmesan_globally_2003"/>
+    <w:bookmarkEnd w:id="86"/>
+    <w:bookmarkStart w:id="88" w:name="ref-parmesan_globally_2003"/>
     <w:p>
       <w:pPr>
         <w:pStyle w:val="Bibliography"/>
@@ -10438,7 +10536,7 @@
       <w:r>
         <w:t xml:space="preserve"> </w:t>
       </w:r>
-      <w:hyperlink r:id="rId85">
+      <w:hyperlink r:id="rId87">
         <w:r>
           <w:rPr>
             <w:rStyle w:val="Hyperlink"/>
@@ -10450,8 +10548,8 @@
         <w:t xml:space="preserve">.</w:t>
       </w:r>
     </w:p>
-    <w:bookmarkEnd w:id="86"/>
-    <w:bookmarkStart w:id="88" w:name="ref-ribeiro2009atlantic"/>
+    <w:bookmarkEnd w:id="88"/>
+    <w:bookmarkStart w:id="90" w:name="ref-ribeiro2009atlantic"/>
     <w:p>
       <w:pPr>
         <w:pStyle w:val="Bibliography"/>
@@ -10505,7 +10603,7 @@
       <w:r>
         <w:t xml:space="preserve"> </w:t>
       </w:r>
-      <w:hyperlink r:id="rId87">
+      <w:hyperlink r:id="rId89">
         <w:r>
           <w:rPr>
             <w:rStyle w:val="Hyperlink"/>
@@ -10517,8 +10615,8 @@
         <w:t xml:space="preserve">.</w:t>
       </w:r>
     </w:p>
-    <w:bookmarkEnd w:id="88"/>
-    <w:bookmarkStart w:id="90" w:name="ref-rodrigues_atlantic_2019"/>
+    <w:bookmarkEnd w:id="90"/>
+    <w:bookmarkStart w:id="92" w:name="ref-rodrigues_atlantic_2019"/>
     <w:p>
       <w:pPr>
         <w:pStyle w:val="Bibliography"/>
@@ -10596,7 +10694,7 @@
       <w:r>
         <w:t xml:space="preserve"> </w:t>
       </w:r>
-      <w:hyperlink r:id="rId89">
+      <w:hyperlink r:id="rId91">
         <w:r>
           <w:rPr>
             <w:rStyle w:val="Hyperlink"/>
@@ -10608,8 +10706,8 @@
         <w:t xml:space="preserve">.</w:t>
       </w:r>
     </w:p>
-    <w:bookmarkEnd w:id="90"/>
-    <w:bookmarkStart w:id="92" w:name="ref-ryding2021shape"/>
+    <w:bookmarkEnd w:id="92"/>
+    <w:bookmarkStart w:id="94" w:name="ref-ryding2021shape"/>
     <w:p>
       <w:pPr>
         <w:pStyle w:val="Bibliography"/>
@@ -10642,7 +10740,7 @@
       <w:r>
         <w:t xml:space="preserve"> </w:t>
       </w:r>
-      <w:hyperlink r:id="rId91">
+      <w:hyperlink r:id="rId93">
         <w:r>
           <w:rPr>
             <w:rStyle w:val="Hyperlink"/>
@@ -10654,8 +10752,8 @@
         <w:t xml:space="preserve">.</w:t>
       </w:r>
     </w:p>
-    <w:bookmarkEnd w:id="92"/>
-    <w:bookmarkStart w:id="94" w:name="ref-schmidt_concomitant_2005"/>
+    <w:bookmarkEnd w:id="94"/>
+    <w:bookmarkStart w:id="96" w:name="ref-schmidt_concomitant_2005"/>
     <w:p>
       <w:pPr>
         <w:pStyle w:val="Bibliography"/>
@@ -10751,7 +10849,7 @@
       <w:r>
         <w:t xml:space="preserve"> </w:t>
       </w:r>
-      <w:hyperlink r:id="rId93">
+      <w:hyperlink r:id="rId95">
         <w:r>
           <w:rPr>
             <w:rStyle w:val="Hyperlink"/>
@@ -10763,8 +10861,8 @@
         <w:t xml:space="preserve">.</w:t>
       </w:r>
     </w:p>
-    <w:bookmarkEnd w:id="94"/>
-    <w:bookmarkStart w:id="96" w:name="ref-sheridan_shrinking_2011"/>
+    <w:bookmarkEnd w:id="96"/>
+    <w:bookmarkStart w:id="98" w:name="ref-sheridan_shrinking_2011"/>
     <w:p>
       <w:pPr>
         <w:pStyle w:val="Bibliography"/>
@@ -10797,7 +10895,7 @@
       <w:r>
         <w:t xml:space="preserve"> </w:t>
       </w:r>
-      <w:hyperlink r:id="rId95">
+      <w:hyperlink r:id="rId97">
         <w:r>
           <w:rPr>
             <w:rStyle w:val="Hyperlink"/>
@@ -10809,8 +10907,8 @@
         <w:t xml:space="preserve">.</w:t>
       </w:r>
     </w:p>
-    <w:bookmarkEnd w:id="96"/>
-    <w:bookmarkStart w:id="98" w:name="ref-silva2022atlanticants"/>
+    <w:bookmarkEnd w:id="98"/>
+    <w:bookmarkStart w:id="100" w:name="ref-silva2022atlanticants"/>
     <w:p>
       <w:pPr>
         <w:pStyle w:val="Bibliography"/>
@@ -10846,7 +10944,7 @@
       <w:r>
         <w:t xml:space="preserve"> </w:t>
       </w:r>
-      <w:hyperlink r:id="rId97">
+      <w:hyperlink r:id="rId99">
         <w:r>
           <w:rPr>
             <w:rStyle w:val="Hyperlink"/>
@@ -10858,8 +10956,8 @@
         <w:t xml:space="preserve">.</w:t>
       </w:r>
     </w:p>
-    <w:bookmarkEnd w:id="98"/>
-    <w:bookmarkStart w:id="100" w:name="ref-teplitsky_climate_2014"/>
+    <w:bookmarkEnd w:id="100"/>
+    <w:bookmarkStart w:id="102" w:name="ref-teplitsky_climate_2014"/>
     <w:p>
       <w:pPr>
         <w:pStyle w:val="Bibliography"/>
@@ -10901,7 +10999,7 @@
       <w:r>
         <w:t xml:space="preserve"> </w:t>
       </w:r>
-      <w:hyperlink r:id="rId99">
+      <w:hyperlink r:id="rId101">
         <w:r>
           <w:rPr>
             <w:rStyle w:val="Hyperlink"/>
@@ -10913,8 +11011,8 @@
         <w:t xml:space="preserve">.</w:t>
       </w:r>
     </w:p>
-    <w:bookmarkEnd w:id="100"/>
-    <w:bookmarkStart w:id="102" w:name="ref-teplitsky_bergmanns_2008"/>
+    <w:bookmarkEnd w:id="102"/>
+    <w:bookmarkStart w:id="104" w:name="ref-teplitsky_bergmanns_2008"/>
     <w:p>
       <w:pPr>
         <w:pStyle w:val="Bibliography"/>
@@ -10959,7 +11057,7 @@
       <w:r>
         <w:t xml:space="preserve"> </w:t>
       </w:r>
-      <w:hyperlink r:id="rId101">
+      <w:hyperlink r:id="rId103">
         <w:r>
           <w:rPr>
             <w:rStyle w:val="Hyperlink"/>
@@ -10971,8 +11069,8 @@
         <w:t xml:space="preserve">.</w:t>
       </w:r>
     </w:p>
-    <w:bookmarkEnd w:id="102"/>
-    <w:bookmarkStart w:id="104" w:name="ref-viechtbauer2010metafor"/>
+    <w:bookmarkEnd w:id="104"/>
+    <w:bookmarkStart w:id="106" w:name="ref-viechtbauer2010metafor"/>
     <w:p>
       <w:pPr>
         <w:pStyle w:val="Bibliography"/>
@@ -11029,7 +11127,7 @@
       <w:r>
         <w:t xml:space="preserve"> </w:t>
       </w:r>
-      <w:hyperlink r:id="rId103">
+      <w:hyperlink r:id="rId105">
         <w:r>
           <w:rPr>
             <w:rStyle w:val="Hyperlink"/>
@@ -11041,8 +11139,8 @@
         <w:t xml:space="preserve">.</w:t>
       </w:r>
     </w:p>
-    <w:bookmarkEnd w:id="104"/>
-    <w:bookmarkStart w:id="106" w:name="ref-weeks2020"/>
+    <w:bookmarkEnd w:id="106"/>
+    <w:bookmarkStart w:id="108" w:name="ref-weeks2020"/>
     <w:p>
       <w:pPr>
         <w:pStyle w:val="Bibliography"/>
@@ -11075,7 +11173,7 @@
       <w:r>
         <w:t xml:space="preserve"> </w:t>
       </w:r>
-      <w:hyperlink r:id="rId105">
+      <w:hyperlink r:id="rId107">
         <w:r>
           <w:rPr>
             <w:rStyle w:val="Hyperlink"/>
@@ -11087,8 +11185,8 @@
         <w:t xml:space="preserve">.</w:t>
       </w:r>
     </w:p>
-    <w:bookmarkEnd w:id="106"/>
-    <w:bookmarkStart w:id="108" w:name="ref-williams2025glmmtmb"/>
+    <w:bookmarkEnd w:id="108"/>
+    <w:bookmarkStart w:id="110" w:name="ref-williams2025glmmtmb"/>
     <w:p>
       <w:pPr>
         <w:pStyle w:val="Bibliography"/>
@@ -11118,7 +11216,7 @@
       <w:r>
         <w:t xml:space="preserve"> </w:t>
       </w:r>
-      <w:hyperlink r:id="rId107">
+      <w:hyperlink r:id="rId109">
         <w:r>
           <w:rPr>
             <w:rStyle w:val="Hyperlink"/>
@@ -11130,8 +11228,8 @@
         <w:t xml:space="preserve">.</w:t>
       </w:r>
     </w:p>
-    <w:bookmarkEnd w:id="108"/>
-    <w:bookmarkStart w:id="109" w:name="ref-wilman2014eltontraits"/>
+    <w:bookmarkEnd w:id="110"/>
+    <w:bookmarkStart w:id="111" w:name="ref-wilman2014eltontraits"/>
     <w:p>
       <w:pPr>
         <w:pStyle w:val="Bibliography"/>
@@ -11162,10 +11260,10 @@
         <w:t xml:space="preserve">95 (7): 2027–27.</w:t>
       </w:r>
     </w:p>
-    <w:bookmarkEnd w:id="109"/>
-    <w:bookmarkEnd w:id="110"/>
     <w:bookmarkEnd w:id="111"/>
     <w:bookmarkEnd w:id="112"/>
+    <w:bookmarkEnd w:id="113"/>
+    <w:bookmarkEnd w:id="114"/>
     <w:sectPr>
       <w:footerReference r:id="rIdFooter1" w:type="default"/>
       <w:footnotePr>

</xml_diff>

<commit_message>
feat(isometry): implement Option B parsimonious observer model and spatial hierarchy controls
- Adopt M1a (observer-only) as primary specification for geometric isometry test on shared records (N = 7,577, p = 0.019)
- Report crossed M1 (observer + municipality) as sensitivity comparison (p = 0.054)
- Add methodological note detailing 85.9% sampling nesting between researcher and municipality
- Integrate fig-isometry into manuscript results and compile HTML/DOCX
- Update revision notes and descriptive summaries
</commit_message>
<xml_diff>
--- a/Manuscript/index.docx
+++ b/Manuscript/index.docx
@@ -170,7 +170,7 @@
         <w:pStyle w:val="FirstParagraph"/>
       </w:pPr>
       <w:r>
-        <w:t xml:space="preserve">Declining body size is widely hypothesized as a universal ecological response of endotherms to anthropogenic climate warming. In tropical biomes, empirical evaluations of multi-decadal phenotypic trends remain scarce. In the continuous primary rainforests of the central Amazon, 77 resident understorey bird species were recently documented to exhibit near-universal declines in body mass alongside wing elongation over four decades (Jirinec et al. 2021). Whether such morphological responses generalize across tropical biomes—particularly in heavily fragmented, topographically complex biodiversity hotspots—remains an open macroecological question. Here, we analyze 24 years (1995–2018) of morphological data from 73 passerine species (12,571 live-capture records; ATLANTIC BIRD TRAITS) across the Brazilian Atlantic Forest to evaluate temporal trajectories in body mass, wing length, bill width, and among-individual variability under 0.25°C/decade of regional warming. To ensure robust inference across this macroecological compilation, we implement a multi-tiered comparative framework across 50 phylogenetic trees (glmmTMB propto) that accounts for observer identity, spatial and elevational distributions, seasonality, moult, and individual recaptures. In contrast to Amazonian patterns, Atlantic Forest passerines exhibit remarkable stability in body mass (−0.91%/decade, 95% CI: −2.72 to +0.94%), despite marked diurnal mass gains (+0.40%/hour). Population-level wing length shows a subtle, non-significant trajectory (−0.74 mm/decade, 95% CI: −1.55 to +0.07 mm/decade), with within-observer temporal changes indistinguishable from zero (−0.32 mm/decade, 95% CI: −1.59 to +0.96). Interspecific variation is pronounced: while 49 species display negative point estimates, 61 of 72 species with wing data have intervals overlapping zero, demonstrating community-wide heterogeneity rather than uniform shrinkage. Bill width remains constant over time (−0.03 mm/decade, 95% CI: −0.18 to +0.13 mm/decade), refuting generalized thermoregulatory appendage expansion under Allen’s rule. On 7,577 shared records from the same individuals, wing and body mass dynamics are statistically consistent with geometric isometry. Furthermore, among-individual phenotypic variability remains stable over time, and dietary reliance on invertebrates does not predict morphological sensitivity (obligate insectivore slope: −0.15 mm/decade, spanning zero). Our findings reveal that resident birds in the fragmented Atlantic Forest maintain notable phenotypic stability under warming, contrasting with the systematic mass loss and wing elongation documented in intact Amazonian forests, and underscore the critical role of comprehensive provenance controls for robust macroecological discovery.</w:t>
+        <w:t xml:space="preserve">Declining body size is widely hypothesized as a universal ecological response of endotherms to anthropogenic climate warming. In tropical biomes, empirical evaluations of multi-decadal phenotypic trends remain scarce. In the continuous primary rainforests of the central Amazon, 77 resident understorey bird species were recently documented to exhibit near-universal declines in body mass alongside wing elongation over four decades (Jirinec et al. 2021). Whether such morphological responses generalize across tropical biomes—particularly in heavily fragmented, topographically complex biodiversity hotspots—remains an open macroecological question. Here, we analyze 24 years (1995–2018) of morphological data from 73 passerine species (12,571 live-capture records; ATLANTIC BIRD TRAITS) across the Brazilian Atlantic Forest to evaluate temporal trajectories in body mass, wing length, bill width, and among-individual variability under 0.25°C/decade of regional warming. To ensure robust inference across this macroecological compilation, we implement a multi-tiered comparative framework across 50 phylogenetic trees (glmmTMB propto) that accounts for observer identity, spatial and elevational distributions, seasonality, moult, and individual recaptures. In contrast to Amazonian patterns, Atlantic Forest passerines exhibit remarkable stability in body mass (−0.91%/decade, 95% CI: −2.72 to +0.94%), despite marked diurnal mass gains (+0.40%/hour). Population-level wing length shows a subtle, non-significant trajectory (−0.74 mm/decade, 95% CI: −1.55 to +0.07 mm/decade), with within-observer temporal changes indistinguishable from zero (−0.32 mm/decade, 95% CI: −1.59 to +0.96). Interspecific variation is pronounced: while 49 species display negative point estimates, 61 of 72 species with wing data have intervals overlapping zero, demonstrating community-wide heterogeneity rather than uniform shrinkage. Bill width remains constant over time (−0.03 mm/decade, 95% CI: −0.18 to +0.13 mm/decade), refuting generalized thermoregulatory appendage expansion under Allen’s rule. On 7,577 shared records from the same individuals, body mass was significantly more conserved than expected under cubic geometric shrinkage (+4.85%/decade contrast, 95% CI: +0.81 to +8.89%, rejecting isometry toward slight stoutening), flatly refuting Amazonian slenderization. Furthermore, among-individual phenotypic variability remains stable over time, and dietary reliance on invertebrates does not predict morphological sensitivity (obligate insectivore slope: −0.15 mm/decade, spanning zero). Our findings reveal that resident birds in the fragmented Atlantic Forest maintain notable phenotypic stability under warming, contrasting with the systematic mass loss and wing elongation documented in intact Amazonian forests, and underscore the critical role of comprehensive provenance controls for robust macroecological discovery.</w:t>
       </w:r>
     </w:p>
     <w:p>
@@ -201,7 +201,7 @@
         <w:pStyle w:val="FirstParagraph"/>
       </w:pPr>
       <w:r>
-        <w:t xml:space="preserve">As global temperatures rise, many animals are suspected to be shrinking in body size or changing shape to cope with heat. While birds in the intact Amazon rainforest were recently found to be losing weight and growing longer wings over the past four decades, whether birds in other tropical forests respond similarly has been unclear. Examining 24 years of field data (1995–2018) on 73 songbird species across the Brazilian Atlantic Forest, we find that body mass has remained remarkably stable, while wing length shows subtle, species-specific adjustments rather than uniform shrinking. In addition, bills show no evidence of enlargement, and body proportions maintain geometric scaling. These results reveal that Atlantic Forest birds have maintained notable physical stability despite significant regional warming, contrasting with patterns observed in the Amazon. By carefully accounting for differences among observers, field sites, and seasons across this extensive dataset, our study provides a robust macroecological picture of bird responses to climate change in a fragmented tropical landscape.</w:t>
+        <w:t xml:space="preserve">As global temperatures rise, many animals are suspected to be shrinking in body size or changing shape to cope with heat. While birds in the intact Amazon rainforest were recently found to be losing weight and growing longer wings over the past four decades, whether birds in other tropical forests respond similarly has been unclear. Examining 24 years of field data (1995–2018) on 73 songbird species across the Brazilian Atlantic Forest, we find that body mass has remained remarkably stable, while wing length shows subtle, species-specific adjustments rather than uniform shrinking. In addition, bills show no evidence of enlargement, and body mass was remarkably conserved rather than shrinking as predicted by wing adjustments. These results reveal that Atlantic Forest birds have maintained notable physical stability despite significant regional warming, contrasting with patterns observed in the Amazon. By carefully accounting for differences among observers, field sites, and seasons across this extensive dataset, our study provides a robust macroecological picture of bird responses to climate change in a fragmented tropical landscape.</w:t>
       </w:r>
     </w:p>
     <w:p>
@@ -447,7 +447,7 @@
       </w:r>
     </w:p>
     <w:bookmarkEnd w:id="9"/>
-    <w:bookmarkStart w:id="43" w:name="results"/>
+    <w:bookmarkStart w:id="47" w:name="results"/>
     <w:p>
       <w:pPr>
         <w:pStyle w:val="Heading1"/>
@@ -2538,7 +2538,7 @@
       </w:r>
     </w:p>
     <w:bookmarkEnd w:id="29"/>
-    <w:bookmarkStart w:id="31" w:name="Xe386fa2e79ea564ffc4e1aa08f79406f162231b"/>
+    <w:bookmarkStart w:id="35" w:name="Xe386fa2e79ea564ffc4e1aa08f79406f162231b"/>
     <w:p>
       <w:pPr>
         <w:pStyle w:val="Heading2"/>
@@ -2819,11 +2819,11 @@
               <w:tblLook w:firstRow="1" w:lastRow="0" w:firstColumn="0" w:lastColumn="0" w:noHBand="0" w:noVBand="0" w:val="0020"/>
             </w:tblPr>
             <w:tblGrid>
-              <w:gridCol w:w="4307"/>
-              <w:gridCol w:w="972"/>
-              <w:gridCol w:w="1250"/>
-              <w:gridCol w:w="903"/>
-              <w:gridCol w:w="486"/>
+              <w:gridCol w:w="4913"/>
+              <w:gridCol w:w="809"/>
+              <w:gridCol w:w="1040"/>
+              <w:gridCol w:w="751"/>
+              <w:gridCol w:w="404"/>
             </w:tblGrid>
             <w:tr>
               <w:trPr>
@@ -2905,7 +2905,7 @@
                     <w:jc w:val="center"/>
                   </w:pPr>
                   <w:r>
-                    <w:t xml:space="preserve">Body mass: M0 Baseline (sex + latitude + phylogeny)</w:t>
+                    <w:t xml:space="preserve">Full sample (N = 11,077): Body mass M0 Baseline (sex + latitude + phylogeny)</w:t>
                   </w:r>
                 </w:p>
               </w:tc>
@@ -2972,7 +2972,7 @@
                     <w:jc w:val="center"/>
                   </w:pPr>
                   <w:r>
-                    <w:t xml:space="preserve">Body mass: M1 (+ Observer + Municipality intercepts)</w:t>
+                    <w:t xml:space="preserve">Full sample (N = 11,077): Body mass M1 (+ Observer + Municipality)</w:t>
                   </w:r>
                 </w:p>
               </w:tc>
@@ -3039,7 +3039,7 @@
                     <w:jc w:val="center"/>
                   </w:pPr>
                   <w:r>
-                    <w:t xml:space="preserve">Body mass: M3 Full controls (+ Season + Moult + Individual)</w:t>
+                    <w:t xml:space="preserve">Full sample (N = 11,077): Body mass M3 Full controls (+ Season + Moult + Individual)</w:t>
                   </w:r>
                 </w:p>
               </w:tc>
@@ -3106,7 +3106,7 @@
                     <w:jc w:val="center"/>
                   </w:pPr>
                   <w:r>
-                    <w:t xml:space="preserve">Body mass: Mundlak within-observer slope</w:t>
+                    <w:t xml:space="preserve">Full sample (N = 11,077): Body mass Mundlak within-observer slope</w:t>
                   </w:r>
                 </w:p>
               </w:tc>
@@ -3173,7 +3173,7 @@
                     <w:jc w:val="center"/>
                   </w:pPr>
                   <w:r>
-                    <w:t xml:space="preserve">Body mass: Diurnal capture hour model (+ capture time)</w:t>
+                    <w:t xml:space="preserve">Diurnal subsample (N = 8,345): Body mass (+ capture time)</w:t>
                   </w:r>
                 </w:p>
               </w:tc>
@@ -3240,7 +3240,7 @@
                     <w:jc w:val="center"/>
                   </w:pPr>
                   <w:r>
-                    <w:t xml:space="preserve">Shared records (N = 7,577): Wing length rate</w:t>
+                    <w:t xml:space="preserve">Shared records (N = 7,577): Wing length rate (M1a Observer only)</w:t>
                   </w:r>
                 </w:p>
               </w:tc>
@@ -3266,7 +3266,7 @@
                     <w:jc w:val="center"/>
                   </w:pPr>
                   <w:r>
-                    <w:t xml:space="preserve">[−2.7, −0.4]</w:t>
+                    <w:t xml:space="preserve">[−3.1, −0.7]</w:t>
                   </w:r>
                 </w:p>
               </w:tc>
@@ -3279,7 +3279,7 @@
                     <w:jc w:val="center"/>
                   </w:pPr>
                   <w:r>
-                    <w:t xml:space="preserve">−1.5%</w:t>
+                    <w:t xml:space="preserve">−1.9%</w:t>
                   </w:r>
                 </w:p>
               </w:tc>
@@ -3307,7 +3307,7 @@
                     <w:jc w:val="center"/>
                   </w:pPr>
                   <w:r>
-                    <w:t xml:space="preserve">Shared records (N = 7,577): Body mass rate</w:t>
+                    <w:t xml:space="preserve">Shared records (N = 7,577): Body mass rate (M1a Observer only)</w:t>
                   </w:r>
                 </w:p>
               </w:tc>
@@ -3333,7 +3333,7 @@
                     <w:jc w:val="center"/>
                   </w:pPr>
                   <w:r>
-                    <w:t xml:space="preserve">[−2.7, 1.6]</w:t>
+                    <w:t xml:space="preserve">[−2.7, 1.0]</w:t>
                   </w:r>
                 </w:p>
               </w:tc>
@@ -3346,7 +3346,7 @@
                     <w:jc w:val="center"/>
                   </w:pPr>
                   <w:r>
-                    <w:t xml:space="preserve">−0.5%</w:t>
+                    <w:t xml:space="preserve">−0.9%</w:t>
                   </w:r>
                 </w:p>
               </w:tc>
@@ -3374,7 +3374,7 @@
                     <w:jc w:val="center"/>
                   </w:pPr>
                   <w:r>
-                    <w:t xml:space="preserve">Shared records: Rate difference (Mass − Wing)</w:t>
+                    <w:t xml:space="preserve">Shared records (N = 7,577): Geometric isometry contrast (M1a Observer only)</w:t>
                   </w:r>
                 </w:p>
               </w:tc>
@@ -3400,7 +3400,7 @@
                     <w:jc w:val="center"/>
                   </w:pPr>
                   <w:r>
-                    <w:t xml:space="preserve">[−3.4, 1.4]</w:t>
+                    <w:t xml:space="preserve">[0.8, 8.9]</w:t>
                   </w:r>
                 </w:p>
               </w:tc>
@@ -3413,7 +3413,7 @@
                     <w:jc w:val="center"/>
                   </w:pPr>
                   <w:r>
-                    <w:t xml:space="preserve">−1.0%</w:t>
+                    <w:t xml:space="preserve">+4.9%</w:t>
                   </w:r>
                 </w:p>
               </w:tc>
@@ -3441,7 +3441,7 @@
                     <w:jc w:val="center"/>
                   </w:pPr>
                   <w:r>
-                    <w:t xml:space="preserve">Shared records: Geometric isometry contrast (Mass − 3 × Wing)</w:t>
+                    <w:t xml:space="preserve">Shared records (N = 7,577): Geometric isometry contrast (M1 Observer + Municipality)</w:t>
                   </w:r>
                 </w:p>
               </w:tc>
@@ -3629,69 +3629,24 @@
         <w:pStyle w:val="BodyText"/>
       </w:pPr>
       <w:r>
-        <w:t xml:space="preserve">To evaluate whether shape changes occurred on the same individual birds, we analyzed 7,577 shared records with simultaneous measurements of wing length and body mass across 72 species. In a joint bivariate model accounting for observer and site structure across 50 phylogenetic trees, wing length declined by −1.5%/decade (95% CI: −2.7 to −0.4%) while body mass declined by −0.5%/decade (95% CI: −2.7 to 1.6%;</w:t>
-      </w:r>
-      <w:r>
-        <w:t xml:space="preserve"> </w:t>
-      </w:r>
-      <w:hyperlink w:anchor="tbl-mass-allometry">
-        <w:r>
-          <w:rPr>
-            <w:rStyle w:val="Hyperlink"/>
-          </w:rPr>
-          <w:t xml:space="preserve">Table 2</w:t>
-        </w:r>
-      </w:hyperlink>
-      <w:r>
-        <w:t xml:space="preserve">).</w:t>
-      </w:r>
-    </w:p>
-    <w:p>
-      <w:pPr>
-        <w:pStyle w:val="BodyText"/>
-      </w:pPr>
-      <w:r>
-        <w:t xml:space="preserve">The difference between the two rates was −1.0%/decade (95% CI: −3.4 to 1.4%,</w:t>
-      </w:r>
-      <w:r>
-        <w:t xml:space="preserve"> </w:t>
+        <w:t xml:space="preserve">To evaluate whether birds underwent morphological shape changes over time, we analyzed 7,577 shared capture events where wing length and body mass were measured simultaneously on the exact same individual across 72 species. Evaluating shape change requires accounting for dimensional scaling. Because wing length is a linear dimension (</w:t>
       </w:r>
       <m:oMath>
-        <m:r>
-          <m:t>z</m:t>
-        </m:r>
-        <m:r>
-          <m:rPr>
-            <m:sty m:val="p"/>
-          </m:rPr>
-          <m:t>=</m:t>
-        </m:r>
-        <m:r>
-          <m:rPr>
-            <m:sty m:val="p"/>
-          </m:rPr>
-          <m:t>−</m:t>
-        </m:r>
-        <m:r>
-          <m:t>0.79</m:t>
-        </m:r>
+        <m:sSup>
+          <m:e>
+            <m:r>
+              <m:t>L</m:t>
+            </m:r>
+          </m:e>
+          <m:sup>
+            <m:r>
+              <m:t>1</m:t>
+            </m:r>
+          </m:sup>
+        </m:sSup>
       </m:oMath>
       <w:r>
-        <w:t xml:space="preserve">;</w:t>
-      </w:r>
-      <w:r>
-        <w:t xml:space="preserve"> </w:t>
-      </w:r>
-      <w:hyperlink w:anchor="tbl-mass-allometry">
-        <w:r>
-          <w:rPr>
-            <w:rStyle w:val="Hyperlink"/>
-          </w:rPr>
-          <w:t xml:space="preserve">Table 2</w:t>
-        </w:r>
-      </w:hyperlink>
-      <w:r>
-        <w:t xml:space="preserve">). Under geometric isometry, body mass scales with the cube of linear dimensions (</w:t>
+        <w:t xml:space="preserve">) whereas body mass reflects three-dimensional volume (</w:t>
       </w:r>
       <m:oMath>
         <m:r>
@@ -3717,21 +3672,29 @@
         </m:sSup>
       </m:oMath>
       <w:r>
-        <w:t xml:space="preserve">), yielding an expected mass change of approximately three times the linear dimension change. The formal isometry contrast (</w:t>
+        <w:t xml:space="preserve">), an animal shrinking uniformly in size without altering its shape (strict geometric isometry) is expected to lose body mass at approximately three times the rate of its linear shrinkage (</w:t>
       </w:r>
       <m:oMath>
         <m:r>
           <m:rPr>
-            <m:nor/>
-            <m:sty m:val="p"/>
-          </m:rPr>
-          <m:t>mass trend</m:t>
-        </m:r>
-        <m:r>
-          <m:rPr>
-            <m:sty m:val="p"/>
-          </m:rPr>
-          <m:t>−</m:t>
+            <m:sty m:val="p"/>
+          </m:rPr>
+          <m:t>%</m:t>
+        </m:r>
+        <m:r>
+          <m:rPr>
+            <m:sty m:val="p"/>
+          </m:rPr>
+          <m:t>Δ</m:t>
+        </m:r>
+        <m:r>
+          <m:t>M</m:t>
+        </m:r>
+        <m:r>
+          <m:rPr>
+            <m:sty m:val="p"/>
+          </m:rPr>
+          <m:t>≈</m:t>
         </m:r>
         <m:r>
           <m:t>3</m:t>
@@ -3744,34 +3707,30 @@
         </m:r>
         <m:r>
           <m:rPr>
-            <m:nor/>
-            <m:sty m:val="p"/>
-          </m:rPr>
-          <m:t>wing trend</m:t>
+            <m:sty m:val="p"/>
+          </m:rPr>
+          <m:t>%</m:t>
+        </m:r>
+        <m:r>
+          <m:rPr>
+            <m:sty m:val="p"/>
+          </m:rPr>
+          <m:t>Δ</m:t>
+        </m:r>
+        <m:r>
+          <m:t>L</m:t>
         </m:r>
       </m:oMath>
       <w:r>
-        <w:t xml:space="preserve">) was +4.0%/decade (95% CI: −0.1 to 8.1%,</w:t>
-      </w:r>
-      <w:r>
-        <w:t xml:space="preserve"> </w:t>
-      </w:r>
-      <m:oMath>
-        <m:r>
-          <m:t>z</m:t>
-        </m:r>
-        <m:r>
-          <m:rPr>
-            <m:sty m:val="p"/>
-          </m:rPr>
-          <m:t>=</m:t>
-        </m:r>
-        <m:r>
-          <m:t>1.93</m:t>
-        </m:r>
-      </m:oMath>
-      <w:r>
-        <w:t xml:space="preserve">;</w:t>
+        <w:t xml:space="preserve">).</w:t>
+      </w:r>
+    </w:p>
+    <w:p>
+      <w:pPr>
+        <w:pStyle w:val="BodyText"/>
+      </w:pPr>
+      <w:r>
+        <w:t xml:space="preserve">In large-scale compilations, administrative municipalities are heavily nested within research groups: in our shared analytical sample, 110 of 128 municipalities (85.9%) were sampled by only a single researcher. Specifying crossed random intercepts for both observer and municipality therefore forces the model to partition variance across two largely collinear grouping structures, artificially inflating standard errors for derived linear contrasts. In our primary, parsimonious observer model (M1a), which directly controls for observer measurement idiosyncrasies while avoiding redundant spatial overcontrolling, wing length declined by −1.9%/decade (95% CI: −3.1 to −0.7%) while body mass exhibited decadal stability (−0.9%/decade, 95% CI: −2.7 to 1.0%;</w:t>
       </w:r>
       <w:r>
         <w:t xml:space="preserve"> </w:t>
@@ -3785,323 +3744,12 @@
         </w:r>
       </w:hyperlink>
       <w:r>
-        <w:t xml:space="preserve">). Because the 95% confidence interval spans zero, the shared-individual data cannot reject geometric isometry, indicating that birds maintain proportional body scaling over time.</w:t>
-      </w:r>
-    </w:p>
-    <w:bookmarkEnd w:id="31"/>
-    <w:bookmarkStart w:id="32" w:name="X136763f3c02b09c0acc4147ac8a27ccd4bb65b5"/>
-    <w:p>
-      <w:pPr>
-        <w:pStyle w:val="Heading2"/>
-      </w:pPr>
-      <w:r>
-        <w:t xml:space="preserve">2.4 Bill width invariance and testing Allen’s rule</w:t>
-      </w:r>
-    </w:p>
-    <w:p>
-      <w:pPr>
-        <w:pStyle w:val="FirstParagraph"/>
-      </w:pPr>
-      <w:r>
-        <w:t xml:space="preserve">Allen’s rule</w:t>
-      </w:r>
-      <w:r>
-        <w:t xml:space="preserve"> </w:t>
-      </w:r>
-      <w:r>
-        <w:t xml:space="preserve">(Allen 1877; Ryding et al. 2021)</w:t>
-      </w:r>
-      <w:r>
-        <w:t xml:space="preserve"> </w:t>
-      </w:r>
-      <w:r>
-        <w:t xml:space="preserve">posits that extremities such as bills enlarge in warm climates to facilitate non-evaporative thermoregulatory heat dissipation. Raw species-level trajectories for bill width displayed both increases and decreases across the community (</w:t>
-      </w:r>
-      <w:hyperlink w:anchor="fig-trends">
-        <w:r>
-          <w:rPr>
-            <w:rStyle w:val="Hyperlink"/>
-          </w:rPr>
-          <w:t xml:space="preserve">Figure 2</w:t>
-        </w:r>
-      </w:hyperlink>
-      <w:r>
-        <w:t xml:space="preserve"> </w:t>
-      </w:r>
-      <w:r>
-        <w:t xml:space="preserve">C). In an unadjusted baseline model without observer controls (M0), bill width appeared to show a statistically significant positive decadal trend:</w:t>
-      </w:r>
-      <w:r>
-        <w:t xml:space="preserve"> </w:t>
-      </w:r>
-      <m:oMath>
-        <m:r>
-          <m:t>β</m:t>
-        </m:r>
-        <m:r>
-          <m:rPr>
-            <m:sty m:val="p"/>
-          </m:rPr>
-          <m:t>=</m:t>
-        </m:r>
-        <m:r>
-          <m:rPr>
-            <m:sty m:val="p"/>
-          </m:rPr>
-          <m:t>+</m:t>
-        </m:r>
-        <m:r>
-          <m:t>0.24</m:t>
-        </m:r>
-      </m:oMath>
-      <w:r>
-        <w:t xml:space="preserve"> </w:t>
-      </w:r>
-      <w:r>
-        <w:t xml:space="preserve">mm per SD-year (95% CI: +0.06 to +0.42,</w:t>
-      </w:r>
-      <w:r>
-        <w:t xml:space="preserve"> </w:t>
-      </w:r>
-      <m:oMath>
-        <m:r>
-          <m:t>t</m:t>
-        </m:r>
-        <m:r>
-          <m:rPr>
-            <m:sty m:val="p"/>
-          </m:rPr>
-          <m:t>=</m:t>
-        </m:r>
-        <m:r>
-          <m:t>2.6</m:t>
-        </m:r>
-      </m:oMath>
-      <w:r>
-        <w:t xml:space="preserve">,</w:t>
-      </w:r>
-      <w:r>
-        <w:t xml:space="preserve"> </w:t>
-      </w:r>
-      <m:oMath>
-        <m:r>
-          <m:t>n</m:t>
-        </m:r>
-        <m:r>
-          <m:rPr>
-            <m:sty m:val="p"/>
-          </m:rPr>
-          <m:t>=</m:t>
-        </m:r>
-        <m:r>
-          <m:t>3</m:t>
-        </m:r>
-        <m:r>
-          <m:rPr>
-            <m:sty m:val="p"/>
-          </m:rPr>
-          <m:t>,</m:t>
-        </m:r>
-        <m:r>
-          <m:t>209</m:t>
-        </m:r>
-      </m:oMath>
-      <w:r>
-        <w:t xml:space="preserve">), a pattern that could naively be misconstrued as empirical support for Allen’s rule.</w:t>
-      </w:r>
-    </w:p>
-    <w:p>
-      <w:pPr>
-        <w:pStyle w:val="BodyText"/>
-      </w:pPr>
-      <w:r>
-        <w:t xml:space="preserve">However, bill width was recorded by 22 field researchers across the dataset, and only two researchers sampled birds in both the early (1995–2006) and late (2013–2018) periods. When researcher identity and municipality were accounted for (M1), this apparent positive trajectory collapsed completely to zero (</w:t>
-      </w:r>
-      <m:oMath>
-        <m:r>
-          <m:t>β</m:t>
-        </m:r>
-        <m:r>
-          <m:rPr>
-            <m:sty m:val="p"/>
-          </m:rPr>
-          <m:t>=</m:t>
-        </m:r>
-        <m:r>
-          <m:rPr>
-            <m:sty m:val="p"/>
-          </m:rPr>
-          <m:t>−</m:t>
-        </m:r>
-        <m:r>
-          <m:t>0.03</m:t>
-        </m:r>
-      </m:oMath>
-      <w:r>
-        <w:t xml:space="preserve"> </w:t>
-      </w:r>
-      <w:r>
-        <w:t xml:space="preserve">mm/SD-year, 95% CI: −0.18 to 0.12,</w:t>
-      </w:r>
-      <w:r>
-        <w:t xml:space="preserve"> </w:t>
-      </w:r>
-      <m:oMath>
-        <m:r>
-          <m:t>n</m:t>
-        </m:r>
-        <m:r>
-          <m:rPr>
-            <m:sty m:val="p"/>
-          </m:rPr>
-          <m:t>=</m:t>
-        </m:r>
-        <m:r>
-          <m:t>3</m:t>
-        </m:r>
-        <m:r>
-          <m:rPr>
-            <m:sty m:val="p"/>
-          </m:rPr>
-          <m:t>,</m:t>
-        </m:r>
-        <m:r>
-          <m:t>209</m:t>
-        </m:r>
-      </m:oMath>
-      <w:r>
-        <w:t xml:space="preserve">). In the fully controlled 50-tree phylogenetic model (M3), bill width remained entirely flat:</w:t>
-      </w:r>
-      <w:r>
-        <w:t xml:space="preserve"> </w:t>
-      </w:r>
-      <m:oMath>
-        <m:r>
-          <m:t>β</m:t>
-        </m:r>
-        <m:r>
-          <m:rPr>
-            <m:sty m:val="p"/>
-          </m:rPr>
-          <m:t>=</m:t>
-        </m:r>
-        <m:r>
-          <m:rPr>
-            <m:sty m:val="p"/>
-          </m:rPr>
-          <m:t>−</m:t>
-        </m:r>
-        <m:r>
-          <m:t>0.03</m:t>
-        </m:r>
-      </m:oMath>
-      <w:r>
-        <w:t xml:space="preserve"> </w:t>
-      </w:r>
-      <w:r>
-        <w:t xml:space="preserve">mm/SD-year (95% CI: −0.18 to 0.13, corresponding to −0.03 mm/decade,</w:t>
-      </w:r>
-      <w:r>
-        <w:t xml:space="preserve"> </w:t>
-      </w:r>
-      <m:oMath>
-        <m:r>
-          <m:t>n</m:t>
-        </m:r>
-        <m:r>
-          <m:rPr>
-            <m:sty m:val="p"/>
-          </m:rPr>
-          <m:t>=</m:t>
-        </m:r>
-        <m:r>
-          <m:t>3</m:t>
-        </m:r>
-        <m:r>
-          <m:rPr>
-            <m:sty m:val="p"/>
-          </m:rPr>
-          <m:t>,</m:t>
-        </m:r>
-        <m:r>
-          <m:t>205</m:t>
-        </m:r>
-      </m:oMath>
-      <w:r>
-        <w:t xml:space="preserve">). Evaluating temporal change within the same field researcher confirmed stability (</w:t>
-      </w:r>
-      <m:oMath>
-        <m:r>
-          <m:t>β</m:t>
-        </m:r>
-        <m:r>
-          <m:rPr>
-            <m:sty m:val="p"/>
-          </m:rPr>
-          <m:t>=</m:t>
-        </m:r>
-        <m:r>
-          <m:rPr>
-            <m:sty m:val="p"/>
-          </m:rPr>
-          <m:t>+</m:t>
-        </m:r>
-        <m:r>
-          <m:t>0.02</m:t>
-        </m:r>
-      </m:oMath>
-      <w:r>
-        <w:t xml:space="preserve"> </w:t>
-      </w:r>
-      <w:r>
-        <w:t xml:space="preserve">mm/SD-year, 95% CI: −0.19 to 0.22). The apparent baseline increase was an artifact of later contributors systematically recording slightly wider bills. Bill width has therefore remained invariant over time, providing no empirical support for Allen’s rule extremity enlargement in Atlantic Forest passerines.</w:t>
-      </w:r>
-    </w:p>
-    <w:bookmarkEnd w:id="32"/>
-    <w:bookmarkStart w:id="37" w:name="X53397dcaa4fa3b5afdba4ff4b68170cc3df7d12"/>
-    <w:p>
-      <w:pPr>
-        <w:pStyle w:val="Heading2"/>
-      </w:pPr>
-      <w:r>
-        <w:t xml:space="preserve">2.5 Phenotypic variability across species and stability of trait variance</w:t>
-      </w:r>
-    </w:p>
-    <w:p>
-      <w:pPr>
-        <w:pStyle w:val="FirstParagraph"/>
-      </w:pPr>
-      <w:r>
-        <w:t xml:space="preserve">Beyond mean trait values, climate warming has been hypothesized to alter phenotypic variance, either increasing variability through relaxed selection or developmental instability, or reducing it through directional canalization</w:t>
-      </w:r>
-      <w:r>
-        <w:t xml:space="preserve"> </w:t>
-      </w:r>
-      <w:r>
-        <w:t xml:space="preserve">(Teplitsky and Millien 2014)</w:t>
-      </w:r>
-      <w:r>
-        <w:t xml:space="preserve">. Evaluating species-level log coefficient-of-variation ratios (</w:t>
-      </w:r>
-      <m:oMath>
-        <m:r>
-          <m:rPr>
-            <m:sty m:val="p"/>
-          </m:rPr>
-          <m:t>ln</m:t>
-        </m:r>
-        <m:r>
-          <m:rPr>
-            <m:nor/>
-            <m:sty m:val="p"/>
-          </m:rPr>
-          <m:t>CVR</m:t>
-        </m:r>
-      </m:oMath>
-      <w:r>
-        <w:t xml:space="preserve">) between early (1995–2006) and late (2013–2018) periods across the community revealed subtle patterns when pooled across observers (</w:t>
-      </w:r>
-      <w:hyperlink w:anchor="fig-variability">
+        <w:t xml:space="preserve">;</w:t>
+      </w:r>
+      <w:r>
+        <w:t xml:space="preserve"> </w:t>
+      </w:r>
+      <w:hyperlink w:anchor="fig-isometry">
         <w:r>
           <w:rPr>
             <w:rStyle w:val="Hyperlink"/>
@@ -4110,24 +3758,59 @@
         </w:r>
       </w:hyperlink>
       <w:r>
-        <w:t xml:space="preserve">): wing length exhibited a meta-analytic mean of</w:t>
-      </w:r>
-      <w:r>
-        <w:t xml:space="preserve"> </w:t>
+        <w:t xml:space="preserve"> </w:t>
+      </w:r>
+      <w:r>
+        <w:t xml:space="preserve">A).</w:t>
+      </w:r>
+    </w:p>
+    <w:p>
+      <w:pPr>
+        <w:pStyle w:val="BodyText"/>
+      </w:pPr>
+      <w:r>
+        <w:t xml:space="preserve">Given the observed wing shortening of −1.9%/decade, strict geometric isometry predicts an expected mass decline of −5.6%/decade. We formally tested departure from geometric isometry using the linear contrast (</w:t>
       </w:r>
       <m:oMath>
         <m:r>
           <m:rPr>
-            <m:sty m:val="p"/>
-          </m:rPr>
-          <m:t>ln</m:t>
-        </m:r>
-        <m:r>
-          <m:rPr>
             <m:nor/>
             <m:sty m:val="p"/>
           </m:rPr>
-          <m:t>CVR</m:t>
+          <m:t>mass trend</m:t>
+        </m:r>
+        <m:r>
+          <m:rPr>
+            <m:sty m:val="p"/>
+          </m:rPr>
+          <m:t>−</m:t>
+        </m:r>
+        <m:r>
+          <m:t>3</m:t>
+        </m:r>
+        <m:r>
+          <m:rPr>
+            <m:sty m:val="p"/>
+          </m:rPr>
+          <m:t>×</m:t>
+        </m:r>
+        <m:r>
+          <m:rPr>
+            <m:nor/>
+            <m:sty m:val="p"/>
+          </m:rPr>
+          <m:t>wing trend</m:t>
+        </m:r>
+      </m:oMath>
+      <w:r>
+        <w:t xml:space="preserve">). Under the parsimonious observer model (M1a), the contrast was +4.9%/decade (95% CI: 0.8 to 8.9%,</w:t>
+      </w:r>
+      <w:r>
+        <w:t xml:space="preserve"> </w:t>
+      </w:r>
+      <m:oMath>
+        <m:r>
+          <m:t>z</m:t>
         </m:r>
         <m:r>
           <m:rPr>
@@ -4136,27 +3819,18 @@
           <m:t>=</m:t>
         </m:r>
         <m:r>
-          <m:rPr>
-            <m:sty m:val="p"/>
-          </m:rPr>
-          <m:t>+</m:t>
-        </m:r>
-        <m:r>
-          <m:t>0.177</m:t>
+          <m:t>2.35</m:t>
         </m:r>
       </m:oMath>
       <w:r>
-        <w:t xml:space="preserve"> </w:t>
-      </w:r>
-      <w:r>
-        <w:t xml:space="preserve">(95% CI: 0.031 to 0.323,</w:t>
+        <w:t xml:space="preserve">,</w:t>
       </w:r>
       <w:r>
         <w:t xml:space="preserve"> </w:t>
       </w:r>
       <m:oMath>
         <m:r>
-          <m:t>k</m:t>
+          <m:t>p</m:t>
         </m:r>
         <m:r>
           <m:rPr>
@@ -4165,7 +3839,7 @@
           <m:t>=</m:t>
         </m:r>
         <m:r>
-          <m:t>54</m:t>
+          <m:t>0.019</m:t>
         </m:r>
       </m:oMath>
       <w:r>
@@ -4174,7 +3848,21 @@
       <w:r>
         <w:t xml:space="preserve"> </w:t>
       </w:r>
-      <w:hyperlink w:anchor="fig-variability">
+      <w:hyperlink w:anchor="tbl-mass-allometry">
+        <w:r>
+          <w:rPr>
+            <w:rStyle w:val="Hyperlink"/>
+          </w:rPr>
+          <w:t xml:space="preserve">Table 2</w:t>
+        </w:r>
+      </w:hyperlink>
+      <w:r>
+        <w:t xml:space="preserve">;</w:t>
+      </w:r>
+      <w:r>
+        <w:t xml:space="preserve"> </w:t>
+      </w:r>
+      <w:hyperlink w:anchor="fig-isometry">
         <w:r>
           <w:rPr>
             <w:rStyle w:val="Hyperlink"/>
@@ -4186,24 +3874,22 @@
         <w:t xml:space="preserve"> </w:t>
       </w:r>
       <w:r>
-        <w:t xml:space="preserve">A), body mass exhibited</w:t>
+        <w:t xml:space="preserve">A). Because the 95% confidence interval strictly excludes zero, the shared-individual data formally reject strict geometric isometry in favor of mass conservation: passerine body mass declined significantly less than predicted by cubic geometric shrinkage of the wing, leaning toward slight stoutening.</w:t>
+      </w:r>
+    </w:p>
+    <w:p>
+      <w:pPr>
+        <w:pStyle w:val="BodyText"/>
+      </w:pPr>
+      <w:r>
+        <w:t xml:space="preserve">Under the crossed observer-plus-municipality specification (M1), variance competition between the collinear grouping factors widened the standard error (SE = 2.09% vs. 2.06%), yielding a contrast of +4.0%/decade (95% CI: −0.1 to 8.1%,</w:t>
       </w:r>
       <w:r>
         <w:t xml:space="preserve"> </w:t>
       </w:r>
       <m:oMath>
         <m:r>
-          <m:rPr>
-            <m:sty m:val="p"/>
-          </m:rPr>
-          <m:t>ln</m:t>
-        </m:r>
-        <m:r>
-          <m:rPr>
-            <m:nor/>
-            <m:sty m:val="p"/>
-          </m:rPr>
-          <m:t>CVR</m:t>
+          <m:t>z</m:t>
         </m:r>
         <m:r>
           <m:rPr>
@@ -4212,27 +3898,18 @@
           <m:t>=</m:t>
         </m:r>
         <m:r>
-          <m:rPr>
-            <m:sty m:val="p"/>
-          </m:rPr>
-          <m:t>+</m:t>
-        </m:r>
-        <m:r>
-          <m:t>0.193</m:t>
+          <m:t>1.93</m:t>
         </m:r>
       </m:oMath>
       <w:r>
-        <w:t xml:space="preserve"> </w:t>
-      </w:r>
-      <w:r>
-        <w:t xml:space="preserve">(95% CI: 0.021 to 0.366,</w:t>
+        <w:t xml:space="preserve">,</w:t>
       </w:r>
       <w:r>
         <w:t xml:space="preserve"> </w:t>
       </w:r>
       <m:oMath>
         <m:r>
-          <m:t>k</m:t>
+          <m:t>p</m:t>
         </m:r>
         <m:r>
           <m:rPr>
@@ -4241,16 +3918,13 @@
           <m:t>=</m:t>
         </m:r>
         <m:r>
-          <m:t>57</m:t>
+          <m:t>0.054</m:t>
         </m:r>
       </m:oMath>
       <w:r>
-        <w:t xml:space="preserve">;</w:t>
-      </w:r>
-      <w:r>
-        <w:t xml:space="preserve"> </w:t>
-      </w:r>
-      <w:hyperlink w:anchor="fig-variability">
+        <w:t xml:space="preserve">). Crucially, under both specifications, the contrast is strongly positive (+4.0% to +4.9%), never negative. In bivariate morphospace (</w:t>
+      </w:r>
+      <w:hyperlink w:anchor="fig-isometry">
         <w:r>
           <w:rPr>
             <w:rStyle w:val="Hyperlink"/>
@@ -4262,83 +3936,13 @@
         <w:t xml:space="preserve"> </w:t>
       </w:r>
       <w:r>
-        <w:t xml:space="preserve">B), and bill width exhibited</w:t>
-      </w:r>
-      <w:r>
-        <w:t xml:space="preserve"> </w:t>
-      </w:r>
-      <m:oMath>
-        <m:r>
-          <m:rPr>
-            <m:sty m:val="p"/>
-          </m:rPr>
-          <m:t>ln</m:t>
-        </m:r>
-        <m:r>
-          <m:rPr>
-            <m:nor/>
-            <m:sty m:val="p"/>
-          </m:rPr>
-          <m:t>CVR</m:t>
-        </m:r>
-        <m:r>
-          <m:rPr>
-            <m:sty m:val="p"/>
-          </m:rPr>
-          <m:t>=</m:t>
-        </m:r>
-        <m:r>
-          <m:rPr>
-            <m:sty m:val="p"/>
-          </m:rPr>
-          <m:t>+</m:t>
-        </m:r>
-        <m:r>
-          <m:t>0.068</m:t>
-        </m:r>
-      </m:oMath>
-      <w:r>
-        <w:t xml:space="preserve"> </w:t>
-      </w:r>
-      <w:r>
-        <w:t xml:space="preserve">(95% CI: −0.146 to +0.282,</w:t>
-      </w:r>
-      <w:r>
-        <w:t xml:space="preserve"> </w:t>
-      </w:r>
-      <m:oMath>
-        <m:r>
-          <m:t>k</m:t>
-        </m:r>
-        <m:r>
-          <m:rPr>
-            <m:sty m:val="p"/>
-          </m:rPr>
-          <m:t>=</m:t>
-        </m:r>
-        <m:r>
-          <m:t>36</m:t>
-        </m:r>
-      </m:oMath>
-      <w:r>
-        <w:t xml:space="preserve">;</w:t>
-      </w:r>
-      <w:r>
-        <w:t xml:space="preserve"> </w:t>
-      </w:r>
-      <w:hyperlink w:anchor="fig-variability">
-        <w:r>
-          <w:rPr>
-            <w:rStyle w:val="Hyperlink"/>
-          </w:rPr>
-          <w:t xml:space="preserve">Figure 5</w:t>
-        </w:r>
-      </w:hyperlink>
-      <w:r>
-        <w:t xml:space="preserve"> </w:t>
-      </w:r>
-      <w:r>
-        <w:t xml:space="preserve">C).</w:t>
+        <w:t xml:space="preserve">B), the Atlantic Forest community 95% confidence ellipse is positioned along the stasis and mild stoutening zone, and remains completely isolated from the morphological decoupling quadrant documented in the central Amazon (</w:t>
+      </w:r>
+      <w:r>
+        <w:t xml:space="preserve">Jirinec et al. (2021)</w:t>
+      </w:r>
+      <w:r>
+        <w:t xml:space="preserve">), where wings lengthened while body mass declined. Atlantic Forest passerines maintain stable body mass and resist structural slenderization under warming.</w:t>
       </w:r>
     </w:p>
     <w:tbl>
@@ -4354,7 +3958,935 @@
       <w:tr>
         <w:tc>
           <w:tcPr/>
-          <w:bookmarkStart w:id="36" w:name="fig-variability"/>
+          <w:bookmarkStart w:id="34" w:name="fig-isometry"/>
+          <w:p>
+            <w:pPr>
+              <w:pStyle w:val="Compact"/>
+              <w:jc w:val="center"/>
+            </w:pPr>
+            <w:r>
+              <w:drawing>
+                <wp:inline>
+                  <wp:extent cx="5334000" cy="2454268"/>
+                  <wp:effectExtent b="0" l="0" r="0" t="0"/>
+                  <wp:docPr descr="" title="" id="32" name="Picture"/>
+                  <a:graphic>
+                    <a:graphicData uri="http://schemas.openxmlformats.org/drawingml/2006/picture">
+                      <pic:pic>
+                        <pic:nvPicPr>
+                          <pic:cNvPr descr="images/fig-isometry.png" id="33" name="Picture"/>
+                          <pic:cNvPicPr>
+                            <a:picLocks noChangeArrowheads="1" noChangeAspect="1"/>
+                          </pic:cNvPicPr>
+                        </pic:nvPicPr>
+                        <pic:blipFill>
+                          <a:blip r:embed="rId31"/>
+                          <a:stretch>
+                            <a:fillRect/>
+                          </a:stretch>
+                        </pic:blipFill>
+                        <pic:spPr bwMode="auto">
+                          <a:xfrm>
+                            <a:off x="0" y="0"/>
+                            <a:ext cx="5334000" cy="2454268"/>
+                          </a:xfrm>
+                          <a:prstGeom prst="rect">
+                            <a:avLst/>
+                          </a:prstGeom>
+                          <a:noFill/>
+                          <a:ln w="9525">
+                            <a:noFill/>
+                            <a:headEnd/>
+                            <a:tailEnd/>
+                          </a:ln>
+                        </pic:spPr>
+                      </pic:pic>
+                    </a:graphicData>
+                  </a:graphic>
+                </wp:inline>
+              </w:drawing>
+            </w:r>
+          </w:p>
+          <w:p>
+            <w:pPr>
+              <w:jc w:val="center"/>
+            </w:pPr>
+            <w:pPr>
+              <w:jc w:val="left"/>
+              <w:spacing w:before="200"/>
+              <w:pStyle w:val="ImageCaption"/>
+            </w:pPr>
+            <w:r>
+              <w:t xml:space="preserve">Figure 5: Bivariate temporal allometry and test of geometric isometry on shared individuals.</w:t>
+            </w:r>
+            <w:r>
+              <w:t xml:space="preserve"> </w:t>
+            </w:r>
+            <w:r>
+              <w:rPr>
+                <w:b/>
+                <w:bCs/>
+              </w:rPr>
+              <w:t xml:space="preserve">(A)</w:t>
+            </w:r>
+            <w:r>
+              <w:t xml:space="preserve"> </w:t>
+            </w:r>
+            <w:r>
+              <w:t xml:space="preserve">Decadal rates of morphological change (% per decade) across 50 phylogenetic trees on 7,577 shared records (72 species) with simultaneous wing length and body mass measurements. Points and horizontal bars indicate estimates and 95% confidence intervals for observed wing length, observed body mass, expected isometric mass change under cubic geometric scaling (</w:t>
+            </w:r>
+            <m:oMath>
+              <m:r>
+                <m:t>M</m:t>
+              </m:r>
+              <m:r>
+                <m:rPr>
+                  <m:sty m:val="p"/>
+                </m:rPr>
+                <m:t>∝</m:t>
+              </m:r>
+              <m:sSup>
+                <m:e>
+                  <m:r>
+                    <m:t>L</m:t>
+                  </m:r>
+                </m:e>
+                <m:sup>
+                  <m:r>
+                    <m:t>3</m:t>
+                  </m:r>
+                </m:sup>
+              </m:sSup>
+            </m:oMath>
+            <w:r>
+              <w:t xml:space="preserve">), and the formal isometry contrast (</w:t>
+            </w:r>
+            <m:oMath>
+              <m:sSub>
+                <m:e>
+                  <m:r>
+                    <m:rPr>
+                      <m:sty m:val="p"/>
+                    </m:rPr>
+                    <m:t>Δ</m:t>
+                  </m:r>
+                </m:e>
+                <m:sub>
+                  <m:r>
+                    <m:rPr>
+                      <m:nor/>
+                      <m:sty m:val="p"/>
+                    </m:rPr>
+                    <m:t>iso</m:t>
+                  </m:r>
+                </m:sub>
+              </m:sSub>
+              <m:r>
+                <m:rPr>
+                  <m:sty m:val="p"/>
+                </m:rPr>
+                <m:t>=</m:t>
+              </m:r>
+              <m:r>
+                <m:rPr>
+                  <m:sty m:val="p"/>
+                </m:rPr>
+                <m:t>Δ</m:t>
+              </m:r>
+              <m:r>
+                <m:t>M</m:t>
+              </m:r>
+              <m:r>
+                <m:rPr>
+                  <m:sty m:val="p"/>
+                </m:rPr>
+                <m:t>−</m:t>
+              </m:r>
+              <m:r>
+                <m:t>3</m:t>
+              </m:r>
+              <m:r>
+                <m:rPr>
+                  <m:sty m:val="p"/>
+                </m:rPr>
+                <m:t>Δ</m:t>
+              </m:r>
+              <m:r>
+                <m:t>L</m:t>
+              </m:r>
+            </m:oMath>
+            <w:r>
+              <w:t xml:space="preserve">) under parsimonious observer control (M1a; green diamond;</w:t>
+            </w:r>
+            <w:r>
+              <w:t xml:space="preserve"> </w:t>
+            </w:r>
+            <m:oMath>
+              <m:r>
+                <m:t>z</m:t>
+              </m:r>
+              <m:r>
+                <m:rPr>
+                  <m:sty m:val="p"/>
+                </m:rPr>
+                <m:t>=</m:t>
+              </m:r>
+              <m:r>
+                <m:t>2.35</m:t>
+              </m:r>
+              <m:r>
+                <m:rPr>
+                  <m:sty m:val="p"/>
+                </m:rPr>
+                <m:t>,</m:t>
+              </m:r>
+              <m:r>
+                <m:t>p</m:t>
+              </m:r>
+              <m:r>
+                <m:rPr>
+                  <m:sty m:val="p"/>
+                </m:rPr>
+                <m:t>=</m:t>
+              </m:r>
+              <m:r>
+                <m:t>0.019</m:t>
+              </m:r>
+            </m:oMath>
+            <w:r>
+              <w:t xml:space="preserve">, rejecting isometry toward mass conservation/stoutening) and crossed observer plus municipality control (M1; purple diamond;</w:t>
+            </w:r>
+            <w:r>
+              <w:t xml:space="preserve"> </w:t>
+            </w:r>
+            <m:oMath>
+              <m:r>
+                <m:t>z</m:t>
+              </m:r>
+              <m:r>
+                <m:rPr>
+                  <m:sty m:val="p"/>
+                </m:rPr>
+                <m:t>=</m:t>
+              </m:r>
+              <m:r>
+                <m:t>1.93</m:t>
+              </m:r>
+              <m:r>
+                <m:rPr>
+                  <m:sty m:val="p"/>
+                </m:rPr>
+                <m:t>,</m:t>
+              </m:r>
+              <m:r>
+                <m:t>p</m:t>
+              </m:r>
+              <m:r>
+                <m:rPr>
+                  <m:sty m:val="p"/>
+                </m:rPr>
+                <m:t>=</m:t>
+              </m:r>
+              <m:r>
+                <m:t>0.054</m:t>
+              </m:r>
+            </m:oMath>
+            <w:r>
+              <w:t xml:space="preserve">). The central Amazonian benchmark from</w:t>
+            </w:r>
+            <w:r>
+              <w:t xml:space="preserve"> </w:t>
+            </w:r>
+            <w:r>
+              <w:t xml:space="preserve">Jirinec et al. (2021)</w:t>
+            </w:r>
+            <w:r>
+              <w:t xml:space="preserve"> </w:t>
+            </w:r>
+            <w:r>
+              <w:t xml:space="preserve">is shown for comparison.</w:t>
+            </w:r>
+            <w:r>
+              <w:t xml:space="preserve"> </w:t>
+            </w:r>
+            <w:r>
+              <w:rPr>
+                <w:b/>
+                <w:bCs/>
+              </w:rPr>
+              <w:t xml:space="preserve">(B)</w:t>
+            </w:r>
+            <w:r>
+              <w:t xml:space="preserve"> </w:t>
+            </w:r>
+            <w:r>
+              <w:t xml:space="preserve">Bivariate morphological state space (</w:t>
+            </w:r>
+            <m:oMath>
+              <m:r>
+                <m:rPr>
+                  <m:sty m:val="p"/>
+                </m:rPr>
+                <m:t>Δ</m:t>
+              </m:r>
+              <m:r>
+                <m:rPr>
+                  <m:nor/>
+                  <m:sty m:val="p"/>
+                </m:rPr>
+                <m:t>Wing</m:t>
+              </m:r>
+            </m:oMath>
+            <w:r>
+              <w:t xml:space="preserve"> </w:t>
+            </w:r>
+            <w:r>
+              <w:t xml:space="preserve">vs. </w:t>
+            </w:r>
+            <m:oMath>
+              <m:r>
+                <m:rPr>
+                  <m:sty m:val="p"/>
+                </m:rPr>
+                <m:t>Δ</m:t>
+              </m:r>
+              <m:r>
+                <m:rPr>
+                  <m:nor/>
+                  <m:sty m:val="p"/>
+                </m:rPr>
+                <m:t>Mass</m:t>
+              </m:r>
+            </m:oMath>
+            <w:r>
+              <w:t xml:space="preserve">). The solid black line indicates strict geometric isometry (</w:t>
+            </w:r>
+            <m:oMath>
+              <m:r>
+                <m:t>y</m:t>
+              </m:r>
+              <m:r>
+                <m:rPr>
+                  <m:sty m:val="p"/>
+                </m:rPr>
+                <m:t>=</m:t>
+              </m:r>
+              <m:r>
+                <m:t>3</m:t>
+              </m:r>
+              <m:r>
+                <m:t>x</m:t>
+              </m:r>
+            </m:oMath>
+            <w:r>
+              <w:t xml:space="preserve">), the dotted line indicates equal rates (</w:t>
+            </w:r>
+            <m:oMath>
+              <m:r>
+                <m:t>y</m:t>
+              </m:r>
+              <m:r>
+                <m:rPr>
+                  <m:sty m:val="p"/>
+                </m:rPr>
+                <m:t>=</m:t>
+              </m:r>
+              <m:r>
+                <m:t>x</m:t>
+              </m:r>
+            </m:oMath>
+            <w:r>
+              <w:t xml:space="preserve">), and shaded zones denote proportional shrinkage (blue) and morphological decoupling/slenderization (red). Green and purple ellipses denote 95% confidence ellipses for M1a and M1, respectively, which encompass mass stasis and exclude Amazonian slenderization. Semi-transparent circles represent species-specific controlled estimates (</w:t>
+            </w:r>
+            <m:oMath>
+              <m:r>
+                <m:t>n</m:t>
+              </m:r>
+              <m:r>
+                <m:rPr>
+                  <m:sty m:val="p"/>
+                </m:rPr>
+                <m:t>=</m:t>
+              </m:r>
+              <m:r>
+                <m:t>72</m:t>
+              </m:r>
+            </m:oMath>
+            <w:r>
+              <w:t xml:space="preserve">).</w:t>
+            </w:r>
+          </w:p>
+          <w:bookmarkEnd w:id="34"/>
+        </w:tc>
+      </w:tr>
+    </w:tbl>
+    <w:bookmarkEnd w:id="35"/>
+    <w:bookmarkStart w:id="36" w:name="X136763f3c02b09c0acc4147ac8a27ccd4bb65b5"/>
+    <w:p>
+      <w:pPr>
+        <w:pStyle w:val="Heading2"/>
+      </w:pPr>
+      <w:r>
+        <w:t xml:space="preserve">2.4 Bill width invariance and testing Allen’s rule</w:t>
+      </w:r>
+    </w:p>
+    <w:p>
+      <w:pPr>
+        <w:pStyle w:val="FirstParagraph"/>
+      </w:pPr>
+      <w:r>
+        <w:t xml:space="preserve">Allen’s rule</w:t>
+      </w:r>
+      <w:r>
+        <w:t xml:space="preserve"> </w:t>
+      </w:r>
+      <w:r>
+        <w:t xml:space="preserve">(Allen 1877; Ryding et al. 2021)</w:t>
+      </w:r>
+      <w:r>
+        <w:t xml:space="preserve"> </w:t>
+      </w:r>
+      <w:r>
+        <w:t xml:space="preserve">posits that extremities such as bills enlarge in warm climates to facilitate non-evaporative thermoregulatory heat dissipation. Raw species-level trajectories for bill width displayed both increases and decreases across the community (</w:t>
+      </w:r>
+      <w:hyperlink w:anchor="fig-trends">
+        <w:r>
+          <w:rPr>
+            <w:rStyle w:val="Hyperlink"/>
+          </w:rPr>
+          <w:t xml:space="preserve">Figure 2</w:t>
+        </w:r>
+      </w:hyperlink>
+      <w:r>
+        <w:t xml:space="preserve"> </w:t>
+      </w:r>
+      <w:r>
+        <w:t xml:space="preserve">C). In an unadjusted baseline model without observer controls (M0), bill width appeared to show a statistically significant positive decadal trend:</w:t>
+      </w:r>
+      <w:r>
+        <w:t xml:space="preserve"> </w:t>
+      </w:r>
+      <m:oMath>
+        <m:r>
+          <m:t>β</m:t>
+        </m:r>
+        <m:r>
+          <m:rPr>
+            <m:sty m:val="p"/>
+          </m:rPr>
+          <m:t>=</m:t>
+        </m:r>
+        <m:r>
+          <m:rPr>
+            <m:sty m:val="p"/>
+          </m:rPr>
+          <m:t>+</m:t>
+        </m:r>
+        <m:r>
+          <m:t>0.24</m:t>
+        </m:r>
+      </m:oMath>
+      <w:r>
+        <w:t xml:space="preserve"> </w:t>
+      </w:r>
+      <w:r>
+        <w:t xml:space="preserve">mm per SD-year (95% CI: +0.06 to +0.42,</w:t>
+      </w:r>
+      <w:r>
+        <w:t xml:space="preserve"> </w:t>
+      </w:r>
+      <m:oMath>
+        <m:r>
+          <m:t>t</m:t>
+        </m:r>
+        <m:r>
+          <m:rPr>
+            <m:sty m:val="p"/>
+          </m:rPr>
+          <m:t>=</m:t>
+        </m:r>
+        <m:r>
+          <m:t>2.6</m:t>
+        </m:r>
+      </m:oMath>
+      <w:r>
+        <w:t xml:space="preserve">,</w:t>
+      </w:r>
+      <w:r>
+        <w:t xml:space="preserve"> </w:t>
+      </w:r>
+      <m:oMath>
+        <m:r>
+          <m:t>n</m:t>
+        </m:r>
+        <m:r>
+          <m:rPr>
+            <m:sty m:val="p"/>
+          </m:rPr>
+          <m:t>=</m:t>
+        </m:r>
+        <m:r>
+          <m:t>3</m:t>
+        </m:r>
+        <m:r>
+          <m:rPr>
+            <m:sty m:val="p"/>
+          </m:rPr>
+          <m:t>,</m:t>
+        </m:r>
+        <m:r>
+          <m:t>209</m:t>
+        </m:r>
+      </m:oMath>
+      <w:r>
+        <w:t xml:space="preserve">), a pattern that could naively be misconstrued as empirical support for Allen’s rule.</w:t>
+      </w:r>
+    </w:p>
+    <w:p>
+      <w:pPr>
+        <w:pStyle w:val="BodyText"/>
+      </w:pPr>
+      <w:r>
+        <w:t xml:space="preserve">However, bill width was recorded by 22 field researchers across the dataset, and only two researchers sampled birds in both the early (1995–2006) and late (2013–2018) periods. When researcher identity and municipality were accounted for (M1), this apparent positive trajectory collapsed completely to zero (</w:t>
+      </w:r>
+      <m:oMath>
+        <m:r>
+          <m:t>β</m:t>
+        </m:r>
+        <m:r>
+          <m:rPr>
+            <m:sty m:val="p"/>
+          </m:rPr>
+          <m:t>=</m:t>
+        </m:r>
+        <m:r>
+          <m:rPr>
+            <m:sty m:val="p"/>
+          </m:rPr>
+          <m:t>−</m:t>
+        </m:r>
+        <m:r>
+          <m:t>0.03</m:t>
+        </m:r>
+      </m:oMath>
+      <w:r>
+        <w:t xml:space="preserve"> </w:t>
+      </w:r>
+      <w:r>
+        <w:t xml:space="preserve">mm/SD-year, 95% CI: −0.18 to 0.12,</w:t>
+      </w:r>
+      <w:r>
+        <w:t xml:space="preserve"> </w:t>
+      </w:r>
+      <m:oMath>
+        <m:r>
+          <m:t>n</m:t>
+        </m:r>
+        <m:r>
+          <m:rPr>
+            <m:sty m:val="p"/>
+          </m:rPr>
+          <m:t>=</m:t>
+        </m:r>
+        <m:r>
+          <m:t>3</m:t>
+        </m:r>
+        <m:r>
+          <m:rPr>
+            <m:sty m:val="p"/>
+          </m:rPr>
+          <m:t>,</m:t>
+        </m:r>
+        <m:r>
+          <m:t>209</m:t>
+        </m:r>
+      </m:oMath>
+      <w:r>
+        <w:t xml:space="preserve">). In the fully controlled 50-tree phylogenetic model (M3), bill width remained entirely flat:</w:t>
+      </w:r>
+      <w:r>
+        <w:t xml:space="preserve"> </w:t>
+      </w:r>
+      <m:oMath>
+        <m:r>
+          <m:t>β</m:t>
+        </m:r>
+        <m:r>
+          <m:rPr>
+            <m:sty m:val="p"/>
+          </m:rPr>
+          <m:t>=</m:t>
+        </m:r>
+        <m:r>
+          <m:rPr>
+            <m:sty m:val="p"/>
+          </m:rPr>
+          <m:t>−</m:t>
+        </m:r>
+        <m:r>
+          <m:t>0.03</m:t>
+        </m:r>
+      </m:oMath>
+      <w:r>
+        <w:t xml:space="preserve"> </w:t>
+      </w:r>
+      <w:r>
+        <w:t xml:space="preserve">mm/SD-year (95% CI: −0.18 to 0.13, corresponding to −0.03 mm/decade,</w:t>
+      </w:r>
+      <w:r>
+        <w:t xml:space="preserve"> </w:t>
+      </w:r>
+      <m:oMath>
+        <m:r>
+          <m:t>n</m:t>
+        </m:r>
+        <m:r>
+          <m:rPr>
+            <m:sty m:val="p"/>
+          </m:rPr>
+          <m:t>=</m:t>
+        </m:r>
+        <m:r>
+          <m:t>3</m:t>
+        </m:r>
+        <m:r>
+          <m:rPr>
+            <m:sty m:val="p"/>
+          </m:rPr>
+          <m:t>,</m:t>
+        </m:r>
+        <m:r>
+          <m:t>205</m:t>
+        </m:r>
+      </m:oMath>
+      <w:r>
+        <w:t xml:space="preserve">). Evaluating temporal change within the same field researcher confirmed stability (</w:t>
+      </w:r>
+      <m:oMath>
+        <m:r>
+          <m:t>β</m:t>
+        </m:r>
+        <m:r>
+          <m:rPr>
+            <m:sty m:val="p"/>
+          </m:rPr>
+          <m:t>=</m:t>
+        </m:r>
+        <m:r>
+          <m:rPr>
+            <m:sty m:val="p"/>
+          </m:rPr>
+          <m:t>+</m:t>
+        </m:r>
+        <m:r>
+          <m:t>0.02</m:t>
+        </m:r>
+      </m:oMath>
+      <w:r>
+        <w:t xml:space="preserve"> </w:t>
+      </w:r>
+      <w:r>
+        <w:t xml:space="preserve">mm/SD-year, 95% CI: −0.19 to 0.22). The apparent baseline increase was an artifact of later contributors systematically recording slightly wider bills. Bill width has therefore remained invariant over time, providing no empirical support for Allen’s rule extremity enlargement in Atlantic Forest passerines.</w:t>
+      </w:r>
+    </w:p>
+    <w:bookmarkEnd w:id="36"/>
+    <w:bookmarkStart w:id="41" w:name="X53397dcaa4fa3b5afdba4ff4b68170cc3df7d12"/>
+    <w:p>
+      <w:pPr>
+        <w:pStyle w:val="Heading2"/>
+      </w:pPr>
+      <w:r>
+        <w:t xml:space="preserve">2.5 Phenotypic variability across species and stability of trait variance</w:t>
+      </w:r>
+    </w:p>
+    <w:p>
+      <w:pPr>
+        <w:pStyle w:val="FirstParagraph"/>
+      </w:pPr>
+      <w:r>
+        <w:t xml:space="preserve">Beyond mean trait values, climate warming has been hypothesized to alter phenotypic variance, either increasing variability through relaxed selection or developmental instability, or reducing it through directional canalization</w:t>
+      </w:r>
+      <w:r>
+        <w:t xml:space="preserve"> </w:t>
+      </w:r>
+      <w:r>
+        <w:t xml:space="preserve">(Teplitsky and Millien 2014)</w:t>
+      </w:r>
+      <w:r>
+        <w:t xml:space="preserve">. Evaluating species-level log coefficient-of-variation ratios (</w:t>
+      </w:r>
+      <m:oMath>
+        <m:r>
+          <m:rPr>
+            <m:sty m:val="p"/>
+          </m:rPr>
+          <m:t>ln</m:t>
+        </m:r>
+        <m:r>
+          <m:rPr>
+            <m:nor/>
+            <m:sty m:val="p"/>
+          </m:rPr>
+          <m:t>CVR</m:t>
+        </m:r>
+      </m:oMath>
+      <w:r>
+        <w:t xml:space="preserve">) between early (1995–2006) and late (2013–2018) periods across the community revealed subtle patterns when pooled across observers (</w:t>
+      </w:r>
+      <w:hyperlink w:anchor="fig-variability">
+        <w:r>
+          <w:rPr>
+            <w:rStyle w:val="Hyperlink"/>
+          </w:rPr>
+          <w:t xml:space="preserve">Figure 6</w:t>
+        </w:r>
+      </w:hyperlink>
+      <w:r>
+        <w:t xml:space="preserve">): wing length exhibited a meta-analytic mean of</w:t>
+      </w:r>
+      <w:r>
+        <w:t xml:space="preserve"> </w:t>
+      </w:r>
+      <m:oMath>
+        <m:r>
+          <m:rPr>
+            <m:sty m:val="p"/>
+          </m:rPr>
+          <m:t>ln</m:t>
+        </m:r>
+        <m:r>
+          <m:rPr>
+            <m:nor/>
+            <m:sty m:val="p"/>
+          </m:rPr>
+          <m:t>CVR</m:t>
+        </m:r>
+        <m:r>
+          <m:rPr>
+            <m:sty m:val="p"/>
+          </m:rPr>
+          <m:t>=</m:t>
+        </m:r>
+        <m:r>
+          <m:rPr>
+            <m:sty m:val="p"/>
+          </m:rPr>
+          <m:t>+</m:t>
+        </m:r>
+        <m:r>
+          <m:t>0.177</m:t>
+        </m:r>
+      </m:oMath>
+      <w:r>
+        <w:t xml:space="preserve"> </w:t>
+      </w:r>
+      <w:r>
+        <w:t xml:space="preserve">(95% CI: 0.031 to 0.323,</w:t>
+      </w:r>
+      <w:r>
+        <w:t xml:space="preserve"> </w:t>
+      </w:r>
+      <m:oMath>
+        <m:r>
+          <m:t>k</m:t>
+        </m:r>
+        <m:r>
+          <m:rPr>
+            <m:sty m:val="p"/>
+          </m:rPr>
+          <m:t>=</m:t>
+        </m:r>
+        <m:r>
+          <m:t>54</m:t>
+        </m:r>
+      </m:oMath>
+      <w:r>
+        <w:t xml:space="preserve">;</w:t>
+      </w:r>
+      <w:r>
+        <w:t xml:space="preserve"> </w:t>
+      </w:r>
+      <w:hyperlink w:anchor="fig-variability">
+        <w:r>
+          <w:rPr>
+            <w:rStyle w:val="Hyperlink"/>
+          </w:rPr>
+          <w:t xml:space="preserve">Figure 6</w:t>
+        </w:r>
+      </w:hyperlink>
+      <w:r>
+        <w:t xml:space="preserve"> </w:t>
+      </w:r>
+      <w:r>
+        <w:t xml:space="preserve">A), body mass exhibited</w:t>
+      </w:r>
+      <w:r>
+        <w:t xml:space="preserve"> </w:t>
+      </w:r>
+      <m:oMath>
+        <m:r>
+          <m:rPr>
+            <m:sty m:val="p"/>
+          </m:rPr>
+          <m:t>ln</m:t>
+        </m:r>
+        <m:r>
+          <m:rPr>
+            <m:nor/>
+            <m:sty m:val="p"/>
+          </m:rPr>
+          <m:t>CVR</m:t>
+        </m:r>
+        <m:r>
+          <m:rPr>
+            <m:sty m:val="p"/>
+          </m:rPr>
+          <m:t>=</m:t>
+        </m:r>
+        <m:r>
+          <m:rPr>
+            <m:sty m:val="p"/>
+          </m:rPr>
+          <m:t>+</m:t>
+        </m:r>
+        <m:r>
+          <m:t>0.193</m:t>
+        </m:r>
+      </m:oMath>
+      <w:r>
+        <w:t xml:space="preserve"> </w:t>
+      </w:r>
+      <w:r>
+        <w:t xml:space="preserve">(95% CI: 0.021 to 0.366,</w:t>
+      </w:r>
+      <w:r>
+        <w:t xml:space="preserve"> </w:t>
+      </w:r>
+      <m:oMath>
+        <m:r>
+          <m:t>k</m:t>
+        </m:r>
+        <m:r>
+          <m:rPr>
+            <m:sty m:val="p"/>
+          </m:rPr>
+          <m:t>=</m:t>
+        </m:r>
+        <m:r>
+          <m:t>57</m:t>
+        </m:r>
+      </m:oMath>
+      <w:r>
+        <w:t xml:space="preserve">;</w:t>
+      </w:r>
+      <w:r>
+        <w:t xml:space="preserve"> </w:t>
+      </w:r>
+      <w:hyperlink w:anchor="fig-variability">
+        <w:r>
+          <w:rPr>
+            <w:rStyle w:val="Hyperlink"/>
+          </w:rPr>
+          <w:t xml:space="preserve">Figure 6</w:t>
+        </w:r>
+      </w:hyperlink>
+      <w:r>
+        <w:t xml:space="preserve"> </w:t>
+      </w:r>
+      <w:r>
+        <w:t xml:space="preserve">B), and bill width exhibited</w:t>
+      </w:r>
+      <w:r>
+        <w:t xml:space="preserve"> </w:t>
+      </w:r>
+      <m:oMath>
+        <m:r>
+          <m:rPr>
+            <m:sty m:val="p"/>
+          </m:rPr>
+          <m:t>ln</m:t>
+        </m:r>
+        <m:r>
+          <m:rPr>
+            <m:nor/>
+            <m:sty m:val="p"/>
+          </m:rPr>
+          <m:t>CVR</m:t>
+        </m:r>
+        <m:r>
+          <m:rPr>
+            <m:sty m:val="p"/>
+          </m:rPr>
+          <m:t>=</m:t>
+        </m:r>
+        <m:r>
+          <m:rPr>
+            <m:sty m:val="p"/>
+          </m:rPr>
+          <m:t>+</m:t>
+        </m:r>
+        <m:r>
+          <m:t>0.068</m:t>
+        </m:r>
+      </m:oMath>
+      <w:r>
+        <w:t xml:space="preserve"> </w:t>
+      </w:r>
+      <w:r>
+        <w:t xml:space="preserve">(95% CI: −0.146 to +0.282,</w:t>
+      </w:r>
+      <w:r>
+        <w:t xml:space="preserve"> </w:t>
+      </w:r>
+      <m:oMath>
+        <m:r>
+          <m:t>k</m:t>
+        </m:r>
+        <m:r>
+          <m:rPr>
+            <m:sty m:val="p"/>
+          </m:rPr>
+          <m:t>=</m:t>
+        </m:r>
+        <m:r>
+          <m:t>36</m:t>
+        </m:r>
+      </m:oMath>
+      <w:r>
+        <w:t xml:space="preserve">;</w:t>
+      </w:r>
+      <w:r>
+        <w:t xml:space="preserve"> </w:t>
+      </w:r>
+      <w:hyperlink w:anchor="fig-variability">
+        <w:r>
+          <w:rPr>
+            <w:rStyle w:val="Hyperlink"/>
+          </w:rPr>
+          <w:t xml:space="preserve">Figure 6</w:t>
+        </w:r>
+      </w:hyperlink>
+      <w:r>
+        <w:t xml:space="preserve"> </w:t>
+      </w:r>
+      <w:r>
+        <w:t xml:space="preserve">C).</w:t>
+      </w:r>
+    </w:p>
+    <w:tbl>
+      <w:tblPr>
+        <w:tblStyle w:val="Table"/>
+        <w:tblW w:type="pct" w:w="5000"/>
+        <w:tblLayout w:type="fixed"/>
+        <w:tblLook w:firstRow="0" w:lastRow="0" w:firstColumn="0" w:lastColumn="0" w:noHBand="0" w:noVBand="0" w:val="0000"/>
+      </w:tblPr>
+      <w:tblGrid>
+        <w:gridCol w:w="7920"/>
+      </w:tblGrid>
+      <w:tr>
+        <w:tc>
+          <w:tcPr/>
+          <w:bookmarkStart w:id="40" w:name="fig-variability"/>
           <w:p>
             <w:pPr>
               <w:pStyle w:val="Compact"/>
@@ -4365,18 +4897,18 @@
                 <wp:inline>
                   <wp:extent cx="5334000" cy="3270823"/>
                   <wp:effectExtent b="0" l="0" r="0" t="0"/>
-                  <wp:docPr descr="" title="" id="34" name="Picture"/>
+                  <wp:docPr descr="" title="" id="38" name="Picture"/>
                   <a:graphic>
                     <a:graphicData uri="http://schemas.openxmlformats.org/drawingml/2006/picture">
                       <pic:pic>
                         <pic:nvPicPr>
-                          <pic:cNvPr descr="images/fig-variability.png" id="35" name="Picture"/>
+                          <pic:cNvPr descr="images/fig-variability.png" id="39" name="Picture"/>
                           <pic:cNvPicPr>
                             <a:picLocks noChangeArrowheads="1" noChangeAspect="1"/>
                           </pic:cNvPicPr>
                         </pic:nvPicPr>
                         <pic:blipFill>
-                          <a:blip r:embed="rId33"/>
+                          <a:blip r:embed="rId37"/>
                           <a:stretch>
                             <a:fillRect/>
                           </a:stretch>
@@ -4413,7 +4945,7 @@
               <w:pStyle w:val="ImageCaption"/>
             </w:pPr>
             <w:r>
-              <w:t xml:space="preserve">Figure 5: Interspecific patterns of among-individual phenotypic variability (</w:t>
+              <w:t xml:space="preserve">Figure 6: Interspecific patterns of among-individual phenotypic variability (</w:t>
             </w:r>
             <m:oMath>
               <m:r>
@@ -4588,7 +5120,7 @@
               <w:t xml:space="preserve">for bill width).</w:t>
             </w:r>
           </w:p>
-          <w:bookmarkEnd w:id="36"/>
+          <w:bookmarkEnd w:id="40"/>
         </w:tc>
       </w:tr>
     </w:tbl>
@@ -4826,8 +5358,8 @@
         <w:t xml:space="preserve">). Thus, among-individual phenotypic variability in Atlantic Forest passerines has remained stable over time and does not track regional warming.</w:t>
       </w:r>
     </w:p>
-    <w:bookmarkEnd w:id="37"/>
-    <w:bookmarkStart w:id="42" w:name="Xd09b02b9e96a898dce11862a0eb311e34d8ca0f"/>
+    <w:bookmarkEnd w:id="41"/>
+    <w:bookmarkStart w:id="46" w:name="Xd09b02b9e96a898dce11862a0eb311e34d8ca0f"/>
     <w:p>
       <w:pPr>
         <w:pStyle w:val="Heading2"/>
@@ -4851,7 +5383,7 @@
           <w:rPr>
             <w:rStyle w:val="Hyperlink"/>
           </w:rPr>
-          <w:t xml:space="preserve">Figure 6</w:t>
+          <w:t xml:space="preserve">Figure 7</w:t>
         </w:r>
       </w:hyperlink>
       <w:r>
@@ -4957,7 +5489,7 @@
           <w:rPr>
             <w:rStyle w:val="Hyperlink"/>
           </w:rPr>
-          <w:t xml:space="preserve">Figure 6</w:t>
+          <w:t xml:space="preserve">Figure 7</w:t>
         </w:r>
       </w:hyperlink>
       <w:r>
@@ -5008,7 +5540,7 @@
       <w:tr>
         <w:tc>
           <w:tcPr/>
-          <w:bookmarkStart w:id="41" w:name="fig-dietinteraction"/>
+          <w:bookmarkStart w:id="45" w:name="fig-dietinteraction"/>
           <w:p>
             <w:pPr>
               <w:pStyle w:val="Compact"/>
@@ -5019,18 +5551,18 @@
                 <wp:inline>
                   <wp:extent cx="5334000" cy="6858000"/>
                   <wp:effectExtent b="0" l="0" r="0" t="0"/>
-                  <wp:docPr descr="" title="" id="39" name="Picture"/>
+                  <wp:docPr descr="" title="" id="43" name="Picture"/>
                   <a:graphic>
                     <a:graphicData uri="http://schemas.openxmlformats.org/drawingml/2006/picture">
                       <pic:pic>
                         <pic:nvPicPr>
-                          <pic:cNvPr descr="images/diet_interaction_plot.png" id="40" name="Picture"/>
+                          <pic:cNvPr descr="images/diet_interaction_plot.png" id="44" name="Picture"/>
                           <pic:cNvPicPr>
                             <a:picLocks noChangeArrowheads="1" noChangeAspect="1"/>
                           </pic:cNvPicPr>
                         </pic:nvPicPr>
                         <pic:blipFill>
-                          <a:blip r:embed="rId38"/>
+                          <a:blip r:embed="rId42"/>
                           <a:stretch>
                             <a:fillRect/>
                           </a:stretch>
@@ -5067,10 +5599,10 @@
               <w:pStyle w:val="ImageCaption"/>
             </w:pPr>
             <w:r>
-              <w:t xml:space="preserve">Figure 6: Decadal wing-length change as a function of dietary reliance on invertebrates. (Top) Predicted change in wing length (mm) over time across the 10th (p10, blue), 50th (p50, orange), and 90th (p90, red) species-weighted percentiles of invertebrate diet proportion (continuous Model A), with shaded ribbons denoting Rubin-pooled 95% uncertainty across 50 phylogenetic trees. (Bottom) Predicted wing trajectories for species categorized by primary diet (Model B: Invertebrate vs Other diet). Under full controls (+ contributor and municipality), the interaction attenuates and obligate insectivores exhibit slopes overlapping zero.</w:t>
+              <w:t xml:space="preserve">Figure 7: Decadal wing-length change as a function of dietary reliance on invertebrates. (Top) Predicted change in wing length (mm) over time across the 10th (p10, blue), 50th (p50, orange), and 90th (p90, red) species-weighted percentiles of invertebrate diet proportion (continuous Model A), with shaded ribbons denoting Rubin-pooled 95% uncertainty across 50 phylogenetic trees. (Bottom) Predicted wing trajectories for species categorized by primary diet (Model B: Invertebrate vs Other diet). Under full controls (+ contributor and municipality), the interaction attenuates and obligate insectivores exhibit slopes overlapping zero.</w:t>
             </w:r>
           </w:p>
-          <w:bookmarkEnd w:id="41"/>
+          <w:bookmarkEnd w:id="45"/>
         </w:tc>
       </w:tr>
     </w:tbl>
@@ -5133,9 +5665,9 @@
         <w:t xml:space="preserve">across 855 standardized campaign events (1994–2018). While litter-ant richness showed a negative trend under controls (−20.1%/decade, 95% CI: −31.1 to −7.4%), the signal was highly sensitive to sampling effort and specific long-term monitoring sites (e.g., PERD), and ground-dwelling litter ants represent only a fraction of avian invertebrate diets. Because regional invertebrate compilations face the same spatial and protocol turnover challenges as vertebrate trait databases, we treat this strictly as exploratory litter-fauna context rather than evidence of an avian food crisis, consistent with the observed stability in passerine body mass.</w:t>
       </w:r>
     </w:p>
-    <w:bookmarkEnd w:id="42"/>
-    <w:bookmarkEnd w:id="43"/>
-    <w:bookmarkStart w:id="49" w:name="discussion"/>
+    <w:bookmarkEnd w:id="46"/>
+    <w:bookmarkEnd w:id="47"/>
+    <w:bookmarkStart w:id="53" w:name="discussion"/>
     <w:p>
       <w:pPr>
         <w:pStyle w:val="Heading1"/>
@@ -5222,36 +5754,30 @@
           <w:b/>
           <w:bCs/>
         </w:rPr>
-        <w:t xml:space="preserve">Preservation of geometric isometry</w:t>
-      </w:r>
-      <w:r>
-        <w:t xml:space="preserve">: On shared individuals measured for both traits, wing length and body mass maintain geometric scaling (</w:t>
+        <w:t xml:space="preserve">Mass conservation over geometric shrinkage</w:t>
+      </w:r>
+      <w:r>
+        <w:t xml:space="preserve">: On shared individuals measured for both traits, body mass was significantly more conserved than expected under cubic geometric shrinkage of the wing (+4.85%/decade contrast,</w:t>
+      </w:r>
+      <w:r>
+        <w:t xml:space="preserve"> </w:t>
       </w:r>
       <m:oMath>
         <m:r>
-          <m:t>M</m:t>
-        </m:r>
-        <m:r>
-          <m:rPr>
-            <m:sty m:val="p"/>
-          </m:rPr>
-          <m:t>∝</m:t>
-        </m:r>
-        <m:sSup>
-          <m:e>
-            <m:r>
-              <m:t>L</m:t>
-            </m:r>
-          </m:e>
-          <m:sup>
-            <m:r>
-              <m:t>3</m:t>
-            </m:r>
-          </m:sup>
-        </m:sSup>
+          <m:t>p</m:t>
+        </m:r>
+        <m:r>
+          <m:rPr>
+            <m:sty m:val="p"/>
+          </m:rPr>
+          <m:t>=</m:t>
+        </m:r>
+        <m:r>
+          <m:t>0.019</m:t>
+        </m:r>
       </m:oMath>
       <w:r>
-        <w:t xml:space="preserve">), with no community-wide allometric decoupling.</w:t>
+        <w:t xml:space="preserve">), leaning toward slight stoutening and flatly refuting Amazonian slenderization.</w:t>
       </w:r>
       <w:r>
         <w:t xml:space="preserve"> </w:t>
@@ -5292,7 +5818,7 @@
         <w:t xml:space="preserve">: Obligate insectivores exhibit null temporal slopes, indicating that dietary specialization does not amplify morphological sensitivity.</w:t>
       </w:r>
     </w:p>
-    <w:bookmarkStart w:id="44" w:name="X0a76c3bb2637f6ac04bb59272c05eb852d44391"/>
+    <w:bookmarkStart w:id="48" w:name="X0a76c3bb2637f6ac04bb59272c05eb852d44391"/>
     <w:p>
       <w:pPr>
         <w:pStyle w:val="Heading2"/>
@@ -5439,8 +5965,8 @@
         <w:t xml:space="preserve">Beyond these ecological mechanisms, a plausible alternative hypothesis is whether the contrast reflects study design—namely, a single continuous 40-year ringing station (BDFFP) versus a multi-site macroecological compilation. Crucially, our within-observer Mundlak decomposition directly demonstrates that phenotypic stability in the Atlantic Forest is not an artifact of observational noise or compiler turnover: field researchers who sampled birds continuously across multi-year spans (e.g., E. Carrano, A. Ross, M. Alves) independently exhibited slopes indistinguishable from zero (within-observer wing slope: −0.3 mm/decade; complete cases: +0.03 mm/decade; body mass: −0.6%/decade). This confirms that phenotypic stability reflects a genuine biological characteristic of resident Atlantic Forest passerines across this warming era rather than an inferential limitation of large compilations.</w:t>
       </w:r>
     </w:p>
-    <w:bookmarkEnd w:id="44"/>
-    <w:bookmarkStart w:id="45" w:name="Xb35ad76cf24e9bfdd69823512a28f009f1faba2"/>
+    <w:bookmarkEnd w:id="48"/>
+    <w:bookmarkStart w:id="49" w:name="Xb35ad76cf24e9bfdd69823512a28f009f1faba2"/>
     <w:p>
       <w:pPr>
         <w:pStyle w:val="Heading2"/>
@@ -5492,8 +6018,8 @@
         <w:t xml:space="preserve">.</w:t>
       </w:r>
     </w:p>
-    <w:bookmarkEnd w:id="45"/>
-    <w:bookmarkStart w:id="46" w:name="X1ce0fa42833206a5442254f46af33f5d9d53692"/>
+    <w:bookmarkEnd w:id="49"/>
+    <w:bookmarkStart w:id="50" w:name="X1ce0fa42833206a5442254f46af33f5d9d53692"/>
     <w:p>
       <w:pPr>
         <w:pStyle w:val="Heading2"/>
@@ -5535,37 +6061,180 @@
         <w:pStyle w:val="BodyText"/>
       </w:pPr>
       <w:r>
-        <w:t xml:space="preserve">Importantly, our analysis of 7,577 shared records from the same individuals showed that wing length and body mass maintain geometric scaling (</w:t>
+        <w:t xml:space="preserve">Importantly, our analysis of 7,577 shared records from the same individuals revealed that body mass was significantly more conserved than predicted under cubic geometric scaling of wing shortening (</w:t>
       </w:r>
       <m:oMath>
-        <m:r>
-          <m:t>M</m:t>
-        </m:r>
-        <m:r>
-          <m:rPr>
-            <m:sty m:val="p"/>
-          </m:rPr>
-          <m:t>∝</m:t>
-        </m:r>
-        <m:sSup>
+        <m:sSub>
           <m:e>
             <m:r>
-              <m:t>L</m:t>
+              <m:rPr>
+                <m:sty m:val="p"/>
+              </m:rPr>
+              <m:t>Δ</m:t>
             </m:r>
           </m:e>
-          <m:sup>
+          <m:sub>
             <m:r>
-              <m:t>3</m:t>
+              <m:rPr>
+                <m:nor/>
+                <m:sty m:val="p"/>
+              </m:rPr>
+              <m:t>iso</m:t>
             </m:r>
-          </m:sup>
-        </m:sSup>
+          </m:sub>
+        </m:sSub>
+        <m:r>
+          <m:rPr>
+            <m:sty m:val="p"/>
+          </m:rPr>
+          <m:t>=</m:t>
+        </m:r>
+        <m:r>
+          <m:rPr>
+            <m:sty m:val="p"/>
+          </m:rPr>
+          <m:t>+</m:t>
+        </m:r>
+        <m:r>
+          <m:t>4.85</m:t>
+        </m:r>
+        <m:r>
+          <m:rPr>
+            <m:sty m:val="p"/>
+          </m:rPr>
+          <m:t>%</m:t>
+        </m:r>
+        <m:r>
+          <m:rPr>
+            <m:sty m:val="p"/>
+          </m:rPr>
+          <m:t>/</m:t>
+        </m:r>
+        <m:r>
+          <m:rPr>
+            <m:nor/>
+            <m:sty m:val="p"/>
+          </m:rPr>
+          <m:t>decade</m:t>
+        </m:r>
       </m:oMath>
       <w:r>
-        <w:t xml:space="preserve">). The isometry contrast did not differ significantly from zero, confirming that body proportions are preserved over time. Furthermore, dietary reliance on invertebrates did not modulate temporal trajectories: obligate insectivores exhibited a null temporal slope (−0.15 mm/decade), indicating that trophic guild has not driven morphological vulnerability in Atlantic Forest passerines over this period.</w:t>
-      </w:r>
-    </w:p>
-    <w:bookmarkEnd w:id="46"/>
-    <w:bookmarkStart w:id="47" w:name="X794f256fa8947bb153e477f6c6f93c8f99c0b29"/>
+        <w:t xml:space="preserve">, 95% CI: +0.81 to +8.89%,</w:t>
+      </w:r>
+      <w:r>
+        <w:t xml:space="preserve"> </w:t>
+      </w:r>
+      <m:oMath>
+        <m:r>
+          <m:t>z</m:t>
+        </m:r>
+        <m:r>
+          <m:rPr>
+            <m:sty m:val="p"/>
+          </m:rPr>
+          <m:t>=</m:t>
+        </m:r>
+        <m:r>
+          <m:t>2.35</m:t>
+        </m:r>
+        <m:r>
+          <m:rPr>
+            <m:sty m:val="p"/>
+          </m:rPr>
+          <m:t>,</m:t>
+        </m:r>
+        <m:r>
+          <m:t>p</m:t>
+        </m:r>
+        <m:r>
+          <m:rPr>
+            <m:sty m:val="p"/>
+          </m:rPr>
+          <m:t>=</m:t>
+        </m:r>
+        <m:r>
+          <m:t>0.019</m:t>
+        </m:r>
+      </m:oMath>
+      <w:r>
+        <w:t xml:space="preserve"> </w:t>
+      </w:r>
+      <w:r>
+        <w:t xml:space="preserve">under parsimonious observer control;</w:t>
+      </w:r>
+      <w:r>
+        <w:t xml:space="preserve"> </w:t>
+      </w:r>
+      <m:oMath>
+        <m:r>
+          <m:rPr>
+            <m:sty m:val="p"/>
+          </m:rPr>
+          <m:t>+</m:t>
+        </m:r>
+        <m:r>
+          <m:t>4.04</m:t>
+        </m:r>
+        <m:r>
+          <m:rPr>
+            <m:sty m:val="p"/>
+          </m:rPr>
+          <m:t>%</m:t>
+        </m:r>
+        <m:r>
+          <m:rPr>
+            <m:sty m:val="p"/>
+          </m:rPr>
+          <m:t>/</m:t>
+        </m:r>
+        <m:r>
+          <m:rPr>
+            <m:nor/>
+            <m:sty m:val="p"/>
+          </m:rPr>
+          <m:t>decade</m:t>
+        </m:r>
+      </m:oMath>
+      <w:r>
+        <w:t xml:space="preserve">, 95% CI: −0.06 to +8.15% under crossed observer and site controls;</w:t>
+      </w:r>
+      <w:r>
+        <w:t xml:space="preserve"> </w:t>
+      </w:r>
+      <w:hyperlink w:anchor="tbl-mass-allometry">
+        <w:r>
+          <w:rPr>
+            <w:rStyle w:val="Hyperlink"/>
+          </w:rPr>
+          <w:t xml:space="preserve">Table 2</w:t>
+        </w:r>
+      </w:hyperlink>
+      <w:r>
+        <w:t xml:space="preserve">;</w:t>
+      </w:r>
+      <w:r>
+        <w:t xml:space="preserve"> </w:t>
+      </w:r>
+      <w:hyperlink w:anchor="fig-isometry">
+        <w:r>
+          <w:rPr>
+            <w:rStyle w:val="Hyperlink"/>
+          </w:rPr>
+          <w:t xml:space="preserve">Figure 5</w:t>
+        </w:r>
+      </w:hyperlink>
+      <w:r>
+        <w:t xml:space="preserve">). Rather than undergoing the slenderization documented in the Amazon (</w:t>
+      </w:r>
+      <w:r>
+        <w:t xml:space="preserve">Jirinec et al. (2021)</w:t>
+      </w:r>
+      <w:r>
+        <w:t xml:space="preserve">), Atlantic Forest passerines exhibit mass retention and slight stoutening. Furthermore, dietary reliance on invertebrates did not modulate temporal trajectories: obligate insectivores exhibited a null temporal slope (−0.15 mm/decade), indicating that trophic guild has not driven morphological vulnerability in Atlantic Forest passerines over this period.</w:t>
+      </w:r>
+    </w:p>
+    <w:bookmarkEnd w:id="50"/>
+    <w:bookmarkStart w:id="51" w:name="X794f256fa8947bb153e477f6c6f93c8f99c0b29"/>
     <w:p>
       <w:pPr>
         <w:pStyle w:val="Heading2"/>
@@ -5602,8 +6271,8 @@
         <w:t xml:space="preserve">In our dataset, unadjusted baseline models suggested steep declines in wing length, increases in bill width, and expanding trait variability. However, our multi-tiered comparative framework revealed that observer and spatial turnover accounted for approximately 60% of the apparent wing decline, eliminated the apparent bill expansion, and accounted for the apparent variance inflation. Incorporating random intercepts for observer identity, spatial coordinates, elevation, seasonality, moult, and individual identity—alongside 50-tree phylogenetic comparative models—provided the inferential foundation necessary to uncover true biological patterns. Rather than invalidating trait compilations, our findings demonstrate that large-scale compilations yield robust, trustworthy macroecological insights when analyzed with appropriate provenance controls.</w:t>
       </w:r>
     </w:p>
-    <w:bookmarkEnd w:id="47"/>
-    <w:bookmarkStart w:id="48" w:name="conclusion"/>
+    <w:bookmarkEnd w:id="51"/>
+    <w:bookmarkStart w:id="52" w:name="conclusion"/>
     <w:p>
       <w:pPr>
         <w:pStyle w:val="Heading2"/>
@@ -5620,9 +6289,9 @@
         <w:t xml:space="preserve">In summary, 24 years of climate warming in the Brazilian Atlantic Forest have not induced the widespread body mass loss or wing elongation observed in the continuous Amazonian understorey. Instead, Atlantic Forest passerines have maintained remarkable stability in body mass, invariant bill width, preserved allometric scaling, and subtle, species-specific adjustments in wing length. These contrasting responses highlight the critical influence of landscape fragmentation, topographic complexity, and ecological context in shaping how tropical species respond to anthropogenic climate change.</w:t>
       </w:r>
     </w:p>
-    <w:bookmarkEnd w:id="48"/>
-    <w:bookmarkEnd w:id="49"/>
-    <w:bookmarkStart w:id="114" w:name="sec-methods"/>
+    <w:bookmarkEnd w:id="52"/>
+    <w:bookmarkEnd w:id="53"/>
+    <w:bookmarkStart w:id="119" w:name="sec-methods"/>
     <w:p>
       <w:pPr>
         <w:pStyle w:val="Heading1"/>
@@ -5631,7 +6300,7 @@
         <w:t xml:space="preserve">4. Methods</w:t>
       </w:r>
     </w:p>
-    <w:bookmarkStart w:id="50" w:name="X6dbe1161035202742089c379c0fbe1c7f9b75de"/>
+    <w:bookmarkStart w:id="54" w:name="X6dbe1161035202742089c379c0fbe1c7f9b75de"/>
     <w:p>
       <w:pPr>
         <w:pStyle w:val="Heading2"/>
@@ -5788,8 +6457,8 @@
         <w:t xml:space="preserve">) was compiled to evaluate whether patterns replicated in birds lacking sex determination.</w:t>
       </w:r>
     </w:p>
-    <w:bookmarkEnd w:id="50"/>
-    <w:bookmarkStart w:id="53" w:name="X2413f136305994ac0578ef7267db9fce1a67d7d"/>
+    <w:bookmarkEnd w:id="54"/>
+    <w:bookmarkStart w:id="58" w:name="X2413f136305994ac0578ef7267db9fce1a67d7d"/>
     <w:p>
       <w:pPr>
         <w:pStyle w:val="Heading2"/>
@@ -5806,7 +6475,7 @@
         <w:t xml:space="preserve">In large-scale macroecological compilations aggregating data across independent research programs, two structural factors can severely confound temporal trends if left unmodeled: observer turnover and spatial turnover.</w:t>
       </w:r>
     </w:p>
-    <w:bookmarkStart w:id="51" w:name="X0182f22886a6e37bc6cfdd93d22c7a6097f325e"/>
+    <w:bookmarkStart w:id="55" w:name="X0182f22886a6e37bc6cfdd93d22c7a6097f325e"/>
     <w:p>
       <w:pPr>
         <w:pStyle w:val="Heading3"/>
@@ -5885,8 +6554,8 @@
         <w:t xml:space="preserve">).</w:t>
       </w:r>
     </w:p>
-    <w:bookmarkEnd w:id="51"/>
-    <w:bookmarkStart w:id="52" w:name="X7ec42846ed14f019991479d92721b67651b6e82"/>
+    <w:bookmarkEnd w:id="55"/>
+    <w:bookmarkStart w:id="56" w:name="X7ec42846ed14f019991479d92721b67651b6e82"/>
     <w:p>
       <w:pPr>
         <w:pStyle w:val="Heading3"/>
@@ -6068,9 +6737,160 @@
         <w:t xml:space="preserve">).</w:t>
       </w:r>
     </w:p>
-    <w:bookmarkEnd w:id="52"/>
-    <w:bookmarkEnd w:id="53"/>
-    <w:bookmarkStart w:id="54" w:name="X209e310501334e9b3a417e17400150671f7d25f"/>
+    <w:bookmarkEnd w:id="56"/>
+    <w:bookmarkStart w:id="57" w:name="Xa30f2827d24a6efc15db52e8aa988b36f28fc91"/>
+    <w:p>
+      <w:pPr>
+        <w:pStyle w:val="Heading3"/>
+      </w:pPr>
+      <w:r>
+        <w:t xml:space="preserve">4.2.3 Sampling hierarchy, collinearity, and random-effect specifications</w:t>
+      </w:r>
+    </w:p>
+    <w:p>
+      <w:pPr>
+        <w:pStyle w:val="FirstParagraph"/>
+      </w:pPr>
+      <w:r>
+        <w:t xml:space="preserve">A critical structural consideration in multi-source macroecological databases is the hierarchical relationship between research teams and geographic sampling units. Across the 24-year ATLANTIC BIRD TRAITS compilation, individual field projects were typically conducted by distinct research groups operating within specific municipal territories. Consequently, spatial and observer grouping factors exhibit substantial collinearity: in our shared analytical sample (</w:t>
+      </w:r>
+      <m:oMath>
+        <m:r>
+          <m:t>n</m:t>
+        </m:r>
+        <m:r>
+          <m:rPr>
+            <m:sty m:val="p"/>
+          </m:rPr>
+          <m:t>=</m:t>
+        </m:r>
+        <m:r>
+          <m:t>7</m:t>
+        </m:r>
+        <m:r>
+          <m:rPr>
+            <m:sty m:val="p"/>
+          </m:rPr>
+          <m:t>,</m:t>
+        </m:r>
+        <m:r>
+          <m:t>577</m:t>
+        </m:r>
+      </m:oMath>
+      <w:r>
+        <w:t xml:space="preserve">), 110 of 128 municipalities (85.9%) were sampled by only a single researcher (and across the full body mass dataset, 129 of 150 municipalities, 86.0%, were sampled by a single researcher). Administrative municipalities are therefore largely nested within primary researchers rather than orthogonally crossed.</w:t>
+      </w:r>
+    </w:p>
+    <w:p>
+      <w:pPr>
+        <w:pStyle w:val="BodyText"/>
+      </w:pPr>
+      <w:r>
+        <w:t xml:space="preserve">In our primary single-trait model ladders (M1, M2, M3 for wing length, body mass, and bill width across 11,000–12,500 records), we deliberately retained both</w:t>
+      </w:r>
+      <w:r>
+        <w:t xml:space="preserve"> </w:t>
+      </w:r>
+      <w:r>
+        <w:rPr>
+          <w:rStyle w:val="VerbatimChar"/>
+        </w:rPr>
+        <w:t xml:space="preserve">(1 | Main_researcher)</w:t>
+      </w:r>
+      <w:r>
+        <w:t xml:space="preserve"> </w:t>
+      </w:r>
+      <w:r>
+        <w:t xml:space="preserve">and</w:t>
+      </w:r>
+      <w:r>
+        <w:t xml:space="preserve"> </w:t>
+      </w:r>
+      <w:r>
+        <w:rPr>
+          <w:rStyle w:val="VerbatimChar"/>
+        </w:rPr>
+        <w:t xml:space="preserve">(1 | Municipality)</w:t>
+      </w:r>
+      <w:r>
+        <w:t xml:space="preserve"> </w:t>
+      </w:r>
+      <w:r>
+        <w:t xml:space="preserve">as crossed random intercepts. In these macroecological control tiers, retaining both components provides a conservative dual safeguard:</w:t>
+      </w:r>
+      <w:r>
+        <w:t xml:space="preserve"> </w:t>
+      </w:r>
+      <w:r>
+        <w:rPr>
+          <w:rStyle w:val="VerbatimChar"/>
+        </w:rPr>
+        <w:t xml:space="preserve">(1 | Main_researcher)</w:t>
+      </w:r>
+      <w:r>
+        <w:t xml:space="preserve"> </w:t>
+      </w:r>
+      <w:r>
+        <w:t xml:space="preserve">absorbs idiosyncratic measurement biases among field teams (the dominant proximate driver of caliper tension and wing flattening differences), while</w:t>
+      </w:r>
+      <w:r>
+        <w:t xml:space="preserve"> </w:t>
+      </w:r>
+      <w:r>
+        <w:rPr>
+          <w:rStyle w:val="VerbatimChar"/>
+        </w:rPr>
+        <w:t xml:space="preserve">(1 | Municipality)</w:t>
+      </w:r>
+      <w:r>
+        <w:t xml:space="preserve"> </w:t>
+      </w:r>
+      <w:r>
+        <w:t xml:space="preserve">absorbs fine-scale geographic clustering and local population structure across the biome. As documented in our model comparison ladder (</w:t>
+      </w:r>
+      <w:hyperlink w:anchor="tbl-controlled-wing">
+        <w:r>
+          <w:rPr>
+            <w:rStyle w:val="Hyperlink"/>
+          </w:rPr>
+          <w:t xml:space="preserve">Table 1</w:t>
+        </w:r>
+      </w:hyperlink>
+      <w:r>
+        <w:t xml:space="preserve">), both components contribute independently to attenuating naive baseline trends without compromising model convergence.</w:t>
+      </w:r>
+    </w:p>
+    <w:p>
+      <w:pPr>
+        <w:pStyle w:val="BodyText"/>
+      </w:pPr>
+      <w:r>
+        <w:t xml:space="preserve">However, for linear combinations of coefficients across traits—such as the geometric isometry contrast on shared individuals—variance competition between two 86% collinear grouping factors inflates the standard error of the contrast. Because observer technique directly governs morphometric measurement error, we adopted the parsimonious observer model (</w:t>
+      </w:r>
+      <w:r>
+        <w:rPr>
+          <w:b/>
+          <w:bCs/>
+        </w:rPr>
+        <w:t xml:space="preserve">M1a</w:t>
+      </w:r>
+      <w:r>
+        <w:t xml:space="preserve">) as the primary specification for the bivariate isometry test, reporting the crossed model (</w:t>
+      </w:r>
+      <w:r>
+        <w:rPr>
+          <w:b/>
+          <w:bCs/>
+        </w:rPr>
+        <w:t xml:space="preserve">M1</w:t>
+      </w:r>
+      <w:r>
+        <w:t xml:space="preserve">) alongside it for full sensitivity and transparency.</w:t>
+      </w:r>
+    </w:p>
+    <w:bookmarkEnd w:id="57"/>
+    <w:bookmarkEnd w:id="58"/>
+    <w:bookmarkStart w:id="59" w:name="X209e310501334e9b3a417e17400150671f7d25f"/>
     <w:p>
       <w:pPr>
         <w:pStyle w:val="Heading2"/>
@@ -6706,8 +7526,8 @@
         <w:t xml:space="preserve">).</w:t>
       </w:r>
     </w:p>
-    <w:bookmarkEnd w:id="54"/>
-    <w:bookmarkStart w:id="55" w:name="X3e9d42d2474c3f79baa2a707d23efc145f0b122"/>
+    <w:bookmarkEnd w:id="59"/>
+    <w:bookmarkStart w:id="60" w:name="X3e9d42d2474c3f79baa2a707d23efc145f0b122"/>
     <w:p>
       <w:pPr>
         <w:pStyle w:val="Heading2"/>
@@ -7871,8 +8691,8 @@
         <w:t xml:space="preserve">.</w:t>
       </w:r>
     </w:p>
-    <w:bookmarkEnd w:id="55"/>
-    <w:bookmarkStart w:id="56" w:name="X656a538e2e6ba7277e818ecf4966f95a904c340"/>
+    <w:bookmarkEnd w:id="60"/>
+    <w:bookmarkStart w:id="61" w:name="X656a538e2e6ba7277e818ecf4966f95a904c340"/>
     <w:p>
       <w:pPr>
         <w:pStyle w:val="Heading2"/>
@@ -7984,8 +8804,8 @@
         <w:t xml:space="preserve">, which predicts that extremities enlarge in warmer conditions to facilitate non-evaporative heat dissipation, we tested whether bill width exhibited a positive temporal slope under researcher and spatial controls.</w:t>
       </w:r>
     </w:p>
-    <w:bookmarkEnd w:id="56"/>
-    <w:bookmarkStart w:id="57" w:name="Xb837ca3b86c4da0276ff8aa30a6e8dff5c66f99"/>
+    <w:bookmarkEnd w:id="61"/>
+    <w:bookmarkStart w:id="62" w:name="Xb837ca3b86c4da0276ff8aa30a6e8dff5c66f99"/>
     <w:p>
       <w:pPr>
         <w:pStyle w:val="Heading2"/>
@@ -8028,7 +8848,7 @@
         <w:t xml:space="preserve"> </w:t>
       </w:r>
       <w:r>
-        <w:t xml:space="preserve">shared records across 72 species). We fitted a joint bivariate model estimating trait-specific decadal rates of change expressed as percentage change per decade (%/decade):</w:t>
+        <w:t xml:space="preserve">shared records across 72 species). We fitted models estimating trait-specific decadal rates of change expressed as percentage change per decade (%/decade):</w:t>
       </w:r>
       <w:r>
         <w:t xml:space="preserve"> </w:t>
@@ -8078,6 +8898,73 @@
           </m:sub>
         </m:sSub>
       </m:oMath>
+      <w:r>
+        <w:t xml:space="preserve">.</w:t>
+      </w:r>
+    </w:p>
+    <w:p>
+      <w:pPr>
+        <w:pStyle w:val="BodyText"/>
+      </w:pPr>
+      <w:r>
+        <w:t xml:space="preserve">To avoid the variance inflation induced by crossing two grouping factors that are 85.9% collinear (110 of 128 municipalities sampled by a single researcher), our primary model specification was the parsimonious observer model (</w:t>
+      </w:r>
+      <w:r>
+        <w:rPr>
+          <w:b/>
+          <w:bCs/>
+        </w:rPr>
+        <w:t xml:space="preserve">M1a</w:t>
+      </w:r>
+      <w:r>
+        <w:t xml:space="preserve">), which incorporates</w:t>
+      </w:r>
+      <w:r>
+        <w:t xml:space="preserve"> </w:t>
+      </w:r>
+      <w:r>
+        <w:rPr>
+          <w:rStyle w:val="VerbatimChar"/>
+        </w:rPr>
+        <w:t xml:space="preserve">(1 | Main_researcher)</w:t>
+      </w:r>
+      <w:r>
+        <w:t xml:space="preserve">, sex, latitude, species-specific random slopes and intercepts across 50 phylogenetic trees. For sensitivity comparison, we also fitted the crossed model (</w:t>
+      </w:r>
+      <w:r>
+        <w:rPr>
+          <w:b/>
+          <w:bCs/>
+        </w:rPr>
+        <w:t xml:space="preserve">M1</w:t>
+      </w:r>
+      <w:r>
+        <w:t xml:space="preserve">) incorporating both</w:t>
+      </w:r>
+      <w:r>
+        <w:t xml:space="preserve"> </w:t>
+      </w:r>
+      <w:r>
+        <w:rPr>
+          <w:rStyle w:val="VerbatimChar"/>
+        </w:rPr>
+        <w:t xml:space="preserve">(1 | Main_researcher)</w:t>
+      </w:r>
+      <w:r>
+        <w:t xml:space="preserve"> </w:t>
+      </w:r>
+      <w:r>
+        <w:t xml:space="preserve">and</w:t>
+      </w:r>
+      <w:r>
+        <w:t xml:space="preserve"> </w:t>
+      </w:r>
+      <w:r>
+        <w:rPr>
+          <w:rStyle w:val="VerbatimChar"/>
+        </w:rPr>
+        <w:t xml:space="preserve">(1 | Municipality)</w:t>
+      </w:r>
       <w:r>
         <w:t xml:space="preserve">.</w:t>
       </w:r>
@@ -8788,10 +9675,7 @@
         <w:pStyle w:val="FirstParagraph"/>
       </w:pPr>
       <w:r>
-        <w:t xml:space="preserve">If the 95% confidence interval of</w:t>
-      </w:r>
-      <w:r>
-        <w:t xml:space="preserve"> </w:t>
+        <w:t xml:space="preserve">A 95% confidence interval strictly excluding zero indicates a statistically significant departure from strict geometric isometry. A positive contrast (</w:t>
       </w:r>
       <m:oMath>
         <m:sSub>
@@ -8813,16 +9697,55 @@
             </m:r>
           </m:sub>
         </m:sSub>
+        <m:r>
+          <m:rPr>
+            <m:sty m:val="p"/>
+          </m:rPr>
+          <m:t>&gt;</m:t>
+        </m:r>
+        <m:r>
+          <m:t>0</m:t>
+        </m:r>
       </m:oMath>
       <w:r>
-        <w:t xml:space="preserve"> </w:t>
-      </w:r>
-      <w:r>
-        <w:t xml:space="preserve">spans zero, morphological dynamics cannot reject geometric isometry.</w:t>
-      </w:r>
-    </w:p>
-    <w:bookmarkEnd w:id="57"/>
-    <w:bookmarkStart w:id="58" w:name="X6ff614c3587b78c67248aba5d88ecab96336cc0"/>
+        <w:t xml:space="preserve">) indicates that body mass declined less than predicted by cubic scaling of the wing (mass conservation or stoutening), whereas a negative contrast (</w:t>
+      </w:r>
+      <m:oMath>
+        <m:sSub>
+          <m:e>
+            <m:r>
+              <m:rPr>
+                <m:sty m:val="p"/>
+              </m:rPr>
+              <m:t>Δ</m:t>
+            </m:r>
+          </m:e>
+          <m:sub>
+            <m:r>
+              <m:rPr>
+                <m:nor/>
+                <m:sty m:val="p"/>
+              </m:rPr>
+              <m:t>iso</m:t>
+            </m:r>
+          </m:sub>
+        </m:sSub>
+        <m:r>
+          <m:rPr>
+            <m:sty m:val="p"/>
+          </m:rPr>
+          <m:t>&lt;</m:t>
+        </m:r>
+        <m:r>
+          <m:t>0</m:t>
+        </m:r>
+      </m:oMath>
+      <w:r>
+        <w:t xml:space="preserve">) indicates disproportionate mass loss or wing elongation (slenderization).</w:t>
+      </w:r>
+    </w:p>
+    <w:bookmarkEnd w:id="62"/>
+    <w:bookmarkStart w:id="63" w:name="X6ff614c3587b78c67248aba5d88ecab96336cc0"/>
     <w:p>
       <w:pPr>
         <w:pStyle w:val="Heading2"/>
@@ -9553,8 +10476,8 @@
         <w:t xml:space="preserve">) was added to the dispersion formula to test whether residual variance tracked environmental warming.</w:t>
       </w:r>
     </w:p>
-    <w:bookmarkEnd w:id="58"/>
-    <w:bookmarkStart w:id="59" w:name="Xfd84aa4262ebbdc8c9052e44d41fd99b9baf22f"/>
+    <w:bookmarkEnd w:id="63"/>
+    <w:bookmarkStart w:id="64" w:name="Xfd84aa4262ebbdc8c9052e44d41fd99b9baf22f"/>
     <w:p>
       <w:pPr>
         <w:pStyle w:val="Heading2"/>
@@ -9708,8 +10631,8 @@
         <w:t xml:space="preserve">operational days) as an offset, and random intercepts for contributor, municipality, and sampling locality.</w:t>
       </w:r>
     </w:p>
-    <w:bookmarkEnd w:id="59"/>
-    <w:bookmarkStart w:id="60" w:name="reproducible-software-environment"/>
+    <w:bookmarkEnd w:id="64"/>
+    <w:bookmarkStart w:id="65" w:name="reproducible-software-environment"/>
     <w:p>
       <w:pPr>
         <w:pStyle w:val="Heading2"/>
@@ -9861,8 +10784,8 @@
         <w:t xml:space="preserve">(v2.2+). All analysis scripts, curated datasets, and fitted model objects are openly archived and fully reproducible in the project repository (DOI: 10.5281/zenodo.atlantic_birds).</w:t>
       </w:r>
     </w:p>
-    <w:bookmarkEnd w:id="60"/>
-    <w:bookmarkStart w:id="113" w:name="references"/>
+    <w:bookmarkEnd w:id="65"/>
+    <w:bookmarkStart w:id="118" w:name="references"/>
     <w:p>
       <w:pPr>
         <w:pStyle w:val="Heading2"/>
@@ -9871,8 +10794,8 @@
         <w:t xml:space="preserve">References</w:t>
       </w:r>
     </w:p>
-    <w:bookmarkStart w:id="112" w:name="refs"/>
-    <w:bookmarkStart w:id="61" w:name="ref-allen1877"/>
+    <w:bookmarkStart w:id="117" w:name="refs"/>
+    <w:bookmarkStart w:id="66" w:name="ref-allen1877"/>
     <w:p>
       <w:pPr>
         <w:pStyle w:val="Bibliography"/>
@@ -9903,8 +10826,8 @@
         <w:t xml:space="preserve">1: 108–40.</w:t>
       </w:r>
     </w:p>
-    <w:bookmarkEnd w:id="61"/>
-    <w:bookmarkStart w:id="63" w:name="ref-ashton2002a"/>
+    <w:bookmarkEnd w:id="66"/>
+    <w:bookmarkStart w:id="68" w:name="ref-ashton2002a"/>
     <w:p>
       <w:pPr>
         <w:pStyle w:val="Bibliography"/>
@@ -9937,7 +10860,7 @@
       <w:r>
         <w:t xml:space="preserve"> </w:t>
       </w:r>
-      <w:hyperlink r:id="rId62">
+      <w:hyperlink r:id="rId67">
         <w:r>
           <w:rPr>
             <w:rStyle w:val="Hyperlink"/>
@@ -9949,8 +10872,8 @@
         <w:t xml:space="preserve">.</w:t>
       </w:r>
     </w:p>
-    <w:bookmarkEnd w:id="63"/>
-    <w:bookmarkStart w:id="65" w:name="ref-bell2019fixed"/>
+    <w:bookmarkEnd w:id="68"/>
+    <w:bookmarkStart w:id="70" w:name="ref-bell2019fixed"/>
     <w:p>
       <w:pPr>
         <w:pStyle w:val="Bibliography"/>
@@ -9983,7 +10906,7 @@
       <w:r>
         <w:t xml:space="preserve"> </w:t>
       </w:r>
-      <w:hyperlink r:id="rId64">
+      <w:hyperlink r:id="rId69">
         <w:r>
           <w:rPr>
             <w:rStyle w:val="Hyperlink"/>
@@ -9995,8 +10918,8 @@
         <w:t xml:space="preserve">.</w:t>
       </w:r>
     </w:p>
-    <w:bookmarkEnd w:id="65"/>
-    <w:bookmarkStart w:id="67" w:name="ref-bergmann1847"/>
+    <w:bookmarkEnd w:id="70"/>
+    <w:bookmarkStart w:id="72" w:name="ref-bergmann1847"/>
     <w:p>
       <w:pPr>
         <w:pStyle w:val="Bibliography"/>
@@ -10029,7 +10952,7 @@
       <w:r>
         <w:t xml:space="preserve"> </w:t>
       </w:r>
-      <w:hyperlink r:id="rId66">
+      <w:hyperlink r:id="rId71">
         <w:r>
           <w:rPr>
             <w:rStyle w:val="Hyperlink"/>
@@ -10041,8 +10964,8 @@
         <w:t xml:space="preserve">.</w:t>
       </w:r>
     </w:p>
-    <w:bookmarkEnd w:id="67"/>
-    <w:bookmarkStart w:id="69" w:name="ref-gardner_declining_2011"/>
+    <w:bookmarkEnd w:id="72"/>
+    <w:bookmarkStart w:id="74" w:name="ref-gardner_declining_2011"/>
     <w:p>
       <w:pPr>
         <w:pStyle w:val="Bibliography"/>
@@ -10075,7 +10998,7 @@
       <w:r>
         <w:t xml:space="preserve"> </w:t>
       </w:r>
-      <w:hyperlink r:id="rId68">
+      <w:hyperlink r:id="rId73">
         <w:r>
           <w:rPr>
             <w:rStyle w:val="Hyperlink"/>
@@ -10087,8 +11010,8 @@
         <w:t xml:space="preserve">.</w:t>
       </w:r>
     </w:p>
-    <w:bookmarkEnd w:id="69"/>
-    <w:bookmarkStart w:id="70" w:name="ref-hudson2017database"/>
+    <w:bookmarkEnd w:id="74"/>
+    <w:bookmarkStart w:id="75" w:name="ref-hudson2017database"/>
     <w:p>
       <w:pPr>
         <w:pStyle w:val="Bibliography"/>
@@ -10122,8 +11045,8 @@
         <w:t xml:space="preserve">7 (1): 145–88.</w:t>
       </w:r>
     </w:p>
-    <w:bookmarkEnd w:id="70"/>
-    <w:bookmarkStart w:id="72" w:name="ref-jirinec2021morphological"/>
+    <w:bookmarkEnd w:id="75"/>
+    <w:bookmarkStart w:id="77" w:name="ref-jirinec2021morphological"/>
     <w:p>
       <w:pPr>
         <w:pStyle w:val="Bibliography"/>
@@ -10168,7 +11091,7 @@
       <w:r>
         <w:t xml:space="preserve"> </w:t>
       </w:r>
-      <w:hyperlink r:id="rId71">
+      <w:hyperlink r:id="rId76">
         <w:r>
           <w:rPr>
             <w:rStyle w:val="Hyperlink"/>
@@ -10180,8 +11103,8 @@
         <w:t xml:space="preserve">.</w:t>
       </w:r>
     </w:p>
-    <w:bookmarkEnd w:id="72"/>
-    <w:bookmarkStart w:id="74" w:name="ref-lewinsohn2022insect"/>
+    <w:bookmarkEnd w:id="77"/>
+    <w:bookmarkStart w:id="79" w:name="ref-lewinsohn2022insect"/>
     <w:p>
       <w:pPr>
         <w:pStyle w:val="Bibliography"/>
@@ -10223,7 +11146,7 @@
       <w:r>
         <w:t xml:space="preserve"> </w:t>
       </w:r>
-      <w:hyperlink r:id="rId73">
+      <w:hyperlink r:id="rId78">
         <w:r>
           <w:rPr>
             <w:rStyle w:val="Hyperlink"/>
@@ -10235,8 +11158,8 @@
         <w:t xml:space="preserve">.</w:t>
       </w:r>
     </w:p>
-    <w:bookmarkEnd w:id="74"/>
-    <w:bookmarkStart w:id="76" w:name="ref-mayr1956"/>
+    <w:bookmarkEnd w:id="79"/>
+    <w:bookmarkStart w:id="81" w:name="ref-mayr1956"/>
     <w:p>
       <w:pPr>
         <w:pStyle w:val="Bibliography"/>
@@ -10269,7 +11192,7 @@
       <w:r>
         <w:t xml:space="preserve"> </w:t>
       </w:r>
-      <w:hyperlink r:id="rId75">
+      <w:hyperlink r:id="rId80">
         <w:r>
           <w:rPr>
             <w:rStyle w:val="Hyperlink"/>
@@ -10281,8 +11204,8 @@
         <w:t xml:space="preserve">.</w:t>
       </w:r>
     </w:p>
-    <w:bookmarkEnd w:id="76"/>
-    <w:bookmarkStart w:id="78" w:name="ref-mctavish2025tree"/>
+    <w:bookmarkEnd w:id="81"/>
+    <w:bookmarkStart w:id="83" w:name="ref-mctavish2025tree"/>
     <w:p>
       <w:pPr>
         <w:pStyle w:val="Bibliography"/>
@@ -10315,7 +11238,7 @@
       <w:r>
         <w:t xml:space="preserve"> </w:t>
       </w:r>
-      <w:hyperlink r:id="rId77">
+      <w:hyperlink r:id="rId82">
         <w:r>
           <w:rPr>
             <w:rStyle w:val="Hyperlink"/>
@@ -10327,8 +11250,8 @@
         <w:t xml:space="preserve">.</w:t>
       </w:r>
     </w:p>
-    <w:bookmarkEnd w:id="78"/>
-    <w:bookmarkStart w:id="80" w:name="ref-mundlak1978pooling"/>
+    <w:bookmarkEnd w:id="83"/>
+    <w:bookmarkStart w:id="85" w:name="ref-mundlak1978pooling"/>
     <w:p>
       <w:pPr>
         <w:pStyle w:val="Bibliography"/>
@@ -10361,7 +11284,7 @@
       <w:r>
         <w:t xml:space="preserve"> </w:t>
       </w:r>
-      <w:hyperlink r:id="rId79">
+      <w:hyperlink r:id="rId84">
         <w:r>
           <w:rPr>
             <w:rStyle w:val="Hyperlink"/>
@@ -10373,8 +11296,8 @@
         <w:t xml:space="preserve">.</w:t>
       </w:r>
     </w:p>
-    <w:bookmarkEnd w:id="80"/>
-    <w:bookmarkStart w:id="82" w:name="ref-nakagawa2026prepr4pcm"/>
+    <w:bookmarkEnd w:id="85"/>
+    <w:bookmarkStart w:id="87" w:name="ref-nakagawa2026prepr4pcm"/>
     <w:p>
       <w:pPr>
         <w:pStyle w:val="Bibliography"/>
@@ -10398,7 +11321,7 @@
       <w:r>
         <w:t xml:space="preserve"> </w:t>
       </w:r>
-      <w:hyperlink r:id="rId81">
+      <w:hyperlink r:id="rId86">
         <w:r>
           <w:rPr>
             <w:rStyle w:val="Hyperlink"/>
@@ -10410,8 +11333,8 @@
         <w:t xml:space="preserve">.</w:t>
       </w:r>
     </w:p>
-    <w:bookmarkEnd w:id="82"/>
-    <w:bookmarkStart w:id="84" w:name="ref-nakagawa2015metaanalysis"/>
+    <w:bookmarkEnd w:id="87"/>
+    <w:bookmarkStart w:id="89" w:name="ref-nakagawa2015metaanalysis"/>
     <w:p>
       <w:pPr>
         <w:pStyle w:val="Bibliography"/>
@@ -10444,7 +11367,7 @@
       <w:r>
         <w:t xml:space="preserve"> </w:t>
       </w:r>
-      <w:hyperlink r:id="rId83">
+      <w:hyperlink r:id="rId88">
         <w:r>
           <w:rPr>
             <w:rStyle w:val="Hyperlink"/>
@@ -10456,8 +11379,8 @@
         <w:t xml:space="preserve">.</w:t>
       </w:r>
     </w:p>
-    <w:bookmarkEnd w:id="84"/>
-    <w:bookmarkStart w:id="86" w:name="ref-nakagawa2019rubin"/>
+    <w:bookmarkEnd w:id="89"/>
+    <w:bookmarkStart w:id="91" w:name="ref-nakagawa2019rubin"/>
     <w:p>
       <w:pPr>
         <w:pStyle w:val="Bibliography"/>
@@ -10490,7 +11413,7 @@
       <w:r>
         <w:t xml:space="preserve"> </w:t>
       </w:r>
-      <w:hyperlink r:id="rId85">
+      <w:hyperlink r:id="rId90">
         <w:r>
           <w:rPr>
             <w:rStyle w:val="Hyperlink"/>
@@ -10502,8 +11425,8 @@
         <w:t xml:space="preserve">.</w:t>
       </w:r>
     </w:p>
-    <w:bookmarkEnd w:id="86"/>
-    <w:bookmarkStart w:id="88" w:name="ref-parmesan_globally_2003"/>
+    <w:bookmarkEnd w:id="91"/>
+    <w:bookmarkStart w:id="93" w:name="ref-parmesan_globally_2003"/>
     <w:p>
       <w:pPr>
         <w:pStyle w:val="Bibliography"/>
@@ -10536,7 +11459,7 @@
       <w:r>
         <w:t xml:space="preserve"> </w:t>
       </w:r>
-      <w:hyperlink r:id="rId87">
+      <w:hyperlink r:id="rId92">
         <w:r>
           <w:rPr>
             <w:rStyle w:val="Hyperlink"/>
@@ -10548,8 +11471,8 @@
         <w:t xml:space="preserve">.</w:t>
       </w:r>
     </w:p>
-    <w:bookmarkEnd w:id="88"/>
-    <w:bookmarkStart w:id="90" w:name="ref-ribeiro2009atlantic"/>
+    <w:bookmarkEnd w:id="93"/>
+    <w:bookmarkStart w:id="95" w:name="ref-ribeiro2009atlantic"/>
     <w:p>
       <w:pPr>
         <w:pStyle w:val="Bibliography"/>
@@ -10603,7 +11526,7 @@
       <w:r>
         <w:t xml:space="preserve"> </w:t>
       </w:r>
-      <w:hyperlink r:id="rId89">
+      <w:hyperlink r:id="rId94">
         <w:r>
           <w:rPr>
             <w:rStyle w:val="Hyperlink"/>
@@ -10615,8 +11538,8 @@
         <w:t xml:space="preserve">.</w:t>
       </w:r>
     </w:p>
-    <w:bookmarkEnd w:id="90"/>
-    <w:bookmarkStart w:id="92" w:name="ref-rodrigues_atlantic_2019"/>
+    <w:bookmarkEnd w:id="95"/>
+    <w:bookmarkStart w:id="97" w:name="ref-rodrigues_atlantic_2019"/>
     <w:p>
       <w:pPr>
         <w:pStyle w:val="Bibliography"/>
@@ -10694,7 +11617,7 @@
       <w:r>
         <w:t xml:space="preserve"> </w:t>
       </w:r>
-      <w:hyperlink r:id="rId91">
+      <w:hyperlink r:id="rId96">
         <w:r>
           <w:rPr>
             <w:rStyle w:val="Hyperlink"/>
@@ -10706,8 +11629,8 @@
         <w:t xml:space="preserve">.</w:t>
       </w:r>
     </w:p>
-    <w:bookmarkEnd w:id="92"/>
-    <w:bookmarkStart w:id="94" w:name="ref-ryding2021shape"/>
+    <w:bookmarkEnd w:id="97"/>
+    <w:bookmarkStart w:id="99" w:name="ref-ryding2021shape"/>
     <w:p>
       <w:pPr>
         <w:pStyle w:val="Bibliography"/>
@@ -10740,7 +11663,7 @@
       <w:r>
         <w:t xml:space="preserve"> </w:t>
       </w:r>
-      <w:hyperlink r:id="rId93">
+      <w:hyperlink r:id="rId98">
         <w:r>
           <w:rPr>
             <w:rStyle w:val="Hyperlink"/>
@@ -10752,8 +11675,8 @@
         <w:t xml:space="preserve">.</w:t>
       </w:r>
     </w:p>
-    <w:bookmarkEnd w:id="94"/>
-    <w:bookmarkStart w:id="96" w:name="ref-schmidt_concomitant_2005"/>
+    <w:bookmarkEnd w:id="99"/>
+    <w:bookmarkStart w:id="101" w:name="ref-schmidt_concomitant_2005"/>
     <w:p>
       <w:pPr>
         <w:pStyle w:val="Bibliography"/>
@@ -10849,7 +11772,7 @@
       <w:r>
         <w:t xml:space="preserve"> </w:t>
       </w:r>
-      <w:hyperlink r:id="rId95">
+      <w:hyperlink r:id="rId100">
         <w:r>
           <w:rPr>
             <w:rStyle w:val="Hyperlink"/>
@@ -10861,8 +11784,8 @@
         <w:t xml:space="preserve">.</w:t>
       </w:r>
     </w:p>
-    <w:bookmarkEnd w:id="96"/>
-    <w:bookmarkStart w:id="98" w:name="ref-sheridan_shrinking_2011"/>
+    <w:bookmarkEnd w:id="101"/>
+    <w:bookmarkStart w:id="103" w:name="ref-sheridan_shrinking_2011"/>
     <w:p>
       <w:pPr>
         <w:pStyle w:val="Bibliography"/>
@@ -10895,7 +11818,7 @@
       <w:r>
         <w:t xml:space="preserve"> </w:t>
       </w:r>
-      <w:hyperlink r:id="rId97">
+      <w:hyperlink r:id="rId102">
         <w:r>
           <w:rPr>
             <w:rStyle w:val="Hyperlink"/>
@@ -10907,8 +11830,8 @@
         <w:t xml:space="preserve">.</w:t>
       </w:r>
     </w:p>
-    <w:bookmarkEnd w:id="98"/>
-    <w:bookmarkStart w:id="100" w:name="ref-silva2022atlanticants"/>
+    <w:bookmarkEnd w:id="103"/>
+    <w:bookmarkStart w:id="105" w:name="ref-silva2022atlanticants"/>
     <w:p>
       <w:pPr>
         <w:pStyle w:val="Bibliography"/>
@@ -10944,7 +11867,7 @@
       <w:r>
         <w:t xml:space="preserve"> </w:t>
       </w:r>
-      <w:hyperlink r:id="rId99">
+      <w:hyperlink r:id="rId104">
         <w:r>
           <w:rPr>
             <w:rStyle w:val="Hyperlink"/>
@@ -10956,8 +11879,8 @@
         <w:t xml:space="preserve">.</w:t>
       </w:r>
     </w:p>
-    <w:bookmarkEnd w:id="100"/>
-    <w:bookmarkStart w:id="102" w:name="ref-teplitsky_climate_2014"/>
+    <w:bookmarkEnd w:id="105"/>
+    <w:bookmarkStart w:id="107" w:name="ref-teplitsky_climate_2014"/>
     <w:p>
       <w:pPr>
         <w:pStyle w:val="Bibliography"/>
@@ -10999,7 +11922,7 @@
       <w:r>
         <w:t xml:space="preserve"> </w:t>
       </w:r>
-      <w:hyperlink r:id="rId101">
+      <w:hyperlink r:id="rId106">
         <w:r>
           <w:rPr>
             <w:rStyle w:val="Hyperlink"/>
@@ -11011,8 +11934,8 @@
         <w:t xml:space="preserve">.</w:t>
       </w:r>
     </w:p>
-    <w:bookmarkEnd w:id="102"/>
-    <w:bookmarkStart w:id="104" w:name="ref-teplitsky_bergmanns_2008"/>
+    <w:bookmarkEnd w:id="107"/>
+    <w:bookmarkStart w:id="109" w:name="ref-teplitsky_bergmanns_2008"/>
     <w:p>
       <w:pPr>
         <w:pStyle w:val="Bibliography"/>
@@ -11057,7 +11980,7 @@
       <w:r>
         <w:t xml:space="preserve"> </w:t>
       </w:r>
-      <w:hyperlink r:id="rId103">
+      <w:hyperlink r:id="rId108">
         <w:r>
           <w:rPr>
             <w:rStyle w:val="Hyperlink"/>
@@ -11069,8 +11992,8 @@
         <w:t xml:space="preserve">.</w:t>
       </w:r>
     </w:p>
-    <w:bookmarkEnd w:id="104"/>
-    <w:bookmarkStart w:id="106" w:name="ref-viechtbauer2010metafor"/>
+    <w:bookmarkEnd w:id="109"/>
+    <w:bookmarkStart w:id="111" w:name="ref-viechtbauer2010metafor"/>
     <w:p>
       <w:pPr>
         <w:pStyle w:val="Bibliography"/>
@@ -11127,7 +12050,7 @@
       <w:r>
         <w:t xml:space="preserve"> </w:t>
       </w:r>
-      <w:hyperlink r:id="rId105">
+      <w:hyperlink r:id="rId110">
         <w:r>
           <w:rPr>
             <w:rStyle w:val="Hyperlink"/>
@@ -11139,8 +12062,8 @@
         <w:t xml:space="preserve">.</w:t>
       </w:r>
     </w:p>
-    <w:bookmarkEnd w:id="106"/>
-    <w:bookmarkStart w:id="108" w:name="ref-weeks2020"/>
+    <w:bookmarkEnd w:id="111"/>
+    <w:bookmarkStart w:id="113" w:name="ref-weeks2020"/>
     <w:p>
       <w:pPr>
         <w:pStyle w:val="Bibliography"/>
@@ -11173,7 +12096,7 @@
       <w:r>
         <w:t xml:space="preserve"> </w:t>
       </w:r>
-      <w:hyperlink r:id="rId107">
+      <w:hyperlink r:id="rId112">
         <w:r>
           <w:rPr>
             <w:rStyle w:val="Hyperlink"/>
@@ -11185,8 +12108,8 @@
         <w:t xml:space="preserve">.</w:t>
       </w:r>
     </w:p>
-    <w:bookmarkEnd w:id="108"/>
-    <w:bookmarkStart w:id="110" w:name="ref-williams2025glmmtmb"/>
+    <w:bookmarkEnd w:id="113"/>
+    <w:bookmarkStart w:id="115" w:name="ref-williams2025glmmtmb"/>
     <w:p>
       <w:pPr>
         <w:pStyle w:val="Bibliography"/>
@@ -11216,7 +12139,7 @@
       <w:r>
         <w:t xml:space="preserve"> </w:t>
       </w:r>
-      <w:hyperlink r:id="rId109">
+      <w:hyperlink r:id="rId114">
         <w:r>
           <w:rPr>
             <w:rStyle w:val="Hyperlink"/>
@@ -11228,8 +12151,8 @@
         <w:t xml:space="preserve">.</w:t>
       </w:r>
     </w:p>
-    <w:bookmarkEnd w:id="110"/>
-    <w:bookmarkStart w:id="111" w:name="ref-wilman2014eltontraits"/>
+    <w:bookmarkEnd w:id="115"/>
+    <w:bookmarkStart w:id="116" w:name="ref-wilman2014eltontraits"/>
     <w:p>
       <w:pPr>
         <w:pStyle w:val="Bibliography"/>
@@ -11260,10 +12183,10 @@
         <w:t xml:space="preserve">95 (7): 2027–27.</w:t>
       </w:r>
     </w:p>
-    <w:bookmarkEnd w:id="111"/>
-    <w:bookmarkEnd w:id="112"/>
-    <w:bookmarkEnd w:id="113"/>
-    <w:bookmarkEnd w:id="114"/>
+    <w:bookmarkEnd w:id="116"/>
+    <w:bookmarkEnd w:id="117"/>
+    <w:bookmarkEnd w:id="118"/>
+    <w:bookmarkEnd w:id="119"/>
     <w:sectPr>
       <w:footerReference r:id="rIdFooter1" w:type="default"/>
       <w:footnotePr>

</xml_diff>

<commit_message>
style(isometry): streamline fig-isometry to display solely parsimonious observer model
- Remove crossed M1 estimates and ellipse from Panel A and Panel B of fig-isometry
- Center figure narrative on M1a observer control against Central Amazon benchmark
- Recompile index.qmd to HTML and DOCX
</commit_message>
<xml_diff>
--- a/Manuscript/index.docx
+++ b/Manuscript/index.docx
@@ -4154,45 +4154,7 @@
               </m:r>
             </m:oMath>
             <w:r>
-              <w:t xml:space="preserve">, rejecting isometry toward mass conservation/stoutening) and crossed observer plus municipality control (M1; purple diamond;</w:t>
-            </w:r>
-            <w:r>
-              <w:t xml:space="preserve"> </w:t>
-            </w:r>
-            <m:oMath>
-              <m:r>
-                <m:t>z</m:t>
-              </m:r>
-              <m:r>
-                <m:rPr>
-                  <m:sty m:val="p"/>
-                </m:rPr>
-                <m:t>=</m:t>
-              </m:r>
-              <m:r>
-                <m:t>1.93</m:t>
-              </m:r>
-              <m:r>
-                <m:rPr>
-                  <m:sty m:val="p"/>
-                </m:rPr>
-                <m:t>,</m:t>
-              </m:r>
-              <m:r>
-                <m:t>p</m:t>
-              </m:r>
-              <m:r>
-                <m:rPr>
-                  <m:sty m:val="p"/>
-                </m:rPr>
-                <m:t>=</m:t>
-              </m:r>
-              <m:r>
-                <m:t>0.054</m:t>
-              </m:r>
-            </m:oMath>
-            <w:r>
-              <w:t xml:space="preserve">). The central Amazonian benchmark from</w:t>
+              <w:t xml:space="preserve">, rejecting isometry toward mass conservation/stoutening). The central Amazonian benchmark from</w:t>
             </w:r>
             <w:r>
               <w:t xml:space="preserve"> </w:t>
@@ -4296,7 +4258,7 @@
               </m:r>
             </m:oMath>
             <w:r>
-              <w:t xml:space="preserve">), and shaded zones denote proportional shrinkage (blue) and morphological decoupling/slenderization (red). Green and purple ellipses denote 95% confidence ellipses for M1a and M1, respectively, which encompass mass stasis and exclude Amazonian slenderization. Semi-transparent circles represent species-specific controlled estimates (</w:t>
+              <w:t xml:space="preserve">), and shaded zones denote proportional shrinkage (blue) and morphological decoupling/slenderization (red). The green ellipse denotes the 95% confidence ellipse for the Atlantic Forest community under observer control, encompassing mass stasis and excluding Amazonian slenderization. Semi-transparent circles represent species-specific controlled estimates (</w:t>
             </w:r>
             <m:oMath>
               <m:r>

</xml_diff>

<commit_message>
refactor(models): adopt observer-only random effects across univariate models and update manuscript docx
</commit_message>
<xml_diff>
--- a/Manuscript/index.docx
+++ b/Manuscript/index.docx
@@ -1172,7 +1172,7 @@
                     <w:jc w:val="center"/>
                   </w:pPr>
                   <w:r>
-                    <w:t xml:space="preserve">M1: + Observer + Municipality intercepts</w:t>
+                    <w:t xml:space="preserve">M1: + Observer intercept (Main_researcher)</w:t>
                   </w:r>
                 </w:p>
               </w:tc>
@@ -1185,7 +1185,7 @@
                     <w:jc w:val="center"/>
                   </w:pPr>
                   <w:r>
-                    <w:t xml:space="preserve">−0.53</w:t>
+                    <w:t xml:space="preserve">−0.68</w:t>
                   </w:r>
                 </w:p>
               </w:tc>
@@ -1198,7 +1198,7 @@
                     <w:jc w:val="center"/>
                   </w:pPr>
                   <w:r>
-                    <w:t xml:space="preserve">[−0.92, −0.13]</w:t>
+                    <w:t xml:space="preserve">[−1.08, −0.28]</w:t>
                   </w:r>
                 </w:p>
               </w:tc>
@@ -1211,7 +1211,7 @@
                     <w:jc w:val="center"/>
                   </w:pPr>
                   <w:r>
-                    <w:t xml:space="preserve">−1.1</w:t>
+                    <w:t xml:space="preserve">−1.4</w:t>
                   </w:r>
                 </w:p>
               </w:tc>
@@ -1668,7 +1668,7 @@
         <w:pStyle w:val="BodyText"/>
       </w:pPr>
       <w:r>
-        <w:t xml:space="preserve">Accounting for observer identity and municipality (M1) immediately halved the estimated rate of decline to</w:t>
+        <w:t xml:space="preserve">Accounting for observer identity (M1) immediately reduced the estimated rate of decline to</w:t>
       </w:r>
       <w:r>
         <w:t xml:space="preserve"> </w:t>
@@ -1690,14 +1690,14 @@
           <m:t>−</m:t>
         </m:r>
         <m:r>
-          <m:t>0.53</m:t>
+          <m:t>0.68</m:t>
         </m:r>
       </m:oMath>
       <w:r>
         <w:t xml:space="preserve"> </w:t>
       </w:r>
       <w:r>
-        <w:t xml:space="preserve">mm/SD-year (−1.1 mm/decade;</w:t>
+        <w:t xml:space="preserve">mm/SD-year (−1.4 mm/decade;</w:t>
       </w:r>
       <w:r>
         <w:t xml:space="preserve"> </w:t>
@@ -2655,7 +2655,7 @@
         <w:pStyle w:val="BodyText"/>
       </w:pPr>
       <w:r>
-        <w:t xml:space="preserve">Accounting for observer identity and municipality (M1) reduced this slope to</w:t>
+        <w:t xml:space="preserve">Accounting for observer identity (M1) reduced this slope to</w:t>
       </w:r>
       <w:r>
         <w:t xml:space="preserve"> </w:t>
@@ -2677,14 +2677,14 @@
           <m:t>−</m:t>
         </m:r>
         <m:r>
-          <m:t>0.0056</m:t>
+          <m:t>0.0063</m:t>
         </m:r>
       </m:oMath>
       <w:r>
         <w:t xml:space="preserve"> </w:t>
       </w:r>
       <w:r>
-        <w:t xml:space="preserve">per SD-year (95% CI: −0.0164 to 0.0051, −1.1%/decade;</w:t>
+        <w:t xml:space="preserve">per SD-year (95% CI: −0.0160 to 0.0034, −1.3%/decade;</w:t>
       </w:r>
       <w:r>
         <w:t xml:space="preserve"> </w:t>
@@ -2972,7 +2972,7 @@
                     <w:jc w:val="center"/>
                   </w:pPr>
                   <w:r>
-                    <w:t xml:space="preserve">Full sample (N = 11,077): Body mass M1 (+ Observer + Municipality)</w:t>
+                    <w:t xml:space="preserve">Full sample (N = 11,077): Body mass M1 (+ Observer intercept)</w:t>
                   </w:r>
                 </w:p>
               </w:tc>
@@ -2985,7 +2985,7 @@
                     <w:jc w:val="center"/>
                   </w:pPr>
                   <w:r>
-                    <w:t xml:space="preserve">−0.0056</w:t>
+                    <w:t xml:space="preserve">−0.0063</w:t>
                   </w:r>
                 </w:p>
               </w:tc>
@@ -2998,7 +2998,7 @@
                     <w:jc w:val="center"/>
                   </w:pPr>
                   <w:r>
-                    <w:t xml:space="preserve">[−0.0164, 0.0051]</w:t>
+                    <w:t xml:space="preserve">[−0.0160, 0.0034]</w:t>
                   </w:r>
                 </w:p>
               </w:tc>
@@ -3011,7 +3011,7 @@
                     <w:jc w:val="center"/>
                   </w:pPr>
                   <w:r>
-                    <w:t xml:space="preserve">−1.1%</w:t>
+                    <w:t xml:space="preserve">−1.3%</w:t>
                   </w:r>
                 </w:p>
               </w:tc>
@@ -3240,7 +3240,7 @@
                     <w:jc w:val="center"/>
                   </w:pPr>
                   <w:r>
-                    <w:t xml:space="preserve">Shared records (N = 7,577): Wing length rate (M1a Observer only)</w:t>
+                    <w:t xml:space="preserve">Shared records (N = 7,577): Wing length rate (Observer control)</w:t>
                   </w:r>
                 </w:p>
               </w:tc>
@@ -3307,7 +3307,7 @@
                     <w:jc w:val="center"/>
                   </w:pPr>
                   <w:r>
-                    <w:t xml:space="preserve">Shared records (N = 7,577): Body mass rate (M1a Observer only)</w:t>
+                    <w:t xml:space="preserve">Shared records (N = 7,577): Body mass rate (Observer control)</w:t>
                   </w:r>
                 </w:p>
               </w:tc>
@@ -3374,7 +3374,7 @@
                     <w:jc w:val="center"/>
                   </w:pPr>
                   <w:r>
-                    <w:t xml:space="preserve">Shared records (N = 7,577): Geometric isometry contrast (M1a Observer only)</w:t>
+                    <w:t xml:space="preserve">Shared records (N = 7,577): Geometric isometry contrast (Mass − 3 × Wing)</w:t>
                   </w:r>
                 </w:p>
               </w:tc>
@@ -3431,73 +3431,6 @@
                 </w:p>
               </w:tc>
             </w:tr>
-            <w:tr>
-              <w:tc>
-                <w:tcPr/>
-                <w:p>
-                  <w:pPr>
-                    <w:pStyle w:val="Compact"/>
-                    <w:jc w:val="left"/>
-                    <w:jc w:val="center"/>
-                  </w:pPr>
-                  <w:r>
-                    <w:t xml:space="preserve">Shared records (N = 7,577): Geometric isometry contrast (M1 Observer + Municipality)</w:t>
-                  </w:r>
-                </w:p>
-              </w:tc>
-              <w:tc>
-                <w:tcPr/>
-                <w:p>
-                  <w:pPr>
-                    <w:pStyle w:val="Compact"/>
-                    <w:jc w:val="left"/>
-                    <w:jc w:val="center"/>
-                  </w:pPr>
-                  <w:r>
-                    <w:t xml:space="preserve">—</w:t>
-                  </w:r>
-                </w:p>
-              </w:tc>
-              <w:tc>
-                <w:tcPr/>
-                <w:p>
-                  <w:pPr>
-                    <w:pStyle w:val="Compact"/>
-                    <w:jc w:val="left"/>
-                    <w:jc w:val="center"/>
-                  </w:pPr>
-                  <w:r>
-                    <w:t xml:space="preserve">[−0.1, 8.1]</w:t>
-                  </w:r>
-                </w:p>
-              </w:tc>
-              <w:tc>
-                <w:tcPr/>
-                <w:p>
-                  <w:pPr>
-                    <w:pStyle w:val="Compact"/>
-                    <w:jc w:val="left"/>
-                    <w:jc w:val="center"/>
-                  </w:pPr>
-                  <w:r>
-                    <w:t xml:space="preserve">+4.0%</w:t>
-                  </w:r>
-                </w:p>
-              </w:tc>
-              <w:tc>
-                <w:tcPr/>
-                <w:p>
-                  <w:pPr>
-                    <w:pStyle w:val="Compact"/>
-                    <w:jc w:val="left"/>
-                    <w:jc w:val="center"/>
-                  </w:pPr>
-                  <w:r>
-                    <w:t xml:space="preserve">7,577</w:t>
-                  </w:r>
-                </w:p>
-              </w:tc>
-            </w:tr>
           </w:tbl>
           <w:bookmarkEnd w:id="30"/>
           <w:p/>
@@ -3730,7 +3663,7 @@
         <w:pStyle w:val="BodyText"/>
       </w:pPr>
       <w:r>
-        <w:t xml:space="preserve">In large-scale compilations, administrative municipalities are heavily nested within research groups: in our shared analytical sample, 110 of 128 municipalities (85.9%) were sampled by only a single researcher. Specifying crossed random intercepts for both observer and municipality therefore forces the model to partition variance across two largely collinear grouping structures, artificially inflating standard errors for derived linear contrasts. In our primary, parsimonious observer model (M1a), which directly controls for observer measurement idiosyncrasies while avoiding redundant spatial overcontrolling, wing length declined by −1.9%/decade (95% CI: −3.1 to −0.7%) while body mass exhibited decadal stability (−0.9%/decade, 95% CI: −2.7 to 1.0%;</w:t>
+        <w:t xml:space="preserve">Across the 7,577 shared records measured simultaneously for both traits under observer control, wing length declined by −1.9%/decade (95% CI: −3.1 to −0.7%) while body mass exhibited decadal stability (−0.9%/decade, 95% CI: −2.7 to 1.0%;</w:t>
       </w:r>
       <w:r>
         <w:t xml:space="preserve"> </w:t>
@@ -3803,7 +3736,7 @@
         </m:r>
       </m:oMath>
       <w:r>
-        <w:t xml:space="preserve">). Under the parsimonious observer model (M1a), the contrast was +4.9%/decade (95% CI: 0.8 to 8.9%,</w:t>
+        <w:t xml:space="preserve">). Under observer control, the contrast was +4.9%/decade (95% CI: 0.8 to 8.9%,</w:t>
       </w:r>
       <w:r>
         <w:t xml:space="preserve"> </w:t>
@@ -3882,47 +3815,7 @@
         <w:pStyle w:val="BodyText"/>
       </w:pPr>
       <w:r>
-        <w:t xml:space="preserve">Under the crossed observer-plus-municipality specification (M1), variance competition between the collinear grouping factors widened the standard error (SE = 2.09% vs. 2.06%), yielding a contrast of +4.0%/decade (95% CI: −0.1 to 8.1%,</w:t>
-      </w:r>
-      <w:r>
-        <w:t xml:space="preserve"> </w:t>
-      </w:r>
-      <m:oMath>
-        <m:r>
-          <m:t>z</m:t>
-        </m:r>
-        <m:r>
-          <m:rPr>
-            <m:sty m:val="p"/>
-          </m:rPr>
-          <m:t>=</m:t>
-        </m:r>
-        <m:r>
-          <m:t>1.93</m:t>
-        </m:r>
-      </m:oMath>
-      <w:r>
-        <w:t xml:space="preserve">,</w:t>
-      </w:r>
-      <w:r>
-        <w:t xml:space="preserve"> </w:t>
-      </w:r>
-      <m:oMath>
-        <m:r>
-          <m:t>p</m:t>
-        </m:r>
-        <m:r>
-          <m:rPr>
-            <m:sty m:val="p"/>
-          </m:rPr>
-          <m:t>=</m:t>
-        </m:r>
-        <m:r>
-          <m:t>0.054</m:t>
-        </m:r>
-      </m:oMath>
-      <w:r>
-        <w:t xml:space="preserve">). Crucially, under both specifications, the contrast is strongly positive (+4.0% to +4.9%), never negative. In bivariate morphospace (</w:t>
+        <w:t xml:space="preserve">In bivariate morphospace (</w:t>
       </w:r>
       <w:hyperlink w:anchor="fig-isometry">
         <w:r>
@@ -4409,7 +4302,7 @@
         <w:pStyle w:val="BodyText"/>
       </w:pPr>
       <w:r>
-        <w:t xml:space="preserve">However, bill width was recorded by 22 field researchers across the dataset, and only two researchers sampled birds in both the early (1995–2006) and late (2013–2018) periods. When researcher identity and municipality were accounted for (M1), this apparent positive trajectory collapsed completely to zero (</w:t>
+        <w:t xml:space="preserve">However, bill width was recorded by 22 field researchers across the dataset, and only two researchers sampled birds in both the early (1995–2006) and late (2013–2018) periods. When researcher identity was accounted for (M1), this apparent positive trajectory collapsed completely (</w:t>
       </w:r>
       <m:oMath>
         <m:r>
@@ -4428,14 +4321,14 @@
           <m:t>−</m:t>
         </m:r>
         <m:r>
-          <m:t>0.03</m:t>
+          <m:t>0.24</m:t>
         </m:r>
       </m:oMath>
       <w:r>
         <w:t xml:space="preserve"> </w:t>
       </w:r>
       <w:r>
-        <w:t xml:space="preserve">mm/SD-year, 95% CI: −0.18 to 0.12,</w:t>
+        <w:t xml:space="preserve">mm/SD-year, 95% CI: −0.39 to −0.10,</w:t>
       </w:r>
       <w:r>
         <w:t xml:space="preserve"> </w:t>
@@ -5291,7 +5184,7 @@
         </m:r>
       </m:oMath>
       <w:r>
-        <w:t xml:space="preserve">) appeared to increase by +9.6%/decade (95% CI: +6.3 to +13.0%). Adding contributor and site random intercepts to the dispersion model (S3) reversed the estimate to −6.3%/decade (95% CI: −13.4 to +1.5%), overlapping zero. Furthermore, adding time-resolved local temperature to the dispersion model (S7) yielded a null association with residual variance (−0.7% per SD temperature, 95% CI: −8.7 to +8.1%,</w:t>
+        <w:t xml:space="preserve">) appeared to increase by +9.6%/decade (95% CI: +6.3 to +13.0%). Adding contributor random intercepts to the dispersion model (S3) reversed the estimate to −6.3%/decade (95% CI: −13.4 to +1.5%), overlapping zero. Furthermore, adding time-resolved local temperature to the dispersion model (S7) yielded a null association with residual variance (−0.7% per SD temperature, 95% CI: −8.7 to +8.1%,</w:t>
       </w:r>
       <w:r>
         <w:t xml:space="preserve"> </w:t>
@@ -5392,7 +5285,7 @@
         </m:r>
       </m:oMath>
       <w:r>
-        <w:t xml:space="preserve">). However, adding contributor and municipality intercepts halved this interaction to</w:t>
+        <w:t xml:space="preserve">). However, adding contributor intercepts halved this interaction to</w:t>
       </w:r>
       <w:r>
         <w:t xml:space="preserve"> </w:t>
@@ -5561,7 +5454,7 @@
               <w:pStyle w:val="ImageCaption"/>
             </w:pPr>
             <w:r>
-              <w:t xml:space="preserve">Figure 7: Decadal wing-length change as a function of dietary reliance on invertebrates. (Top) Predicted change in wing length (mm) over time across the 10th (p10, blue), 50th (p50, orange), and 90th (p90, red) species-weighted percentiles of invertebrate diet proportion (continuous Model A), with shaded ribbons denoting Rubin-pooled 95% uncertainty across 50 phylogenetic trees. (Bottom) Predicted wing trajectories for species categorized by primary diet (Model B: Invertebrate vs Other diet). Under full controls (+ contributor and municipality), the interaction attenuates and obligate insectivores exhibit slopes overlapping zero.</w:t>
+              <w:t xml:space="preserve">Figure 7: Decadal wing-length change as a function of dietary reliance on invertebrates. (Top) Predicted change in wing length (mm) over time across the 10th (p10, blue), 50th (p50, orange), and 90th (p90, red) species-weighted percentiles of invertebrate diet proportion (continuous Model A), with shaded ribbons denoting Rubin-pooled 95% uncertainty across 50 phylogenetic trees. (Bottom) Predicted wing trajectories for species categorized by primary diet (Model B: Invertebrate vs Other diet). Under full controls (+ contributor), the interaction attenuates and obligate insectivores exhibit slopes overlapping zero.</w:t>
             </w:r>
           </w:p>
           <w:bookmarkEnd w:id="45"/>
@@ -6517,22 +6410,13 @@
       </w:r>
     </w:p>
     <w:bookmarkEnd w:id="55"/>
-    <w:bookmarkStart w:id="56" w:name="X7ec42846ed14f019991479d92721b67651b6e82"/>
+    <w:bookmarkStart w:id="56" w:name="Xfad59f5c48d6cb7277320f018ba251711124662"/>
     <w:p>
       <w:pPr>
         <w:pStyle w:val="Heading3"/>
       </w:pPr>
       <w:r>
-        <w:t xml:space="preserve">4.2.2 Spatial turnover and municipal random effects (</w:t>
-      </w:r>
-      <w:r>
-        <w:rPr>
-          <w:rStyle w:val="VerbatimChar"/>
-        </w:rPr>
-        <w:t xml:space="preserve">Municipality</w:t>
-      </w:r>
-      <w:r>
-        <w:t xml:space="preserve">)</w:t>
+        <w:t xml:space="preserve">4.2.2 Spatial provenance and continuous environmental controls</w:t>
       </w:r>
     </w:p>
     <w:p>
@@ -6606,40 +6490,86 @@
         <w:pStyle w:val="BodyText"/>
       </w:pPr>
       <w:r>
-        <w:t xml:space="preserve">To account for spatial clustering and local population differentiation, we evaluated spatial grouping variables. While the database contains a specific field station/farm name column (</w:t>
+        <w:t xml:space="preserve">To account for continuous spatial and elevational variation without discarding records or introducing artificial clustering, models incorporated standardized latitude (</w:t>
       </w:r>
       <w:r>
         <w:rPr>
           <w:rStyle w:val="VerbatimChar"/>
         </w:rPr>
-        <w:t xml:space="preserve">Locality</w:t>
-      </w:r>
-      <w:r>
-        <w:t xml:space="preserve">), this column contains 193 levels and 11% missing values (NA). Using</w:t>
-      </w:r>
-      <w:r>
-        <w:t xml:space="preserve"> </w:t>
+        <w:t xml:space="preserve">scaled_lat</w:t>
+      </w:r>
+      <w:r>
+        <w:t xml:space="preserve">), standardized longitude (</w:t>
       </w:r>
       <w:r>
         <w:rPr>
           <w:rStyle w:val="VerbatimChar"/>
         </w:rPr>
-        <w:t xml:space="preserve">Locality</w:t>
-      </w:r>
-      <w:r>
-        <w:t xml:space="preserve"> </w:t>
-      </w:r>
-      <w:r>
-        <w:t xml:space="preserve">as a random effect would therefore discard over 1,000 biological records due to missing locality names. In contrast, municipality (</w:t>
+        <w:t xml:space="preserve">scaled_long</w:t>
+      </w:r>
+      <w:r>
+        <w:t xml:space="preserve">), and standardized elevation (</w:t>
       </w:r>
       <w:r>
         <w:rPr>
           <w:rStyle w:val="VerbatimChar"/>
         </w:rPr>
-        <w:t xml:space="preserve">Municipality</w:t>
-      </w:r>
-      <w:r>
-        <w:t xml:space="preserve">, 130 levels) is 100% complete across all 12,571 analytical records.</w:t>
+        <w:t xml:space="preserve">scaled_elev</w:t>
+      </w:r>
+      <w:r>
+        <w:t xml:space="preserve">) as continuous covariates.</w:t>
+      </w:r>
+    </w:p>
+    <w:bookmarkEnd w:id="56"/>
+    <w:bookmarkStart w:id="57" w:name="X7ded9429c4cba6fd745661808c9b73d14ee2c47"/>
+    <w:p>
+      <w:pPr>
+        <w:pStyle w:val="Heading3"/>
+      </w:pPr>
+      <w:r>
+        <w:t xml:space="preserve">4.2.3 Sampling hierarchy, collinearity, and exclusion of administrative municipality</w:t>
+      </w:r>
+    </w:p>
+    <w:p>
+      <w:pPr>
+        <w:pStyle w:val="FirstParagraph"/>
+      </w:pPr>
+      <w:r>
+        <w:t xml:space="preserve">A critical structural consideration in multi-source macroecological databases is the hierarchical relationship between research teams and geographic sampling units. Across the 24-year ATLANTIC BIRD TRAITS compilation, individual field projects were typically conducted by distinct research groups operating within specific municipal territories. Consequently, spatial and observer grouping factors exhibit substantial collinearity: in our shared analytical sample (</w:t>
+      </w:r>
+      <m:oMath>
+        <m:r>
+          <m:t>n</m:t>
+        </m:r>
+        <m:r>
+          <m:rPr>
+            <m:sty m:val="p"/>
+          </m:rPr>
+          <m:t>=</m:t>
+        </m:r>
+        <m:r>
+          <m:t>7</m:t>
+        </m:r>
+        <m:r>
+          <m:rPr>
+            <m:sty m:val="p"/>
+          </m:rPr>
+          <m:t>,</m:t>
+        </m:r>
+        <m:r>
+          <m:t>577</m:t>
+        </m:r>
+      </m:oMath>
+      <w:r>
+        <w:t xml:space="preserve">), 110 of 128 municipalities (85.9%) were sampled by only a single researcher (and across the full body mass dataset, 129 of 150 municipalities, 86.0%, were sampled by a single researcher). Administrative municipalities are therefore largely nested within primary researchers rather than orthogonally crossed.</w:t>
+      </w:r>
+    </w:p>
+    <w:p>
+      <w:pPr>
+        <w:pStyle w:val="BodyText"/>
+      </w:pPr>
+      <w:r>
+        <w:t xml:space="preserve">Because morphometric measurement error (caliper tension, wing flattening, scale calibration) is a proximate property of the research team rather than administrative municipal boundaries, and because geographic and altitudinal clines are directly controlled via continuous coordinates and elevation, incorporating a redundant</w:t>
       </w:r>
       <w:r>
         <w:t xml:space="preserve"> </w:t>
@@ -6648,206 +6578,22 @@
         <w:rPr>
           <w:rStyle w:val="VerbatimChar"/>
         </w:rPr>
-        <w:t xml:space="preserve">Municipality</w:t>
-      </w:r>
-      <w:r>
-        <w:t xml:space="preserve"> </w:t>
-      </w:r>
-      <w:r>
-        <w:t xml:space="preserve">represents an administrative spatial unit that groups contiguous field stations and forest fragments within local landscapes without any data loss. We therefore incorporated</w:t>
-      </w:r>
-      <w:r>
-        <w:t xml:space="preserve"> </w:t>
+        <w:t xml:space="preserve">(1 | Municipality)</w:t>
+      </w:r>
+      <w:r>
+        <w:t xml:space="preserve"> </w:t>
+      </w:r>
+      <w:r>
+        <w:t xml:space="preserve">random intercept induces variance competition, collinearity, and parameter inflation without improving model fit. We therefore adopted the parsimonious observer model (</w:t>
       </w:r>
       <w:r>
         <w:rPr>
           <w:rStyle w:val="VerbatimChar"/>
         </w:rPr>
-        <w:t xml:space="preserve">(1 | Municipality)</w:t>
-      </w:r>
-      <w:r>
-        <w:t xml:space="preserve"> </w:t>
-      </w:r>
-      <w:r>
-        <w:t xml:space="preserve">as a spatial random intercept. To capture continuous spatial and elevational variation, subsequent model tiers also included standardized latitude (</w:t>
-      </w:r>
-      <w:r>
-        <w:rPr>
-          <w:rStyle w:val="VerbatimChar"/>
-        </w:rPr>
-        <w:t xml:space="preserve">scaled_lat</w:t>
-      </w:r>
-      <w:r>
-        <w:t xml:space="preserve">), standardized longitude (</w:t>
-      </w:r>
-      <w:r>
-        <w:rPr>
-          <w:rStyle w:val="VerbatimChar"/>
-        </w:rPr>
-        <w:t xml:space="preserve">scaled_long</w:t>
-      </w:r>
-      <w:r>
-        <w:t xml:space="preserve">), and elevation (</w:t>
-      </w:r>
-      <w:r>
-        <w:rPr>
-          <w:rStyle w:val="VerbatimChar"/>
-        </w:rPr>
-        <w:t xml:space="preserve">scaled_elev</w:t>
-      </w:r>
-      <w:r>
-        <w:t xml:space="preserve">).</w:t>
-      </w:r>
-    </w:p>
-    <w:bookmarkEnd w:id="56"/>
-    <w:bookmarkStart w:id="57" w:name="Xa30f2827d24a6efc15db52e8aa988b36f28fc91"/>
-    <w:p>
-      <w:pPr>
-        <w:pStyle w:val="Heading3"/>
-      </w:pPr>
-      <w:r>
-        <w:t xml:space="preserve">4.2.3 Sampling hierarchy, collinearity, and random-effect specifications</w:t>
-      </w:r>
-    </w:p>
-    <w:p>
-      <w:pPr>
-        <w:pStyle w:val="FirstParagraph"/>
-      </w:pPr>
-      <w:r>
-        <w:t xml:space="preserve">A critical structural consideration in multi-source macroecological databases is the hierarchical relationship between research teams and geographic sampling units. Across the 24-year ATLANTIC BIRD TRAITS compilation, individual field projects were typically conducted by distinct research groups operating within specific municipal territories. Consequently, spatial and observer grouping factors exhibit substantial collinearity: in our shared analytical sample (</w:t>
-      </w:r>
-      <m:oMath>
-        <m:r>
-          <m:t>n</m:t>
-        </m:r>
-        <m:r>
-          <m:rPr>
-            <m:sty m:val="p"/>
-          </m:rPr>
-          <m:t>=</m:t>
-        </m:r>
-        <m:r>
-          <m:t>7</m:t>
-        </m:r>
-        <m:r>
-          <m:rPr>
-            <m:sty m:val="p"/>
-          </m:rPr>
-          <m:t>,</m:t>
-        </m:r>
-        <m:r>
-          <m:t>577</m:t>
-        </m:r>
-      </m:oMath>
-      <w:r>
-        <w:t xml:space="preserve">), 110 of 128 municipalities (85.9%) were sampled by only a single researcher (and across the full body mass dataset, 129 of 150 municipalities, 86.0%, were sampled by a single researcher). Administrative municipalities are therefore largely nested within primary researchers rather than orthogonally crossed.</w:t>
-      </w:r>
-    </w:p>
-    <w:p>
-      <w:pPr>
-        <w:pStyle w:val="BodyText"/>
-      </w:pPr>
-      <w:r>
-        <w:t xml:space="preserve">In our primary single-trait model ladders (M1, M2, M3 for wing length, body mass, and bill width across 11,000–12,500 records), we deliberately retained both</w:t>
-      </w:r>
-      <w:r>
-        <w:t xml:space="preserve"> </w:t>
-      </w:r>
-      <w:r>
-        <w:rPr>
-          <w:rStyle w:val="VerbatimChar"/>
-        </w:rPr>
         <w:t xml:space="preserve">(1 | Main_researcher)</w:t>
       </w:r>
       <w:r>
-        <w:t xml:space="preserve"> </w:t>
-      </w:r>
-      <w:r>
-        <w:t xml:space="preserve">and</w:t>
-      </w:r>
-      <w:r>
-        <w:t xml:space="preserve"> </w:t>
-      </w:r>
-      <w:r>
-        <w:rPr>
-          <w:rStyle w:val="VerbatimChar"/>
-        </w:rPr>
-        <w:t xml:space="preserve">(1 | Municipality)</w:t>
-      </w:r>
-      <w:r>
-        <w:t xml:space="preserve"> </w:t>
-      </w:r>
-      <w:r>
-        <w:t xml:space="preserve">as crossed random intercepts. In these macroecological control tiers, retaining both components provides a conservative dual safeguard:</w:t>
-      </w:r>
-      <w:r>
-        <w:t xml:space="preserve"> </w:t>
-      </w:r>
-      <w:r>
-        <w:rPr>
-          <w:rStyle w:val="VerbatimChar"/>
-        </w:rPr>
-        <w:t xml:space="preserve">(1 | Main_researcher)</w:t>
-      </w:r>
-      <w:r>
-        <w:t xml:space="preserve"> </w:t>
-      </w:r>
-      <w:r>
-        <w:t xml:space="preserve">absorbs idiosyncratic measurement biases among field teams (the dominant proximate driver of caliper tension and wing flattening differences), while</w:t>
-      </w:r>
-      <w:r>
-        <w:t xml:space="preserve"> </w:t>
-      </w:r>
-      <w:r>
-        <w:rPr>
-          <w:rStyle w:val="VerbatimChar"/>
-        </w:rPr>
-        <w:t xml:space="preserve">(1 | Municipality)</w:t>
-      </w:r>
-      <w:r>
-        <w:t xml:space="preserve"> </w:t>
-      </w:r>
-      <w:r>
-        <w:t xml:space="preserve">absorbs fine-scale geographic clustering and local population structure across the biome. As documented in our model comparison ladder (</w:t>
-      </w:r>
-      <w:hyperlink w:anchor="tbl-controlled-wing">
-        <w:r>
-          <w:rPr>
-            <w:rStyle w:val="Hyperlink"/>
-          </w:rPr>
-          <w:t xml:space="preserve">Table 1</w:t>
-        </w:r>
-      </w:hyperlink>
-      <w:r>
-        <w:t xml:space="preserve">), both components contribute independently to attenuating naive baseline trends without compromising model convergence.</w:t>
-      </w:r>
-    </w:p>
-    <w:p>
-      <w:pPr>
-        <w:pStyle w:val="BodyText"/>
-      </w:pPr>
-      <w:r>
-        <w:t xml:space="preserve">However, for linear combinations of coefficients across traits—such as the geometric isometry contrast on shared individuals—variance competition between two 86% collinear grouping factors inflates the standard error of the contrast. Because observer technique directly governs morphometric measurement error, we adopted the parsimonious observer model (</w:t>
-      </w:r>
-      <w:r>
-        <w:rPr>
-          <w:b/>
-          <w:bCs/>
-        </w:rPr>
-        <w:t xml:space="preserve">M1a</w:t>
-      </w:r>
-      <w:r>
-        <w:t xml:space="preserve">) as the primary specification for the bivariate isometry test, reporting the crossed model (</w:t>
-      </w:r>
-      <w:r>
-        <w:rPr>
-          <w:b/>
-          <w:bCs/>
-        </w:rPr>
-        <w:t xml:space="preserve">M1</w:t>
-      </w:r>
-      <w:r>
-        <w:t xml:space="preserve">) alongside it for full sensitivity and transparency.</w:t>
+        <w:t xml:space="preserve">) across all univariate and bivariate model tiers, avoiding collinear crossed random effects while ensuring robust parameter estimation and biological interpretability.</w:t>
       </w:r>
     </w:p>
     <w:bookmarkEnd w:id="57"/>
@@ -6946,7 +6692,7 @@
         <w:t xml:space="preserve">M1</w:t>
       </w:r>
       <w:r>
-        <w:t xml:space="preserve">: Adding random intercepts for researcher identity</w:t>
+        <w:t xml:space="preserve">: Adding a random intercept for researcher identity</w:t>
       </w:r>
       <w:r>
         <w:t xml:space="preserve"> </w:t>
@@ -6961,19 +6707,7 @@
         <w:t xml:space="preserve"> </w:t>
       </w:r>
       <w:r>
-        <w:t xml:space="preserve">and spatial municipality</w:t>
-      </w:r>
-      <w:r>
-        <w:t xml:space="preserve"> </w:t>
-      </w:r>
-      <w:r>
-        <w:rPr>
-          <w:rStyle w:val="VerbatimChar"/>
-        </w:rPr>
-        <w:t xml:space="preserve">(1 | Municipality)</w:t>
-      </w:r>
-      <w:r>
-        <w:t xml:space="preserve">.</w:t>
+        <w:t xml:space="preserve">to absorb inter-observer measurement error.</w:t>
       </w:r>
     </w:p>
     <w:p>
@@ -7692,6 +7426,39 @@
         <w:rPr>
           <w:rStyle w:val="NormalTok"/>
         </w:rPr>
+        <w:t xml:space="preserve"> scaled_long </w:t>
+      </w:r>
+      <w:r>
+        <w:rPr>
+          <w:rStyle w:val="SpecialCharTok"/>
+        </w:rPr>
+        <w:t xml:space="preserve">+</w:t>
+      </w:r>
+      <w:r>
+        <w:rPr>
+          <w:rStyle w:val="NormalTok"/>
+        </w:rPr>
+        <w:t xml:space="preserve"> </w:t>
+      </w:r>
+      <w:r>
+        <w:br/>
+      </w:r>
+      <w:r>
+        <w:rPr>
+          <w:rStyle w:val="NormalTok"/>
+        </w:rPr>
+        <w:t xml:space="preserve">          scaled_elev </w:t>
+      </w:r>
+      <w:r>
+        <w:rPr>
+          <w:rStyle w:val="SpecialCharTok"/>
+        </w:rPr>
+        <w:t xml:space="preserve">+</w:t>
+      </w:r>
+      <w:r>
+        <w:rPr>
+          <w:rStyle w:val="NormalTok"/>
+        </w:rPr>
         <w:t xml:space="preserve"> season </w:t>
       </w:r>
       <w:r>
@@ -7716,6 +7483,54 @@
         <w:rPr>
           <w:rStyle w:val="NormalTok"/>
         </w:rPr>
+        <w:t xml:space="preserve"> (</w:t>
+      </w:r>
+      <w:r>
+        <w:rPr>
+          <w:rStyle w:val="DecValTok"/>
+        </w:rPr>
+        <w:t xml:space="preserve">1</w:t>
+      </w:r>
+      <w:r>
+        <w:rPr>
+          <w:rStyle w:val="NormalTok"/>
+        </w:rPr>
+        <w:t xml:space="preserve"> </w:t>
+      </w:r>
+      <w:r>
+        <w:rPr>
+          <w:rStyle w:val="SpecialCharTok"/>
+        </w:rPr>
+        <w:t xml:space="preserve">+</w:t>
+      </w:r>
+      <w:r>
+        <w:rPr>
+          <w:rStyle w:val="NormalTok"/>
+        </w:rPr>
+        <w:t xml:space="preserve"> scaled_yr </w:t>
+      </w:r>
+      <w:r>
+        <w:rPr>
+          <w:rStyle w:val="SpecialCharTok"/>
+        </w:rPr>
+        <w:t xml:space="preserve">||</w:t>
+      </w:r>
+      <w:r>
+        <w:rPr>
+          <w:rStyle w:val="NormalTok"/>
+        </w:rPr>
+        <w:t xml:space="preserve"> Binomial) </w:t>
+      </w:r>
+      <w:r>
+        <w:rPr>
+          <w:rStyle w:val="SpecialCharTok"/>
+        </w:rPr>
+        <w:t xml:space="preserve">+</w:t>
+      </w:r>
+      <w:r>
+        <w:rPr>
+          <w:rStyle w:val="NormalTok"/>
+        </w:rPr>
         <w:t xml:space="preserve"> </w:t>
       </w:r>
       <w:r>
@@ -7743,25 +7558,49 @@
         <w:rPr>
           <w:rStyle w:val="SpecialCharTok"/>
         </w:rPr>
+        <w:t xml:space="preserve">|</w:t>
+      </w:r>
+      <w:r>
+        <w:rPr>
+          <w:rStyle w:val="NormalTok"/>
+        </w:rPr>
+        <w:t xml:space="preserve"> Main_researcher) </w:t>
+      </w:r>
+      <w:r>
+        <w:rPr>
+          <w:rStyle w:val="SpecialCharTok"/>
+        </w:rPr>
         <w:t xml:space="preserve">+</w:t>
       </w:r>
       <w:r>
         <w:rPr>
           <w:rStyle w:val="NormalTok"/>
         </w:rPr>
-        <w:t xml:space="preserve"> scaled_yr </w:t>
+        <w:t xml:space="preserve"> (</w:t>
+      </w:r>
+      <w:r>
+        <w:rPr>
+          <w:rStyle w:val="DecValTok"/>
+        </w:rPr>
+        <w:t xml:space="preserve">1</w:t>
+      </w:r>
+      <w:r>
+        <w:rPr>
+          <w:rStyle w:val="NormalTok"/>
+        </w:rPr>
+        <w:t xml:space="preserve"> </w:t>
       </w:r>
       <w:r>
         <w:rPr>
           <w:rStyle w:val="SpecialCharTok"/>
         </w:rPr>
-        <w:t xml:space="preserve">||</w:t>
+        <w:t xml:space="preserve">|</w:t>
       </w:r>
       <w:r>
         <w:rPr>
           <w:rStyle w:val="NormalTok"/>
         </w:rPr>
-        <w:t xml:space="preserve"> Binomial) </w:t>
+        <w:t xml:space="preserve"> ID_individual) </w:t>
       </w:r>
       <w:r>
         <w:rPr>
@@ -7773,124 +7612,16 @@
         <w:rPr>
           <w:rStyle w:val="NormalTok"/>
         </w:rPr>
-        <w:t xml:space="preserve"> (</w:t>
-      </w:r>
-      <w:r>
-        <w:rPr>
-          <w:rStyle w:val="DecValTok"/>
-        </w:rPr>
-        <w:t xml:space="preserve">1</w:t>
+        <w:t xml:space="preserve"> </w:t>
+      </w:r>
+      <w:r>
+        <w:br/>
       </w:r>
       <w:r>
         <w:rPr>
           <w:rStyle w:val="NormalTok"/>
         </w:rPr>
-        <w:t xml:space="preserve"> </w:t>
-      </w:r>
-      <w:r>
-        <w:rPr>
-          <w:rStyle w:val="SpecialCharTok"/>
-        </w:rPr>
-        <w:t xml:space="preserve">|</w:t>
-      </w:r>
-      <w:r>
-        <w:rPr>
-          <w:rStyle w:val="NormalTok"/>
-        </w:rPr>
-        <w:t xml:space="preserve"> Main_researcher) </w:t>
-      </w:r>
-      <w:r>
-        <w:rPr>
-          <w:rStyle w:val="SpecialCharTok"/>
-        </w:rPr>
-        <w:t xml:space="preserve">+</w:t>
-      </w:r>
-      <w:r>
-        <w:rPr>
-          <w:rStyle w:val="NormalTok"/>
-        </w:rPr>
-        <w:t xml:space="preserve"> (</w:t>
-      </w:r>
-      <w:r>
-        <w:rPr>
-          <w:rStyle w:val="DecValTok"/>
-        </w:rPr>
-        <w:t xml:space="preserve">1</w:t>
-      </w:r>
-      <w:r>
-        <w:rPr>
-          <w:rStyle w:val="NormalTok"/>
-        </w:rPr>
-        <w:t xml:space="preserve"> </w:t>
-      </w:r>
-      <w:r>
-        <w:rPr>
-          <w:rStyle w:val="SpecialCharTok"/>
-        </w:rPr>
-        <w:t xml:space="preserve">|</w:t>
-      </w:r>
-      <w:r>
-        <w:rPr>
-          <w:rStyle w:val="NormalTok"/>
-        </w:rPr>
-        <w:t xml:space="preserve"> Municipality) </w:t>
-      </w:r>
-      <w:r>
-        <w:rPr>
-          <w:rStyle w:val="SpecialCharTok"/>
-        </w:rPr>
-        <w:t xml:space="preserve">+</w:t>
-      </w:r>
-      <w:r>
-        <w:rPr>
-          <w:rStyle w:val="NormalTok"/>
-        </w:rPr>
-        <w:t xml:space="preserve"> </w:t>
-      </w:r>
-      <w:r>
-        <w:br/>
-      </w:r>
-      <w:r>
-        <w:rPr>
-          <w:rStyle w:val="NormalTok"/>
-        </w:rPr>
-        <w:t xml:space="preserve">          (</w:t>
-      </w:r>
-      <w:r>
-        <w:rPr>
-          <w:rStyle w:val="DecValTok"/>
-        </w:rPr>
-        <w:t xml:space="preserve">1</w:t>
-      </w:r>
-      <w:r>
-        <w:rPr>
-          <w:rStyle w:val="NormalTok"/>
-        </w:rPr>
-        <w:t xml:space="preserve"> </w:t>
-      </w:r>
-      <w:r>
-        <w:rPr>
-          <w:rStyle w:val="SpecialCharTok"/>
-        </w:rPr>
-        <w:t xml:space="preserve">|</w:t>
-      </w:r>
-      <w:r>
-        <w:rPr>
-          <w:rStyle w:val="NormalTok"/>
-        </w:rPr>
-        <w:t xml:space="preserve"> ID_individual) </w:t>
-      </w:r>
-      <w:r>
-        <w:rPr>
-          <w:rStyle w:val="SpecialCharTok"/>
-        </w:rPr>
-        <w:t xml:space="preserve">+</w:t>
-      </w:r>
-      <w:r>
-        <w:rPr>
-          <w:rStyle w:val="NormalTok"/>
-        </w:rPr>
-        <w:t xml:space="preserve"> </w:t>
+        <w:t xml:space="preserve">          </w:t>
       </w:r>
       <w:r>
         <w:rPr>
@@ -8720,7 +8451,7 @@
         </m:r>
       </m:oMath>
       <w:r>
-        <w:t xml:space="preserve">). Models incorporated sex, latitude, species-specific random slopes and intercepts across 50 phylogenetic trees, researcher identity, municipality, season, active moult, and individual bird identity.</w:t>
+        <w:t xml:space="preserve">). Models incorporated sex, latitude, longitude, elevation, species-specific random slopes and intercepts across 50 phylogenetic trees, researcher identity, season, active moult, and individual bird identity.</w:t>
       </w:r>
     </w:p>
     <w:p>
@@ -8869,17 +8600,7 @@
         <w:pStyle w:val="BodyText"/>
       </w:pPr>
       <w:r>
-        <w:t xml:space="preserve">To avoid the variance inflation induced by crossing two grouping factors that are 85.9% collinear (110 of 128 municipalities sampled by a single researcher), our primary model specification was the parsimonious observer model (</w:t>
-      </w:r>
-      <w:r>
-        <w:rPr>
-          <w:b/>
-          <w:bCs/>
-        </w:rPr>
-        <w:t xml:space="preserve">M1a</w:t>
-      </w:r>
-      <w:r>
-        <w:t xml:space="preserve">), which incorporates</w:t>
+        <w:t xml:space="preserve">To avoid the variance inflation induced by crossing two grouping factors that are 85.9% collinear (110 of 128 municipalities sampled by a single researcher), all models incorporated the parsimonious observer random intercept</w:t>
       </w:r>
       <w:r>
         <w:t xml:space="preserve"> </w:t>
@@ -8891,44 +8612,7 @@
         <w:t xml:space="preserve">(1 | Main_researcher)</w:t>
       </w:r>
       <w:r>
-        <w:t xml:space="preserve">, sex, latitude, species-specific random slopes and intercepts across 50 phylogenetic trees. For sensitivity comparison, we also fitted the crossed model (</w:t>
-      </w:r>
-      <w:r>
-        <w:rPr>
-          <w:b/>
-          <w:bCs/>
-        </w:rPr>
-        <w:t xml:space="preserve">M1</w:t>
-      </w:r>
-      <w:r>
-        <w:t xml:space="preserve">) incorporating both</w:t>
-      </w:r>
-      <w:r>
-        <w:t xml:space="preserve"> </w:t>
-      </w:r>
-      <w:r>
-        <w:rPr>
-          <w:rStyle w:val="VerbatimChar"/>
-        </w:rPr>
-        <w:t xml:space="preserve">(1 | Main_researcher)</w:t>
-      </w:r>
-      <w:r>
-        <w:t xml:space="preserve"> </w:t>
-      </w:r>
-      <w:r>
-        <w:t xml:space="preserve">and</w:t>
-      </w:r>
-      <w:r>
-        <w:t xml:space="preserve"> </w:t>
-      </w:r>
-      <w:r>
-        <w:rPr>
-          <w:rStyle w:val="VerbatimChar"/>
-        </w:rPr>
-        <w:t xml:space="preserve">(1 | Municipality)</w:t>
-      </w:r>
-      <w:r>
-        <w:t xml:space="preserve">.</w:t>
+        <w:t xml:space="preserve">, alongside sex, latitude, and species-specific random slopes and intercepts across 50 phylogenetic trees.</w:t>
       </w:r>
     </w:p>
     <w:p>
@@ -10369,28 +10053,6 @@
               </m:r>
             </m:sub>
           </m:sSub>
-          <m:r>
-            <m:rPr>
-              <m:sty m:val="p"/>
-            </m:rPr>
-            <m:t>+</m:t>
-          </m:r>
-          <m:sSub>
-            <m:e>
-              <m:r>
-                <m:t>u</m:t>
-              </m:r>
-            </m:e>
-            <m:sub>
-              <m:r>
-                <m:rPr>
-                  <m:nor/>
-                  <m:sty m:val="p"/>
-                </m:rPr>
-                <m:t>municipality</m:t>
-              </m:r>
-            </m:sub>
-          </m:sSub>
         </m:oMath>
       </m:oMathPara>
     </w:p>
@@ -10529,7 +10191,7 @@
         <w:t xml:space="preserve"> </w:t>
       </w:r>
       <w:r>
-        <w:t xml:space="preserve">invertebrate diet) versus Other (frugivores, nectarivores, granivores, omnivores). Both models were fitted across 50 phylogenetic trees with observer and municipality random intercepts.</w:t>
+        <w:t xml:space="preserve">invertebrate diet) versus Other (frugivores, nectarivores, granivores, omnivores). Both models were fitted across 50 phylogenetic trees with observer random intercepts.</w:t>
       </w:r>
     </w:p>
     <w:p>

</xml_diff>

<commit_message>
feat(manuscript): add secular results section, clean discussion, and generate supplementary materials
- Add 'Century-scale trajectories, climatic breakpoint, and sampling expansion' section to Results in Manuscript/index.qmd
- Move all raw numerical estimates, test statistics, and p-values from Discussion to Results
- Rewrite Discussion subsection to focus on macroecological and aerodynamic interpretation without raw numbers
- Generate Manuscript/supplementary.qmd, supplementary.docx, and supplementary.html with Notes S1-S5, Table S1, and Figs S1-S9
- Copy and link all supplementary figures in Manuscript/images/
</commit_message>
<xml_diff>
--- a/Manuscript/index.docx
+++ b/Manuscript/index.docx
@@ -447,7 +447,7 @@
       </w:r>
     </w:p>
     <w:bookmarkEnd w:id="9"/>
-    <w:bookmarkStart w:id="52" w:name="results"/>
+    <w:bookmarkStart w:id="53" w:name="results"/>
     <w:p>
       <w:pPr>
         <w:pStyle w:val="Heading1"/>
@@ -6442,14 +6442,13 @@
       </w:r>
     </w:p>
     <w:bookmarkEnd w:id="51"/>
-    <w:bookmarkEnd w:id="52"/>
-    <w:bookmarkStart w:id="59" w:name="discussion"/>
-    <w:p>
-      <w:pPr>
-        <w:pStyle w:val="Heading1"/>
-      </w:pPr>
-      <w:r>
-        <w:t xml:space="preserve">3. Discussion</w:t>
+    <w:bookmarkStart w:id="52" w:name="X1264079677b6ff16e9e2275b5c337c839d73011"/>
+    <w:p>
+      <w:pPr>
+        <w:pStyle w:val="Heading2"/>
+      </w:pPr>
+      <w:r>
+        <w:t xml:space="preserve">2.7 Century-scale trajectories, climatic breakpoint, and sampling expansion</w:t>
       </w:r>
     </w:p>
     <w:p>
@@ -6457,88 +6456,196 @@
         <w:pStyle w:val="FirstParagraph"/>
       </w:pPr>
       <w:r>
-        <w:t xml:space="preserve">Our macroecological investigation across 73 passerine bird species and 24 years of climate warming in the Brazilian Atlantic Forest reveals a pattern of phenotypic stability alongside subtle, species-specific adjustments. Across multiple morphometric dimensions, we find:</w:t>
-      </w:r>
-      <w:r>
-        <w:t xml:space="preserve"> </w:t>
-      </w:r>
-      <w:r>
-        <w:t xml:space="preserve">(1)</w:t>
-      </w:r>
-      <w:r>
-        <w:t xml:space="preserve"> </w:t>
-      </w:r>
-      <w:r>
-        <w:rPr>
-          <w:b/>
-          <w:bCs/>
-        </w:rPr>
-        <w:t xml:space="preserve">Body mass stability</w:t>
-      </w:r>
-      <w:r>
-        <w:t xml:space="preserve">: In contrast to predictions from Bergmann’s rule, body mass has remained constant over 24 years (−0.91%/decade, spanning zero), despite strong diurnal feeding rhythms (+0.40%/hour).</w:t>
-      </w:r>
-      <w:r>
-        <w:t xml:space="preserve"> </w:t>
-      </w:r>
-      <w:r>
-        <w:t xml:space="preserve">(2)</w:t>
-      </w:r>
-      <w:r>
-        <w:t xml:space="preserve"> </w:t>
-      </w:r>
-      <w:r>
-        <w:rPr>
-          <w:b/>
-          <w:bCs/>
-        </w:rPr>
-        <w:t xml:space="preserve">Subtle and heterogeneous wing trajectories</w:t>
-      </w:r>
-      <w:r>
-        <w:t xml:space="preserve">: Community-level wing length shows a subtle, non-significant trajectory (−0.74 mm/decade; within-observer slope −0.32 mm/decade), characterized by pronounced interspecific variation where 61 of 72 species overlap zero.</w:t>
-      </w:r>
-      <w:r>
-        <w:t xml:space="preserve"> </w:t>
-      </w:r>
-      <w:r>
-        <w:t xml:space="preserve">(3)</w:t>
-      </w:r>
-      <w:r>
-        <w:t xml:space="preserve"> </w:t>
-      </w:r>
-      <w:r>
-        <w:rPr>
-          <w:b/>
-          <w:bCs/>
-        </w:rPr>
-        <w:t xml:space="preserve">Bill width invariance shows no support for Allen’s rule</w:t>
-      </w:r>
-      <w:r>
-        <w:t xml:space="preserve">: Bill width shows no temporal expansion under controls (−0.03 mm/decade), providing no evidence for extremity enlargement for thermoregulatory heat dissipation.</w:t>
-      </w:r>
-      <w:r>
-        <w:t xml:space="preserve"> </w:t>
-      </w:r>
-      <w:r>
-        <w:t xml:space="preserve">(4)</w:t>
-      </w:r>
-      <w:r>
-        <w:t xml:space="preserve"> </w:t>
-      </w:r>
-      <w:r>
-        <w:rPr>
-          <w:b/>
-          <w:bCs/>
-        </w:rPr>
-        <w:t xml:space="preserve">Mass conservation over geometric shrinkage</w:t>
-      </w:r>
-      <w:r>
-        <w:t xml:space="preserve">: On shared individuals measured for both traits, body mass was significantly more conserved than expected under cubic geometric shrinkage of the wing (+4.85%/decade contrast,</w:t>
-      </w:r>
-      <w:r>
-        <w:t xml:space="preserve"> </w:t>
-      </w:r>
-      <m:oMath>
+        <w:t xml:space="preserve">To evaluate whether the morphological stability and subtle wing adjustments observed between 1995 and 2018 represent contemporary responses to accelerated warming or part of longer century-scale trends, we integrated historical museum records and expanded our analytical scope across the avian community.</w:t>
+      </w:r>
+    </w:p>
+    <w:p>
+      <w:pPr>
+        <w:pStyle w:val="BodyText"/>
+      </w:pPr>
+      <w:r>
+        <w:t xml:space="preserve">Two-phase piecewise linear regression on secular regional temperature anomalies (NASA GISS Zonal</w:t>
+      </w:r>
+      <w:r>
+        <w:t xml:space="preserve"> </w:t>
+      </w:r>
+      <m:oMath>
+        <m:sSup>
+          <m:e>
+            <m:r>
+              <m:t>24</m:t>
+            </m:r>
+          </m:e>
+          <m:sup>
+            <m:r>
+              <m:rPr>
+                <m:sty m:val="p"/>
+              </m:rPr>
+              <m:t>∘</m:t>
+            </m:r>
+          </m:sup>
+        </m:sSup>
+        <m:r>
+          <m:rPr>
+            <m:nor/>
+            <m:sty m:val="p"/>
+          </m:rPr>
+          <m:t>S</m:t>
+        </m:r>
+        <m:r>
+          <m:rPr>
+            <m:nor/>
+            <m:sty m:val="p"/>
+          </m:rPr>
+          <m:t>–Equator</m:t>
+        </m:r>
+      </m:oMath>
+      <w:r>
+        <w:t xml:space="preserve">, 1880–2018;</w:t>
+      </w:r>
+      <w:r>
+        <w:t xml:space="preserve"> </w:t>
+      </w:r>
+      <w:r>
+        <w:t xml:space="preserve">Lenssen et al. (2019)</w:t>
+      </w:r>
+      <w:r>
+        <w:t xml:space="preserve">) identified a pronounced structural breakpoint in regional climate warming at</w:t>
+      </w:r>
+      <w:r>
+        <w:t xml:space="preserve"> </w:t>
+      </w:r>
+      <m:oMath>
+        <m:r>
+          <m:t>1980</m:t>
+        </m:r>
+        <m:r>
+          <m:rPr>
+            <m:sty m:val="p"/>
+          </m:rPr>
+          <m:t>±</m:t>
+        </m:r>
+        <m:r>
+          <m:t>3</m:t>
+        </m:r>
+      </m:oMath>
+      <w:r>
+        <w:t xml:space="preserve"> </w:t>
+      </w:r>
+      <w:r>
+        <w:t xml:space="preserve">years (Supplementary Fig. S4). Prior to 1980, regional temperatures exhibited minimal decadal change (</w:t>
+      </w:r>
+      <m:oMath>
+        <m:r>
+          <m:rPr>
+            <m:sty m:val="p"/>
+          </m:rPr>
+          <m:t>+</m:t>
+        </m:r>
+        <m:sSup>
+          <m:e>
+            <m:r>
+              <m:t>0.036</m:t>
+            </m:r>
+          </m:e>
+          <m:sup>
+            <m:r>
+              <m:rPr>
+                <m:sty m:val="p"/>
+              </m:rPr>
+              <m:t>∘</m:t>
+            </m:r>
+          </m:sup>
+        </m:sSup>
+        <m:r>
+          <m:rPr>
+            <m:nor/>
+            <m:sty m:val="p"/>
+          </m:rPr>
+          <m:t>C</m:t>
+        </m:r>
+      </m:oMath>
+      <w:r>
+        <w:t xml:space="preserve">/decade, 95% CI:</w:t>
+      </w:r>
+      <w:r>
+        <w:t xml:space="preserve"> </w:t>
+      </w:r>
+      <m:oMath>
+        <m:r>
+          <m:rPr>
+            <m:sty m:val="p"/>
+          </m:rPr>
+          <m:t>+</m:t>
+        </m:r>
+        <m:r>
+          <m:t>0.002</m:t>
+        </m:r>
+      </m:oMath>
+      <w:r>
+        <w:t xml:space="preserve"> </w:t>
+      </w:r>
+      <w:r>
+        <w:t xml:space="preserve">to</w:t>
+      </w:r>
+      <w:r>
+        <w:t xml:space="preserve"> </w:t>
+      </w:r>
+      <m:oMath>
+        <m:r>
+          <m:rPr>
+            <m:sty m:val="p"/>
+          </m:rPr>
+          <m:t>+</m:t>
+        </m:r>
+        <m:sSup>
+          <m:e>
+            <m:r>
+              <m:t>0.070</m:t>
+            </m:r>
+          </m:e>
+          <m:sup>
+            <m:r>
+              <m:rPr>
+                <m:sty m:val="p"/>
+              </m:rPr>
+              <m:t>∘</m:t>
+            </m:r>
+          </m:sup>
+        </m:sSup>
+        <m:r>
+          <m:rPr>
+            <m:nor/>
+            <m:sty m:val="p"/>
+          </m:rPr>
+          <m:t>C</m:t>
+        </m:r>
+      </m:oMath>
+      <w:r>
+        <w:t xml:space="preserve">/decade,</w:t>
+      </w:r>
+      <w:r>
+        <w:t xml:space="preserve"> </w:t>
+      </w:r>
+      <m:oMath>
+        <m:r>
+          <m:t>t</m:t>
+        </m:r>
+        <m:r>
+          <m:rPr>
+            <m:sty m:val="p"/>
+          </m:rPr>
+          <m:t>=</m:t>
+        </m:r>
+        <m:r>
+          <m:t>2.05</m:t>
+        </m:r>
+        <m:r>
+          <m:rPr>
+            <m:sty m:val="p"/>
+          </m:rPr>
+          <m:t>,</m:t>
+        </m:r>
         <m:r>
           <m:t>p</m:t>
         </m:r>
@@ -6549,30 +6656,597 @@
           <m:t>=</m:t>
         </m:r>
         <m:r>
-          <m:t>0.019</m:t>
-        </m:r>
-      </m:oMath>
-      <w:r>
-        <w:t xml:space="preserve">), leaning toward slight stoutening and in contrast to Amazonian slenderization.</w:t>
-      </w:r>
-      <w:r>
-        <w:t xml:space="preserve"> </w:t>
-      </w:r>
-      <w:r>
-        <w:t xml:space="preserve">(5)</w:t>
-      </w:r>
-      <w:r>
-        <w:t xml:space="preserve"> </w:t>
-      </w:r>
-      <w:r>
-        <w:rPr>
-          <w:b/>
-          <w:bCs/>
-        </w:rPr>
-        <w:t xml:space="preserve">Direct thermal modulation of allometry</w:t>
-      </w:r>
-      <w:r>
-        <w:t xml:space="preserve">: Interannual temperature anomalies directly drive departures from geometric isometry toward relative wing shortening and mass retention (</w:t>
+          <m:t>0.042</m:t>
+        </m:r>
+      </m:oMath>
+      <w:r>
+        <w:t xml:space="preserve">). After 1980, regional warming accelerated by more than five-fold (</w:t>
+      </w:r>
+      <m:oMath>
+        <m:r>
+          <m:rPr>
+            <m:sty m:val="p"/>
+          </m:rPr>
+          <m:t>+</m:t>
+        </m:r>
+        <m:sSup>
+          <m:e>
+            <m:r>
+              <m:t>0.190</m:t>
+            </m:r>
+          </m:e>
+          <m:sup>
+            <m:r>
+              <m:rPr>
+                <m:sty m:val="p"/>
+              </m:rPr>
+              <m:t>∘</m:t>
+            </m:r>
+          </m:sup>
+        </m:sSup>
+        <m:r>
+          <m:rPr>
+            <m:nor/>
+            <m:sty m:val="p"/>
+          </m:rPr>
+          <m:t>C</m:t>
+        </m:r>
+      </m:oMath>
+      <w:r>
+        <w:t xml:space="preserve">/decade, 95% CI:</w:t>
+      </w:r>
+      <w:r>
+        <w:t xml:space="preserve"> </w:t>
+      </w:r>
+      <m:oMath>
+        <m:r>
+          <m:rPr>
+            <m:sty m:val="p"/>
+          </m:rPr>
+          <m:t>+</m:t>
+        </m:r>
+        <m:r>
+          <m:t>0.147</m:t>
+        </m:r>
+      </m:oMath>
+      <w:r>
+        <w:t xml:space="preserve"> </w:t>
+      </w:r>
+      <w:r>
+        <w:t xml:space="preserve">to</w:t>
+      </w:r>
+      <w:r>
+        <w:t xml:space="preserve"> </w:t>
+      </w:r>
+      <m:oMath>
+        <m:r>
+          <m:rPr>
+            <m:sty m:val="p"/>
+          </m:rPr>
+          <m:t>+</m:t>
+        </m:r>
+        <m:sSup>
+          <m:e>
+            <m:r>
+              <m:t>0.233</m:t>
+            </m:r>
+          </m:e>
+          <m:sup>
+            <m:r>
+              <m:rPr>
+                <m:sty m:val="p"/>
+              </m:rPr>
+              <m:t>∘</m:t>
+            </m:r>
+          </m:sup>
+        </m:sSup>
+        <m:r>
+          <m:rPr>
+            <m:nor/>
+            <m:sty m:val="p"/>
+          </m:rPr>
+          <m:t>C</m:t>
+        </m:r>
+      </m:oMath>
+      <w:r>
+        <w:t xml:space="preserve">/decade,</w:t>
+      </w:r>
+      <w:r>
+        <w:t xml:space="preserve"> </w:t>
+      </w:r>
+      <m:oMath>
+        <m:r>
+          <m:t>t</m:t>
+        </m:r>
+        <m:r>
+          <m:rPr>
+            <m:sty m:val="p"/>
+          </m:rPr>
+          <m:t>=</m:t>
+        </m:r>
+        <m:r>
+          <m:t>8.62</m:t>
+        </m:r>
+        <m:r>
+          <m:rPr>
+            <m:sty m:val="p"/>
+          </m:rPr>
+          <m:t>,</m:t>
+        </m:r>
+        <m:r>
+          <m:t>p</m:t>
+        </m:r>
+        <m:r>
+          <m:rPr>
+            <m:sty m:val="p"/>
+          </m:rPr>
+          <m:t>&lt;</m:t>
+        </m:r>
+        <m:sSup>
+          <m:e>
+            <m:r>
+              <m:t>10</m:t>
+            </m:r>
+          </m:e>
+          <m:sup>
+            <m:r>
+              <m:rPr>
+                <m:sty m:val="p"/>
+              </m:rPr>
+              <m:t>−</m:t>
+            </m:r>
+            <m:r>
+              <m:t>15</m:t>
+            </m:r>
+          </m:sup>
+        </m:sSup>
+      </m:oMath>
+      <w:r>
+        <w:t xml:space="preserve">), matching the local rate observed across our modern capture sites (+0.25°C/decade).</w:t>
+      </w:r>
+    </w:p>
+    <w:p>
+      <w:pPr>
+        <w:pStyle w:val="BodyText"/>
+      </w:pPr>
+      <w:r>
+        <w:t xml:space="preserve">Historical museum study skins (</w:t>
+      </w:r>
+      <m:oMath>
+        <m:r>
+          <m:t>n</m:t>
+        </m:r>
+        <m:r>
+          <m:rPr>
+            <m:sty m:val="p"/>
+          </m:rPr>
+          <m:t>=</m:t>
+        </m:r>
+        <m:r>
+          <m:t>3</m:t>
+        </m:r>
+        <m:r>
+          <m:rPr>
+            <m:sty m:val="p"/>
+          </m:rPr>
+          <m:t>,</m:t>
+        </m:r>
+        <m:r>
+          <m:t>439</m:t>
+        </m:r>
+      </m:oMath>
+      <w:r>
+        <w:t xml:space="preserve"> </w:t>
+      </w:r>
+      <w:r>
+        <w:t xml:space="preserve">adult specimens across 142 passerine species, 1884–2017; MZUSP, MNRJ, FURB, UFPE) confirmed that pre-1980 morphology was stable or slightly increasing in wing length (</w:t>
+      </w:r>
+      <m:oMath>
+        <m:r>
+          <m:rPr>
+            <m:sty m:val="p"/>
+          </m:rPr>
+          <m:t>+</m:t>
+        </m:r>
+        <m:r>
+          <m:t>0.45</m:t>
+        </m:r>
+      </m:oMath>
+      <w:r>
+        <w:t xml:space="preserve"> </w:t>
+      </w:r>
+      <w:r>
+        <w:t xml:space="preserve">mm/decade,</w:t>
+      </w:r>
+      <w:r>
+        <w:t xml:space="preserve"> </w:t>
+      </w:r>
+      <m:oMath>
+        <m:r>
+          <m:t>t</m:t>
+        </m:r>
+        <m:r>
+          <m:rPr>
+            <m:sty m:val="p"/>
+          </m:rPr>
+          <m:t>=</m:t>
+        </m:r>
+        <m:r>
+          <m:t>3.71</m:t>
+        </m:r>
+      </m:oMath>
+      <w:r>
+        <w:t xml:space="preserve">), with no thermal sensitivity to annual temperature anomalies (</w:t>
+      </w:r>
+      <m:oMath>
+        <m:r>
+          <m:t>β</m:t>
+        </m:r>
+        <m:r>
+          <m:rPr>
+            <m:sty m:val="p"/>
+          </m:rPr>
+          <m:t>=</m:t>
+        </m:r>
+        <m:r>
+          <m:rPr>
+            <m:sty m:val="p"/>
+          </m:rPr>
+          <m:t>+</m:t>
+        </m:r>
+        <m:r>
+          <m:t>0.10</m:t>
+        </m:r>
+      </m:oMath>
+      <w:r>
+        <w:t xml:space="preserve"> </w:t>
+      </w:r>
+      <w:r>
+        <w:t xml:space="preserve">mm/°C,</w:t>
+      </w:r>
+      <w:r>
+        <w:t xml:space="preserve"> </w:t>
+      </w:r>
+      <m:oMath>
+        <m:r>
+          <m:t>t</m:t>
+        </m:r>
+        <m:r>
+          <m:rPr>
+            <m:sty m:val="p"/>
+          </m:rPr>
+          <m:t>=</m:t>
+        </m:r>
+        <m:r>
+          <m:t>0.11</m:t>
+        </m:r>
+        <m:r>
+          <m:rPr>
+            <m:sty m:val="p"/>
+          </m:rPr>
+          <m:t>,</m:t>
+        </m:r>
+        <m:r>
+          <m:t>p</m:t>
+        </m:r>
+        <m:r>
+          <m:rPr>
+            <m:sty m:val="p"/>
+          </m:rPr>
+          <m:t>=</m:t>
+        </m:r>
+        <m:r>
+          <m:t>0.91</m:t>
+        </m:r>
+      </m:oMath>
+      <w:r>
+        <w:t xml:space="preserve">; Supplementary Fig. S4). Downward wing-length trajectories emerged specifically in the post-1980 modern era (</w:t>
+      </w:r>
+      <m:oMath>
+        <m:r>
+          <m:rPr>
+            <m:sty m:val="p"/>
+          </m:rPr>
+          <m:t>−</m:t>
+        </m:r>
+        <m:r>
+          <m:t>0.26</m:t>
+        </m:r>
+      </m:oMath>
+      <w:r>
+        <w:t xml:space="preserve"> </w:t>
+      </w:r>
+      <w:r>
+        <w:t xml:space="preserve">to</w:t>
+      </w:r>
+      <w:r>
+        <w:t xml:space="preserve"> </w:t>
+      </w:r>
+      <m:oMath>
+        <m:r>
+          <m:rPr>
+            <m:sty m:val="p"/>
+          </m:rPr>
+          <m:t>−</m:t>
+        </m:r>
+        <m:r>
+          <m:t>0.41</m:t>
+        </m:r>
+      </m:oMath>
+      <w:r>
+        <w:t xml:space="preserve"> </w:t>
+      </w:r>
+      <w:r>
+        <w:t xml:space="preserve">mm/decade,</w:t>
+      </w:r>
+      <w:r>
+        <w:t xml:space="preserve"> </w:t>
+      </w:r>
+      <m:oMath>
+        <m:r>
+          <m:t>p</m:t>
+        </m:r>
+        <m:r>
+          <m:rPr>
+            <m:sty m:val="p"/>
+          </m:rPr>
+          <m:t>&lt;</m:t>
+        </m:r>
+        <m:r>
+          <m:t>0.02</m:t>
+        </m:r>
+      </m:oMath>
+      <w:r>
+        <w:t xml:space="preserve">), accompanied by strong direct thermal sensitivity (</w:t>
+      </w:r>
+      <m:oMath>
+        <m:r>
+          <m:t>β</m:t>
+        </m:r>
+        <m:r>
+          <m:rPr>
+            <m:sty m:val="p"/>
+          </m:rPr>
+          <m:t>=</m:t>
+        </m:r>
+        <m:r>
+          <m:rPr>
+            <m:sty m:val="p"/>
+          </m:rPr>
+          <m:t>−</m:t>
+        </m:r>
+        <m:r>
+          <m:t>1.68</m:t>
+        </m:r>
+      </m:oMath>
+      <w:r>
+        <w:t xml:space="preserve"> </w:t>
+      </w:r>
+      <w:r>
+        <w:t xml:space="preserve">mm/°C,</w:t>
+      </w:r>
+      <w:r>
+        <w:t xml:space="preserve"> </w:t>
+      </w:r>
+      <m:oMath>
+        <m:r>
+          <m:t>t</m:t>
+        </m:r>
+        <m:r>
+          <m:rPr>
+            <m:sty m:val="p"/>
+          </m:rPr>
+          <m:t>=</m:t>
+        </m:r>
+        <m:r>
+          <m:rPr>
+            <m:sty m:val="p"/>
+          </m:rPr>
+          <m:t>−</m:t>
+        </m:r>
+        <m:r>
+          <m:t>2.81</m:t>
+        </m:r>
+        <m:r>
+          <m:rPr>
+            <m:sty m:val="p"/>
+          </m:rPr>
+          <m:t>,</m:t>
+        </m:r>
+        <m:r>
+          <m:t>p</m:t>
+        </m:r>
+        <m:r>
+          <m:rPr>
+            <m:sty m:val="p"/>
+          </m:rPr>
+          <m:t>=</m:t>
+        </m:r>
+        <m:r>
+          <m:t>0.005</m:t>
+        </m:r>
+      </m:oMath>
+      <w:r>
+        <w:t xml:space="preserve">). Similarly, body mass in historical specimens (1962–1979) was strictly invariant (</w:t>
+      </w:r>
+      <m:oMath>
+        <m:r>
+          <m:rPr>
+            <m:sty m:val="p"/>
+          </m:rPr>
+          <m:t>−</m:t>
+        </m:r>
+        <m:r>
+          <m:t>0.17</m:t>
+        </m:r>
+        <m:r>
+          <m:rPr>
+            <m:sty m:val="p"/>
+          </m:rPr>
+          <m:t>%</m:t>
+        </m:r>
+      </m:oMath>
+      <w:r>
+        <w:t xml:space="preserve">/year,</w:t>
+      </w:r>
+      <w:r>
+        <w:t xml:space="preserve"> </w:t>
+      </w:r>
+      <m:oMath>
+        <m:r>
+          <m:t>t</m:t>
+        </m:r>
+        <m:r>
+          <m:rPr>
+            <m:sty m:val="p"/>
+          </m:rPr>
+          <m:t>=</m:t>
+        </m:r>
+        <m:r>
+          <m:rPr>
+            <m:sty m:val="p"/>
+          </m:rPr>
+          <m:t>−</m:t>
+        </m:r>
+        <m:r>
+          <m:t>0.65</m:t>
+        </m:r>
+        <m:r>
+          <m:rPr>
+            <m:sty m:val="p"/>
+          </m:rPr>
+          <m:t>,</m:t>
+        </m:r>
+        <m:r>
+          <m:t>p</m:t>
+        </m:r>
+        <m:r>
+          <m:rPr>
+            <m:sty m:val="p"/>
+          </m:rPr>
+          <m:t>=</m:t>
+        </m:r>
+        <m:r>
+          <m:t>0.52</m:t>
+        </m:r>
+      </m:oMath>
+      <w:r>
+        <w:t xml:space="preserve">; thermal sensitivity</w:t>
+      </w:r>
+      <w:r>
+        <w:t xml:space="preserve"> </w:t>
+      </w:r>
+      <m:oMath>
+        <m:r>
+          <m:t>β</m:t>
+        </m:r>
+        <m:r>
+          <m:rPr>
+            <m:sty m:val="p"/>
+          </m:rPr>
+          <m:t>=</m:t>
+        </m:r>
+        <m:r>
+          <m:rPr>
+            <m:sty m:val="p"/>
+          </m:rPr>
+          <m:t>−</m:t>
+        </m:r>
+        <m:r>
+          <m:t>1.97</m:t>
+        </m:r>
+        <m:r>
+          <m:rPr>
+            <m:sty m:val="p"/>
+          </m:rPr>
+          <m:t>%</m:t>
+        </m:r>
+        <m:sSup>
+          <m:e>
+            <m:r>
+              <m:rPr>
+                <m:sty m:val="p"/>
+              </m:rPr>
+              <m:t>/</m:t>
+            </m:r>
+          </m:e>
+          <m:sup>
+            <m:r>
+              <m:rPr>
+                <m:sty m:val="p"/>
+              </m:rPr>
+              <m:t>∘</m:t>
+            </m:r>
+          </m:sup>
+        </m:sSup>
+        <m:r>
+          <m:rPr>
+            <m:nor/>
+            <m:sty m:val="p"/>
+          </m:rPr>
+          <m:t>C</m:t>
+        </m:r>
+        <m:r>
+          <m:rPr>
+            <m:sty m:val="p"/>
+          </m:rPr>
+          <m:t>,</m:t>
+        </m:r>
+        <m:r>
+          <m:t>p</m:t>
+        </m:r>
+        <m:r>
+          <m:rPr>
+            <m:sty m:val="p"/>
+          </m:rPr>
+          <m:t>=</m:t>
+        </m:r>
+        <m:r>
+          <m:t>0.86</m:t>
+        </m:r>
+      </m:oMath>
+      <w:r>
+        <w:t xml:space="preserve">; Supplementary Fig. S5), mirroring the post-1980 stability (</w:t>
+      </w:r>
+      <m:oMath>
+        <m:r>
+          <m:rPr>
+            <m:sty m:val="p"/>
+          </m:rPr>
+          <m:t>−</m:t>
+        </m:r>
+        <m:r>
+          <m:t>0.02</m:t>
+        </m:r>
+        <m:r>
+          <m:rPr>
+            <m:sty m:val="p"/>
+          </m:rPr>
+          <m:t>%</m:t>
+        </m:r>
+      </m:oMath>
+      <w:r>
+        <w:t xml:space="preserve">/year,</w:t>
+      </w:r>
+      <w:r>
+        <w:t xml:space="preserve"> </w:t>
+      </w:r>
+      <m:oMath>
+        <m:r>
+          <m:t>p</m:t>
+        </m:r>
+        <m:r>
+          <m:rPr>
+            <m:sty m:val="p"/>
+          </m:rPr>
+          <m:t>=</m:t>
+        </m:r>
+        <m:r>
+          <m:t>0.49</m:t>
+        </m:r>
+      </m:oMath>
+      <w:r>
+        <w:t xml:space="preserve">). For bivariate allometry, pre-1980 specimens followed geometric isometry (</w:t>
       </w:r>
       <m:oMath>
         <m:sSub>
@@ -6599,7 +7273,7 @@
         <w:t xml:space="preserve"> </w:t>
       </w:r>
       <w:r>
-        <w:t xml:space="preserve">increases by</w:t>
+        <w:t xml:space="preserve">trend:</w:t>
       </w:r>
       <w:r>
         <w:t xml:space="preserve"> </w:t>
@@ -6612,7 +7286,7 @@
           <m:t>+</m:t>
         </m:r>
         <m:r>
-          <m:t>2.1</m:t>
+          <m:t>0.52</m:t>
         </m:r>
         <m:r>
           <m:rPr>
@@ -6622,10 +7296,7 @@
         </m:r>
       </m:oMath>
       <w:r>
-        <w:t xml:space="preserve"> </w:t>
-      </w:r>
-      <w:r>
-        <w:t xml:space="preserve">per °C,</w:t>
+        <w:t xml:space="preserve">/year,</w:t>
       </w:r>
       <w:r>
         <w:t xml:space="preserve"> </w:t>
@@ -6641,13 +7312,54 @@
           <m:t>=</m:t>
         </m:r>
         <m:r>
-          <m:t>0.030</m:t>
-        </m:r>
-      </m:oMath>
-      <w:r>
-        <w:t xml:space="preserve">), while body mass remains thermally decoupled (</w:t>
-      </w:r>
-      <m:oMath>
+          <m:t>0.69</m:t>
+        </m:r>
+      </m:oMath>
+      <w:r>
+        <w:t xml:space="preserve">), whereas post-1980 records exhibited a significant shift toward stoutening (</w:t>
+      </w:r>
+      <m:oMath>
+        <m:r>
+          <m:rPr>
+            <m:sty m:val="p"/>
+          </m:rPr>
+          <m:t>+</m:t>
+        </m:r>
+        <m:r>
+          <m:t>2.12</m:t>
+        </m:r>
+        <m:r>
+          <m:rPr>
+            <m:sty m:val="p"/>
+          </m:rPr>
+          <m:t>%</m:t>
+        </m:r>
+      </m:oMath>
+      <w:r>
+        <w:t xml:space="preserve">/decade,</w:t>
+      </w:r>
+      <w:r>
+        <w:t xml:space="preserve"> </w:t>
+      </w:r>
+      <m:oMath>
+        <m:r>
+          <m:t>t</m:t>
+        </m:r>
+        <m:r>
+          <m:rPr>
+            <m:sty m:val="p"/>
+          </m:rPr>
+          <m:t>=</m:t>
+        </m:r>
+        <m:r>
+          <m:t>2.04</m:t>
+        </m:r>
+        <m:r>
+          <m:rPr>
+            <m:sty m:val="p"/>
+          </m:rPr>
+          <m:t>,</m:t>
+        </m:r>
         <m:r>
           <m:t>p</m:t>
         </m:r>
@@ -6658,17 +7370,443 @@
           <m:t>=</m:t>
         </m:r>
         <m:r>
-          <m:t>0.57</m:t>
-        </m:r>
-      </m:oMath>
-      <w:r>
-        <w:t xml:space="preserve">).</w:t>
-      </w:r>
-      <w:r>
-        <w:t xml:space="preserve"> </w:t>
-      </w:r>
-      <w:r>
-        <w:t xml:space="preserve">(6)</w:t>
+          <m:t>0.048</m:t>
+        </m:r>
+      </m:oMath>
+      <w:r>
+        <w:t xml:space="preserve">; thermal sensitivity</w:t>
+      </w:r>
+      <w:r>
+        <w:t xml:space="preserve"> </w:t>
+      </w:r>
+      <m:oMath>
+        <m:r>
+          <m:t>β</m:t>
+        </m:r>
+        <m:r>
+          <m:rPr>
+            <m:sty m:val="p"/>
+          </m:rPr>
+          <m:t>=</m:t>
+        </m:r>
+        <m:r>
+          <m:rPr>
+            <m:sty m:val="p"/>
+          </m:rPr>
+          <m:t>+</m:t>
+        </m:r>
+        <m:r>
+          <m:t>9.32</m:t>
+        </m:r>
+        <m:r>
+          <m:rPr>
+            <m:sty m:val="p"/>
+          </m:rPr>
+          <m:t>%</m:t>
+        </m:r>
+        <m:sSup>
+          <m:e>
+            <m:r>
+              <m:rPr>
+                <m:sty m:val="p"/>
+              </m:rPr>
+              <m:t>/</m:t>
+            </m:r>
+          </m:e>
+          <m:sup>
+            <m:r>
+              <m:rPr>
+                <m:sty m:val="p"/>
+              </m:rPr>
+              <m:t>∘</m:t>
+            </m:r>
+          </m:sup>
+        </m:sSup>
+        <m:r>
+          <m:rPr>
+            <m:nor/>
+            <m:sty m:val="p"/>
+          </m:rPr>
+          <m:t>C</m:t>
+        </m:r>
+        <m:r>
+          <m:rPr>
+            <m:sty m:val="p"/>
+          </m:rPr>
+          <m:t>,</m:t>
+        </m:r>
+        <m:r>
+          <m:t>p</m:t>
+        </m:r>
+        <m:r>
+          <m:rPr>
+            <m:sty m:val="p"/>
+          </m:rPr>
+          <m:t>=</m:t>
+        </m:r>
+        <m:r>
+          <m:t>0.034</m:t>
+        </m:r>
+      </m:oMath>
+      <w:r>
+        <w:t xml:space="preserve">; Supplementary Fig. S6). Across 175 species continuously connecting historical museum collections to modern field ringing (</w:t>
+      </w:r>
+      <m:oMath>
+        <m:r>
+          <m:t>n</m:t>
+        </m:r>
+        <m:r>
+          <m:rPr>
+            <m:sty m:val="p"/>
+          </m:rPr>
+          <m:t>=</m:t>
+        </m:r>
+        <m:r>
+          <m:t>24</m:t>
+        </m:r>
+        <m:r>
+          <m:rPr>
+            <m:sty m:val="p"/>
+          </m:rPr>
+          <m:t>,</m:t>
+        </m:r>
+        <m:r>
+          <m:t>583</m:t>
+        </m:r>
+      </m:oMath>
+      <w:r>
+        <w:t xml:space="preserve"> </w:t>
+      </w:r>
+      <w:r>
+        <w:t xml:space="preserve">records), the secular wing decline was</w:t>
+      </w:r>
+      <w:r>
+        <w:t xml:space="preserve"> </w:t>
+      </w:r>
+      <m:oMath>
+        <m:r>
+          <m:rPr>
+            <m:sty m:val="p"/>
+          </m:rPr>
+          <m:t>−</m:t>
+        </m:r>
+        <m:r>
+          <m:t>0.71</m:t>
+        </m:r>
+        <m:r>
+          <m:rPr>
+            <m:sty m:val="p"/>
+          </m:rPr>
+          <m:t>%</m:t>
+        </m:r>
+      </m:oMath>
+      <w:r>
+        <w:t xml:space="preserve">/decade (</w:t>
+      </w:r>
+      <m:oMath>
+        <m:r>
+          <m:t>t</m:t>
+        </m:r>
+        <m:r>
+          <m:rPr>
+            <m:sty m:val="p"/>
+          </m:rPr>
+          <m:t>=</m:t>
+        </m:r>
+        <m:r>
+          <m:rPr>
+            <m:sty m:val="p"/>
+          </m:rPr>
+          <m:t>−</m:t>
+        </m:r>
+        <m:r>
+          <m:t>1.98</m:t>
+        </m:r>
+        <m:r>
+          <m:rPr>
+            <m:sty m:val="p"/>
+          </m:rPr>
+          <m:t>,</m:t>
+        </m:r>
+        <m:r>
+          <m:t>p</m:t>
+        </m:r>
+        <m:r>
+          <m:rPr>
+            <m:sty m:val="p"/>
+          </m:rPr>
+          <m:t>=</m:t>
+        </m:r>
+        <m:r>
+          <m:t>0.047</m:t>
+        </m:r>
+      </m:oMath>
+      <w:r>
+        <w:t xml:space="preserve">; Supplementary Fig. S8).</w:t>
+      </w:r>
+    </w:p>
+    <w:p>
+      <w:pPr>
+        <w:pStyle w:val="BodyText"/>
+      </w:pPr>
+      <w:r>
+        <w:t xml:space="preserve">Furthermore, when expanding our analytical scope to mirror the less restrictive sampling design of</w:t>
+      </w:r>
+      <w:r>
+        <w:t xml:space="preserve"> </w:t>
+      </w:r>
+      <w:r>
+        <w:t xml:space="preserve">Jirinec et al. (2021)</w:t>
+      </w:r>
+      <w:r>
+        <w:t xml:space="preserve">—incorporating birds of unknown sex, all age classes, and all understorey mist-netted orders (</w:t>
+      </w:r>
+      <m:oMath>
+        <m:r>
+          <m:t>n</m:t>
+        </m:r>
+        <m:r>
+          <m:rPr>
+            <m:sty m:val="p"/>
+          </m:rPr>
+          <m:t>=</m:t>
+        </m:r>
+        <m:r>
+          <m:t>46</m:t>
+        </m:r>
+        <m:r>
+          <m:rPr>
+            <m:sty m:val="p"/>
+          </m:rPr>
+          <m:t>,</m:t>
+        </m:r>
+        <m:r>
+          <m:t>663</m:t>
+        </m:r>
+      </m:oMath>
+      <w:r>
+        <w:t xml:space="preserve"> </w:t>
+      </w:r>
+      <w:r>
+        <w:t xml:space="preserve">captures across 243 species; Supplementary Fig. S7; Supplementary Table S1)—wing-length trajectories remained consistent with our focal passerine estimates (</w:t>
+      </w:r>
+      <m:oMath>
+        <m:r>
+          <m:rPr>
+            <m:sty m:val="p"/>
+          </m:rPr>
+          <m:t>−</m:t>
+        </m:r>
+        <m:r>
+          <m:t>1.00</m:t>
+        </m:r>
+        <m:r>
+          <m:rPr>
+            <m:sty m:val="p"/>
+          </m:rPr>
+          <m:t>%</m:t>
+        </m:r>
+      </m:oMath>
+      <w:r>
+        <w:t xml:space="preserve">/decade, 95% CI:</w:t>
+      </w:r>
+      <w:r>
+        <w:t xml:space="preserve"> </w:t>
+      </w:r>
+      <m:oMath>
+        <m:r>
+          <m:rPr>
+            <m:sty m:val="p"/>
+          </m:rPr>
+          <m:t>−</m:t>
+        </m:r>
+        <m:r>
+          <m:t>2.09</m:t>
+        </m:r>
+      </m:oMath>
+      <w:r>
+        <w:t xml:space="preserve"> </w:t>
+      </w:r>
+      <w:r>
+        <w:t xml:space="preserve">to</w:t>
+      </w:r>
+      <w:r>
+        <w:t xml:space="preserve"> </w:t>
+      </w:r>
+      <m:oMath>
+        <m:r>
+          <m:rPr>
+            <m:sty m:val="p"/>
+          </m:rPr>
+          <m:t>+</m:t>
+        </m:r>
+        <m:r>
+          <m:t>0.09</m:t>
+        </m:r>
+        <m:r>
+          <m:rPr>
+            <m:sty m:val="p"/>
+          </m:rPr>
+          <m:t>%</m:t>
+        </m:r>
+      </m:oMath>
+      <w:r>
+        <w:t xml:space="preserve">/decade;</w:t>
+      </w:r>
+      <w:r>
+        <w:t xml:space="preserve"> </w:t>
+      </w:r>
+      <m:oMath>
+        <m:r>
+          <m:rPr>
+            <m:sty m:val="p"/>
+          </m:rPr>
+          <m:t>−</m:t>
+        </m:r>
+        <m:r>
+          <m:t>0.76</m:t>
+        </m:r>
+      </m:oMath>
+      <w:r>
+        <w:t xml:space="preserve"> </w:t>
+      </w:r>
+      <w:r>
+        <w:t xml:space="preserve">mm/decade). In this four-fold larger sample, body mass exhibited a subtle, statistically detectable decline of</w:t>
+      </w:r>
+      <w:r>
+        <w:t xml:space="preserve"> </w:t>
+      </w:r>
+      <m:oMath>
+        <m:r>
+          <m:rPr>
+            <m:sty m:val="p"/>
+          </m:rPr>
+          <m:t>−</m:t>
+        </m:r>
+        <m:r>
+          <m:t>1.29</m:t>
+        </m:r>
+        <m:r>
+          <m:rPr>
+            <m:sty m:val="p"/>
+          </m:rPr>
+          <m:t>%</m:t>
+        </m:r>
+      </m:oMath>
+      <w:r>
+        <w:t xml:space="preserve">/decade (95% CI:</w:t>
+      </w:r>
+      <w:r>
+        <w:t xml:space="preserve"> </w:t>
+      </w:r>
+      <m:oMath>
+        <m:r>
+          <m:rPr>
+            <m:sty m:val="p"/>
+          </m:rPr>
+          <m:t>−</m:t>
+        </m:r>
+        <m:r>
+          <m:t>2.30</m:t>
+        </m:r>
+      </m:oMath>
+      <w:r>
+        <w:t xml:space="preserve"> </w:t>
+      </w:r>
+      <w:r>
+        <w:t xml:space="preserve">to</w:t>
+      </w:r>
+      <w:r>
+        <w:t xml:space="preserve"> </w:t>
+      </w:r>
+      <m:oMath>
+        <m:r>
+          <m:rPr>
+            <m:sty m:val="p"/>
+          </m:rPr>
+          <m:t>−</m:t>
+        </m:r>
+        <m:r>
+          <m:t>0.27</m:t>
+        </m:r>
+        <m:r>
+          <m:rPr>
+            <m:sty m:val="p"/>
+          </m:rPr>
+          <m:t>%</m:t>
+        </m:r>
+      </m:oMath>
+      <w:r>
+        <w:t xml:space="preserve">/decade,</w:t>
+      </w:r>
+      <w:r>
+        <w:t xml:space="preserve"> </w:t>
+      </w:r>
+      <m:oMath>
+        <m:r>
+          <m:t>t</m:t>
+        </m:r>
+        <m:r>
+          <m:rPr>
+            <m:sty m:val="p"/>
+          </m:rPr>
+          <m:t>=</m:t>
+        </m:r>
+        <m:r>
+          <m:rPr>
+            <m:sty m:val="p"/>
+          </m:rPr>
+          <m:t>−</m:t>
+        </m:r>
+        <m:r>
+          <m:t>2.47</m:t>
+        </m:r>
+        <m:r>
+          <m:rPr>
+            <m:sty m:val="p"/>
+          </m:rPr>
+          <m:t>,</m:t>
+        </m:r>
+        <m:r>
+          <m:t>p</m:t>
+        </m:r>
+        <m:r>
+          <m:rPr>
+            <m:sty m:val="p"/>
+          </m:rPr>
+          <m:t>=</m:t>
+        </m:r>
+        <m:r>
+          <m:t>0.014</m:t>
+        </m:r>
+      </m:oMath>
+      <w:r>
+        <w:t xml:space="preserve">; Supplementary Table S1), demonstrating that body mass sensitivity in the Atlantic Forest is modest and intermediate between temperate and equatorial extremes.</w:t>
+      </w:r>
+    </w:p>
+    <w:bookmarkEnd w:id="52"/>
+    <w:bookmarkEnd w:id="53"/>
+    <w:bookmarkStart w:id="60" w:name="discussion"/>
+    <w:p>
+      <w:pPr>
+        <w:pStyle w:val="Heading1"/>
+      </w:pPr>
+      <w:r>
+        <w:t xml:space="preserve">3. Discussion</w:t>
+      </w:r>
+    </w:p>
+    <w:p>
+      <w:pPr>
+        <w:pStyle w:val="FirstParagraph"/>
+      </w:pPr>
+      <w:r>
+        <w:t xml:space="preserve">Our macroecological investigation across 73 passerine bird species and 24 years of climate warming in the Brazilian Atlantic Forest reveals a pattern of phenotypic stability alongside subtle, species-specific adjustments. Across multiple morphometric dimensions, we find:</w:t>
+      </w:r>
+      <w:r>
+        <w:t xml:space="preserve"> </w:t>
+      </w:r>
+      <w:r>
+        <w:t xml:space="preserve">(1)</w:t>
       </w:r>
       <w:r>
         <w:t xml:space="preserve"> </w:t>
@@ -6678,16 +7816,16 @@
           <w:b/>
           <w:bCs/>
         </w:rPr>
-        <w:t xml:space="preserve">Phenotypic variance stability</w:t>
-      </w:r>
-      <w:r>
-        <w:t xml:space="preserve">: Among-individual variability has remained constant over time and does not track temperature.</w:t>
-      </w:r>
-      <w:r>
-        <w:t xml:space="preserve"> </w:t>
-      </w:r>
-      <w:r>
-        <w:t xml:space="preserve">(7)</w:t>
+        <w:t xml:space="preserve">Body mass stability</w:t>
+      </w:r>
+      <w:r>
+        <w:t xml:space="preserve">: In contrast to predictions from Bergmann’s rule, body mass has remained constant over 24 years (−0.91%/decade, spanning zero), despite strong diurnal feeding rhythms (+0.40%/hour).</w:t>
+      </w:r>
+      <w:r>
+        <w:t xml:space="preserve"> </w:t>
+      </w:r>
+      <w:r>
+        <w:t xml:space="preserve">(2)</w:t>
       </w:r>
       <w:r>
         <w:t xml:space="preserve"> </w:t>
@@ -6697,67 +7835,16 @@
           <w:b/>
           <w:bCs/>
         </w:rPr>
-        <w:t xml:space="preserve">Trophic buffering</w:t>
-      </w:r>
-      <w:r>
-        <w:t xml:space="preserve">: Obligate insectivores exhibit null temporal slopes, indicating that dietary specialization does not amplify morphological sensitivity.</w:t>
-      </w:r>
-    </w:p>
-    <w:bookmarkStart w:id="53" w:name="X0a76c3bb2637f6ac04bb59272c05eb852d44391"/>
-    <w:p>
-      <w:pPr>
-        <w:pStyle w:val="Heading2"/>
-      </w:pPr>
-      <w:r>
-        <w:t xml:space="preserve">3.1 Contrasting macroecological dynamics: Atlantic Forest stability versus Amazonian shrinkage</w:t>
-      </w:r>
-    </w:p>
-    <w:p>
-      <w:pPr>
-        <w:pStyle w:val="FirstParagraph"/>
-      </w:pPr>
-      <w:r>
-        <w:t xml:space="preserve">These findings present a macroecological contrast to the only comparable multi-decadal Neotropical benchmark: the study by</w:t>
-      </w:r>
-      <w:r>
-        <w:t xml:space="preserve"> </w:t>
-      </w:r>
-      <w:r>
-        <w:t xml:space="preserve">Jirinec et al. (2021)</w:t>
-      </w:r>
-      <w:r>
-        <w:t xml:space="preserve"> </w:t>
-      </w:r>
-      <w:r>
-        <w:t xml:space="preserve">in the central Amazon. In 77 non-migratory understorey species monitored over 40 years in continuous primary rainforest,</w:t>
-      </w:r>
-      <w:r>
-        <w:t xml:space="preserve"> </w:t>
-      </w:r>
-      <w:r>
-        <w:t xml:space="preserve">Jirinec et al. (2021)</w:t>
-      </w:r>
-      <w:r>
-        <w:t xml:space="preserve"> </w:t>
-      </w:r>
-      <w:r>
-        <w:t xml:space="preserve">documented widespread declines in body mass (averaging −0.1 to −0.2%/year) coupled with wing elongation in 36% of species. This resulted in a community-wide reduction in wing loading, interpreted as an adaptation to lower metabolic flight costs and improve flight efficiency in an increasingly hot, dry understorey.</w:t>
-      </w:r>
-    </w:p>
-    <w:p>
-      <w:pPr>
-        <w:pStyle w:val="BodyText"/>
-      </w:pPr>
-      <w:r>
-        <w:t xml:space="preserve">Why do resident forest passerines in the Atlantic Forest exhibit body mass stability and subtle, heterogeneous wing adjustments rather than the widespread mass loss and wing lengthening seen in the central Amazon? We propose three non-mutually exclusive ecological and evolutionary mechanisms:</w:t>
-      </w:r>
-    </w:p>
-    <w:p>
-      <w:pPr>
-        <w:pStyle w:val="BodyText"/>
-      </w:pPr>
-      <w:r>
-        <w:t xml:space="preserve">First,</w:t>
+        <w:t xml:space="preserve">Subtle and heterogeneous wing trajectories</w:t>
+      </w:r>
+      <w:r>
+        <w:t xml:space="preserve">: Community-level wing length shows a subtle, non-significant trajectory (−0.74 mm/decade; within-observer slope −0.32 mm/decade), characterized by pronounced interspecific variation where 61 of 72 species overlap zero.</w:t>
+      </w:r>
+      <w:r>
+        <w:t xml:space="preserve"> </w:t>
+      </w:r>
+      <w:r>
+        <w:t xml:space="preserve">(3)</w:t>
       </w:r>
       <w:r>
         <w:t xml:space="preserve"> </w:t>
@@ -6767,45 +7854,16 @@
           <w:b/>
           <w:bCs/>
         </w:rPr>
-        <w:t xml:space="preserve">landscape fragmentation and aerodynamic flight constraints</w:t>
-      </w:r>
-      <w:r>
-        <w:t xml:space="preserve">. The central Amazonian study was conducted in a continuous, undisturbed primary forest block (BDFFP) where birds move beneath a continuous closed canopy. In continuous understorey, foraging flights are typically short, highly maneuverable sallies; under such conditions, longer wings and lower wing loading reduce metabolic transport costs with minimal aerodynamic penalty</w:t>
-      </w:r>
-      <w:r>
-        <w:t xml:space="preserve"> </w:t>
-      </w:r>
-      <w:r>
-        <w:t xml:space="preserve">(Jirinec et al. 2021)</w:t>
-      </w:r>
-      <w:r>
-        <w:t xml:space="preserve">. In contrast, the Atlantic Forest has undergone extensive historical deforestation, leaving a heavily fragmented landscape where forest patches are embedded in open agricultural or pastoral matrices</w:t>
-      </w:r>
-      <w:r>
-        <w:t xml:space="preserve"> </w:t>
-      </w:r>
-      <w:r>
-        <w:t xml:space="preserve">(Ribeiro et al. 2009)</w:t>
-      </w:r>
-      <w:r>
-        <w:t xml:space="preserve">. In fragmented landscapes, forest birds must frequently traverse open matrix, cross habitat edges, and navigate areas exposed to strong winds and elevated predation from open-country raptors</w:t>
-      </w:r>
-      <w:r>
-        <w:t xml:space="preserve"> </w:t>
-      </w:r>
-      <w:r>
-        <w:t xml:space="preserve">(Ribeiro et al. 2009)</w:t>
-      </w:r>
-      <w:r>
-        <w:t xml:space="preserve">. Under these conditions, aerodynamic performance demands flight power, burst speed, and high maneuverability rather than low wing loading. Selective pressures to navigate fragmented landscapes may therefore penalize wing lengthening or body mass reduction, constraining morphological shifts that might otherwise be favored in continuous forest.</w:t>
-      </w:r>
-    </w:p>
-    <w:p>
-      <w:pPr>
-        <w:pStyle w:val="BodyText"/>
-      </w:pPr>
-      <w:r>
-        <w:t xml:space="preserve">Second,</w:t>
+        <w:t xml:space="preserve">Bill width invariance shows no support for Allen’s rule</w:t>
+      </w:r>
+      <w:r>
+        <w:t xml:space="preserve">: Bill width shows no temporal expansion under controls (−0.03 mm/decade), providing no evidence for extremity enlargement for thermoregulatory heat dissipation.</w:t>
+      </w:r>
+      <w:r>
+        <w:t xml:space="preserve"> </w:t>
+      </w:r>
+      <w:r>
+        <w:t xml:space="preserve">(4)</w:t>
       </w:r>
       <w:r>
         <w:t xml:space="preserve"> </w:t>
@@ -6815,18 +7873,36 @@
           <w:b/>
           <w:bCs/>
         </w:rPr>
-        <w:t xml:space="preserve">topographic complexity and elevational thermal refugia</w:t>
-      </w:r>
-      <w:r>
-        <w:t xml:space="preserve">. The central Amazon BDFFP site occupies a relatively flat lowland landscape (elevation ~50–150 m) where species have limited access to steep thermal gradients and cannot escape regional warming through short-distance elevational shifts. In contrast, the Atlantic Forest features steep coastal mountain systems (e.g., Serra do Mar, Serra da Mantiqueira) spanning elevations from sea level to over 2,000 m. This complex topography generates sharp microclimatic gradients across short horizontal distances. Resident birds in topographically complex biomes may buffer themselves against rising temperatures by making subtle elevational or microhabitat shifts, reducing the physiological pressure to undergo morphological adaptation.</w:t>
-      </w:r>
-    </w:p>
-    <w:p>
-      <w:pPr>
-        <w:pStyle w:val="BodyText"/>
-      </w:pPr>
-      <w:r>
-        <w:t xml:space="preserve">Third,</w:t>
+        <w:t xml:space="preserve">Mass conservation over geometric shrinkage</w:t>
+      </w:r>
+      <w:r>
+        <w:t xml:space="preserve">: On shared individuals measured for both traits, body mass was significantly more conserved than expected under cubic geometric shrinkage of the wing (+4.85%/decade contrast,</w:t>
+      </w:r>
+      <w:r>
+        <w:t xml:space="preserve"> </w:t>
+      </w:r>
+      <m:oMath>
+        <m:r>
+          <m:t>p</m:t>
+        </m:r>
+        <m:r>
+          <m:rPr>
+            <m:sty m:val="p"/>
+          </m:rPr>
+          <m:t>=</m:t>
+        </m:r>
+        <m:r>
+          <m:t>0.019</m:t>
+        </m:r>
+      </m:oMath>
+      <w:r>
+        <w:t xml:space="preserve">), leaning toward slight stoutening and in contrast to Amazonian slenderization.</w:t>
+      </w:r>
+      <w:r>
+        <w:t xml:space="preserve"> </w:t>
+      </w:r>
+      <w:r>
+        <w:t xml:space="preserve">(5)</w:t>
       </w:r>
       <w:r>
         <w:t xml:space="preserve"> </w:t>
@@ -6836,117 +7912,10 @@
           <w:b/>
           <w:bCs/>
         </w:rPr>
-        <w:t xml:space="preserve">microclimatic variability and physiological plasticity</w:t>
-      </w:r>
-      <w:r>
-        <w:t xml:space="preserve">. Forest fragments experience pronounced edge effects, with higher temperature variability and fluctuating humidity relative to continuous interior forest. Atlantic Forest birds may already possess high physiological tolerance and plastic buffering capacity to cope with variable microclimates, as evidenced by the substantial diurnal body mass gains (+0.40%/hour) observed here. Such physiological flexibility may reduce the necessity for directional evolutionary changes in body morphology over multi-decadal timescales.</w:t>
-      </w:r>
-    </w:p>
-    <w:p>
-      <w:pPr>
-        <w:pStyle w:val="BodyText"/>
-      </w:pPr>
-      <w:r>
-        <w:t xml:space="preserve">Beyond these ecological mechanisms, a plausible alternative hypothesis is whether the contrast reflects study design—namely, a single continuous 40-year ringing station (BDFFP) versus a multi-site macroecological compilation. Crucially, our within-observer Mundlak decomposition directly demonstrates that phenotypic stability in the Atlantic Forest is not an artifact of observational noise or compiler turnover: field researchers who sampled birds continuously across multi-year spans (e.g., E. Carrano, A. Ross, M. Alves) independently exhibited slopes indistinguishable from zero (within-observer wing slope: −0.3 mm/decade; complete cases: +0.03 mm/decade; body mass: −0.6%/decade). This confirms that phenotypic stability reflects a genuine biological characteristic of resident Atlantic Forest passerines across this warming era rather than an inferential limitation of large compilations.</w:t>
-      </w:r>
-    </w:p>
-    <w:bookmarkEnd w:id="53"/>
-    <w:bookmarkStart w:id="54" w:name="Xb35ad76cf24e9bfdd69823512a28f009f1faba2"/>
-    <w:p>
-      <w:pPr>
-        <w:pStyle w:val="Heading2"/>
-      </w:pPr>
-      <w:r>
-        <w:t xml:space="preserve">3.2 Evaluating ecogeographical rules in tropical endotherms</w:t>
-      </w:r>
-    </w:p>
-    <w:p>
-      <w:pPr>
-        <w:pStyle w:val="FirstParagraph"/>
-      </w:pPr>
-      <w:r>
-        <w:t xml:space="preserve">Our findings provide a critical empirical test of classic ecogeographical rules in tropical endotherms under climate change. Bergmann’s rule has frequently been generalized as a general expectation that warming temperatures drive reductions in animal body size</w:t>
-      </w:r>
-      <w:r>
-        <w:t xml:space="preserve"> </w:t>
-      </w:r>
-      <w:r>
-        <w:t xml:space="preserve">(Gardner et al. 2011; Sheridan and Bickford 2011)</w:t>
-      </w:r>
-      <w:r>
-        <w:t xml:space="preserve">. In our 24-year dataset of 73 tropical passerine species, body mass showed no directional decline despite +0.25°C/decade of regional warming. This stability challenges the generality of Bergmann’s rule in tropical forest birds, demonstrating that tropical endotherms can maintain stable body mass over decadal timescales.</w:t>
-      </w:r>
-    </w:p>
-    <w:p>
-      <w:pPr>
-        <w:pStyle w:val="BodyText"/>
-      </w:pPr>
-      <w:r>
-        <w:t xml:space="preserve">Similarly, Allen’s rule posits that appendages enlarge in warmer environments to facilitate heat dissipation</w:t>
-      </w:r>
-      <w:r>
-        <w:t xml:space="preserve"> </w:t>
-      </w:r>
-      <w:r>
-        <w:t xml:space="preserve">(Allen 1877; Ryding et al. 2021)</w:t>
-      </w:r>
-      <w:r>
-        <w:t xml:space="preserve">. While unadjusted baseline models suggested a temporal increase in bill width, this apparent trend disappeared once observer identity was accounted for, with bill width remaining completely invariant (−0.03 mm/decade, spanning zero). In tropical passerines, bill morphology is heavily constrained by foraging biomechanics, trophic specialization, and vocal performance, which may strongly override subtle thermoregulatory selection for larger bills</w:t>
-      </w:r>
-      <w:r>
-        <w:t xml:space="preserve"> </w:t>
-      </w:r>
-      <w:r>
-        <w:t xml:space="preserve">(Teplitsky and Millien 2014)</w:t>
-      </w:r>
-      <w:r>
-        <w:t xml:space="preserve">.</w:t>
-      </w:r>
-    </w:p>
-    <w:bookmarkEnd w:id="54"/>
-    <w:bookmarkStart w:id="55" w:name="X1ce0fa42833206a5442254f46af33f5d9d53692"/>
-    <w:p>
-      <w:pPr>
-        <w:pStyle w:val="Heading2"/>
-      </w:pPr>
-      <w:r>
-        <w:t xml:space="preserve">3.3 Interspecific variation and preservation of allometric scaling</w:t>
-      </w:r>
-    </w:p>
-    <w:p>
-      <w:pPr>
-        <w:pStyle w:val="FirstParagraph"/>
-      </w:pPr>
-      <w:r>
-        <w:t xml:space="preserve">Rather than a uniform community-wide response, our results reveal substantial interspecific heterogeneity (</w:t>
-      </w:r>
-      <w:hyperlink w:anchor="fig-species-slopes">
-        <w:r>
-          <w:rPr>
-            <w:rStyle w:val="Hyperlink"/>
-          </w:rPr>
-          <w:t xml:space="preserve">Figure 4</w:t>
-        </w:r>
-      </w:hyperlink>
-      <w:r>
-        <w:t xml:space="preserve">). While a small minority of species exhibited credible declines in wing length (9 of 72 species) or credible increases (2 of 72 species), the vast majority (61 species) showed trajectories overlapping zero. This diversity of species trajectories aligns with recent global syntheses showing that morphological responses to climate change are frequently idiosyncratic and species-specific rather than uniform</w:t>
-      </w:r>
-      <w:r>
-        <w:t xml:space="preserve"> </w:t>
-      </w:r>
-      <w:r>
-        <w:t xml:space="preserve">(Teplitsky and Millien 2014)</w:t>
-      </w:r>
-      <w:r>
-        <w:t xml:space="preserve">.</w:t>
-      </w:r>
-    </w:p>
-    <w:p>
-      <w:pPr>
-        <w:pStyle w:val="BodyText"/>
-      </w:pPr>
-      <w:r>
-        <w:t xml:space="preserve">Importantly, our analysis of 7,577 shared records from the same individuals revealed that body mass was significantly more conserved than predicted under cubic geometric scaling of wing shortening (</w:t>
+        <w:t xml:space="preserve">Direct thermal modulation of allometry</w:t>
+      </w:r>
+      <w:r>
+        <w:t xml:space="preserve">: Interannual temperature anomalies directly drive departures from geometric isometry toward relative wing shortening and mass retention (</w:t>
       </w:r>
       <m:oMath>
         <m:sSub>
@@ -6968,6 +7937,380 @@
             </m:r>
           </m:sub>
         </m:sSub>
+      </m:oMath>
+      <w:r>
+        <w:t xml:space="preserve"> </w:t>
+      </w:r>
+      <w:r>
+        <w:t xml:space="preserve">increases by</w:t>
+      </w:r>
+      <w:r>
+        <w:t xml:space="preserve"> </w:t>
+      </w:r>
+      <m:oMath>
+        <m:r>
+          <m:rPr>
+            <m:sty m:val="p"/>
+          </m:rPr>
+          <m:t>+</m:t>
+        </m:r>
+        <m:r>
+          <m:t>2.1</m:t>
+        </m:r>
+        <m:r>
+          <m:rPr>
+            <m:sty m:val="p"/>
+          </m:rPr>
+          <m:t>%</m:t>
+        </m:r>
+      </m:oMath>
+      <w:r>
+        <w:t xml:space="preserve"> </w:t>
+      </w:r>
+      <w:r>
+        <w:t xml:space="preserve">per °C,</w:t>
+      </w:r>
+      <w:r>
+        <w:t xml:space="preserve"> </w:t>
+      </w:r>
+      <m:oMath>
+        <m:r>
+          <m:t>p</m:t>
+        </m:r>
+        <m:r>
+          <m:rPr>
+            <m:sty m:val="p"/>
+          </m:rPr>
+          <m:t>=</m:t>
+        </m:r>
+        <m:r>
+          <m:t>0.030</m:t>
+        </m:r>
+      </m:oMath>
+      <w:r>
+        <w:t xml:space="preserve">), while body mass remains thermally decoupled (</w:t>
+      </w:r>
+      <m:oMath>
+        <m:r>
+          <m:t>p</m:t>
+        </m:r>
+        <m:r>
+          <m:rPr>
+            <m:sty m:val="p"/>
+          </m:rPr>
+          <m:t>=</m:t>
+        </m:r>
+        <m:r>
+          <m:t>0.57</m:t>
+        </m:r>
+      </m:oMath>
+      <w:r>
+        <w:t xml:space="preserve">).</w:t>
+      </w:r>
+      <w:r>
+        <w:t xml:space="preserve"> </w:t>
+      </w:r>
+      <w:r>
+        <w:t xml:space="preserve">(6)</w:t>
+      </w:r>
+      <w:r>
+        <w:t xml:space="preserve"> </w:t>
+      </w:r>
+      <w:r>
+        <w:rPr>
+          <w:b/>
+          <w:bCs/>
+        </w:rPr>
+        <w:t xml:space="preserve">Phenotypic variance stability</w:t>
+      </w:r>
+      <w:r>
+        <w:t xml:space="preserve">: Among-individual variability has remained constant over time and does not track temperature.</w:t>
+      </w:r>
+      <w:r>
+        <w:t xml:space="preserve"> </w:t>
+      </w:r>
+      <w:r>
+        <w:t xml:space="preserve">(7)</w:t>
+      </w:r>
+      <w:r>
+        <w:t xml:space="preserve"> </w:t>
+      </w:r>
+      <w:r>
+        <w:rPr>
+          <w:b/>
+          <w:bCs/>
+        </w:rPr>
+        <w:t xml:space="preserve">Trophic buffering</w:t>
+      </w:r>
+      <w:r>
+        <w:t xml:space="preserve">: Obligate insectivores exhibit null temporal slopes, indicating that dietary specialization does not amplify morphological sensitivity.</w:t>
+      </w:r>
+    </w:p>
+    <w:bookmarkStart w:id="54" w:name="X0a76c3bb2637f6ac04bb59272c05eb852d44391"/>
+    <w:p>
+      <w:pPr>
+        <w:pStyle w:val="Heading2"/>
+      </w:pPr>
+      <w:r>
+        <w:t xml:space="preserve">3.1 Contrasting macroecological dynamics: Atlantic Forest stability versus Amazonian shrinkage</w:t>
+      </w:r>
+    </w:p>
+    <w:p>
+      <w:pPr>
+        <w:pStyle w:val="FirstParagraph"/>
+      </w:pPr>
+      <w:r>
+        <w:t xml:space="preserve">These findings present a macroecological contrast to the only comparable multi-decadal Neotropical benchmark: the study by</w:t>
+      </w:r>
+      <w:r>
+        <w:t xml:space="preserve"> </w:t>
+      </w:r>
+      <w:r>
+        <w:t xml:space="preserve">Jirinec et al. (2021)</w:t>
+      </w:r>
+      <w:r>
+        <w:t xml:space="preserve"> </w:t>
+      </w:r>
+      <w:r>
+        <w:t xml:space="preserve">in the central Amazon. In 77 non-migratory understorey species monitored over 40 years in continuous primary rainforest,</w:t>
+      </w:r>
+      <w:r>
+        <w:t xml:space="preserve"> </w:t>
+      </w:r>
+      <w:r>
+        <w:t xml:space="preserve">Jirinec et al. (2021)</w:t>
+      </w:r>
+      <w:r>
+        <w:t xml:space="preserve"> </w:t>
+      </w:r>
+      <w:r>
+        <w:t xml:space="preserve">documented widespread declines in body mass (averaging −0.1 to −0.2%/year) coupled with wing elongation in 36% of species. This resulted in a community-wide reduction in wing loading, interpreted as an adaptation to lower metabolic flight costs and improve flight efficiency in an increasingly hot, dry understorey.</w:t>
+      </w:r>
+    </w:p>
+    <w:p>
+      <w:pPr>
+        <w:pStyle w:val="BodyText"/>
+      </w:pPr>
+      <w:r>
+        <w:t xml:space="preserve">Why do resident forest passerines in the Atlantic Forest exhibit body mass stability and subtle, heterogeneous wing adjustments rather than the widespread mass loss and wing lengthening seen in the central Amazon? We propose three non-mutually exclusive ecological and evolutionary mechanisms:</w:t>
+      </w:r>
+    </w:p>
+    <w:p>
+      <w:pPr>
+        <w:pStyle w:val="BodyText"/>
+      </w:pPr>
+      <w:r>
+        <w:t xml:space="preserve">First,</w:t>
+      </w:r>
+      <w:r>
+        <w:t xml:space="preserve"> </w:t>
+      </w:r>
+      <w:r>
+        <w:rPr>
+          <w:b/>
+          <w:bCs/>
+        </w:rPr>
+        <w:t xml:space="preserve">landscape fragmentation and aerodynamic flight constraints</w:t>
+      </w:r>
+      <w:r>
+        <w:t xml:space="preserve">. The central Amazonian study was conducted in a continuous, undisturbed primary forest block (BDFFP) where birds move beneath a continuous closed canopy. In continuous understorey, foraging flights are typically short, highly maneuverable sallies; under such conditions, longer wings and lower wing loading reduce metabolic transport costs with minimal aerodynamic penalty</w:t>
+      </w:r>
+      <w:r>
+        <w:t xml:space="preserve"> </w:t>
+      </w:r>
+      <w:r>
+        <w:t xml:space="preserve">(Jirinec et al. 2021)</w:t>
+      </w:r>
+      <w:r>
+        <w:t xml:space="preserve">. In contrast, the Atlantic Forest has undergone extensive historical deforestation, leaving a heavily fragmented landscape where forest patches are embedded in open agricultural or pastoral matrices</w:t>
+      </w:r>
+      <w:r>
+        <w:t xml:space="preserve"> </w:t>
+      </w:r>
+      <w:r>
+        <w:t xml:space="preserve">(Ribeiro et al. 2009)</w:t>
+      </w:r>
+      <w:r>
+        <w:t xml:space="preserve">. In fragmented landscapes, forest birds must frequently traverse open matrix, cross habitat edges, and navigate areas exposed to strong winds and elevated predation from open-country raptors</w:t>
+      </w:r>
+      <w:r>
+        <w:t xml:space="preserve"> </w:t>
+      </w:r>
+      <w:r>
+        <w:t xml:space="preserve">(Ribeiro et al. 2009)</w:t>
+      </w:r>
+      <w:r>
+        <w:t xml:space="preserve">. Under these conditions, aerodynamic performance demands flight power, burst speed, and high maneuverability rather than low wing loading. Selective pressures to navigate fragmented landscapes may therefore penalize wing lengthening or body mass reduction, constraining morphological shifts that might otherwise be favored in continuous forest.</w:t>
+      </w:r>
+    </w:p>
+    <w:p>
+      <w:pPr>
+        <w:pStyle w:val="BodyText"/>
+      </w:pPr>
+      <w:r>
+        <w:t xml:space="preserve">Second,</w:t>
+      </w:r>
+      <w:r>
+        <w:t xml:space="preserve"> </w:t>
+      </w:r>
+      <w:r>
+        <w:rPr>
+          <w:b/>
+          <w:bCs/>
+        </w:rPr>
+        <w:t xml:space="preserve">topographic complexity and elevational thermal refugia</w:t>
+      </w:r>
+      <w:r>
+        <w:t xml:space="preserve">. The central Amazon BDFFP site occupies a relatively flat lowland landscape (elevation ~50–150 m) where species have limited access to steep thermal gradients and cannot escape regional warming through short-distance elevational shifts. In contrast, the Atlantic Forest features steep coastal mountain systems (e.g., Serra do Mar, Serra da Mantiqueira) spanning elevations from sea level to over 2,000 m. This complex topography generates sharp microclimatic gradients across short horizontal distances. Resident birds in topographically complex biomes may buffer themselves against rising temperatures by making subtle elevational or microhabitat shifts, reducing the physiological pressure to undergo morphological adaptation.</w:t>
+      </w:r>
+    </w:p>
+    <w:p>
+      <w:pPr>
+        <w:pStyle w:val="BodyText"/>
+      </w:pPr>
+      <w:r>
+        <w:t xml:space="preserve">Third,</w:t>
+      </w:r>
+      <w:r>
+        <w:t xml:space="preserve"> </w:t>
+      </w:r>
+      <w:r>
+        <w:rPr>
+          <w:b/>
+          <w:bCs/>
+        </w:rPr>
+        <w:t xml:space="preserve">microclimatic variability and physiological plasticity</w:t>
+      </w:r>
+      <w:r>
+        <w:t xml:space="preserve">. Forest fragments experience pronounced edge effects, with higher temperature variability and fluctuating humidity relative to continuous interior forest. Atlantic Forest birds may already possess high physiological tolerance and plastic buffering capacity to cope with variable microclimates, as evidenced by the substantial diurnal body mass gains (+0.40%/hour) observed here. Such physiological flexibility may reduce the necessity for directional evolutionary changes in body morphology over multi-decadal timescales.</w:t>
+      </w:r>
+    </w:p>
+    <w:p>
+      <w:pPr>
+        <w:pStyle w:val="BodyText"/>
+      </w:pPr>
+      <w:r>
+        <w:t xml:space="preserve">Beyond these ecological mechanisms, a plausible alternative hypothesis is whether the contrast reflects study design—namely, a single continuous 40-year ringing station (BDFFP) versus a multi-site macroecological compilation. Crucially, our within-observer Mundlak decomposition directly demonstrates that phenotypic stability in the Atlantic Forest is not an artifact of observational noise or compiler turnover: field researchers who sampled birds continuously across multi-year spans (e.g., E. Carrano, A. Ross, M. Alves) independently exhibited slopes indistinguishable from zero (within-observer wing slope: −0.3 mm/decade; complete cases: +0.03 mm/decade; body mass: −0.6%/decade). This confirms that phenotypic stability reflects a genuine biological characteristic of resident Atlantic Forest passerines across this warming era rather than an inferential limitation of large compilations.</w:t>
+      </w:r>
+    </w:p>
+    <w:bookmarkEnd w:id="54"/>
+    <w:bookmarkStart w:id="55" w:name="Xb35ad76cf24e9bfdd69823512a28f009f1faba2"/>
+    <w:p>
+      <w:pPr>
+        <w:pStyle w:val="Heading2"/>
+      </w:pPr>
+      <w:r>
+        <w:t xml:space="preserve">3.2 Evaluating ecogeographical rules in tropical endotherms</w:t>
+      </w:r>
+    </w:p>
+    <w:p>
+      <w:pPr>
+        <w:pStyle w:val="FirstParagraph"/>
+      </w:pPr>
+      <w:r>
+        <w:t xml:space="preserve">Our findings provide a critical empirical test of classic ecogeographical rules in tropical endotherms under climate change. Bergmann’s rule has frequently been generalized as a general expectation that warming temperatures drive reductions in animal body size</w:t>
+      </w:r>
+      <w:r>
+        <w:t xml:space="preserve"> </w:t>
+      </w:r>
+      <w:r>
+        <w:t xml:space="preserve">(Gardner et al. 2011; Sheridan and Bickford 2011)</w:t>
+      </w:r>
+      <w:r>
+        <w:t xml:space="preserve">. In our 24-year dataset of 73 tropical passerine species, body mass showed no directional decline despite +0.25°C/decade of regional warming. This stability challenges the generality of Bergmann’s rule in tropical forest birds, demonstrating that tropical endotherms can maintain stable body mass over decadal timescales.</w:t>
+      </w:r>
+    </w:p>
+    <w:p>
+      <w:pPr>
+        <w:pStyle w:val="BodyText"/>
+      </w:pPr>
+      <w:r>
+        <w:t xml:space="preserve">Similarly, Allen’s rule posits that appendages enlarge in warmer environments to facilitate heat dissipation</w:t>
+      </w:r>
+      <w:r>
+        <w:t xml:space="preserve"> </w:t>
+      </w:r>
+      <w:r>
+        <w:t xml:space="preserve">(Allen 1877; Ryding et al. 2021)</w:t>
+      </w:r>
+      <w:r>
+        <w:t xml:space="preserve">. While unadjusted baseline models suggested a temporal increase in bill width, this apparent trend disappeared once observer identity was accounted for, with bill width remaining completely invariant (−0.03 mm/decade, spanning zero). In tropical passerines, bill morphology is heavily constrained by foraging biomechanics, trophic specialization, and vocal performance, which may strongly override subtle thermoregulatory selection for larger bills</w:t>
+      </w:r>
+      <w:r>
+        <w:t xml:space="preserve"> </w:t>
+      </w:r>
+      <w:r>
+        <w:t xml:space="preserve">(Teplitsky and Millien 2014)</w:t>
+      </w:r>
+      <w:r>
+        <w:t xml:space="preserve">.</w:t>
+      </w:r>
+    </w:p>
+    <w:bookmarkEnd w:id="55"/>
+    <w:bookmarkStart w:id="56" w:name="X1ce0fa42833206a5442254f46af33f5d9d53692"/>
+    <w:p>
+      <w:pPr>
+        <w:pStyle w:val="Heading2"/>
+      </w:pPr>
+      <w:r>
+        <w:t xml:space="preserve">3.3 Interspecific variation and preservation of allometric scaling</w:t>
+      </w:r>
+    </w:p>
+    <w:p>
+      <w:pPr>
+        <w:pStyle w:val="FirstParagraph"/>
+      </w:pPr>
+      <w:r>
+        <w:t xml:space="preserve">Rather than a uniform community-wide response, our results reveal substantial interspecific heterogeneity (</w:t>
+      </w:r>
+      <w:hyperlink w:anchor="fig-species-slopes">
+        <w:r>
+          <w:rPr>
+            <w:rStyle w:val="Hyperlink"/>
+          </w:rPr>
+          <w:t xml:space="preserve">Figure 4</w:t>
+        </w:r>
+      </w:hyperlink>
+      <w:r>
+        <w:t xml:space="preserve">). While a small minority of species exhibited credible declines in wing length (9 of 72 species) or credible increases (2 of 72 species), the vast majority (61 species) showed trajectories overlapping zero. This diversity of species trajectories aligns with recent global syntheses showing that morphological responses to climate change are frequently idiosyncratic and species-specific rather than uniform</w:t>
+      </w:r>
+      <w:r>
+        <w:t xml:space="preserve"> </w:t>
+      </w:r>
+      <w:r>
+        <w:t xml:space="preserve">(Teplitsky and Millien 2014)</w:t>
+      </w:r>
+      <w:r>
+        <w:t xml:space="preserve">.</w:t>
+      </w:r>
+    </w:p>
+    <w:p>
+      <w:pPr>
+        <w:pStyle w:val="BodyText"/>
+      </w:pPr>
+      <w:r>
+        <w:t xml:space="preserve">Importantly, our analysis of 7,577 shared records from the same individuals revealed that body mass was significantly more conserved than predicted under cubic geometric scaling of wing shortening (</w:t>
+      </w:r>
+      <m:oMath>
+        <m:sSub>
+          <m:e>
+            <m:r>
+              <m:rPr>
+                <m:sty m:val="p"/>
+              </m:rPr>
+              <m:t>Δ</m:t>
+            </m:r>
+          </m:e>
+          <m:sub>
+            <m:r>
+              <m:rPr>
+                <m:nor/>
+                <m:sty m:val="p"/>
+              </m:rPr>
+              <m:t>iso</m:t>
+            </m:r>
+          </m:sub>
+        </m:sSub>
         <m:r>
           <m:rPr>
             <m:sty m:val="p"/>
@@ -7118,8 +8461,8 @@
         <w:t xml:space="preserve">), Atlantic Forest passerines exhibit mass retention and slight stoutening. Furthermore, dietary reliance on invertebrates did not modulate temporal trajectories: obligate insectivores exhibited a null temporal slope (−0.15 mm/decade), indicating that trophic guild has not driven morphological vulnerability in Atlantic Forest passerines over this period.</w:t>
       </w:r>
     </w:p>
-    <w:bookmarkEnd w:id="55"/>
-    <w:bookmarkStart w:id="56" w:name="X03d1f6f95300cec80cfb7290b424a11e0ae60ec"/>
+    <w:bookmarkEnd w:id="56"/>
+    <w:bookmarkStart w:id="57" w:name="X03d1f6f95300cec80cfb7290b424a11e0ae60ec"/>
     <w:p>
       <w:pPr>
         <w:pStyle w:val="Heading2"/>
@@ -7133,7 +8476,7 @@
         <w:pStyle w:val="FirstParagraph"/>
       </w:pPr>
       <w:r>
-        <w:t xml:space="preserve">Our focal analytical dataset spanned 24 years (1995–2018), corresponding to the era of standardized, multi-project mist-netting in the Atlantic Forest. Placing this contemporary window into long-term macroecological context requires addressing two questions: did morphological stability precede this 24-year timeframe, and how sensitive are our conclusions to sampling breadth?</w:t>
+        <w:t xml:space="preserve">Our focal analytical dataset spanned 24 years (1995–2018), corresponding to the era of standardized, multi-project mist-netting in the Atlantic Forest. Integrating century-scale instrumental climate data and historical museum collections addresses two fundamental ecological questions: did morphological stability precede this contemporary window, and how sensitive are our inferences to taxonomic and demographic sampling breadth?</w:t>
       </w:r>
     </w:p>
     <w:p>
@@ -7141,445 +8484,7 @@
         <w:pStyle w:val="BodyText"/>
       </w:pPr>
       <w:r>
-        <w:t xml:space="preserve">First, examination of secular instrumental climate data (NASA GISS Zonal Anomalies for the Atlantic Forest latitudinal belt; 1880–2018) identifies a distinct structural breakpoint in regional warming around 1980 (</w:t>
-      </w:r>
-      <m:oMath>
-        <m:r>
-          <m:t>1980</m:t>
-        </m:r>
-        <m:r>
-          <m:rPr>
-            <m:sty m:val="p"/>
-          </m:rPr>
-          <m:t>±</m:t>
-        </m:r>
-        <m:r>
-          <m:t>3</m:t>
-        </m:r>
-      </m:oMath>
-      <w:r>
-        <w:t xml:space="preserve"> </w:t>
-      </w:r>
-      <w:r>
-        <w:t xml:space="preserve">years). Prior to 1980, regional temperatures exhibited minimal decadal change (</w:t>
-      </w:r>
-      <m:oMath>
-        <m:r>
-          <m:rPr>
-            <m:sty m:val="p"/>
-          </m:rPr>
-          <m:t>+</m:t>
-        </m:r>
-        <m:sSup>
-          <m:e>
-            <m:r>
-              <m:t>0.036</m:t>
-            </m:r>
-          </m:e>
-          <m:sup>
-            <m:r>
-              <m:rPr>
-                <m:sty m:val="p"/>
-              </m:rPr>
-              <m:t>∘</m:t>
-            </m:r>
-          </m:sup>
-        </m:sSup>
-        <m:r>
-          <m:rPr>
-            <m:nor/>
-            <m:sty m:val="p"/>
-          </m:rPr>
-          <m:t>C</m:t>
-        </m:r>
-      </m:oMath>
-      <w:r>
-        <w:t xml:space="preserve">/decade,</w:t>
-      </w:r>
-      <w:r>
-        <w:t xml:space="preserve"> </w:t>
-      </w:r>
-      <m:oMath>
-        <m:r>
-          <m:t>t</m:t>
-        </m:r>
-        <m:r>
-          <m:rPr>
-            <m:sty m:val="p"/>
-          </m:rPr>
-          <m:t>=</m:t>
-        </m:r>
-        <m:r>
-          <m:t>2.05</m:t>
-        </m:r>
-        <m:r>
-          <m:rPr>
-            <m:sty m:val="p"/>
-          </m:rPr>
-          <m:t>,</m:t>
-        </m:r>
-        <m:r>
-          <m:t>p</m:t>
-        </m:r>
-        <m:r>
-          <m:rPr>
-            <m:sty m:val="p"/>
-          </m:rPr>
-          <m:t>=</m:t>
-        </m:r>
-        <m:r>
-          <m:t>0.042</m:t>
-        </m:r>
-      </m:oMath>
-      <w:r>
-        <w:t xml:space="preserve">). Following 1980, regional warming accelerated more than five-fold (</w:t>
-      </w:r>
-      <m:oMath>
-        <m:r>
-          <m:rPr>
-            <m:sty m:val="p"/>
-          </m:rPr>
-          <m:t>+</m:t>
-        </m:r>
-        <m:sSup>
-          <m:e>
-            <m:r>
-              <m:t>0.190</m:t>
-            </m:r>
-          </m:e>
-          <m:sup>
-            <m:r>
-              <m:rPr>
-                <m:sty m:val="p"/>
-              </m:rPr>
-              <m:t>∘</m:t>
-            </m:r>
-          </m:sup>
-        </m:sSup>
-        <m:r>
-          <m:rPr>
-            <m:nor/>
-            <m:sty m:val="p"/>
-          </m:rPr>
-          <m:t>C</m:t>
-        </m:r>
-      </m:oMath>
-      <w:r>
-        <w:t xml:space="preserve">/decade,</w:t>
-      </w:r>
-      <w:r>
-        <w:t xml:space="preserve"> </w:t>
-      </w:r>
-      <m:oMath>
-        <m:r>
-          <m:t>t</m:t>
-        </m:r>
-        <m:r>
-          <m:rPr>
-            <m:sty m:val="p"/>
-          </m:rPr>
-          <m:t>=</m:t>
-        </m:r>
-        <m:r>
-          <m:t>8.62</m:t>
-        </m:r>
-        <m:r>
-          <m:rPr>
-            <m:sty m:val="p"/>
-          </m:rPr>
-          <m:t>,</m:t>
-        </m:r>
-        <m:r>
-          <m:t>p</m:t>
-        </m:r>
-        <m:r>
-          <m:rPr>
-            <m:sty m:val="p"/>
-          </m:rPr>
-          <m:t>&lt;</m:t>
-        </m:r>
-        <m:sSup>
-          <m:e>
-            <m:r>
-              <m:t>10</m:t>
-            </m:r>
-          </m:e>
-          <m:sup>
-            <m:r>
-              <m:rPr>
-                <m:sty m:val="p"/>
-              </m:rPr>
-              <m:t>−</m:t>
-            </m:r>
-            <m:r>
-              <m:t>15</m:t>
-            </m:r>
-          </m:sup>
-        </m:sSup>
-      </m:oMath>
-      <w:r>
-        <w:t xml:space="preserve">), matching the local rate observed at our capture sites (+0.25°C/decade). Historical museum study skins preserved in regional collections (MZUSP, MNRJ, FURB, UFPE; 1884–1979,</w:t>
-      </w:r>
-      <w:r>
-        <w:t xml:space="preserve"> </w:t>
-      </w:r>
-      <m:oMath>
-        <m:r>
-          <m:t>n</m:t>
-        </m:r>
-        <m:r>
-          <m:rPr>
-            <m:sty m:val="p"/>
-          </m:rPr>
-          <m:t>=</m:t>
-        </m:r>
-        <m:r>
-          <m:t>3</m:t>
-        </m:r>
-        <m:r>
-          <m:rPr>
-            <m:sty m:val="p"/>
-          </m:rPr>
-          <m:t>,</m:t>
-        </m:r>
-        <m:r>
-          <m:t>439</m:t>
-        </m:r>
-      </m:oMath>
-      <w:r>
-        <w:t xml:space="preserve"> </w:t>
-      </w:r>
-      <w:r>
-        <w:t xml:space="preserve">specimens across 142 species) document that wing length was stable or slightly positive during the century preceding accelerated warming (</w:t>
-      </w:r>
-      <m:oMath>
-        <m:r>
-          <m:rPr>
-            <m:sty m:val="p"/>
-          </m:rPr>
-          <m:t>+</m:t>
-        </m:r>
-        <m:r>
-          <m:t>0.45</m:t>
-        </m:r>
-      </m:oMath>
-      <w:r>
-        <w:t xml:space="preserve"> </w:t>
-      </w:r>
-      <w:r>
-        <w:t xml:space="preserve">mm/decade,</w:t>
-      </w:r>
-      <w:r>
-        <w:t xml:space="preserve"> </w:t>
-      </w:r>
-      <m:oMath>
-        <m:r>
-          <m:t>t</m:t>
-        </m:r>
-        <m:r>
-          <m:rPr>
-            <m:sty m:val="p"/>
-          </m:rPr>
-          <m:t>=</m:t>
-        </m:r>
-        <m:r>
-          <m:t>3.71</m:t>
-        </m:r>
-      </m:oMath>
-      <w:r>
-        <w:t xml:space="preserve">), with no thermal sensitivity (</w:t>
-      </w:r>
-      <m:oMath>
-        <m:r>
-          <m:t>β</m:t>
-        </m:r>
-        <m:r>
-          <m:rPr>
-            <m:sty m:val="p"/>
-          </m:rPr>
-          <m:t>=</m:t>
-        </m:r>
-        <m:r>
-          <m:rPr>
-            <m:sty m:val="p"/>
-          </m:rPr>
-          <m:t>+</m:t>
-        </m:r>
-        <m:r>
-          <m:t>0.10</m:t>
-        </m:r>
-      </m:oMath>
-      <w:r>
-        <w:t xml:space="preserve"> </w:t>
-      </w:r>
-      <w:r>
-        <w:t xml:space="preserve">mm/°C,</w:t>
-      </w:r>
-      <w:r>
-        <w:t xml:space="preserve"> </w:t>
-      </w:r>
-      <m:oMath>
-        <m:r>
-          <m:t>p</m:t>
-        </m:r>
-        <m:r>
-          <m:rPr>
-            <m:sty m:val="p"/>
-          </m:rPr>
-          <m:t>=</m:t>
-        </m:r>
-        <m:r>
-          <m:t>0.91</m:t>
-        </m:r>
-      </m:oMath>
-      <w:r>
-        <w:t xml:space="preserve">). Wing shortening emerged specifically in the post-1980 modern era (</w:t>
-      </w:r>
-      <m:oMath>
-        <m:r>
-          <m:rPr>
-            <m:sty m:val="p"/>
-          </m:rPr>
-          <m:t>−</m:t>
-        </m:r>
-        <m:r>
-          <m:t>0.26</m:t>
-        </m:r>
-      </m:oMath>
-      <w:r>
-        <w:t xml:space="preserve"> </w:t>
-      </w:r>
-      <w:r>
-        <w:t xml:space="preserve">to</w:t>
-      </w:r>
-      <w:r>
-        <w:t xml:space="preserve"> </w:t>
-      </w:r>
-      <m:oMath>
-        <m:r>
-          <m:rPr>
-            <m:sty m:val="p"/>
-          </m:rPr>
-          <m:t>−</m:t>
-        </m:r>
-        <m:r>
-          <m:t>0.41</m:t>
-        </m:r>
-      </m:oMath>
-      <w:r>
-        <w:t xml:space="preserve"> </w:t>
-      </w:r>
-      <w:r>
-        <w:t xml:space="preserve">mm/decade,</w:t>
-      </w:r>
-      <w:r>
-        <w:t xml:space="preserve"> </w:t>
-      </w:r>
-      <m:oMath>
-        <m:r>
-          <m:t>p</m:t>
-        </m:r>
-        <m:r>
-          <m:rPr>
-            <m:sty m:val="p"/>
-          </m:rPr>
-          <m:t>&lt;</m:t>
-        </m:r>
-        <m:r>
-          <m:t>0.02</m:t>
-        </m:r>
-      </m:oMath>
-      <w:r>
-        <w:t xml:space="preserve">; thermal sensitivity</w:t>
-      </w:r>
-      <w:r>
-        <w:t xml:space="preserve"> </w:t>
-      </w:r>
-      <m:oMath>
-        <m:r>
-          <m:t>β</m:t>
-        </m:r>
-        <m:r>
-          <m:rPr>
-            <m:sty m:val="p"/>
-          </m:rPr>
-          <m:t>=</m:t>
-        </m:r>
-        <m:r>
-          <m:rPr>
-            <m:sty m:val="p"/>
-          </m:rPr>
-          <m:t>−</m:t>
-        </m:r>
-        <m:r>
-          <m:t>1.68</m:t>
-        </m:r>
-      </m:oMath>
-      <w:r>
-        <w:t xml:space="preserve"> </w:t>
-      </w:r>
-      <w:r>
-        <w:t xml:space="preserve">mm/°C,</w:t>
-      </w:r>
-      <w:r>
-        <w:t xml:space="preserve"> </w:t>
-      </w:r>
-      <m:oMath>
-        <m:r>
-          <m:t>p</m:t>
-        </m:r>
-        <m:r>
-          <m:rPr>
-            <m:sty m:val="p"/>
-          </m:rPr>
-          <m:t>=</m:t>
-        </m:r>
-        <m:r>
-          <m:t>0.005</m:t>
-        </m:r>
-      </m:oMath>
-      <w:r>
-        <w:t xml:space="preserve">). Similarly, body mass in museum and historical field records (1962–1979) showed complete stasis (</w:t>
-      </w:r>
-      <m:oMath>
-        <m:r>
-          <m:rPr>
-            <m:sty m:val="p"/>
-          </m:rPr>
-          <m:t>−</m:t>
-        </m:r>
-        <m:r>
-          <m:t>0.17</m:t>
-        </m:r>
-        <m:r>
-          <m:rPr>
-            <m:sty m:val="p"/>
-          </m:rPr>
-          <m:t>%</m:t>
-        </m:r>
-      </m:oMath>
-      <w:r>
-        <w:t xml:space="preserve">/year,</w:t>
-      </w:r>
-      <w:r>
-        <w:t xml:space="preserve"> </w:t>
-      </w:r>
-      <m:oMath>
-        <m:r>
-          <m:t>p</m:t>
-        </m:r>
-        <m:r>
-          <m:rPr>
-            <m:sty m:val="p"/>
-          </m:rPr>
-          <m:t>=</m:t>
-        </m:r>
-        <m:r>
-          <m:t>0.52</m:t>
-        </m:r>
-      </m:oMath>
-      <w:r>
-        <w:t xml:space="preserve">), mirroring the post-1980 stability. These secular patterns demonstrate that the subtle wing shortening and thermal allometric stoutening documented here represent contemporary responses coincident with post-1980 accelerated warming, rather than century-long evolutionary drift.</w:t>
+        <w:t xml:space="preserve">First, our secular analyses indicate that the subtle wing shortening and allometric stoutening documented here represent contemporary responses coincident with the modern acceleration of regional warming, rather than continuation of century-long evolutionary drift. Historical museum specimens collected between the late 19th century and 1980 document morphological stability across decades characterized by minimal regional temperature change. Wing shortening and thermal allometric stoutening emerged synchronously with the post-1980 acceleration of regional warming, when morphological variation became strongly coupled to annual temperature anomalies. This temporal synchrony provides compelling evidence that contemporary phenotypic adjustments in the Atlantic Forest are functionally linked to recent climate warming rather than reflecting unmeasured historical trends.</w:t>
       </w:r>
     </w:p>
     <w:p>
@@ -7587,218 +8492,11 @@
         <w:pStyle w:val="BodyText"/>
       </w:pPr>
       <w:r>
-        <w:t xml:space="preserve">Second, to evaluate whether filtering choices influenced our findings, we expanded the analytical scope to mirror the less restrictive sampling criteria of</w:t>
-      </w:r>
-      <w:r>
-        <w:t xml:space="preserve"> </w:t>
-      </w:r>
-      <w:r>
-        <w:t xml:space="preserve">Jirinec et al. (2021)</w:t>
-      </w:r>
-      <w:r>
-        <w:t xml:space="preserve">—incorporating birds of unknown sex, all age classes, and all understorey mist-netted orders (</w:t>
-      </w:r>
-      <m:oMath>
-        <m:r>
-          <m:t>n</m:t>
-        </m:r>
-        <m:r>
-          <m:rPr>
-            <m:sty m:val="p"/>
-          </m:rPr>
-          <m:t>=</m:t>
-        </m:r>
-        <m:r>
-          <m:t>46</m:t>
-        </m:r>
-        <m:r>
-          <m:rPr>
-            <m:sty m:val="p"/>
-          </m:rPr>
-          <m:t>,</m:t>
-        </m:r>
-        <m:r>
-          <m:t>663</m:t>
-        </m:r>
-      </m:oMath>
-      <w:r>
-        <w:t xml:space="preserve"> </w:t>
-      </w:r>
-      <w:r>
-        <w:t xml:space="preserve">captures across 243 species; Supplementary Material). Across this expanded community sample, wing length trajectories remained consistent with our fully controlled model (</w:t>
-      </w:r>
-      <m:oMath>
-        <m:r>
-          <m:rPr>
-            <m:sty m:val="p"/>
-          </m:rPr>
-          <m:t>−</m:t>
-        </m:r>
-        <m:r>
-          <m:t>1.00</m:t>
-        </m:r>
-        <m:r>
-          <m:rPr>
-            <m:sty m:val="p"/>
-          </m:rPr>
-          <m:t>%</m:t>
-        </m:r>
-      </m:oMath>
-      <w:r>
-        <w:t xml:space="preserve">/decade, 95% CI:</w:t>
-      </w:r>
-      <w:r>
-        <w:t xml:space="preserve"> </w:t>
-      </w:r>
-      <m:oMath>
-        <m:r>
-          <m:rPr>
-            <m:sty m:val="p"/>
-          </m:rPr>
-          <m:t>−</m:t>
-        </m:r>
-        <m:r>
-          <m:t>2.09</m:t>
-        </m:r>
-      </m:oMath>
-      <w:r>
-        <w:t xml:space="preserve"> </w:t>
-      </w:r>
-      <w:r>
-        <w:t xml:space="preserve">to</w:t>
-      </w:r>
-      <w:r>
-        <w:t xml:space="preserve"> </w:t>
-      </w:r>
-      <m:oMath>
-        <m:r>
-          <m:rPr>
-            <m:sty m:val="p"/>
-          </m:rPr>
-          <m:t>+</m:t>
-        </m:r>
-        <m:r>
-          <m:t>0.09</m:t>
-        </m:r>
-        <m:r>
-          <m:rPr>
-            <m:sty m:val="p"/>
-          </m:rPr>
-          <m:t>%</m:t>
-        </m:r>
-      </m:oMath>
-      <w:r>
-        <w:t xml:space="preserve">/decade), demonstrating that wing shortening estimates are robust across taxonomic and demographic strata. For body mass, the four-fold sample expansion retained an identical point estimate (</w:t>
-      </w:r>
-      <m:oMath>
-        <m:r>
-          <m:rPr>
-            <m:sty m:val="p"/>
-          </m:rPr>
-          <m:t>−</m:t>
-        </m:r>
-        <m:r>
-          <m:t>1.29</m:t>
-        </m:r>
-        <m:r>
-          <m:rPr>
-            <m:sty m:val="p"/>
-          </m:rPr>
-          <m:t>%</m:t>
-        </m:r>
-      </m:oMath>
-      <w:r>
-        <w:t xml:space="preserve">/decade) while narrowing confidence intervals (</w:t>
-      </w:r>
-      <m:oMath>
-        <m:r>
-          <m:rPr>
-            <m:sty m:val="p"/>
-          </m:rPr>
-          <m:t>−</m:t>
-        </m:r>
-        <m:r>
-          <m:t>2.30</m:t>
-        </m:r>
-      </m:oMath>
-      <w:r>
-        <w:t xml:space="preserve"> </w:t>
-      </w:r>
-      <w:r>
-        <w:t xml:space="preserve">to</w:t>
-      </w:r>
-      <w:r>
-        <w:t xml:space="preserve"> </w:t>
-      </w:r>
-      <m:oMath>
-        <m:r>
-          <m:rPr>
-            <m:sty m:val="p"/>
-          </m:rPr>
-          <m:t>−</m:t>
-        </m:r>
-        <m:r>
-          <m:t>0.27</m:t>
-        </m:r>
-        <m:r>
-          <m:rPr>
-            <m:sty m:val="p"/>
-          </m:rPr>
-          <m:t>%</m:t>
-        </m:r>
-      </m:oMath>
-      <w:r>
-        <w:t xml:space="preserve">/decade). This decadal rate positions the Atlantic Forest in an intermediate position between temperate migratory endotherms [Weeks et al. 2020:</w:t>
-      </w:r>
-      <w:r>
-        <w:t xml:space="preserve"> </w:t>
-      </w:r>
-      <m:oMath>
-        <m:r>
-          <m:rPr>
-            <m:sty m:val="p"/>
-          </m:rPr>
-          <m:t>−</m:t>
-        </m:r>
-        <m:r>
-          <m:t>0.68</m:t>
-        </m:r>
-        <m:r>
-          <m:rPr>
-            <m:sty m:val="p"/>
-          </m:rPr>
-          <m:t>%</m:t>
-        </m:r>
-      </m:oMath>
-      <w:r>
-        <w:t xml:space="preserve">/decade] and undisturbed central Amazonian understorey [Jirinec et al. 2021:</w:t>
-      </w:r>
-      <w:r>
-        <w:t xml:space="preserve"> </w:t>
-      </w:r>
-      <m:oMath>
-        <m:r>
-          <m:rPr>
-            <m:sty m:val="p"/>
-          </m:rPr>
-          <m:t>−</m:t>
-        </m:r>
-        <m:r>
-          <m:t>1.80</m:t>
-        </m:r>
-        <m:r>
-          <m:rPr>
-            <m:sty m:val="p"/>
-          </m:rPr>
-          <m:t>%</m:t>
-        </m:r>
-      </m:oMath>
-      <w:r>
-        <w:t xml:space="preserve">/decade]. Crucially, across all analytical treatments and secular series, wing length consistently exhibited negative trajectories, affirming that resident Atlantic Forest birds resist the wing elongation and reduced wing loading observed in the contiguous Amazon.</w:t>
-      </w:r>
-    </w:p>
-    <w:bookmarkEnd w:id="56"/>
-    <w:bookmarkStart w:id="57" w:name="X794f256fa8947bb153e477f6c6f93c8f99c0b29"/>
+        <w:t xml:space="preserve">Second, expanding the analytical framework to mirror less restrictive community sampling confirms that our primary conclusions do not depend on demographic or taxonomic filtering decisions. Across the broader avian understorey community, wing length trajectories remained consistently negative, demonstrating that subtle wing shortening is a robust feature across resident forest birds. For body mass, community-wide analysis revealed a modest decline that places the Atlantic Forest in an intermediate position between temperate migratory species and undisturbed central Amazonian understorey. This intermediate sensitivity is ecologically coherent: while temperate migrants encounter strong selection across large migratory journeys and continuous Amazonian understorey birds experience low-variability interior microclimates, Atlantic Forest birds inhabit topographically complex, fragmented landscapes where elevational thermal refugia and aerodynamic constraints on flight power balance physiological heat dissipation. Crucially, across all analytical strata and century-long series, wing length consistently exhibited negative or neutral trajectories, affirming that resident Atlantic Forest birds maintain flight power and resist the wing elongation and reduced wing loading observed in the contiguous Amazon.</w:t>
+      </w:r>
+    </w:p>
+    <w:bookmarkEnd w:id="57"/>
+    <w:bookmarkStart w:id="58" w:name="X794f256fa8947bb153e477f6c6f93c8f99c0b29"/>
     <w:p>
       <w:pPr>
         <w:pStyle w:val="Heading2"/>
@@ -7835,8 +8533,8 @@
         <w:t xml:space="preserve">In our dataset, unadjusted baseline models suggested steep declines in wing length, increases in bill width, and expanding trait variability. However, our multi-tiered comparative framework revealed that observer and spatial turnover accounted for approximately 60% of the apparent wing decline, eliminated the apparent bill expansion, and accounted for the apparent variance inflation. Incorporating random intercepts for observer identity, spatial coordinates, elevation, seasonality, moult, and individual identity—alongside 50-tree phylogenetic comparative models—provided the inferential foundation necessary to uncover true biological patterns. Rather than invalidating trait compilations, our findings demonstrate that large-scale compilations yield robust, trustworthy macroecological insights when analyzed with appropriate provenance controls.</w:t>
       </w:r>
     </w:p>
-    <w:bookmarkEnd w:id="57"/>
-    <w:bookmarkStart w:id="58" w:name="conclusion"/>
+    <w:bookmarkEnd w:id="58"/>
+    <w:bookmarkStart w:id="59" w:name="conclusion"/>
     <w:p>
       <w:pPr>
         <w:pStyle w:val="Heading2"/>
@@ -7853,9 +8551,9 @@
         <w:t xml:space="preserve">In summary, 24 years of climate warming in the Brazilian Atlantic Forest have not induced the widespread body mass loss or wing elongation observed in the continuous Amazonian understorey. Instead, Atlantic Forest passerines have maintained notable stability in body mass, invariant bill width, preserved allometric scaling, and subtle, species-specific adjustments in wing length. These contrasting responses highlight the critical influence of landscape fragmentation, topographic complexity, and ecological context in shaping how tropical species respond to anthropogenic climate change.</w:t>
       </w:r>
     </w:p>
-    <w:bookmarkEnd w:id="58"/>
     <w:bookmarkEnd w:id="59"/>
-    <w:bookmarkStart w:id="133" w:name="sec-methods"/>
+    <w:bookmarkEnd w:id="60"/>
+    <w:bookmarkStart w:id="134" w:name="sec-methods"/>
     <w:p>
       <w:pPr>
         <w:pStyle w:val="Heading1"/>
@@ -7864,7 +8562,7 @@
         <w:t xml:space="preserve">4. Methods</w:t>
       </w:r>
     </w:p>
-    <w:bookmarkStart w:id="60" w:name="X6dbe1161035202742089c379c0fbe1c7f9b75de"/>
+    <w:bookmarkStart w:id="61" w:name="X6dbe1161035202742089c379c0fbe1c7f9b75de"/>
     <w:p>
       <w:pPr>
         <w:pStyle w:val="Heading2"/>
@@ -8021,8 +8719,8 @@
         <w:t xml:space="preserve">) was compiled to evaluate whether patterns replicated in birds lacking sex determination.</w:t>
       </w:r>
     </w:p>
-    <w:bookmarkEnd w:id="60"/>
-    <w:bookmarkStart w:id="64" w:name="X2413f136305994ac0578ef7267db9fce1a67d7d"/>
+    <w:bookmarkEnd w:id="61"/>
+    <w:bookmarkStart w:id="65" w:name="X2413f136305994ac0578ef7267db9fce1a67d7d"/>
     <w:p>
       <w:pPr>
         <w:pStyle w:val="Heading2"/>
@@ -8039,7 +8737,7 @@
         <w:t xml:space="preserve">In large-scale macroecological compilations aggregating data across independent research programs, two structural factors can severely confound temporal trends if left unmodeled: observer turnover and spatial turnover.</w:t>
       </w:r>
     </w:p>
-    <w:bookmarkStart w:id="61" w:name="X0182f22886a6e37bc6cfdd93d22c7a6097f325e"/>
+    <w:bookmarkStart w:id="62" w:name="X0182f22886a6e37bc6cfdd93d22c7a6097f325e"/>
     <w:p>
       <w:pPr>
         <w:pStyle w:val="Heading3"/>
@@ -8118,8 +8816,8 @@
         <w:t xml:space="preserve">).</w:t>
       </w:r>
     </w:p>
-    <w:bookmarkEnd w:id="61"/>
-    <w:bookmarkStart w:id="62" w:name="Xfad59f5c48d6cb7277320f018ba251711124662"/>
+    <w:bookmarkEnd w:id="62"/>
+    <w:bookmarkStart w:id="63" w:name="Xfad59f5c48d6cb7277320f018ba251711124662"/>
     <w:p>
       <w:pPr>
         <w:pStyle w:val="Heading3"/>
@@ -8229,8 +8927,8 @@
         <w:t xml:space="preserve">) as continuous covariates.</w:t>
       </w:r>
     </w:p>
-    <w:bookmarkEnd w:id="62"/>
-    <w:bookmarkStart w:id="63" w:name="X7ded9429c4cba6fd745661808c9b73d14ee2c47"/>
+    <w:bookmarkEnd w:id="63"/>
+    <w:bookmarkStart w:id="64" w:name="X7ded9429c4cba6fd745661808c9b73d14ee2c47"/>
     <w:p>
       <w:pPr>
         <w:pStyle w:val="Heading3"/>
@@ -8305,9 +9003,9 @@
         <w:t xml:space="preserve">) across all univariate and bivariate model tiers, avoiding collinear crossed random effects while ensuring robust parameter estimation and biological interpretability.</w:t>
       </w:r>
     </w:p>
-    <w:bookmarkEnd w:id="63"/>
     <w:bookmarkEnd w:id="64"/>
-    <w:bookmarkStart w:id="65" w:name="X209e310501334e9b3a417e17400150671f7d25f"/>
+    <w:bookmarkEnd w:id="65"/>
+    <w:bookmarkStart w:id="66" w:name="X209e310501334e9b3a417e17400150671f7d25f"/>
     <w:p>
       <w:pPr>
         <w:pStyle w:val="Heading2"/>
@@ -8931,8 +9629,8 @@
         <w:t xml:space="preserve">).</w:t>
       </w:r>
     </w:p>
-    <w:bookmarkEnd w:id="65"/>
-    <w:bookmarkStart w:id="66" w:name="X3e9d42d2474c3f79baa2a707d23efc145f0b122"/>
+    <w:bookmarkEnd w:id="66"/>
+    <w:bookmarkStart w:id="67" w:name="X3e9d42d2474c3f79baa2a707d23efc145f0b122"/>
     <w:p>
       <w:pPr>
         <w:pStyle w:val="Heading2"/>
@@ -10093,8 +10791,8 @@
         <w:t xml:space="preserve">.</w:t>
       </w:r>
     </w:p>
-    <w:bookmarkEnd w:id="66"/>
-    <w:bookmarkStart w:id="67" w:name="X656a538e2e6ba7277e818ecf4966f95a904c340"/>
+    <w:bookmarkEnd w:id="67"/>
+    <w:bookmarkStart w:id="68" w:name="X656a538e2e6ba7277e818ecf4966f95a904c340"/>
     <w:p>
       <w:pPr>
         <w:pStyle w:val="Heading2"/>
@@ -10206,8 +10904,8 @@
         <w:t xml:space="preserve">, which predicts that extremities enlarge in warmer conditions to facilitate non-evaporative heat dissipation, we tested whether bill width exhibited a positive temporal slope under researcher and spatial controls.</w:t>
       </w:r>
     </w:p>
-    <w:bookmarkEnd w:id="67"/>
-    <w:bookmarkStart w:id="68" w:name="Xb837ca3b86c4da0276ff8aa30a6e8dff5c66f99"/>
+    <w:bookmarkEnd w:id="68"/>
+    <w:bookmarkStart w:id="69" w:name="Xb837ca3b86c4da0276ff8aa30a6e8dff5c66f99"/>
     <w:p>
       <w:pPr>
         <w:pStyle w:val="Heading2"/>
@@ -11099,8 +11797,8 @@
         <w:t xml:space="preserve">) indicates disproportionate mass loss or wing elongation (slenderization).</w:t>
       </w:r>
     </w:p>
-    <w:bookmarkEnd w:id="68"/>
-    <w:bookmarkStart w:id="69" w:name="X8341f8c6c82e3145741514559789c1da539f06b"/>
+    <w:bookmarkEnd w:id="69"/>
+    <w:bookmarkStart w:id="70" w:name="X8341f8c6c82e3145741514559789c1da539f06b"/>
     <w:p>
       <w:pPr>
         <w:pStyle w:val="Heading2"/>
@@ -11493,8 +12191,8 @@
         <w:t xml:space="preserve">) to local and regional temperature anomalies across the 7,577 shared records measured for both traits.</w:t>
       </w:r>
     </w:p>
-    <w:bookmarkEnd w:id="69"/>
-    <w:bookmarkStart w:id="70" w:name="X653d83b9bfe10a4aa35a57686ef1f796453cb4b"/>
+    <w:bookmarkEnd w:id="70"/>
+    <w:bookmarkStart w:id="71" w:name="X653d83b9bfe10a4aa35a57686ef1f796453cb4b"/>
     <w:p>
       <w:pPr>
         <w:pStyle w:val="Heading2"/>
@@ -11840,8 +12538,8 @@
         <w:t xml:space="preserve">captures across 243 species; Supplementary Material), evaluating temporal slopes with random intercepts and slopes for species and random intercepts for sampling locality and contributor.</w:t>
       </w:r>
     </w:p>
-    <w:bookmarkEnd w:id="70"/>
-    <w:bookmarkStart w:id="71" w:name="X6ff614c3587b78c67248aba5d88ecab96336cc0"/>
+    <w:bookmarkEnd w:id="71"/>
+    <w:bookmarkStart w:id="72" w:name="X6ff614c3587b78c67248aba5d88ecab96336cc0"/>
     <w:p>
       <w:pPr>
         <w:pStyle w:val="Heading2"/>
@@ -12550,8 +13248,8 @@
         <w:t xml:space="preserve">) was added to the dispersion formula to test whether residual variance tracked environmental warming.</w:t>
       </w:r>
     </w:p>
-    <w:bookmarkEnd w:id="71"/>
-    <w:bookmarkStart w:id="72" w:name="Xfd84aa4262ebbdc8c9052e44d41fd99b9baf22f"/>
+    <w:bookmarkEnd w:id="72"/>
+    <w:bookmarkStart w:id="73" w:name="Xfd84aa4262ebbdc8c9052e44d41fd99b9baf22f"/>
     <w:p>
       <w:pPr>
         <w:pStyle w:val="Heading2"/>
@@ -12705,8 +13403,8 @@
         <w:t xml:space="preserve">operational days) as an offset, and random intercepts for contributor, municipality, and sampling locality.</w:t>
       </w:r>
     </w:p>
-    <w:bookmarkEnd w:id="72"/>
-    <w:bookmarkStart w:id="73" w:name="reproducible-software-environment"/>
+    <w:bookmarkEnd w:id="73"/>
+    <w:bookmarkStart w:id="74" w:name="reproducible-software-environment"/>
     <w:p>
       <w:pPr>
         <w:pStyle w:val="Heading2"/>
@@ -12858,8 +13556,8 @@
         <w:t xml:space="preserve">(v2.2+). All analysis scripts, curated datasets, and fitted model objects are openly archived and fully reproducible in the project repository (DOI: 10.5281/zenodo.atlantic_birds).</w:t>
       </w:r>
     </w:p>
-    <w:bookmarkEnd w:id="73"/>
-    <w:bookmarkStart w:id="132" w:name="references"/>
+    <w:bookmarkEnd w:id="74"/>
+    <w:bookmarkStart w:id="133" w:name="references"/>
     <w:p>
       <w:pPr>
         <w:pStyle w:val="Heading2"/>
@@ -12868,8 +13566,8 @@
         <w:t xml:space="preserve">References</w:t>
       </w:r>
     </w:p>
-    <w:bookmarkStart w:id="131" w:name="refs"/>
-    <w:bookmarkStart w:id="74" w:name="ref-allen1877"/>
+    <w:bookmarkStart w:id="132" w:name="refs"/>
+    <w:bookmarkStart w:id="75" w:name="ref-allen1877"/>
     <w:p>
       <w:pPr>
         <w:pStyle w:val="Bibliography"/>
@@ -12900,8 +13598,8 @@
         <w:t xml:space="preserve">1: 108–40.</w:t>
       </w:r>
     </w:p>
-    <w:bookmarkEnd w:id="74"/>
-    <w:bookmarkStart w:id="76" w:name="ref-ashton2002a"/>
+    <w:bookmarkEnd w:id="75"/>
+    <w:bookmarkStart w:id="77" w:name="ref-ashton2002a"/>
     <w:p>
       <w:pPr>
         <w:pStyle w:val="Bibliography"/>
@@ -12934,7 +13632,7 @@
       <w:r>
         <w:t xml:space="preserve"> </w:t>
       </w:r>
-      <w:hyperlink r:id="rId75">
+      <w:hyperlink r:id="rId76">
         <w:r>
           <w:rPr>
             <w:rStyle w:val="Hyperlink"/>
@@ -12946,8 +13644,8 @@
         <w:t xml:space="preserve">.</w:t>
       </w:r>
     </w:p>
-    <w:bookmarkEnd w:id="76"/>
-    <w:bookmarkStart w:id="78" w:name="ref-bell2019fixed"/>
+    <w:bookmarkEnd w:id="77"/>
+    <w:bookmarkStart w:id="79" w:name="ref-bell2019fixed"/>
     <w:p>
       <w:pPr>
         <w:pStyle w:val="Bibliography"/>
@@ -12980,7 +13678,7 @@
       <w:r>
         <w:t xml:space="preserve"> </w:t>
       </w:r>
-      <w:hyperlink r:id="rId77">
+      <w:hyperlink r:id="rId78">
         <w:r>
           <w:rPr>
             <w:rStyle w:val="Hyperlink"/>
@@ -12992,8 +13690,8 @@
         <w:t xml:space="preserve">.</w:t>
       </w:r>
     </w:p>
-    <w:bookmarkEnd w:id="78"/>
-    <w:bookmarkStart w:id="80" w:name="ref-bergmann1847"/>
+    <w:bookmarkEnd w:id="79"/>
+    <w:bookmarkStart w:id="81" w:name="ref-bergmann1847"/>
     <w:p>
       <w:pPr>
         <w:pStyle w:val="Bibliography"/>
@@ -13026,7 +13724,7 @@
       <w:r>
         <w:t xml:space="preserve"> </w:t>
       </w:r>
-      <w:hyperlink r:id="rId79">
+      <w:hyperlink r:id="rId80">
         <w:r>
           <w:rPr>
             <w:rStyle w:val="Hyperlink"/>
@@ -13038,8 +13736,8 @@
         <w:t xml:space="preserve">.</w:t>
       </w:r>
     </w:p>
-    <w:bookmarkEnd w:id="80"/>
-    <w:bookmarkStart w:id="82" w:name="ref-gardner_declining_2011"/>
+    <w:bookmarkEnd w:id="81"/>
+    <w:bookmarkStart w:id="83" w:name="ref-gardner_declining_2011"/>
     <w:p>
       <w:pPr>
         <w:pStyle w:val="Bibliography"/>
@@ -13072,7 +13770,7 @@
       <w:r>
         <w:t xml:space="preserve"> </w:t>
       </w:r>
-      <w:hyperlink r:id="rId81">
+      <w:hyperlink r:id="rId82">
         <w:r>
           <w:rPr>
             <w:rStyle w:val="Hyperlink"/>
@@ -13084,8 +13782,8 @@
         <w:t xml:space="preserve">.</w:t>
       </w:r>
     </w:p>
-    <w:bookmarkEnd w:id="82"/>
-    <w:bookmarkStart w:id="84" w:name="ref-harris2020crudata"/>
+    <w:bookmarkEnd w:id="83"/>
+    <w:bookmarkStart w:id="85" w:name="ref-harris2020crudata"/>
     <w:p>
       <w:pPr>
         <w:pStyle w:val="Bibliography"/>
@@ -13130,7 +13828,7 @@
       <w:r>
         <w:t xml:space="preserve"> </w:t>
       </w:r>
-      <w:hyperlink r:id="rId83">
+      <w:hyperlink r:id="rId84">
         <w:r>
           <w:rPr>
             <w:rStyle w:val="Hyperlink"/>
@@ -13142,8 +13840,8 @@
         <w:t xml:space="preserve">.</w:t>
       </w:r>
     </w:p>
-    <w:bookmarkEnd w:id="84"/>
-    <w:bookmarkStart w:id="85" w:name="ref-hudson2017database"/>
+    <w:bookmarkEnd w:id="85"/>
+    <w:bookmarkStart w:id="86" w:name="ref-hudson2017database"/>
     <w:p>
       <w:pPr>
         <w:pStyle w:val="Bibliography"/>
@@ -13177,8 +13875,8 @@
         <w:t xml:space="preserve">7 (1): 145–88.</w:t>
       </w:r>
     </w:p>
-    <w:bookmarkEnd w:id="85"/>
-    <w:bookmarkStart w:id="87" w:name="ref-jirinec2021morphological"/>
+    <w:bookmarkEnd w:id="86"/>
+    <w:bookmarkStart w:id="88" w:name="ref-jirinec2021morphological"/>
     <w:p>
       <w:pPr>
         <w:pStyle w:val="Bibliography"/>
@@ -13223,7 +13921,7 @@
       <w:r>
         <w:t xml:space="preserve"> </w:t>
       </w:r>
-      <w:hyperlink r:id="rId86">
+      <w:hyperlink r:id="rId87">
         <w:r>
           <w:rPr>
             <w:rStyle w:val="Hyperlink"/>
@@ -13235,8 +13933,8 @@
         <w:t xml:space="preserve">.</w:t>
       </w:r>
     </w:p>
-    <w:bookmarkEnd w:id="87"/>
-    <w:bookmarkStart w:id="89" w:name="ref-lenssen2019gistemp"/>
+    <w:bookmarkEnd w:id="88"/>
+    <w:bookmarkStart w:id="90" w:name="ref-lenssen2019gistemp"/>
     <w:p>
       <w:pPr>
         <w:pStyle w:val="Bibliography"/>
@@ -13281,7 +13979,7 @@
       <w:r>
         <w:t xml:space="preserve"> </w:t>
       </w:r>
-      <w:hyperlink r:id="rId88">
+      <w:hyperlink r:id="rId89">
         <w:r>
           <w:rPr>
             <w:rStyle w:val="Hyperlink"/>
@@ -13293,8 +13991,8 @@
         <w:t xml:space="preserve">.</w:t>
       </w:r>
     </w:p>
-    <w:bookmarkEnd w:id="89"/>
-    <w:bookmarkStart w:id="91" w:name="ref-lewinsohn2022insect"/>
+    <w:bookmarkEnd w:id="90"/>
+    <w:bookmarkStart w:id="92" w:name="ref-lewinsohn2022insect"/>
     <w:p>
       <w:pPr>
         <w:pStyle w:val="Bibliography"/>
@@ -13336,7 +14034,7 @@
       <w:r>
         <w:t xml:space="preserve"> </w:t>
       </w:r>
-      <w:hyperlink r:id="rId90">
+      <w:hyperlink r:id="rId91">
         <w:r>
           <w:rPr>
             <w:rStyle w:val="Hyperlink"/>
@@ -13348,8 +14046,8 @@
         <w:t xml:space="preserve">.</w:t>
       </w:r>
     </w:p>
-    <w:bookmarkEnd w:id="91"/>
-    <w:bookmarkStart w:id="93" w:name="ref-mayr1956"/>
+    <w:bookmarkEnd w:id="92"/>
+    <w:bookmarkStart w:id="94" w:name="ref-mayr1956"/>
     <w:p>
       <w:pPr>
         <w:pStyle w:val="Bibliography"/>
@@ -13382,7 +14080,7 @@
       <w:r>
         <w:t xml:space="preserve"> </w:t>
       </w:r>
-      <w:hyperlink r:id="rId92">
+      <w:hyperlink r:id="rId93">
         <w:r>
           <w:rPr>
             <w:rStyle w:val="Hyperlink"/>
@@ -13394,8 +14092,8 @@
         <w:t xml:space="preserve">.</w:t>
       </w:r>
     </w:p>
-    <w:bookmarkEnd w:id="93"/>
-    <w:bookmarkStart w:id="95" w:name="ref-mctavish2025tree"/>
+    <w:bookmarkEnd w:id="94"/>
+    <w:bookmarkStart w:id="96" w:name="ref-mctavish2025tree"/>
     <w:p>
       <w:pPr>
         <w:pStyle w:val="Bibliography"/>
@@ -13428,7 +14126,7 @@
       <w:r>
         <w:t xml:space="preserve"> </w:t>
       </w:r>
-      <w:hyperlink r:id="rId94">
+      <w:hyperlink r:id="rId95">
         <w:r>
           <w:rPr>
             <w:rStyle w:val="Hyperlink"/>
@@ -13440,8 +14138,8 @@
         <w:t xml:space="preserve">.</w:t>
       </w:r>
     </w:p>
-    <w:bookmarkEnd w:id="95"/>
-    <w:bookmarkStart w:id="97" w:name="ref-muggeo2003estimating"/>
+    <w:bookmarkEnd w:id="96"/>
+    <w:bookmarkStart w:id="98" w:name="ref-muggeo2003estimating"/>
     <w:p>
       <w:pPr>
         <w:pStyle w:val="Bibliography"/>
@@ -13474,7 +14172,7 @@
       <w:r>
         <w:t xml:space="preserve"> </w:t>
       </w:r>
-      <w:hyperlink r:id="rId96">
+      <w:hyperlink r:id="rId97">
         <w:r>
           <w:rPr>
             <w:rStyle w:val="Hyperlink"/>
@@ -13486,8 +14184,8 @@
         <w:t xml:space="preserve">.</w:t>
       </w:r>
     </w:p>
-    <w:bookmarkEnd w:id="97"/>
-    <w:bookmarkStart w:id="99" w:name="ref-mundlak1978pooling"/>
+    <w:bookmarkEnd w:id="98"/>
+    <w:bookmarkStart w:id="100" w:name="ref-mundlak1978pooling"/>
     <w:p>
       <w:pPr>
         <w:pStyle w:val="Bibliography"/>
@@ -13520,7 +14218,7 @@
       <w:r>
         <w:t xml:space="preserve"> </w:t>
       </w:r>
-      <w:hyperlink r:id="rId98">
+      <w:hyperlink r:id="rId99">
         <w:r>
           <w:rPr>
             <w:rStyle w:val="Hyperlink"/>
@@ -13532,8 +14230,8 @@
         <w:t xml:space="preserve">.</w:t>
       </w:r>
     </w:p>
-    <w:bookmarkEnd w:id="99"/>
-    <w:bookmarkStart w:id="101" w:name="ref-nakagawa2026prepr4pcm"/>
+    <w:bookmarkEnd w:id="100"/>
+    <w:bookmarkStart w:id="102" w:name="ref-nakagawa2026prepr4pcm"/>
     <w:p>
       <w:pPr>
         <w:pStyle w:val="Bibliography"/>
@@ -13557,7 +14255,7 @@
       <w:r>
         <w:t xml:space="preserve"> </w:t>
       </w:r>
-      <w:hyperlink r:id="rId100">
+      <w:hyperlink r:id="rId101">
         <w:r>
           <w:rPr>
             <w:rStyle w:val="Hyperlink"/>
@@ -13569,8 +14267,8 @@
         <w:t xml:space="preserve">.</w:t>
       </w:r>
     </w:p>
-    <w:bookmarkEnd w:id="101"/>
-    <w:bookmarkStart w:id="103" w:name="ref-nakagawa2015metaanalysis"/>
+    <w:bookmarkEnd w:id="102"/>
+    <w:bookmarkStart w:id="104" w:name="ref-nakagawa2015metaanalysis"/>
     <w:p>
       <w:pPr>
         <w:pStyle w:val="Bibliography"/>
@@ -13603,7 +14301,7 @@
       <w:r>
         <w:t xml:space="preserve"> </w:t>
       </w:r>
-      <w:hyperlink r:id="rId102">
+      <w:hyperlink r:id="rId103">
         <w:r>
           <w:rPr>
             <w:rStyle w:val="Hyperlink"/>
@@ -13615,8 +14313,8 @@
         <w:t xml:space="preserve">.</w:t>
       </w:r>
     </w:p>
-    <w:bookmarkEnd w:id="103"/>
-    <w:bookmarkStart w:id="105" w:name="ref-nakagawa2019rubin"/>
+    <w:bookmarkEnd w:id="104"/>
+    <w:bookmarkStart w:id="106" w:name="ref-nakagawa2019rubin"/>
     <w:p>
       <w:pPr>
         <w:pStyle w:val="Bibliography"/>
@@ -13649,7 +14347,7 @@
       <w:r>
         <w:t xml:space="preserve"> </w:t>
       </w:r>
-      <w:hyperlink r:id="rId104">
+      <w:hyperlink r:id="rId105">
         <w:r>
           <w:rPr>
             <w:rStyle w:val="Hyperlink"/>
@@ -13661,8 +14359,8 @@
         <w:t xml:space="preserve">.</w:t>
       </w:r>
     </w:p>
-    <w:bookmarkEnd w:id="105"/>
-    <w:bookmarkStart w:id="107" w:name="ref-parmesan_globally_2003"/>
+    <w:bookmarkEnd w:id="106"/>
+    <w:bookmarkStart w:id="108" w:name="ref-parmesan_globally_2003"/>
     <w:p>
       <w:pPr>
         <w:pStyle w:val="Bibliography"/>
@@ -13695,7 +14393,7 @@
       <w:r>
         <w:t xml:space="preserve"> </w:t>
       </w:r>
-      <w:hyperlink r:id="rId106">
+      <w:hyperlink r:id="rId107">
         <w:r>
           <w:rPr>
             <w:rStyle w:val="Hyperlink"/>
@@ -13707,8 +14405,8 @@
         <w:t xml:space="preserve">.</w:t>
       </w:r>
     </w:p>
-    <w:bookmarkEnd w:id="107"/>
-    <w:bookmarkStart w:id="109" w:name="ref-ribeiro2009atlantic"/>
+    <w:bookmarkEnd w:id="108"/>
+    <w:bookmarkStart w:id="110" w:name="ref-ribeiro2009atlantic"/>
     <w:p>
       <w:pPr>
         <w:pStyle w:val="Bibliography"/>
@@ -13762,7 +14460,7 @@
       <w:r>
         <w:t xml:space="preserve"> </w:t>
       </w:r>
-      <w:hyperlink r:id="rId108">
+      <w:hyperlink r:id="rId109">
         <w:r>
           <w:rPr>
             <w:rStyle w:val="Hyperlink"/>
@@ -13774,8 +14472,8 @@
         <w:t xml:space="preserve">.</w:t>
       </w:r>
     </w:p>
-    <w:bookmarkEnd w:id="109"/>
-    <w:bookmarkStart w:id="111" w:name="ref-rodrigues_atlantic_2019"/>
+    <w:bookmarkEnd w:id="110"/>
+    <w:bookmarkStart w:id="112" w:name="ref-rodrigues_atlantic_2019"/>
     <w:p>
       <w:pPr>
         <w:pStyle w:val="Bibliography"/>
@@ -13853,7 +14551,7 @@
       <w:r>
         <w:t xml:space="preserve"> </w:t>
       </w:r>
-      <w:hyperlink r:id="rId110">
+      <w:hyperlink r:id="rId111">
         <w:r>
           <w:rPr>
             <w:rStyle w:val="Hyperlink"/>
@@ -13865,8 +14563,8 @@
         <w:t xml:space="preserve">.</w:t>
       </w:r>
     </w:p>
-    <w:bookmarkEnd w:id="111"/>
-    <w:bookmarkStart w:id="113" w:name="ref-ryding2021shape"/>
+    <w:bookmarkEnd w:id="112"/>
+    <w:bookmarkStart w:id="114" w:name="ref-ryding2021shape"/>
     <w:p>
       <w:pPr>
         <w:pStyle w:val="Bibliography"/>
@@ -13899,7 +14597,7 @@
       <w:r>
         <w:t xml:space="preserve"> </w:t>
       </w:r>
-      <w:hyperlink r:id="rId112">
+      <w:hyperlink r:id="rId113">
         <w:r>
           <w:rPr>
             <w:rStyle w:val="Hyperlink"/>
@@ -13911,8 +14609,8 @@
         <w:t xml:space="preserve">.</w:t>
       </w:r>
     </w:p>
-    <w:bookmarkEnd w:id="113"/>
-    <w:bookmarkStart w:id="115" w:name="ref-schmidt_concomitant_2005"/>
+    <w:bookmarkEnd w:id="114"/>
+    <w:bookmarkStart w:id="116" w:name="ref-schmidt_concomitant_2005"/>
     <w:p>
       <w:pPr>
         <w:pStyle w:val="Bibliography"/>
@@ -14008,7 +14706,7 @@
       <w:r>
         <w:t xml:space="preserve"> </w:t>
       </w:r>
-      <w:hyperlink r:id="rId114">
+      <w:hyperlink r:id="rId115">
         <w:r>
           <w:rPr>
             <w:rStyle w:val="Hyperlink"/>
@@ -14020,8 +14718,8 @@
         <w:t xml:space="preserve">.</w:t>
       </w:r>
     </w:p>
-    <w:bookmarkEnd w:id="115"/>
-    <w:bookmarkStart w:id="117" w:name="ref-sheridan_shrinking_2011"/>
+    <w:bookmarkEnd w:id="116"/>
+    <w:bookmarkStart w:id="118" w:name="ref-sheridan_shrinking_2011"/>
     <w:p>
       <w:pPr>
         <w:pStyle w:val="Bibliography"/>
@@ -14054,7 +14752,7 @@
       <w:r>
         <w:t xml:space="preserve"> </w:t>
       </w:r>
-      <w:hyperlink r:id="rId116">
+      <w:hyperlink r:id="rId117">
         <w:r>
           <w:rPr>
             <w:rStyle w:val="Hyperlink"/>
@@ -14066,8 +14764,8 @@
         <w:t xml:space="preserve">.</w:t>
       </w:r>
     </w:p>
-    <w:bookmarkEnd w:id="117"/>
-    <w:bookmarkStart w:id="119" w:name="ref-silva2022atlanticants"/>
+    <w:bookmarkEnd w:id="118"/>
+    <w:bookmarkStart w:id="120" w:name="ref-silva2022atlanticants"/>
     <w:p>
       <w:pPr>
         <w:pStyle w:val="Bibliography"/>
@@ -14103,7 +14801,7 @@
       <w:r>
         <w:t xml:space="preserve"> </w:t>
       </w:r>
-      <w:hyperlink r:id="rId118">
+      <w:hyperlink r:id="rId119">
         <w:r>
           <w:rPr>
             <w:rStyle w:val="Hyperlink"/>
@@ -14115,8 +14813,8 @@
         <w:t xml:space="preserve">.</w:t>
       </w:r>
     </w:p>
-    <w:bookmarkEnd w:id="119"/>
-    <w:bookmarkStart w:id="121" w:name="ref-teplitsky_climate_2014"/>
+    <w:bookmarkEnd w:id="120"/>
+    <w:bookmarkStart w:id="122" w:name="ref-teplitsky_climate_2014"/>
     <w:p>
       <w:pPr>
         <w:pStyle w:val="Bibliography"/>
@@ -14158,7 +14856,7 @@
       <w:r>
         <w:t xml:space="preserve"> </w:t>
       </w:r>
-      <w:hyperlink r:id="rId120">
+      <w:hyperlink r:id="rId121">
         <w:r>
           <w:rPr>
             <w:rStyle w:val="Hyperlink"/>
@@ -14170,8 +14868,8 @@
         <w:t xml:space="preserve">.</w:t>
       </w:r>
     </w:p>
-    <w:bookmarkEnd w:id="121"/>
-    <w:bookmarkStart w:id="123" w:name="ref-teplitsky_bergmanns_2008"/>
+    <w:bookmarkEnd w:id="122"/>
+    <w:bookmarkStart w:id="124" w:name="ref-teplitsky_bergmanns_2008"/>
     <w:p>
       <w:pPr>
         <w:pStyle w:val="Bibliography"/>
@@ -14216,7 +14914,7 @@
       <w:r>
         <w:t xml:space="preserve"> </w:t>
       </w:r>
-      <w:hyperlink r:id="rId122">
+      <w:hyperlink r:id="rId123">
         <w:r>
           <w:rPr>
             <w:rStyle w:val="Hyperlink"/>
@@ -14228,8 +14926,8 @@
         <w:t xml:space="preserve">.</w:t>
       </w:r>
     </w:p>
-    <w:bookmarkEnd w:id="123"/>
-    <w:bookmarkStart w:id="125" w:name="ref-viechtbauer2010metafor"/>
+    <w:bookmarkEnd w:id="124"/>
+    <w:bookmarkStart w:id="126" w:name="ref-viechtbauer2010metafor"/>
     <w:p>
       <w:pPr>
         <w:pStyle w:val="Bibliography"/>
@@ -14286,7 +14984,7 @@
       <w:r>
         <w:t xml:space="preserve"> </w:t>
       </w:r>
-      <w:hyperlink r:id="rId124">
+      <w:hyperlink r:id="rId125">
         <w:r>
           <w:rPr>
             <w:rStyle w:val="Hyperlink"/>
@@ -14298,8 +14996,8 @@
         <w:t xml:space="preserve">.</w:t>
       </w:r>
     </w:p>
-    <w:bookmarkEnd w:id="125"/>
-    <w:bookmarkStart w:id="127" w:name="ref-weeks2020"/>
+    <w:bookmarkEnd w:id="126"/>
+    <w:bookmarkStart w:id="128" w:name="ref-weeks2020"/>
     <w:p>
       <w:pPr>
         <w:pStyle w:val="Bibliography"/>
@@ -14332,7 +15030,7 @@
       <w:r>
         <w:t xml:space="preserve"> </w:t>
       </w:r>
-      <w:hyperlink r:id="rId126">
+      <w:hyperlink r:id="rId127">
         <w:r>
           <w:rPr>
             <w:rStyle w:val="Hyperlink"/>
@@ -14344,8 +15042,8 @@
         <w:t xml:space="preserve">.</w:t>
       </w:r>
     </w:p>
-    <w:bookmarkEnd w:id="127"/>
-    <w:bookmarkStart w:id="129" w:name="ref-williams2025glmmtmb"/>
+    <w:bookmarkEnd w:id="128"/>
+    <w:bookmarkStart w:id="130" w:name="ref-williams2025glmmtmb"/>
     <w:p>
       <w:pPr>
         <w:pStyle w:val="Bibliography"/>
@@ -14375,7 +15073,7 @@
       <w:r>
         <w:t xml:space="preserve"> </w:t>
       </w:r>
-      <w:hyperlink r:id="rId128">
+      <w:hyperlink r:id="rId129">
         <w:r>
           <w:rPr>
             <w:rStyle w:val="Hyperlink"/>
@@ -14387,8 +15085,8 @@
         <w:t xml:space="preserve">.</w:t>
       </w:r>
     </w:p>
-    <w:bookmarkEnd w:id="129"/>
-    <w:bookmarkStart w:id="130" w:name="ref-wilman2014eltontraits"/>
+    <w:bookmarkEnd w:id="130"/>
+    <w:bookmarkStart w:id="131" w:name="ref-wilman2014eltontraits"/>
     <w:p>
       <w:pPr>
         <w:pStyle w:val="Bibliography"/>
@@ -14419,10 +15117,10 @@
         <w:t xml:space="preserve">95 (7): 2027–27.</w:t>
       </w:r>
     </w:p>
-    <w:bookmarkEnd w:id="130"/>
     <w:bookmarkEnd w:id="131"/>
     <w:bookmarkEnd w:id="132"/>
     <w:bookmarkEnd w:id="133"/>
+    <w:bookmarkEnd w:id="134"/>
     <w:sectPr>
       <w:footerReference r:id="rIdFooter1" w:type="default"/>
       <w:footnotePr>

</xml_diff>

<commit_message>
feat(manuscript): integrate user edits, add coauthors, harmonize supplementary, and translate figures to english
- Port all 28 textual revisions from index.docx into Manuscript/index.qmd
- Add Ayumi Mizuno and Santiago Ortega as coauthors in both index.qmd and supplementary.qmd
- Harmonize tone and museum collection references in Manuscript/supplementary.qmd
- Translate Figures S4-S6 to English in Analysis/scripts/secular_museum_expansion.R and sync to Manuscript/images/
- Re-render index.docx, index.html, supplementary.docx, and supplementary.html via Quarto
</commit_message>
<xml_diff>
--- a/Manuscript/index.docx
+++ b/Manuscript/index.docx
@@ -24,13 +24,31 @@
         <w:t xml:space="preserve">1*</w:t>
       </w:r>
       <w:r>
+        <w:t xml:space="preserve">, Ayumi Mizuno</w:t>
+      </w:r>
+      <w:r>
+        <w:rPr>
+          <w:vertAlign w:val="superscript"/>
+        </w:rPr>
+        <w:t xml:space="preserve">2</w:t>
+      </w:r>
+      <w:r>
+        <w:t xml:space="preserve">, Santiago Ortega</w:t>
+      </w:r>
+      <w:r>
+        <w:rPr>
+          <w:vertAlign w:val="superscript"/>
+        </w:rPr>
+        <w:t xml:space="preserve">3</w:t>
+      </w:r>
+      <w:r>
         <w:t xml:space="preserve">, João C.T. Menezes</w:t>
       </w:r>
       <w:r>
         <w:rPr>
           <w:vertAlign w:val="superscript"/>
         </w:rPr>
-        <w:t xml:space="preserve">2</w:t>
+        <w:t xml:space="preserve">4</w:t>
       </w:r>
       <w:r>
         <w:t xml:space="preserve">, Gustavo Burin</w:t>
@@ -39,7 +57,7 @@
         <w:rPr>
           <w:vertAlign w:val="superscript"/>
         </w:rPr>
-        <w:t xml:space="preserve">3</w:t>
+        <w:t xml:space="preserve">5</w:t>
       </w:r>
     </w:p>
     <w:p>
@@ -115,7 +133,7 @@
         <w:t xml:space="preserve">ORCID: </w:t>
       </w:r>
       <w:r>
-        <w:t xml:space="preserve">Eduardo S.A. Santos: 0000-0002-0434-3655 | João C.T. Menezes: 0000-0003-4156-2934 | Gustavo Burin: 0000-0001-7851-0666</w:t>
+        <w:t xml:space="preserve">Eduardo S.A. Santos: 0000-0002-0434-3655 | Ayumi Mizuno: 0000-0003-0822-5637 | Santiago Ortega: 0000-0002-3518-276X | João C.T. Menezes: 0000-0003-4156-2934 | Gustavo Burin: 0000-0001-7851-0666</w:t>
       </w:r>
     </w:p>
     <w:p>
@@ -170,7 +188,7 @@
         <w:pStyle w:val="FirstParagraph"/>
       </w:pPr>
       <w:r>
-        <w:t xml:space="preserve">Declining body size has been widely hypothesized as a general ecological response of endotherms to anthropogenic climate warming. In tropical biomes, empirical evaluations of multi-decadal phenotypic trends remain scarce. In the continuous primary rainforests of the central Amazon, 77 resident understorey bird species were documented to exhibit widespread declines in body mass alongside wing elongation over four decades (Jirinec et al. 2021). Whether such morphological responses generalize across tropical biomes—particularly in heavily fragmented, topographically complex biodiversity hotspots—remains an open macroecological question. Here, we analyze 24 years (1995–2018) of morphological data from 73 passerine species (12,571 live-capture records; ATLANTIC BIRD TRAITS) across the Brazilian Atlantic Forest to evaluate temporal trajectories in body mass, wing length, bill width, and among-individual variability under 0.25°C/decade of regional warming. To ensure robust inference across this macroecological compilation, we implement a multi-tiered comparative framework across 50 phylogenetic trees (glmmTMB propto) that accounts for observer identity, spatial and elevational distributions, seasonality, moult, and individual recaptures. In contrast to Amazonian patterns, Atlantic Forest passerines exhibit stability in body mass (−0.91%/decade, 95% CI: −2.72 to +0.94%), despite marked diurnal mass gains (+0.40%/hour). Population-level wing length shows a subtle, non-significant trajectory (−0.74 mm/decade, 95% CI: −1.55 to +0.07 mm/decade), with within-observer temporal changes indistinguishable from zero (−0.32 mm/decade, 95% CI: −1.59 to +0.96). Interspecific variation is pronounced: while 49 species display negative point estimates, 61 of 72 species with wing data have intervals overlapping zero, demonstrating community-wide heterogeneity rather than uniform shrinkage. Bill width remains constant over time (−0.03 mm/decade, 95% CI: −0.18 to +0.13 mm/decade), providing no support for generalized thermoregulatory appendage expansion under Allen’s rule. On 7,577 shared records from the same individuals, body mass was significantly more conserved than expected under cubic geometric shrinkage (+4.85%/decade contrast, 95% CI: +0.81 to +8.89%, rejecting isometry toward slight stoutening), in contrast to Amazonian slenderization. Furthermore, evaluating interannual temperature anomalies revealed that while body mass remained decoupled from thermal variation, warmer temperatures directly modulated allometric shape change toward relative wing shortening and mass retention (p = 0.030), indicating that thermal variation actively promotes subtle stoutening rather than slenderization. Among-individual phenotypic variability remains stable over time, and dietary reliance on invertebrates does not predict morphological sensitivity (obligate insectivore slope: −0.15 mm/decade, spanning zero). Our findings reveal that resident birds in the fragmented Atlantic Forest maintain phenotypic stability under warming, contrasting with the systematic mass loss and wing elongation documented in intact Amazonian forests, and underscore the critical role of comprehensive provenance controls for robust macroecological discovery.</w:t>
+        <w:t xml:space="preserve">Declining body size has been widely hypothesized as a general ecological response of endotherms to anthropogenic climate warming. In tropical biomes, empirical evaluations of multi-decadal phenotypic trends remain scarce. Whether such morphological responses generalize across tropical biomes—particularly in heavily fragmented, topographically complex biodiversity hotspots—remains an open macroecological question. Here, we analyze 24 years (1995–2018) of morphological data from 73 passerine species (12,571 live-capture records; ATLANTIC BIRD TRAITS) across the Brazilian Atlantic Forest to evaluate temporal trajectories in body mass, wing length, bill width, and among-individual variability under 0.25°C/decade of regional warming. Overall, we found that Atlantic Forest passerines exhibit stability in body mass (−0.91%/decade, 95% CI: −2.72 to +0.94%). Population-level wing length shows a subtle, non-significant trajectory (−0.74 mm/decade, 95% CI: −1.55 to +0.07 mm/decade). Interspecific variation is pronounced: while 49 species display negative point estimates, 61 of 72 species with wing data have intervals overlapping zero, demonstrating community-wide heterogeneity rather than uniform shrinkage. Bill width remains constant over time (−0.03 mm/decade, 95% CI: −0.18 to +0.13 mm/decade), providing no support for generalized thermoregulatory appendage expansion under Allen’s rule. On 7,577 shared records from the same individuals, body mass was significantly more conserved than expected under cubic geometric shrinkage (+4.85%/decade contrast, 95% CI: +0.81 to +8.89%), rejecting isometry and suggesting slight stoutening. Furthermore, evaluating interannual temperature anomalies revealed that while body mass remained decoupled from thermal variation, warmer temperatures directly modulated allometric shape change toward relative wing shortening and mass retention, indicating that thermal variation actively promotes subtle stoutening rather than slenderization. Our findings reveal that resident birds in the fragmented Atlantic Forest display subtle phenotypic changes under warming.</w:t>
       </w:r>
     </w:p>
     <w:p>
@@ -285,7 +303,7 @@
         <w:t xml:space="preserve">(e.g., Weeks et al. 2020)</w:t>
       </w:r>
       <w:r>
-        <w:t xml:space="preserve">. In the tropics, where avian diversity peaks and resident species lack migratory escape routes, empirical evaluations over decadal timescales remain exceptionally scarce. A key long-term benchmark was provided by</w:t>
+        <w:t xml:space="preserve">. In the tropics, where avian diversity peaks and resident species lack migratory escape routes, empirical evaluations over decadal timescales remain scarce. A key long-term report was provided by</w:t>
       </w:r>
       <w:r>
         <w:t xml:space="preserve"> </w:t>
@@ -377,43 +395,7 @@
         </w:r>
       </w:hyperlink>
       <w:r>
-        <w:t xml:space="preserve">) to evaluate whether resident tropical birds in the Atlantic Forest have altered their morphology in response to observed climate warming. Using 50 alternative phylogenetic topologies with fast and flexible phylogenetic mixed models [</w:t>
-      </w:r>
-      <w:r>
-        <w:rPr>
-          <w:rStyle w:val="VerbatimChar"/>
-        </w:rPr>
-        <w:t xml:space="preserve">glmmTMB</w:t>
-      </w:r>
-      <w:r>
-        <w:t xml:space="preserve"> </w:t>
-      </w:r>
-      <w:r>
-        <w:rPr>
-          <w:rStyle w:val="VerbatimChar"/>
-        </w:rPr>
-        <w:t xml:space="preserve">propto</w:t>
-      </w:r>
-      <w:r>
-        <w:t xml:space="preserve">;</w:t>
-      </w:r>
-      <w:r>
-        <w:t xml:space="preserve"> </w:t>
-      </w:r>
-      <w:r>
-        <w:t xml:space="preserve">Williams et al. (2025)</w:t>
-      </w:r>
-      <w:r>
-        <w:t xml:space="preserve">;</w:t>
-      </w:r>
-      <w:r>
-        <w:t xml:space="preserve"> </w:t>
-      </w:r>
-      <w:r>
-        <w:t xml:space="preserve">McTavish et al. (2025)</w:t>
-      </w:r>
-      <w:r>
-        <w:t xml:space="preserve">], we investigate five core macroecological questions:</w:t>
+        <w:t xml:space="preserve">) to evaluate whether resident tropical birds in the Atlantic Forest have altered their morphology in response to observed climate warming. We investigate five core macroecological questions:</w:t>
       </w:r>
       <w:r>
         <w:t xml:space="preserve"> </w:t>
@@ -1711,7 +1693,7 @@
         </w:r>
       </w:hyperlink>
       <w:r>
-        <w:t xml:space="preserve">). Further incorporating protocol proxies (wing column), coordinates, and elevation (M2) stabilized the trajectory at</w:t>
+        <w:t xml:space="preserve">). Further incorporating protocol proxies (right or left wing), coordinates, and elevation (M2) stabilized the trajectory at</w:t>
       </w:r>
       <w:r>
         <w:t xml:space="preserve"> </w:t>
@@ -1740,7 +1722,7 @@
         <w:t xml:space="preserve"> </w:t>
       </w:r>
       <w:r>
-        <w:t xml:space="preserve">mm/SD-year (−1.0 mm/decade). Finally, the fully controlled model (M3)—which accounted for season, moult status, individual recaptures, and 50 phylogenetic trees—yielded a modest decadal slope:</w:t>
+        <w:t xml:space="preserve">mm/SD-year (−1.0 mm/decade). Finally, the fully controlled model (M3)—which accounted for season, moult status, and individual recaptures—yielded a modest decadal slope:</w:t>
       </w:r>
       <w:r>
         <w:t xml:space="preserve"> </w:t>
@@ -1797,7 +1779,7 @@
         </w:r>
       </w:hyperlink>
       <w:r>
-        <w:t xml:space="preserve">). Crucially, the 95% credible interval of this fully controlled estimate comfortably crossed zero. When evaluated strictly on complete cases lacking any missing covariates (</w:t>
+        <w:t xml:space="preserve">). Notably, the 95% credible interval of this fully controlled estimate crossed zero. When evaluated strictly on complete cases lacking any missing covariates (</w:t>
       </w:r>
       <m:oMath>
         <m:r>
@@ -2494,7 +2476,7 @@
         </m:r>
       </m:oMath>
       <w:r>
-        <w:t xml:space="preserve">; M7) yielded an identical trajectory (</w:t>
+        <w:t xml:space="preserve">; M7) yielded a similar trajectory (</w:t>
       </w:r>
       <m:oMath>
         <m:r>
@@ -2534,7 +2516,7 @@
         </w:r>
       </w:hyperlink>
       <w:r>
-        <w:t xml:space="preserve">). Overall, wing-length trajectories in Atlantic Forest passerines are modest, varied across species, and statistically indistinguishable from zero at the community level.</w:t>
+        <w:t xml:space="preserve">). Overall, wing-length trajectories over time in Atlantic Forest passerines are negative and modest, varied across species, and sometimes statistically indistinguishable from zero at the community level.</w:t>
       </w:r>
     </w:p>
     <w:bookmarkEnd w:id="29"/>
@@ -2698,7 +2680,7 @@
         </w:r>
       </w:hyperlink>
       <w:r>
-        <w:t xml:space="preserve">). In the fully controlled phylogenetic model (M3)—which additionally incorporated season, active moult, individual band identity, and 50 trees—body mass remained completely stable:</w:t>
+        <w:t xml:space="preserve">). In the fully controlled phylogenetic model (M3)—which additionally incorporated season, active moult, and individual identity—body mass remained stable:</w:t>
       </w:r>
       <w:r>
         <w:t xml:space="preserve"> </w:t>
@@ -2741,7 +2723,7 @@
         </w:r>
       </w:hyperlink>
       <w:r>
-        <w:t xml:space="preserve">). Crucially, evaluating temporal change strictly within the same field researcher via a Mundlak random-effects model yielded a within-observer slope indistinguishable from zero (</w:t>
+        <w:t xml:space="preserve">). Evaluating temporal change strictly within the same field researcher via a Mundlak random-effects model yielded a within-observer slope indistinguishable from zero (</w:t>
       </w:r>
       <m:oMath>
         <m:r>
@@ -3468,7 +3450,7 @@
         <w:pStyle w:val="BodyText"/>
       </w:pPr>
       <w:r>
-        <w:t xml:space="preserve">Evaluating diurnal capture time revealed that live-captured birds experienced strong daily mass gains (+0.40% body mass per hour of the day, 95% CI: 0.29 to 0.52%,</w:t>
+        <w:t xml:space="preserve">Investigating diurnal capture time revealed that live-captured birds experienced strong daily mass gains (+0.40% body mass per hour of the day, 95% CI: 0.29 to 0.52%,</w:t>
       </w:r>
       <w:r>
         <w:t xml:space="preserve"> </w:t>
@@ -3517,7 +3499,7 @@
         </m:r>
       </m:oMath>
       <w:r>
-        <w:t xml:space="preserve">), reflecting normal diurnal feeding rhythms. With diurnal capture hour explicitly controlled, the decadal year slope remained completely flat (</w:t>
+        <w:t xml:space="preserve">), reflecting normal diurnal feeding rhythms. With diurnal capture hour explicitly controlled, the decadal year slope remained flat (</w:t>
       </w:r>
       <m:oMath>
         <m:r>
@@ -3562,7 +3544,7 @@
         <w:pStyle w:val="BodyText"/>
       </w:pPr>
       <w:r>
-        <w:t xml:space="preserve">To evaluate whether birds underwent morphological shape changes over time, we analyzed 7,577 shared capture events where wing length and body mass were measured simultaneously on the exact same individual across 72 species. Evaluating shape change requires accounting for dimensional scaling. Because wing length is a linear dimension (</w:t>
+        <w:t xml:space="preserve">To investigate whether birds underwent morphological shape changes over time, we analyzed 7,577 shared capture events where wing length and body mass were measured simultaneously on the exact same individual across 72 species. Evaluating shape change requires accounting for dimensional scaling. Because wing length is a linear dimension (</w:t>
       </w:r>
       <m:oMath>
         <m:sSup>
@@ -3807,7 +3789,7 @@
         <w:t xml:space="preserve"> </w:t>
       </w:r>
       <w:r>
-        <w:t xml:space="preserve">A). Because the 95% confidence interval strictly excludes zero, the shared-individual data reject strict geometric isometry in favor of mass conservation: passerine body mass declined less than predicted by cubic geometric shrinkage of the wing, indicating a subtle shift toward stoutening.</w:t>
+        <w:t xml:space="preserve">A). Because the 95% confidence interval excludes zero, the shared-individual data reject strict geometric isometry in favor of mass conservation: passerine body mass declined less than predicted by cubic geometric shrinkage of the wing, indicating a subtle shift toward stoutening.</w:t>
       </w:r>
     </w:p>
     <w:p>
@@ -5215,7 +5197,7 @@
         </m:r>
       </m:oMath>
       <w:r>
-        <w:t xml:space="preserve">), a pattern that could naively be misconstrued as empirical support for Allen’s rule.</w:t>
+        <w:t xml:space="preserve">), a pattern that seems to support Allen’s rule.</w:t>
       </w:r>
     </w:p>
     <w:p>
@@ -5223,7 +5205,7 @@
         <w:pStyle w:val="BodyText"/>
       </w:pPr>
       <w:r>
-        <w:t xml:space="preserve">However, bill width was recorded by 22 field researchers across the dataset, and only two researchers sampled birds in both the early (1995–2006) and late (2013–2018) periods. When researcher identity was accounted for (M1), this apparent positive trajectory collapsed completely (</w:t>
+        <w:t xml:space="preserve">However, when researcher identity was accounted for (M1), this apparent positive trajectory reversed direction (</w:t>
       </w:r>
       <m:oMath>
         <m:r>
@@ -5278,7 +5260,7 @@
         </m:r>
       </m:oMath>
       <w:r>
-        <w:t xml:space="preserve">). In the fully controlled 50-tree phylogenetic model (M3), bill width remained entirely flat:</w:t>
+        <w:t xml:space="preserve">). In the fully controlled 50-tree phylogenetic model (M3), bill width remained flat:</w:t>
       </w:r>
       <w:r>
         <w:t xml:space="preserve"> </w:t>
@@ -6131,7 +6113,7 @@
         </m:r>
       </m:oMath>
       <w:r>
-        <w:t xml:space="preserve">). Thus, among-individual phenotypic variability in Atlantic Forest passerines has remained stable over time and does not track regional warming.</w:t>
+        <w:t xml:space="preserve">). Thus, among-individual phenotypic variability in Atlantic Forest passerines has remained stable over time and does not follow regional warming trends.</w:t>
       </w:r>
     </w:p>
     <w:bookmarkEnd w:id="46"/>
@@ -6396,7 +6378,7 @@
         <w:t xml:space="preserve">Lewinsohn et al. (2022)</w:t>
       </w:r>
       <w:r>
-        <w:t xml:space="preserve">], multi-decadal, standardized prey monitoring within tropical forest understoreys remains an acute macroecological knowledge gap. Global compilations such as PREDICTS</w:t>
+        <w:t xml:space="preserve">], multi-decadal, standardized prey monitoring within tropical forest understoreys remains a macroecological knowledge gap. Global compilations such as PREDICTS</w:t>
       </w:r>
       <w:r>
         <w:t xml:space="preserve"> </w:t>
@@ -7786,7 +7768,7 @@
     </w:p>
     <w:bookmarkEnd w:id="52"/>
     <w:bookmarkEnd w:id="53"/>
-    <w:bookmarkStart w:id="60" w:name="discussion"/>
+    <w:bookmarkStart w:id="59" w:name="discussion"/>
     <w:p>
       <w:pPr>
         <w:pStyle w:val="Heading1"/>
@@ -7819,7 +7801,7 @@
         <w:t xml:space="preserve">Body mass stability</w:t>
       </w:r>
       <w:r>
-        <w:t xml:space="preserve">: In contrast to predictions from Bergmann’s rule, body mass has remained constant over 24 years (−0.91%/decade, spanning zero), despite strong diurnal feeding rhythms (+0.40%/hour).</w:t>
+        <w:t xml:space="preserve">: In contrast to predictions from Bergmann’s rule, body mass has remained constant over 24 years (−0.91%/decade, spanning zero).</w:t>
       </w:r>
       <w:r>
         <w:t xml:space="preserve"> </w:t>
@@ -7857,7 +7839,7 @@
         <w:t xml:space="preserve">Bill width invariance shows no support for Allen’s rule</w:t>
       </w:r>
       <w:r>
-        <w:t xml:space="preserve">: Bill width shows no temporal expansion under controls (−0.03 mm/decade), providing no evidence for extremity enlargement for thermoregulatory heat dissipation.</w:t>
+        <w:t xml:space="preserve">: Bill width shows no temporal expansion (−0.03 mm/decade), providing little evidence for extremity enlargement for thermoregulatory heat dissipation.</w:t>
       </w:r>
       <w:r>
         <w:t xml:space="preserve"> </w:t>
@@ -8190,7 +8172,7 @@
         <w:pStyle w:val="BodyText"/>
       </w:pPr>
       <w:r>
-        <w:t xml:space="preserve">Beyond these ecological mechanisms, a plausible alternative hypothesis is whether the contrast reflects study design—namely, a single continuous 40-year ringing station (BDFFP) versus a multi-site macroecological compilation. Crucially, our within-observer Mundlak decomposition directly demonstrates that phenotypic stability in the Atlantic Forest is not an artifact of observational noise or compiler turnover: field researchers who sampled birds continuously across multi-year spans (e.g., E. Carrano, A. Ross, M. Alves) independently exhibited slopes indistinguishable from zero (within-observer wing slope: −0.3 mm/decade; complete cases: +0.03 mm/decade; body mass: −0.6%/decade). This confirms that phenotypic stability reflects a genuine biological characteristic of resident Atlantic Forest passerines across this warming era rather than an inferential limitation of large compilations.</w:t>
+        <w:t xml:space="preserve">Beyond these ecological mechanisms, a plausible alternative hypothesis is whether the contrast reflects study design—namely, a single continuous 40-year ringing station (BDFFP) versus a multi-site macroecological compilation. Crucially, our within-observer Mundlak decomposition demonstrates that phenotypic stability in the Atlantic Forest is not an artifact of observational noise or compiler turnover: field researchers who sampled birds continuously across multi-year spans (e.g., E. Carrano, A. Ross, M. Alves) independently exhibited slopes indistinguishable from zero (within-observer wing slope: −0.3 mm/decade; complete cases: +0.03 mm/decade; body mass: −0.6%/decade). This confirms that phenotypic stability reflects a genuine biological characteristic of resident Atlantic Forest passerines across this warming era rather than an inferential limitation of large compilations.</w:t>
       </w:r>
     </w:p>
     <w:bookmarkEnd w:id="54"/>
@@ -8234,7 +8216,7 @@
         <w:t xml:space="preserve">(Allen 1877; Ryding et al. 2021)</w:t>
       </w:r>
       <w:r>
-        <w:t xml:space="preserve">. While unadjusted baseline models suggested a temporal increase in bill width, this apparent trend disappeared once observer identity was accounted for, with bill width remaining completely invariant (−0.03 mm/decade, spanning zero). In tropical passerines, bill morphology is heavily constrained by foraging biomechanics, trophic specialization, and vocal performance, which may strongly override subtle thermoregulatory selection for larger bills</w:t>
+        <w:t xml:space="preserve">. While unadjusted baseline models suggested a temporal increase in bill width, this apparent trend disappeared once observer identity was accounted for, with bill width remaining invariant. In tropical passerines, bill morphology is heavily constrained by foraging biomechanics, trophic specialization, and vocal performance, which may strongly override subtle thermoregulatory selection for larger bills</w:t>
       </w:r>
       <w:r>
         <w:t xml:space="preserve"> </w:t>
@@ -8289,176 +8271,13 @@
         <w:pStyle w:val="BodyText"/>
       </w:pPr>
       <w:r>
-        <w:t xml:space="preserve">Importantly, our analysis of 7,577 shared records from the same individuals revealed that body mass was significantly more conserved than predicted under cubic geometric scaling of wing shortening (</w:t>
-      </w:r>
-      <m:oMath>
-        <m:sSub>
-          <m:e>
-            <m:r>
-              <m:rPr>
-                <m:sty m:val="p"/>
-              </m:rPr>
-              <m:t>Δ</m:t>
-            </m:r>
-          </m:e>
-          <m:sub>
-            <m:r>
-              <m:rPr>
-                <m:nor/>
-                <m:sty m:val="p"/>
-              </m:rPr>
-              <m:t>iso</m:t>
-            </m:r>
-          </m:sub>
-        </m:sSub>
-        <m:r>
-          <m:rPr>
-            <m:sty m:val="p"/>
-          </m:rPr>
-          <m:t>=</m:t>
-        </m:r>
-        <m:r>
-          <m:rPr>
-            <m:sty m:val="p"/>
-          </m:rPr>
-          <m:t>+</m:t>
-        </m:r>
-        <m:r>
-          <m:t>4.85</m:t>
-        </m:r>
-        <m:r>
-          <m:rPr>
-            <m:sty m:val="p"/>
-          </m:rPr>
-          <m:t>%</m:t>
-        </m:r>
-        <m:r>
-          <m:rPr>
-            <m:sty m:val="p"/>
-          </m:rPr>
-          <m:t>/</m:t>
-        </m:r>
-        <m:r>
-          <m:rPr>
-            <m:nor/>
-            <m:sty m:val="p"/>
-          </m:rPr>
-          <m:t>decade</m:t>
-        </m:r>
-      </m:oMath>
-      <w:r>
-        <w:t xml:space="preserve">, 95% CI: +0.81 to +8.89%,</w:t>
-      </w:r>
-      <w:r>
-        <w:t xml:space="preserve"> </w:t>
-      </w:r>
-      <m:oMath>
-        <m:r>
-          <m:t>z</m:t>
-        </m:r>
-        <m:r>
-          <m:rPr>
-            <m:sty m:val="p"/>
-          </m:rPr>
-          <m:t>=</m:t>
-        </m:r>
-        <m:r>
-          <m:t>2.35</m:t>
-        </m:r>
-        <m:r>
-          <m:rPr>
-            <m:sty m:val="p"/>
-          </m:rPr>
-          <m:t>,</m:t>
-        </m:r>
-        <m:r>
-          <m:t>p</m:t>
-        </m:r>
-        <m:r>
-          <m:rPr>
-            <m:sty m:val="p"/>
-          </m:rPr>
-          <m:t>=</m:t>
-        </m:r>
-        <m:r>
-          <m:t>0.019</m:t>
-        </m:r>
-      </m:oMath>
-      <w:r>
-        <w:t xml:space="preserve"> </w:t>
-      </w:r>
-      <w:r>
-        <w:t xml:space="preserve">under parsimonious observer control;</w:t>
-      </w:r>
-      <w:r>
-        <w:t xml:space="preserve"> </w:t>
-      </w:r>
-      <m:oMath>
-        <m:r>
-          <m:rPr>
-            <m:sty m:val="p"/>
-          </m:rPr>
-          <m:t>+</m:t>
-        </m:r>
-        <m:r>
-          <m:t>4.04</m:t>
-        </m:r>
-        <m:r>
-          <m:rPr>
-            <m:sty m:val="p"/>
-          </m:rPr>
-          <m:t>%</m:t>
-        </m:r>
-        <m:r>
-          <m:rPr>
-            <m:sty m:val="p"/>
-          </m:rPr>
-          <m:t>/</m:t>
-        </m:r>
-        <m:r>
-          <m:rPr>
-            <m:nor/>
-            <m:sty m:val="p"/>
-          </m:rPr>
-          <m:t>decade</m:t>
-        </m:r>
-      </m:oMath>
-      <w:r>
-        <w:t xml:space="preserve">, 95% CI: −0.06 to +8.15% under crossed observer and site controls;</w:t>
-      </w:r>
-      <w:r>
-        <w:t xml:space="preserve"> </w:t>
-      </w:r>
-      <w:hyperlink w:anchor="tbl-mass-allometry">
-        <w:r>
-          <w:rPr>
-            <w:rStyle w:val="Hyperlink"/>
-          </w:rPr>
-          <w:t xml:space="preserve">Table 2</w:t>
-        </w:r>
-      </w:hyperlink>
-      <w:r>
-        <w:t xml:space="preserve">;</w:t>
-      </w:r>
-      <w:r>
-        <w:t xml:space="preserve"> </w:t>
-      </w:r>
-      <w:hyperlink w:anchor="fig-isometry">
-        <w:r>
-          <w:rPr>
-            <w:rStyle w:val="Hyperlink"/>
-          </w:rPr>
-          <w:t xml:space="preserve">Figure 5</w:t>
-        </w:r>
-      </w:hyperlink>
-      <w:r>
-        <w:t xml:space="preserve">). Rather than undergoing the slenderization documented in the Amazon (</w:t>
+        <w:t xml:space="preserve">Importantly, our analysis of 7,577 shared records from the same individuals revealed that body mass was significantly more conserved than predicted under cubic geometric scaling of wing shortening. Rather than undergoing the slenderization documented in the Amazon (</w:t>
       </w:r>
       <w:r>
         <w:t xml:space="preserve">Jirinec et al. (2021)</w:t>
       </w:r>
       <w:r>
-        <w:t xml:space="preserve">), Atlantic Forest passerines exhibit mass retention and slight stoutening. Furthermore, dietary reliance on invertebrates did not modulate temporal trajectories: obligate insectivores exhibited a null temporal slope (−0.15 mm/decade), indicating that trophic guild has not driven morphological vulnerability in Atlantic Forest passerines over this period.</w:t>
+        <w:t xml:space="preserve">), Atlantic Forest passerines exhibit mass retention and slight stoutening. Furthermore, dietary reliance on invertebrates did not modulate temporal trajectories: obligate insectivores exhibited a null temporal slope, indicating that trophic guild has not driven morphological vulnerability in Atlantic Forest passerines over this period.</w:t>
       </w:r>
     </w:p>
     <w:bookmarkEnd w:id="56"/>
@@ -8484,7 +8303,7 @@
         <w:pStyle w:val="BodyText"/>
       </w:pPr>
       <w:r>
-        <w:t xml:space="preserve">First, our secular analyses indicate that the subtle wing shortening and allometric stoutening documented here represent contemporary responses coincident with the modern acceleration of regional warming, rather than continuation of century-long evolutionary drift. Historical museum specimens collected between the late 19th century and 1980 document morphological stability across decades characterized by minimal regional temperature change. Wing shortening and thermal allometric stoutening emerged synchronously with the post-1980 acceleration of regional warming, when morphological variation became strongly coupled to annual temperature anomalies. This temporal synchrony provides compelling evidence that contemporary phenotypic adjustments in the Atlantic Forest are functionally linked to recent climate warming rather than reflecting unmeasured historical trends.</w:t>
+        <w:t xml:space="preserve">First, our secular analyses indicate that the subtle wing shortening and allometric stoutening documented here represent contemporary responses coincident with the modern acceleration of regional warming, rather than continuation of century-long evolutionary drift. Historical museum specimens collected between the late 19th century and 1980 document morphological stability across decades characterized by minimal regional temperature change. Wing shortening and thermal allometric stoutening emerged with the post-1980 acceleration of regional warming, when morphological variation became strongly coupled to annual temperature anomalies. This temporal synchrony provides compelling evidence that contemporary phenotypic adjustments in the Atlantic Forest are functionally linked to recent climate warming rather than reflecting unmeasured historical trends.</w:t>
       </w:r>
     </w:p>
     <w:p>
@@ -8510,7 +8329,7 @@
         <w:pStyle w:val="FirstParagraph"/>
       </w:pPr>
       <w:r>
-        <w:t xml:space="preserve">Our study highlights the vital role of comprehensive provenance controls when analyzing multi-decadal compilations in macroecology. Large-scale compilations such as ATLANTIC BIRD TRAITS</w:t>
+        <w:t xml:space="preserve">Our study highlights the role of proper data dependency controls when analyzing multi-decadal compilations in macroecology. Large-scale compilations such as ATLANTIC BIRD TRAITS</w:t>
       </w:r>
       <w:r>
         <w:t xml:space="preserve"> </w:t>
@@ -8530,17 +8349,35 @@
         <w:pStyle w:val="BodyText"/>
       </w:pPr>
       <w:r>
-        <w:t xml:space="preserve">In our dataset, unadjusted baseline models suggested steep declines in wing length, increases in bill width, and expanding trait variability. However, our multi-tiered comparative framework revealed that observer and spatial turnover accounted for approximately 60% of the apparent wing decline, eliminated the apparent bill expansion, and accounted for the apparent variance inflation. Incorporating random intercepts for observer identity, spatial coordinates, elevation, seasonality, moult, and individual identity—alongside 50-tree phylogenetic comparative models—provided the inferential foundation necessary to uncover true biological patterns. Rather than invalidating trait compilations, our findings demonstrate that large-scale compilations yield robust, trustworthy macroecological insights when analyzed with appropriate provenance controls.</w:t>
+        <w:t xml:space="preserve">In our dataset, unadjusted baseline models suggested steep declines in wing length, increases in bill width, and expanding trait variability. However, our multi-tiered comparative framework revealed that observer and spatial turnover accounted for approximately 60% of the apparent wing decline, eliminated the apparent bill expansion, and accounted for the apparent variance inflation. Incorporating random intercepts for observer identity, spatial coordinates, elevation, seasonality, moult, and individual identity—alongside 50-tree phylogenetic comparative models—provided the inferential foundation necessary to uncover these biological patterns. Rather than invalidating trait compilations, our findings demonstrate that large-scale compilations yield robust, trustworthy macroecological insights when analyzed appropriately.</w:t>
+      </w:r>
+    </w:p>
+    <w:p>
+      <w:pPr>
+        <w:pStyle w:val="BodyText"/>
+      </w:pPr>
+      <w:r>
+        <w:t xml:space="preserve">In summary, 24 years of climate warming in the Brazilian Atlantic Forest have not induced the widespread body mass loss or wing elongation observed in the continuous Amazonian understorey. Instead, Atlantic Forest passerines have maintained stability in body mass, invariant bill width, preserved allometric scaling, and subtle, species-specific adjustments in wing length. These contrasting responses highlight the influence of landscape fragmentation, topographic complexity, and ecological context in shaping how tropical species respond to anthropogenic climate change.</w:t>
       </w:r>
     </w:p>
     <w:bookmarkEnd w:id="58"/>
-    <w:bookmarkStart w:id="59" w:name="conclusion"/>
+    <w:bookmarkEnd w:id="59"/>
+    <w:bookmarkStart w:id="133" w:name="sec-methods"/>
+    <w:p>
+      <w:pPr>
+        <w:pStyle w:val="Heading1"/>
+      </w:pPr>
+      <w:r>
+        <w:t xml:space="preserve">4. Methods</w:t>
+      </w:r>
+    </w:p>
+    <w:bookmarkStart w:id="60" w:name="X6dbe1161035202742089c379c0fbe1c7f9b75de"/>
     <w:p>
       <w:pPr>
         <w:pStyle w:val="Heading2"/>
       </w:pPr>
       <w:r>
-        <w:t xml:space="preserve">3.6 Conclusion</w:t>
+        <w:t xml:space="preserve">4.1 Trait database filtering and analytical sample derivation</w:t>
       </w:r>
     </w:p>
     <w:p>
@@ -8548,34 +8385,6 @@
         <w:pStyle w:val="FirstParagraph"/>
       </w:pPr>
       <w:r>
-        <w:t xml:space="preserve">In summary, 24 years of climate warming in the Brazilian Atlantic Forest have not induced the widespread body mass loss or wing elongation observed in the continuous Amazonian understorey. Instead, Atlantic Forest passerines have maintained notable stability in body mass, invariant bill width, preserved allometric scaling, and subtle, species-specific adjustments in wing length. These contrasting responses highlight the critical influence of landscape fragmentation, topographic complexity, and ecological context in shaping how tropical species respond to anthropogenic climate change.</w:t>
-      </w:r>
-    </w:p>
-    <w:bookmarkEnd w:id="59"/>
-    <w:bookmarkEnd w:id="60"/>
-    <w:bookmarkStart w:id="134" w:name="sec-methods"/>
-    <w:p>
-      <w:pPr>
-        <w:pStyle w:val="Heading1"/>
-      </w:pPr>
-      <w:r>
-        <w:t xml:space="preserve">4. Methods</w:t>
-      </w:r>
-    </w:p>
-    <w:bookmarkStart w:id="61" w:name="X6dbe1161035202742089c379c0fbe1c7f9b75de"/>
-    <w:p>
-      <w:pPr>
-        <w:pStyle w:val="Heading2"/>
-      </w:pPr>
-      <w:r>
-        <w:t xml:space="preserve">4.1 Trait database filtering and analytical sample derivation</w:t>
-      </w:r>
-    </w:p>
-    <w:p>
-      <w:pPr>
-        <w:pStyle w:val="FirstParagraph"/>
-      </w:pPr>
-      <w:r>
         <w:t xml:space="preserve">We extracted avian morphological measurements from the ATLANTIC BIRD TRAITS database</w:t>
       </w:r>
       <w:r>
@@ -8585,16 +8394,33 @@
         <w:t xml:space="preserve">(Rodrigues et al. 2019)</w:t>
       </w:r>
       <w:r>
-        <w:t xml:space="preserve">, a comprehensive data compilation comprising 72,483 morphometric entries across the Brazilian Atlantic Forest domain, of which passerines represent 83% (60,066 records). To ensure that temporal analyses reflect genuine living phenotypic variation rather than methodological or preservation artifacts, we implemented a rigorous multi-stage filtering protocol (</w:t>
+        <w:t xml:space="preserve">, a comprehensive data compilation comprising 72,483 morphometric entries across the Brazilian Atlantic Forest domain, of which passerines represent 83% (60,066 records). To ensure that temporal analyses reflect genuine living phenotypic variation rather than methodological or preservation artifacts, we implemented a rigorous multi-stage filtering protocol.</w:t>
+      </w:r>
+    </w:p>
+    <w:p>
+      <w:pPr>
+        <w:pStyle w:val="BodyText"/>
+      </w:pPr>
+      <w:r>
+        <w:t xml:space="preserve">First, we restricted the dataset strictly to live field captures, excluding museum study skins. Museum preparation induces marked, non-linear post-mortem shrinkage in feathers, bill keratin, and skeletal dimensions (typically 1–3% reduction in linear dimensions upon drying;</w:t>
+      </w:r>
+      <w:r>
+        <w:t xml:space="preserve"> </w:t>
+      </w:r>
+      <w:r>
+        <w:t xml:space="preserve">Weeks et al. (2020)</w:t>
+      </w:r>
+      <w:r>
+        <w:t xml:space="preserve">). Because museum specimens in regional collections are heavily concentrated in earlier decades of the 20th century, retaining study skins introduces artificial positive temporal trends. Second, we restricted records to adult individuals (</w:t>
       </w:r>
       <w:r>
         <w:rPr>
           <w:rStyle w:val="VerbatimChar"/>
         </w:rPr>
-        <w:t xml:space="preserve">Analysis/scripts/update_descriptive_stats.R</w:t>
-      </w:r>
-      <w:r>
-        <w:t xml:space="preserve">).</w:t>
+        <w:t xml:space="preserve">Age == "Adult"</w:t>
+      </w:r>
+      <w:r>
+        <w:t xml:space="preserve">), excluding juveniles and fledglings whose flight feathers and bills are incompletely developed. Third, we filtered records spatially to sampling localities falling within a 20-km buffer of the Brazilian Atlantic Forest biome boundary (IBGE/MMA official shapefile), eliminating captures situated in adjacent Cerrado or Caatinga enclaves. Fourth, we bounded the temporal window to 1995–2018 (24 calendar years), representing the era of active multi-project mist-netting in the biome with consistent capture documentation.</w:t>
       </w:r>
     </w:p>
     <w:p>
@@ -8602,32 +8428,6 @@
         <w:pStyle w:val="BodyText"/>
       </w:pPr>
       <w:r>
-        <w:t xml:space="preserve">First, we restricted the dataset strictly to live field captures, excluding museum study skins. Museum preparation induces marked, non-linear post-mortem shrinkage in feathers, bill keratin, and skeletal dimensions (typically 1–3% reduction in linear dimensions upon drying;</w:t>
-      </w:r>
-      <w:r>
-        <w:t xml:space="preserve"> </w:t>
-      </w:r>
-      <w:r>
-        <w:t xml:space="preserve">Weeks et al. (2020)</w:t>
-      </w:r>
-      <w:r>
-        <w:t xml:space="preserve">). Because museum specimens in regional collections are heavily concentrated in earlier decades of the 20th century, retaining study skins introduces artificial positive temporal trends. Second, we restricted records to adult individuals (</w:t>
-      </w:r>
-      <w:r>
-        <w:rPr>
-          <w:rStyle w:val="VerbatimChar"/>
-        </w:rPr>
-        <w:t xml:space="preserve">Age == "Adult"</w:t>
-      </w:r>
-      <w:r>
-        <w:t xml:space="preserve">), excluding juveniles and fledglings whose flight feathers and bills are incompletely developed. Third, we filtered records spatially to sampling localities falling within a 20-km buffer of the Brazilian Atlantic Forest biome boundary (IBGE/MMA official shapefile), eliminating captures situated in adjacent Cerrado or Caatinga enclaves. Fourth, we bounded the temporal window to 1995–2018 (24 calendar years), representing the era of active multi-project mist-netting in the biome with consistent capture documentation.</w:t>
-      </w:r>
-    </w:p>
-    <w:p>
-      <w:pPr>
-        <w:pStyle w:val="BodyText"/>
-      </w:pPr>
-      <w:r>
         <w:t xml:space="preserve">Finally, to guarantee robust parameter estimation for species-level random intercepts and random slopes, we restricted the primary analytical sample to species with</w:t>
       </w:r>
       <w:r>
@@ -8668,7 +8468,7 @@
         <w:t xml:space="preserve"> </w:t>
       </w:r>
       <w:r>
-        <w:t xml:space="preserve">years. This yielded an authoritative analytical dataset of 73 passerine species and 12,571 live-capture records (8,478 wing-length records across 72 species; one species,</w:t>
+        <w:t xml:space="preserve">years. This yielded an analytical dataset of 73 passerine species and 12,571 live-capture records (8,478 wing-length records across 72 species; one species,</w:t>
       </w:r>
       <w:r>
         <w:t xml:space="preserve"> </w:t>
@@ -8719,105 +8519,87 @@
         <w:t xml:space="preserve">) was compiled to evaluate whether patterns replicated in birds lacking sex determination.</w:t>
       </w:r>
     </w:p>
+    <w:bookmarkEnd w:id="60"/>
+    <w:bookmarkStart w:id="64" w:name="X2413f136305994ac0578ef7267db9fce1a67d7d"/>
+    <w:p>
+      <w:pPr>
+        <w:pStyle w:val="Heading2"/>
+      </w:pPr>
+      <w:r>
+        <w:t xml:space="preserve">4.2 Accounting for observer turnover and spatial provenance</w:t>
+      </w:r>
+    </w:p>
+    <w:p>
+      <w:pPr>
+        <w:pStyle w:val="FirstParagraph"/>
+      </w:pPr>
+      <w:r>
+        <w:t xml:space="preserve">In large-scale macroecological compilations aggregating data across independent research programs, two structural factors can confound temporal trends if left unmodeled: observer turnover and spatial turnover.</w:t>
+      </w:r>
+    </w:p>
+    <w:bookmarkStart w:id="61" w:name="X84e2870470c905c88a248c6b8d1c54bc364880c"/>
+    <w:p>
+      <w:pPr>
+        <w:pStyle w:val="Heading3"/>
+      </w:pPr>
+      <w:r>
+        <w:t xml:space="preserve">4.2.1 Observer turnover and researcher random effects</w:t>
+      </w:r>
+    </w:p>
+    <w:p>
+      <w:pPr>
+        <w:pStyle w:val="FirstParagraph"/>
+      </w:pPr>
+      <w:r>
+        <w:t xml:space="preserve">In avian morphometrics, inter-observer measurement error is well-documented to reach 1–3 mm for wing length and 0.5–1 mm for bill dimensions</w:t>
+      </w:r>
+      <w:r>
+        <w:t xml:space="preserve"> </w:t>
+      </w:r>
+      <w:r>
+        <w:t xml:space="preserve">(Weeks et al. 2020)</w:t>
+      </w:r>
+      <w:r>
+        <w:t xml:space="preserve">. If different field researchers apply slightly different caliper tension or wing-flattening techniques, and if the identity of active researchers changes over time, apparent temporal trends in morphology can arise entirely through observer turnover.</w:t>
+      </w:r>
+    </w:p>
+    <w:p>
+      <w:pPr>
+        <w:pStyle w:val="BodyText"/>
+      </w:pPr>
+      <w:r>
+        <w:t xml:space="preserve">In the ATLANTIC BIRD TRAITS compilation, the field measurer column (</w:t>
+      </w:r>
+      <w:r>
+        <w:rPr>
+          <w:rStyle w:val="VerbatimChar"/>
+        </w:rPr>
+        <w:t xml:space="preserve">Measurer</w:t>
+      </w:r>
+      <w:r>
+        <w:t xml:space="preserve">) is 100% missing (NA). However, the identity of the principal investigator and research group coordinator (</w:t>
+      </w:r>
+      <w:r>
+        <w:rPr>
+          <w:rStyle w:val="VerbatimChar"/>
+        </w:rPr>
+        <w:t xml:space="preserve">Main_researcher</w:t>
+      </w:r>
+      <w:r>
+        <w:t xml:space="preserve">) is 100% complete across all analytical records, comprising 42 distinct contributors in our wing dataset. An audit revealed high observer turnover across the 24-year record: only 6 of the 42 contributors sampled birds in both the early (1995–2006) and late (2013–2018) periods, while the late period experienced an influx of 33 active contributors compared to 12 early (Supplementary Fig. S1). To account for baseline measurement idiosyncrasies among research groups, we incorporated a random intercept for researcher identity (</w:t>
+      </w:r>
+      <w:r>
+        <w:rPr>
+          <w:rStyle w:val="VerbatimChar"/>
+        </w:rPr>
+        <w:t xml:space="preserve">(1 | Main_researcher)</w:t>
+      </w:r>
+      <w:r>
+        <w:t xml:space="preserve">).</w:t>
+      </w:r>
+    </w:p>
     <w:bookmarkEnd w:id="61"/>
-    <w:bookmarkStart w:id="65" w:name="X2413f136305994ac0578ef7267db9fce1a67d7d"/>
-    <w:p>
-      <w:pPr>
-        <w:pStyle w:val="Heading2"/>
-      </w:pPr>
-      <w:r>
-        <w:t xml:space="preserve">4.2 Accounting for observer turnover and spatial provenance</w:t>
-      </w:r>
-    </w:p>
-    <w:p>
-      <w:pPr>
-        <w:pStyle w:val="FirstParagraph"/>
-      </w:pPr>
-      <w:r>
-        <w:t xml:space="preserve">In large-scale macroecological compilations aggregating data across independent research programs, two structural factors can severely confound temporal trends if left unmodeled: observer turnover and spatial turnover.</w:t>
-      </w:r>
-    </w:p>
-    <w:bookmarkStart w:id="62" w:name="X0182f22886a6e37bc6cfdd93d22c7a6097f325e"/>
-    <w:p>
-      <w:pPr>
-        <w:pStyle w:val="Heading3"/>
-      </w:pPr>
-      <w:r>
-        <w:t xml:space="preserve">4.2.1 Observer turnover and researcher random effects (</w:t>
-      </w:r>
-      <w:r>
-        <w:rPr>
-          <w:rStyle w:val="VerbatimChar"/>
-        </w:rPr>
-        <w:t xml:space="preserve">Main_researcher</w:t>
-      </w:r>
-      <w:r>
-        <w:t xml:space="preserve">)</w:t>
-      </w:r>
-    </w:p>
-    <w:p>
-      <w:pPr>
-        <w:pStyle w:val="FirstParagraph"/>
-      </w:pPr>
-      <w:r>
-        <w:t xml:space="preserve">In avian morphometrics, inter-observer measurement error is well-documented to reach 1–3 mm for wing length and 0.5–1 mm for bill dimensions</w:t>
-      </w:r>
-      <w:r>
-        <w:t xml:space="preserve"> </w:t>
-      </w:r>
-      <w:r>
-        <w:t xml:space="preserve">(Weeks et al. 2020)</w:t>
-      </w:r>
-      <w:r>
-        <w:t xml:space="preserve">. If different field researchers apply slightly different caliper tension or wing-flattening techniques, and if the identity of active researchers changes over time, apparent temporal trends in morphology can arise entirely through observer turnover.</w:t>
-      </w:r>
-    </w:p>
-    <w:p>
-      <w:pPr>
-        <w:pStyle w:val="BodyText"/>
-      </w:pPr>
-      <w:r>
-        <w:t xml:space="preserve">In the ATLANTIC BIRD TRAITS compilation, the field measurer column (</w:t>
-      </w:r>
-      <w:r>
-        <w:rPr>
-          <w:rStyle w:val="VerbatimChar"/>
-        </w:rPr>
-        <w:t xml:space="preserve">Measurer</w:t>
-      </w:r>
-      <w:r>
-        <w:t xml:space="preserve">) is 100% missing (NA) and literature reference (</w:t>
-      </w:r>
-      <w:r>
-        <w:rPr>
-          <w:rStyle w:val="VerbatimChar"/>
-        </w:rPr>
-        <w:t xml:space="preserve">Reference</w:t>
-      </w:r>
-      <w:r>
-        <w:t xml:space="preserve">) is 99% missing. However, the identity of the principal investigator and research group coordinator (</w:t>
-      </w:r>
-      <w:r>
-        <w:rPr>
-          <w:rStyle w:val="VerbatimChar"/>
-        </w:rPr>
-        <w:t xml:space="preserve">Main_researcher</w:t>
-      </w:r>
-      <w:r>
-        <w:t xml:space="preserve">) is 100% complete across all analytical records, comprising 42 distinct contributors in our wing dataset. A provenance audit revealed pronounced observer turnover across the 24-year record: only 6 of the 42 contributors sampled birds in both the early (1995–2006) and late (2013–2018) periods, while the late period experienced an influx of 33 active contributors compared to 12 early (Supplementary Fig. S1). To account for baseline measurement idiosyncrasies among research groups, we incorporated a random intercept for researcher identity (</w:t>
-      </w:r>
-      <w:r>
-        <w:rPr>
-          <w:rStyle w:val="VerbatimChar"/>
-        </w:rPr>
-        <w:t xml:space="preserve">(1 | Main_researcher)</w:t>
-      </w:r>
-      <w:r>
-        <w:t xml:space="preserve">).</w:t>
-      </w:r>
-    </w:p>
-    <w:bookmarkEnd w:id="62"/>
-    <w:bookmarkStart w:id="63" w:name="Xfad59f5c48d6cb7277320f018ba251711124662"/>
+    <w:bookmarkStart w:id="62" w:name="Xfad59f5c48d6cb7277320f018ba251711124662"/>
     <w:p>
       <w:pPr>
         <w:pStyle w:val="Heading3"/>
@@ -8927,85 +8709,85 @@
         <w:t xml:space="preserve">) as continuous covariates.</w:t>
       </w:r>
     </w:p>
+    <w:bookmarkEnd w:id="62"/>
+    <w:bookmarkStart w:id="63" w:name="X7ded9429c4cba6fd745661808c9b73d14ee2c47"/>
+    <w:p>
+      <w:pPr>
+        <w:pStyle w:val="Heading3"/>
+      </w:pPr>
+      <w:r>
+        <w:t xml:space="preserve">4.2.3 Sampling hierarchy, collinearity, and exclusion of administrative municipality</w:t>
+      </w:r>
+    </w:p>
+    <w:p>
+      <w:pPr>
+        <w:pStyle w:val="FirstParagraph"/>
+      </w:pPr>
+      <w:r>
+        <w:t xml:space="preserve">Another structural consideration in multi-source macroecological databases is the hierarchical relationship between research teams and geographic sampling units. Across the 24-year ATLANTIC BIRD TRAITS compilation, individual field projects were typically conducted by distinct research groups operating within specific municipal territories. Consequently, spatial and observer grouping factors exhibit substantial collinearity: in our shared analytical sample (</w:t>
+      </w:r>
+      <m:oMath>
+        <m:r>
+          <m:t>n</m:t>
+        </m:r>
+        <m:r>
+          <m:rPr>
+            <m:sty m:val="p"/>
+          </m:rPr>
+          <m:t>=</m:t>
+        </m:r>
+        <m:r>
+          <m:t>7</m:t>
+        </m:r>
+        <m:r>
+          <m:rPr>
+            <m:sty m:val="p"/>
+          </m:rPr>
+          <m:t>,</m:t>
+        </m:r>
+        <m:r>
+          <m:t>577</m:t>
+        </m:r>
+      </m:oMath>
+      <w:r>
+        <w:t xml:space="preserve">), 110 of 128 municipalities (85.9%) were sampled by only a single researcher (and across the full body mass dataset, 129 of 150 municipalities, 86.0%, were sampled by a single researcher). Administrative municipalities are therefore largely nested within primary researchers rather than orthogonally crossed.</w:t>
+      </w:r>
+    </w:p>
+    <w:p>
+      <w:pPr>
+        <w:pStyle w:val="BodyText"/>
+      </w:pPr>
+      <w:r>
+        <w:t xml:space="preserve">Because morphometric measurement error (caliper tension, wing flattening, scale calibration) is a proximate property of the research team rather than administrative municipal boundaries, and because geographic and altitudinal clines are directly controlled via continuous coordinates and elevation, incorporating a redundant</w:t>
+      </w:r>
+      <w:r>
+        <w:t xml:space="preserve"> </w:t>
+      </w:r>
+      <w:r>
+        <w:rPr>
+          <w:rStyle w:val="VerbatimChar"/>
+        </w:rPr>
+        <w:t xml:space="preserve">(1 | Municipality)</w:t>
+      </w:r>
+      <w:r>
+        <w:t xml:space="preserve"> </w:t>
+      </w:r>
+      <w:r>
+        <w:t xml:space="preserve">random intercept induces variance competition, collinearity, and parameter inflation without improving model fit. We therefore adopted the parsimonious observer model (</w:t>
+      </w:r>
+      <w:r>
+        <w:rPr>
+          <w:rStyle w:val="VerbatimChar"/>
+        </w:rPr>
+        <w:t xml:space="preserve">(1 | Main_researcher)</w:t>
+      </w:r>
+      <w:r>
+        <w:t xml:space="preserve">) across all univariate and bivariate model tiers, avoiding collinear crossed random effects while ensuring robust parameter estimation and biological interpretability.</w:t>
+      </w:r>
+    </w:p>
     <w:bookmarkEnd w:id="63"/>
-    <w:bookmarkStart w:id="64" w:name="X7ded9429c4cba6fd745661808c9b73d14ee2c47"/>
-    <w:p>
-      <w:pPr>
-        <w:pStyle w:val="Heading3"/>
-      </w:pPr>
-      <w:r>
-        <w:t xml:space="preserve">4.2.3 Sampling hierarchy, collinearity, and exclusion of administrative municipality</w:t>
-      </w:r>
-    </w:p>
-    <w:p>
-      <w:pPr>
-        <w:pStyle w:val="FirstParagraph"/>
-      </w:pPr>
-      <w:r>
-        <w:t xml:space="preserve">A critical structural consideration in multi-source macroecological databases is the hierarchical relationship between research teams and geographic sampling units. Across the 24-year ATLANTIC BIRD TRAITS compilation, individual field projects were typically conducted by distinct research groups operating within specific municipal territories. Consequently, spatial and observer grouping factors exhibit substantial collinearity: in our shared analytical sample (</w:t>
-      </w:r>
-      <m:oMath>
-        <m:r>
-          <m:t>n</m:t>
-        </m:r>
-        <m:r>
-          <m:rPr>
-            <m:sty m:val="p"/>
-          </m:rPr>
-          <m:t>=</m:t>
-        </m:r>
-        <m:r>
-          <m:t>7</m:t>
-        </m:r>
-        <m:r>
-          <m:rPr>
-            <m:sty m:val="p"/>
-          </m:rPr>
-          <m:t>,</m:t>
-        </m:r>
-        <m:r>
-          <m:t>577</m:t>
-        </m:r>
-      </m:oMath>
-      <w:r>
-        <w:t xml:space="preserve">), 110 of 128 municipalities (85.9%) were sampled by only a single researcher (and across the full body mass dataset, 129 of 150 municipalities, 86.0%, were sampled by a single researcher). Administrative municipalities are therefore largely nested within primary researchers rather than orthogonally crossed.</w:t>
-      </w:r>
-    </w:p>
-    <w:p>
-      <w:pPr>
-        <w:pStyle w:val="BodyText"/>
-      </w:pPr>
-      <w:r>
-        <w:t xml:space="preserve">Because morphometric measurement error (caliper tension, wing flattening, scale calibration) is a proximate property of the research team rather than administrative municipal boundaries, and because geographic and altitudinal clines are directly controlled via continuous coordinates and elevation, incorporating a redundant</w:t>
-      </w:r>
-      <w:r>
-        <w:t xml:space="preserve"> </w:t>
-      </w:r>
-      <w:r>
-        <w:rPr>
-          <w:rStyle w:val="VerbatimChar"/>
-        </w:rPr>
-        <w:t xml:space="preserve">(1 | Municipality)</w:t>
-      </w:r>
-      <w:r>
-        <w:t xml:space="preserve"> </w:t>
-      </w:r>
-      <w:r>
-        <w:t xml:space="preserve">random intercept induces variance competition, collinearity, and parameter inflation without improving model fit. We therefore adopted the parsimonious observer model (</w:t>
-      </w:r>
-      <w:r>
-        <w:rPr>
-          <w:rStyle w:val="VerbatimChar"/>
-        </w:rPr>
-        <w:t xml:space="preserve">(1 | Main_researcher)</w:t>
-      </w:r>
-      <w:r>
-        <w:t xml:space="preserve">) across all univariate and bivariate model tiers, avoiding collinear crossed random effects while ensuring robust parameter estimation and biological interpretability.</w:t>
-      </w:r>
-    </w:p>
     <w:bookmarkEnd w:id="64"/>
-    <w:bookmarkEnd w:id="65"/>
-    <w:bookmarkStart w:id="66" w:name="X209e310501334e9b3a417e17400150671f7d25f"/>
+    <w:bookmarkStart w:id="65" w:name="X209e310501334e9b3a417e17400150671f7d25f"/>
     <w:p>
       <w:pPr>
         <w:pStyle w:val="Heading2"/>
@@ -9629,8 +9411,8 @@
         <w:t xml:space="preserve">).</w:t>
       </w:r>
     </w:p>
-    <w:bookmarkEnd w:id="66"/>
-    <w:bookmarkStart w:id="67" w:name="X3e9d42d2474c3f79baa2a707d23efc145f0b122"/>
+    <w:bookmarkEnd w:id="65"/>
+    <w:bookmarkStart w:id="66" w:name="X3e9d42d2474c3f79baa2a707d23efc145f0b122"/>
     <w:p>
       <w:pPr>
         <w:pStyle w:val="Heading2"/>
@@ -9717,7 +9499,7 @@
         <w:t xml:space="preserve">brms</w:t>
       </w:r>
       <w:r>
-        <w:t xml:space="preserve">) is computationally prohibitive for complex random-effect structures. We therefore implemented the fast, exact</w:t>
+        <w:t xml:space="preserve">) is computationally expensive for complex random-effect structures. We therefore implemented the fast, exact</w:t>
       </w:r>
       <w:r>
         <w:t xml:space="preserve"> </w:t>
@@ -10195,16 +9977,7 @@
         <w:t xml:space="preserve"> </w:t>
       </w:r>
       <w:r>
-        <w:t xml:space="preserve">reproduces Bayesian posterior means and standard errors to within 0.001 units while reducing computational run times by over 95% (</w:t>
-      </w:r>
-      <w:r>
-        <w:rPr>
-          <w:rStyle w:val="VerbatimChar"/>
-        </w:rPr>
-        <w:t xml:space="preserve">Analysis/scripts/GLMMTMB_ENGINE.md</w:t>
-      </w:r>
-      <w:r>
-        <w:t xml:space="preserve">).</w:t>
+        <w:t xml:space="preserve">reproduces Bayesian posterior means and standard errors to within 0.001 units while reducing computational run times by over 95%.</w:t>
       </w:r>
     </w:p>
     <w:p>
@@ -10791,121 +10564,121 @@
         <w:t xml:space="preserve">.</w:t>
       </w:r>
     </w:p>
+    <w:bookmarkEnd w:id="66"/>
+    <w:bookmarkStart w:id="67" w:name="X656a538e2e6ba7277e818ecf4966f95a904c340"/>
+    <w:p>
+      <w:pPr>
+        <w:pStyle w:val="Heading2"/>
+      </w:pPr>
+      <w:r>
+        <w:t xml:space="preserve">4.5 Body mass and bill width modeling and testing Allen’s rule</w:t>
+      </w:r>
+    </w:p>
+    <w:p>
+      <w:pPr>
+        <w:pStyle w:val="FirstParagraph"/>
+      </w:pPr>
+      <w:r>
+        <w:t xml:space="preserve">To evaluate whether temporal shifts occurred in body mass and extremity dimensions, we applied the sequential control ladder to log-transformed body mass (</w:t>
+      </w:r>
+      <m:oMath>
+        <m:r>
+          <m:t>n</m:t>
+        </m:r>
+        <m:r>
+          <m:rPr>
+            <m:sty m:val="p"/>
+          </m:rPr>
+          <m:t>=</m:t>
+        </m:r>
+        <m:r>
+          <m:t>11</m:t>
+        </m:r>
+        <m:r>
+          <m:rPr>
+            <m:sty m:val="p"/>
+          </m:rPr>
+          <m:t>,</m:t>
+        </m:r>
+        <m:r>
+          <m:t>077</m:t>
+        </m:r>
+      </m:oMath>
+      <w:r>
+        <w:t xml:space="preserve">) and bill width (</w:t>
+      </w:r>
+      <m:oMath>
+        <m:r>
+          <m:t>n</m:t>
+        </m:r>
+        <m:r>
+          <m:rPr>
+            <m:sty m:val="p"/>
+          </m:rPr>
+          <m:t>=</m:t>
+        </m:r>
+        <m:r>
+          <m:t>3</m:t>
+        </m:r>
+        <m:r>
+          <m:rPr>
+            <m:sty m:val="p"/>
+          </m:rPr>
+          <m:t>,</m:t>
+        </m:r>
+        <m:r>
+          <m:t>205</m:t>
+        </m:r>
+      </m:oMath>
+      <w:r>
+        <w:t xml:space="preserve">). Models incorporated sex, latitude, longitude, elevation, species-specific random slopes and intercepts across 50 phylogenetic trees, researcher identity, season, active moult, and individual bird identity.</w:t>
+      </w:r>
+    </w:p>
+    <w:p>
+      <w:pPr>
+        <w:pStyle w:val="BodyText"/>
+      </w:pPr>
+      <w:r>
+        <w:t xml:space="preserve">To evaluate diurnal feeding rhythms in body mass, we extracted recorded capture time (</w:t>
+      </w:r>
+      <w:r>
+        <w:rPr>
+          <w:rStyle w:val="VerbatimChar"/>
+        </w:rPr>
+        <w:t xml:space="preserve">Hour</w:t>
+      </w:r>
+      <w:r>
+        <w:t xml:space="preserve">) for the 8,345 mass records with available time stamps. We modeled diurnal mass gain by including continuous capture hour (</w:t>
+      </w:r>
+      <w:r>
+        <w:rPr>
+          <w:rStyle w:val="VerbatimChar"/>
+        </w:rPr>
+        <w:t xml:space="preserve">hour_num</w:t>
+      </w:r>
+      <w:r>
+        <w:t xml:space="preserve">, 06:00 to 18:00) alongside calendar year.</w:t>
+      </w:r>
+    </w:p>
+    <w:p>
+      <w:pPr>
+        <w:pStyle w:val="BodyText"/>
+      </w:pPr>
+      <w:r>
+        <w:t xml:space="preserve">To evaluate Allen’s rule</w:t>
+      </w:r>
+      <w:r>
+        <w:t xml:space="preserve"> </w:t>
+      </w:r>
+      <w:r>
+        <w:t xml:space="preserve">(Allen 1877; Ryding et al. 2021)</w:t>
+      </w:r>
+      <w:r>
+        <w:t xml:space="preserve">, which predicts that extremities enlarge in warmer conditions to facilitate non-evaporative heat dissipation, we tested whether bill width exhibited a positive temporal slope under researcher and spatial controls.</w:t>
+      </w:r>
+    </w:p>
     <w:bookmarkEnd w:id="67"/>
-    <w:bookmarkStart w:id="68" w:name="X656a538e2e6ba7277e818ecf4966f95a904c340"/>
-    <w:p>
-      <w:pPr>
-        <w:pStyle w:val="Heading2"/>
-      </w:pPr>
-      <w:r>
-        <w:t xml:space="preserve">4.5 Body mass and bill width modeling and testing Allen’s rule</w:t>
-      </w:r>
-    </w:p>
-    <w:p>
-      <w:pPr>
-        <w:pStyle w:val="FirstParagraph"/>
-      </w:pPr>
-      <w:r>
-        <w:t xml:space="preserve">To evaluate whether temporal shifts occurred in body mass and extremity dimensions, we applied the sequential control ladder to log-transformed body mass (</w:t>
-      </w:r>
-      <m:oMath>
-        <m:r>
-          <m:t>n</m:t>
-        </m:r>
-        <m:r>
-          <m:rPr>
-            <m:sty m:val="p"/>
-          </m:rPr>
-          <m:t>=</m:t>
-        </m:r>
-        <m:r>
-          <m:t>11</m:t>
-        </m:r>
-        <m:r>
-          <m:rPr>
-            <m:sty m:val="p"/>
-          </m:rPr>
-          <m:t>,</m:t>
-        </m:r>
-        <m:r>
-          <m:t>077</m:t>
-        </m:r>
-      </m:oMath>
-      <w:r>
-        <w:t xml:space="preserve">) and bill width (</w:t>
-      </w:r>
-      <m:oMath>
-        <m:r>
-          <m:t>n</m:t>
-        </m:r>
-        <m:r>
-          <m:rPr>
-            <m:sty m:val="p"/>
-          </m:rPr>
-          <m:t>=</m:t>
-        </m:r>
-        <m:r>
-          <m:t>3</m:t>
-        </m:r>
-        <m:r>
-          <m:rPr>
-            <m:sty m:val="p"/>
-          </m:rPr>
-          <m:t>,</m:t>
-        </m:r>
-        <m:r>
-          <m:t>205</m:t>
-        </m:r>
-      </m:oMath>
-      <w:r>
-        <w:t xml:space="preserve">). Models incorporated sex, latitude, longitude, elevation, species-specific random slopes and intercepts across 50 phylogenetic trees, researcher identity, season, active moult, and individual bird identity.</w:t>
-      </w:r>
-    </w:p>
-    <w:p>
-      <w:pPr>
-        <w:pStyle w:val="BodyText"/>
-      </w:pPr>
-      <w:r>
-        <w:t xml:space="preserve">To evaluate diurnal feeding rhythms in body mass, we extracted recorded capture time (</w:t>
-      </w:r>
-      <w:r>
-        <w:rPr>
-          <w:rStyle w:val="VerbatimChar"/>
-        </w:rPr>
-        <w:t xml:space="preserve">Hour</w:t>
-      </w:r>
-      <w:r>
-        <w:t xml:space="preserve">) for the 8,345 mass records with available time stamps. We modeled diurnal mass gain by including continuous capture hour (</w:t>
-      </w:r>
-      <w:r>
-        <w:rPr>
-          <w:rStyle w:val="VerbatimChar"/>
-        </w:rPr>
-        <w:t xml:space="preserve">hour_num</w:t>
-      </w:r>
-      <w:r>
-        <w:t xml:space="preserve">, 06:00 to 18:00) alongside calendar year.</w:t>
-      </w:r>
-    </w:p>
-    <w:p>
-      <w:pPr>
-        <w:pStyle w:val="BodyText"/>
-      </w:pPr>
-      <w:r>
-        <w:t xml:space="preserve">To evaluate Allen’s rule</w:t>
-      </w:r>
-      <w:r>
-        <w:t xml:space="preserve"> </w:t>
-      </w:r>
-      <w:r>
-        <w:t xml:space="preserve">(Allen 1877; Ryding et al. 2021)</w:t>
-      </w:r>
-      <w:r>
-        <w:t xml:space="preserve">, which predicts that extremities enlarge in warmer conditions to facilitate non-evaporative heat dissipation, we tested whether bill width exhibited a positive temporal slope under researcher and spatial controls.</w:t>
-      </w:r>
-    </w:p>
-    <w:bookmarkEnd w:id="68"/>
-    <w:bookmarkStart w:id="69" w:name="Xb837ca3b86c4da0276ff8aa30a6e8dff5c66f99"/>
+    <w:bookmarkStart w:id="68" w:name="Xb837ca3b86c4da0276ff8aa30a6e8dff5c66f99"/>
     <w:p>
       <w:pPr>
         <w:pStyle w:val="Heading2"/>
@@ -11797,8 +11570,8 @@
         <w:t xml:space="preserve">) indicates disproportionate mass loss or wing elongation (slenderization).</w:t>
       </w:r>
     </w:p>
-    <w:bookmarkEnd w:id="69"/>
-    <w:bookmarkStart w:id="70" w:name="X8341f8c6c82e3145741514559789c1da539f06b"/>
+    <w:bookmarkEnd w:id="68"/>
+    <w:bookmarkStart w:id="69" w:name="X8341f8c6c82e3145741514559789c1da539f06b"/>
     <w:p>
       <w:pPr>
         <w:pStyle w:val="Heading2"/>
@@ -12191,8 +11964,8 @@
         <w:t xml:space="preserve">) to local and regional temperature anomalies across the 7,577 shared records measured for both traits.</w:t>
       </w:r>
     </w:p>
-    <w:bookmarkEnd w:id="70"/>
-    <w:bookmarkStart w:id="71" w:name="X653d83b9bfe10a4aa35a57686ef1f796453cb4b"/>
+    <w:bookmarkEnd w:id="69"/>
+    <w:bookmarkStart w:id="70" w:name="X653d83b9bfe10a4aa35a57686ef1f796453cb4b"/>
     <w:p>
       <w:pPr>
         <w:pStyle w:val="Heading2"/>
@@ -12235,7 +12008,7 @@
         <w:t xml:space="preserve"> </w:t>
       </w:r>
       <w:r>
-        <w:t xml:space="preserve">adult specimens, 1884–2017) across 142 passerine species preserved in major Brazilian ornithological collections (Museu de Zoologia da USP, Museu Nacional da UFRJ, Universidade Regional de Blumenau, Universidade Federal de Pernambuco).</w:t>
+        <w:t xml:space="preserve">adult specimens, 1884–2017) across 142 passerine species preserved in major Brazilian ornithological collections, available via the ATLANTIC BIRD TRAITS database.</w:t>
       </w:r>
     </w:p>
     <w:p>
@@ -12538,8 +12311,8 @@
         <w:t xml:space="preserve">captures across 243 species; Supplementary Material), evaluating temporal slopes with random intercepts and slopes for species and random intercepts for sampling locality and contributor.</w:t>
       </w:r>
     </w:p>
-    <w:bookmarkEnd w:id="71"/>
-    <w:bookmarkStart w:id="72" w:name="X6ff614c3587b78c67248aba5d88ecab96336cc0"/>
+    <w:bookmarkEnd w:id="70"/>
+    <w:bookmarkStart w:id="71" w:name="X6ff614c3587b78c67248aba5d88ecab96336cc0"/>
     <w:p>
       <w:pPr>
         <w:pStyle w:val="Heading2"/>
@@ -13248,14 +13021,169 @@
         <w:t xml:space="preserve">) was added to the dispersion formula to test whether residual variance tracked environmental warming.</w:t>
       </w:r>
     </w:p>
+    <w:bookmarkEnd w:id="71"/>
+    <w:bookmarkStart w:id="72" w:name="Xfd84aa4262ebbdc8c9052e44d41fd99b9baf22f"/>
+    <w:p>
+      <w:pPr>
+        <w:pStyle w:val="Heading2"/>
+      </w:pPr>
+      <w:r>
+        <w:t xml:space="preserve">4.10 Trophic interactions and regional prey context</w:t>
+      </w:r>
+    </w:p>
+    <w:p>
+      <w:pPr>
+        <w:pStyle w:val="FirstParagraph"/>
+      </w:pPr>
+      <w:r>
+        <w:t xml:space="preserve">Species’ dietary reliance on invertebrates was extracted from the EltonTraits 1.0 database</w:t>
+      </w:r>
+      <w:r>
+        <w:t xml:space="preserve"> </w:t>
+      </w:r>
+      <w:r>
+        <w:t xml:space="preserve">(Wilman et al. 2014)</w:t>
+      </w:r>
+      <w:r>
+        <w:t xml:space="preserve"> </w:t>
+      </w:r>
+      <w:r>
+        <w:t xml:space="preserve">(</w:t>
+      </w:r>
+      <w:r>
+        <w:rPr>
+          <w:rStyle w:val="VerbatimChar"/>
+        </w:rPr>
+        <w:t xml:space="preserve">Diet-Inv</w:t>
+      </w:r>
+      <w:r>
+        <w:t xml:space="preserve">, % of diet consisting of invertebrates). In continuous interaction models (Model A),</w:t>
+      </w:r>
+      <w:r>
+        <w:t xml:space="preserve"> </w:t>
+      </w:r>
+      <w:r>
+        <w:rPr>
+          <w:rStyle w:val="VerbatimChar"/>
+        </w:rPr>
+        <w:t xml:space="preserve">Diet-Inv</w:t>
+      </w:r>
+      <w:r>
+        <w:t xml:space="preserve"> </w:t>
+      </w:r>
+      <w:r>
+        <w:t xml:space="preserve">was standardized (</w:t>
+      </w:r>
+      <m:oMath>
+        <m:r>
+          <m:t>z</m:t>
+        </m:r>
+      </m:oMath>
+      <w:r>
+        <w:t xml:space="preserve">-score) and interacted with calendar year (</w:t>
+      </w:r>
+      <w:r>
+        <w:rPr>
+          <w:rStyle w:val="VerbatimChar"/>
+        </w:rPr>
+        <w:t xml:space="preserve">scaled_yr * diet_inv_std</w:t>
+      </w:r>
+      <w:r>
+        <w:t xml:space="preserve">). Wing-length trajectories were projected across the 10th (p10), 50th (p50), and 90th (p90) species-weighted percentiles of invertebrate reliance. In categorical models (Model B), diet was collapsed into Invertebrate-dominated (</w:t>
+      </w:r>
+      <m:oMath>
+        <m:r>
+          <m:rPr>
+            <m:sty m:val="p"/>
+          </m:rPr>
+          <m:t>≥</m:t>
+        </m:r>
+        <m:r>
+          <m:t>50</m:t>
+        </m:r>
+        <m:r>
+          <m:rPr>
+            <m:sty m:val="p"/>
+          </m:rPr>
+          <m:t>%</m:t>
+        </m:r>
+      </m:oMath>
+      <w:r>
+        <w:t xml:space="preserve"> </w:t>
+      </w:r>
+      <w:r>
+        <w:t xml:space="preserve">invertebrate diet) versus Other (frugivores, nectarivores, granivores, omnivores). Both models were fitted across 50 phylogenetic trees with observer random intercepts.</w:t>
+      </w:r>
+    </w:p>
+    <w:p>
+      <w:pPr>
+        <w:pStyle w:val="BodyText"/>
+      </w:pPr>
+      <w:r>
+        <w:t xml:space="preserve">To evaluate regional prey trends, we modeled litter-ant richness from the ATLANTIC ANTS database</w:t>
+      </w:r>
+      <w:r>
+        <w:t xml:space="preserve"> </w:t>
+      </w:r>
+      <w:r>
+        <w:t xml:space="preserve">(</w:t>
+      </w:r>
+      <w:r>
+        <w:t xml:space="preserve">Silva et al.</w:t>
+      </w:r>
+      <w:r>
+        <w:t xml:space="preserve"> </w:t>
+      </w:r>
+      <w:r>
+        <w:t xml:space="preserve">2022)</w:t>
+      </w:r>
+      <w:r>
+        <w:t xml:space="preserve"> </w:t>
+      </w:r>
+      <w:r>
+        <w:t xml:space="preserve">across 855 standardized field campaigns (1994–2018). We fitted negative-binomial generalized linear mixed models in</w:t>
+      </w:r>
+      <w:r>
+        <w:t xml:space="preserve"> </w:t>
+      </w:r>
+      <w:r>
+        <w:rPr>
+          <w:rStyle w:val="VerbatimChar"/>
+        </w:rPr>
+        <w:t xml:space="preserve">glmmTMB</w:t>
+      </w:r>
+      <w:r>
+        <w:t xml:space="preserve"> </w:t>
+      </w:r>
+      <w:r>
+        <w:t xml:space="preserve">specifying observed ant species richness per campaign as a function of calendar year, with the log of sampling effort (number of pitfall traps</w:t>
+      </w:r>
+      <w:r>
+        <w:t xml:space="preserve"> </w:t>
+      </w:r>
+      <m:oMath>
+        <m:r>
+          <m:rPr>
+            <m:sty m:val="p"/>
+          </m:rPr>
+          <m:t>×</m:t>
+        </m:r>
+      </m:oMath>
+      <w:r>
+        <w:t xml:space="preserve"> </w:t>
+      </w:r>
+      <w:r>
+        <w:t xml:space="preserve">operational days) as an offset, and random intercepts for contributor, municipality, and sampling locality.</w:t>
+      </w:r>
+    </w:p>
     <w:bookmarkEnd w:id="72"/>
-    <w:bookmarkStart w:id="73" w:name="Xfd84aa4262ebbdc8c9052e44d41fd99b9baf22f"/>
+    <w:bookmarkStart w:id="73" w:name="reproducible-software-environment"/>
     <w:p>
       <w:pPr>
         <w:pStyle w:val="Heading2"/>
       </w:pPr>
       <w:r>
-        <w:t xml:space="preserve">4.10 Trophic interactions and regional prey context</w:t>
+        <w:t xml:space="preserve">4.11 Reproducible software environment</w:t>
       </w:r>
     </w:p>
     <w:p>
@@ -13263,28 +13191,22 @@
         <w:pStyle w:val="FirstParagraph"/>
       </w:pPr>
       <w:r>
-        <w:t xml:space="preserve">Species’ dietary reliance on invertebrates was extracted from the EltonTraits 1.0 database</w:t>
-      </w:r>
-      <w:r>
-        <w:t xml:space="preserve"> </w:t>
-      </w:r>
-      <w:r>
-        <w:t xml:space="preserve">(Wilman et al. 2014)</w:t>
-      </w:r>
-      <w:r>
-        <w:t xml:space="preserve"> </w:t>
-      </w:r>
-      <w:r>
-        <w:t xml:space="preserve">(</w:t>
+        <w:t xml:space="preserve">Analyses and manuscript generation were conducted using R version 4.4+ with packages</w:t>
+      </w:r>
+      <w:r>
+        <w:t xml:space="preserve"> </w:t>
       </w:r>
       <w:r>
         <w:rPr>
           <w:rStyle w:val="VerbatimChar"/>
         </w:rPr>
-        <w:t xml:space="preserve">Diet-Inv</w:t>
-      </w:r>
-      <w:r>
-        <w:t xml:space="preserve">, % of diet consisting of invertebrates). In continuous interaction models (Model A),</w:t>
+        <w:t xml:space="preserve">glmmTMB</w:t>
+      </w:r>
+      <w:r>
+        <w:t xml:space="preserve"> </w:t>
+      </w:r>
+      <w:r>
+        <w:t xml:space="preserve">(v1.1.14),</w:t>
       </w:r>
       <w:r>
         <w:t xml:space="preserve"> </w:t>
@@ -13293,82 +13215,28 @@
         <w:rPr>
           <w:rStyle w:val="VerbatimChar"/>
         </w:rPr>
-        <w:t xml:space="preserve">Diet-Inv</w:t>
-      </w:r>
-      <w:r>
-        <w:t xml:space="preserve"> </w:t>
-      </w:r>
-      <w:r>
-        <w:t xml:space="preserve">was standardized (</w:t>
-      </w:r>
-      <m:oMath>
-        <m:r>
-          <m:t>z</m:t>
-        </m:r>
-      </m:oMath>
-      <w:r>
-        <w:t xml:space="preserve">-score) and interacted with calendar year (</w:t>
+        <w:t xml:space="preserve">prepR4pcm</w:t>
+      </w:r>
+      <w:r>
+        <w:t xml:space="preserve"> </w:t>
+      </w:r>
+      <w:r>
+        <w:t xml:space="preserve">(v0.1.0),</w:t>
+      </w:r>
+      <w:r>
+        <w:t xml:space="preserve"> </w:t>
       </w:r>
       <w:r>
         <w:rPr>
           <w:rStyle w:val="VerbatimChar"/>
         </w:rPr>
-        <w:t xml:space="preserve">scaled_yr * diet_inv_std</w:t>
-      </w:r>
-      <w:r>
-        <w:t xml:space="preserve">). Wing-length trajectories were projected across the 10th (p10), 50th (p50), and 90th (p90) species-weighted percentiles of invertebrate reliance. In categorical models (Model B), diet was collapsed into Invertebrate-dominated (</w:t>
-      </w:r>
-      <m:oMath>
-        <m:r>
-          <m:rPr>
-            <m:sty m:val="p"/>
-          </m:rPr>
-          <m:t>≥</m:t>
-        </m:r>
-        <m:r>
-          <m:t>50</m:t>
-        </m:r>
-        <m:r>
-          <m:rPr>
-            <m:sty m:val="p"/>
-          </m:rPr>
-          <m:t>%</m:t>
-        </m:r>
-      </m:oMath>
-      <w:r>
-        <w:t xml:space="preserve"> </w:t>
-      </w:r>
-      <w:r>
-        <w:t xml:space="preserve">invertebrate diet) versus Other (frugivores, nectarivores, granivores, omnivores). Both models were fitted across 50 phylogenetic trees with observer random intercepts.</w:t>
-      </w:r>
-    </w:p>
-    <w:p>
-      <w:pPr>
-        <w:pStyle w:val="BodyText"/>
-      </w:pPr>
-      <w:r>
-        <w:t xml:space="preserve">To evaluate regional prey trends, we modeled litter-ant richness from the ATLANTIC ANTS database</w:t>
-      </w:r>
-      <w:r>
-        <w:t xml:space="preserve"> </w:t>
-      </w:r>
-      <w:r>
-        <w:t xml:space="preserve">(</w:t>
-      </w:r>
-      <w:r>
-        <w:t xml:space="preserve">Silva et al.</w:t>
-      </w:r>
-      <w:r>
-        <w:t xml:space="preserve"> </w:t>
-      </w:r>
-      <w:r>
-        <w:t xml:space="preserve">2022)</w:t>
-      </w:r>
-      <w:r>
-        <w:t xml:space="preserve"> </w:t>
-      </w:r>
-      <w:r>
-        <w:t xml:space="preserve">across 855 standardized field campaigns (1994–2018). We fitted negative-binomial generalized linear mixed models in</w:t>
+        <w:t xml:space="preserve">metafor</w:t>
+      </w:r>
+      <w:r>
+        <w:t xml:space="preserve"> </w:t>
+      </w:r>
+      <w:r>
+        <w:t xml:space="preserve">(v4.6+),</w:t>
       </w:r>
       <w:r>
         <w:t xml:space="preserve"> </w:t>
@@ -13377,197 +13245,102 @@
         <w:rPr>
           <w:rStyle w:val="VerbatimChar"/>
         </w:rPr>
-        <w:t xml:space="preserve">glmmTMB</w:t>
-      </w:r>
-      <w:r>
-        <w:t xml:space="preserve"> </w:t>
-      </w:r>
-      <w:r>
-        <w:t xml:space="preserve">specifying observed ant species richness per campaign as a function of calendar year, with the log of sampling effort (number of pitfall traps</w:t>
-      </w:r>
-      <w:r>
-        <w:t xml:space="preserve"> </w:t>
-      </w:r>
-      <m:oMath>
-        <m:r>
-          <m:rPr>
-            <m:sty m:val="p"/>
-          </m:rPr>
-          <m:t>×</m:t>
-        </m:r>
-      </m:oMath>
-      <w:r>
-        <w:t xml:space="preserve"> </w:t>
-      </w:r>
-      <w:r>
-        <w:t xml:space="preserve">operational days) as an offset, and random intercepts for contributor, municipality, and sampling locality.</w:t>
+        <w:t xml:space="preserve">ape</w:t>
+      </w:r>
+      <w:r>
+        <w:t xml:space="preserve"> </w:t>
+      </w:r>
+      <w:r>
+        <w:t xml:space="preserve">(v5.8+),</w:t>
+      </w:r>
+      <w:r>
+        <w:t xml:space="preserve"> </w:t>
+      </w:r>
+      <w:r>
+        <w:rPr>
+          <w:rStyle w:val="VerbatimChar"/>
+        </w:rPr>
+        <w:t xml:space="preserve">sf</w:t>
+      </w:r>
+      <w:r>
+        <w:t xml:space="preserve"> </w:t>
+      </w:r>
+      <w:r>
+        <w:t xml:space="preserve">(v1.0+),</w:t>
+      </w:r>
+      <w:r>
+        <w:t xml:space="preserve"> </w:t>
+      </w:r>
+      <w:r>
+        <w:rPr>
+          <w:rStyle w:val="VerbatimChar"/>
+        </w:rPr>
+        <w:t xml:space="preserve">terra</w:t>
+      </w:r>
+      <w:r>
+        <w:t xml:space="preserve"> </w:t>
+      </w:r>
+      <w:r>
+        <w:t xml:space="preserve">(v1.8+), and</w:t>
+      </w:r>
+      <w:r>
+        <w:t xml:space="preserve"> </w:t>
+      </w:r>
+      <w:r>
+        <w:rPr>
+          <w:rStyle w:val="VerbatimChar"/>
+        </w:rPr>
+        <w:t xml:space="preserve">tidyverse</w:t>
+      </w:r>
+      <w:r>
+        <w:t xml:space="preserve"> </w:t>
+      </w:r>
+      <w:r>
+        <w:t xml:space="preserve">(v2.0+), alongside Python (version 3.11+) with</w:t>
+      </w:r>
+      <w:r>
+        <w:t xml:space="preserve"> </w:t>
+      </w:r>
+      <w:r>
+        <w:rPr>
+          <w:rStyle w:val="VerbatimChar"/>
+        </w:rPr>
+        <w:t xml:space="preserve">matplotlib</w:t>
+      </w:r>
+      <w:r>
+        <w:t xml:space="preserve"> </w:t>
+      </w:r>
+      <w:r>
+        <w:t xml:space="preserve">(v3.10+) and</w:t>
+      </w:r>
+      <w:r>
+        <w:t xml:space="preserve"> </w:t>
+      </w:r>
+      <w:r>
+        <w:rPr>
+          <w:rStyle w:val="VerbatimChar"/>
+        </w:rPr>
+        <w:t xml:space="preserve">pandas</w:t>
+      </w:r>
+      <w:r>
+        <w:t xml:space="preserve"> </w:t>
+      </w:r>
+      <w:r>
+        <w:t xml:space="preserve">(v2.2+). All analysis scripts, curated datasets, and fitted model objects are openly archived and fully reproducible in the project repository (DOI: 10.5281/zenodo.atlantic_birds).</w:t>
       </w:r>
     </w:p>
     <w:bookmarkEnd w:id="73"/>
-    <w:bookmarkStart w:id="74" w:name="reproducible-software-environment"/>
+    <w:bookmarkStart w:id="132" w:name="references"/>
     <w:p>
       <w:pPr>
         <w:pStyle w:val="Heading2"/>
       </w:pPr>
       <w:r>
-        <w:t xml:space="preserve">4.11 Reproducible software environment</w:t>
-      </w:r>
-    </w:p>
-    <w:p>
-      <w:pPr>
-        <w:pStyle w:val="FirstParagraph"/>
-      </w:pPr>
-      <w:r>
-        <w:t xml:space="preserve">Analyses and manuscript generation were conducted using R version 4.4+ with packages</w:t>
-      </w:r>
-      <w:r>
-        <w:t xml:space="preserve"> </w:t>
-      </w:r>
-      <w:r>
-        <w:rPr>
-          <w:rStyle w:val="VerbatimChar"/>
-        </w:rPr>
-        <w:t xml:space="preserve">glmmTMB</w:t>
-      </w:r>
-      <w:r>
-        <w:t xml:space="preserve"> </w:t>
-      </w:r>
-      <w:r>
-        <w:t xml:space="preserve">(v1.1.14),</w:t>
-      </w:r>
-      <w:r>
-        <w:t xml:space="preserve"> </w:t>
-      </w:r>
-      <w:r>
-        <w:rPr>
-          <w:rStyle w:val="VerbatimChar"/>
-        </w:rPr>
-        <w:t xml:space="preserve">prepR4pcm</w:t>
-      </w:r>
-      <w:r>
-        <w:t xml:space="preserve"> </w:t>
-      </w:r>
-      <w:r>
-        <w:t xml:space="preserve">(v0.1.0),</w:t>
-      </w:r>
-      <w:r>
-        <w:t xml:space="preserve"> </w:t>
-      </w:r>
-      <w:r>
-        <w:rPr>
-          <w:rStyle w:val="VerbatimChar"/>
-        </w:rPr>
-        <w:t xml:space="preserve">metafor</w:t>
-      </w:r>
-      <w:r>
-        <w:t xml:space="preserve"> </w:t>
-      </w:r>
-      <w:r>
-        <w:t xml:space="preserve">(v4.6+),</w:t>
-      </w:r>
-      <w:r>
-        <w:t xml:space="preserve"> </w:t>
-      </w:r>
-      <w:r>
-        <w:rPr>
-          <w:rStyle w:val="VerbatimChar"/>
-        </w:rPr>
-        <w:t xml:space="preserve">ape</w:t>
-      </w:r>
-      <w:r>
-        <w:t xml:space="preserve"> </w:t>
-      </w:r>
-      <w:r>
-        <w:t xml:space="preserve">(v5.8+),</w:t>
-      </w:r>
-      <w:r>
-        <w:t xml:space="preserve"> </w:t>
-      </w:r>
-      <w:r>
-        <w:rPr>
-          <w:rStyle w:val="VerbatimChar"/>
-        </w:rPr>
-        <w:t xml:space="preserve">sf</w:t>
-      </w:r>
-      <w:r>
-        <w:t xml:space="preserve"> </w:t>
-      </w:r>
-      <w:r>
-        <w:t xml:space="preserve">(v1.0+),</w:t>
-      </w:r>
-      <w:r>
-        <w:t xml:space="preserve"> </w:t>
-      </w:r>
-      <w:r>
-        <w:rPr>
-          <w:rStyle w:val="VerbatimChar"/>
-        </w:rPr>
-        <w:t xml:space="preserve">terra</w:t>
-      </w:r>
-      <w:r>
-        <w:t xml:space="preserve"> </w:t>
-      </w:r>
-      <w:r>
-        <w:t xml:space="preserve">(v1.8+), and</w:t>
-      </w:r>
-      <w:r>
-        <w:t xml:space="preserve"> </w:t>
-      </w:r>
-      <w:r>
-        <w:rPr>
-          <w:rStyle w:val="VerbatimChar"/>
-        </w:rPr>
-        <w:t xml:space="preserve">tidyverse</w:t>
-      </w:r>
-      <w:r>
-        <w:t xml:space="preserve"> </w:t>
-      </w:r>
-      <w:r>
-        <w:t xml:space="preserve">(v2.0+), alongside Python (version 3.11+) with</w:t>
-      </w:r>
-      <w:r>
-        <w:t xml:space="preserve"> </w:t>
-      </w:r>
-      <w:r>
-        <w:rPr>
-          <w:rStyle w:val="VerbatimChar"/>
-        </w:rPr>
-        <w:t xml:space="preserve">matplotlib</w:t>
-      </w:r>
-      <w:r>
-        <w:t xml:space="preserve"> </w:t>
-      </w:r>
-      <w:r>
-        <w:t xml:space="preserve">(v3.10+) and</w:t>
-      </w:r>
-      <w:r>
-        <w:t xml:space="preserve"> </w:t>
-      </w:r>
-      <w:r>
-        <w:rPr>
-          <w:rStyle w:val="VerbatimChar"/>
-        </w:rPr>
-        <w:t xml:space="preserve">pandas</w:t>
-      </w:r>
-      <w:r>
-        <w:t xml:space="preserve"> </w:t>
-      </w:r>
-      <w:r>
-        <w:t xml:space="preserve">(v2.2+). All analysis scripts, curated datasets, and fitted model objects are openly archived and fully reproducible in the project repository (DOI: 10.5281/zenodo.atlantic_birds).</w:t>
-      </w:r>
-    </w:p>
-    <w:bookmarkEnd w:id="74"/>
-    <w:bookmarkStart w:id="133" w:name="references"/>
-    <w:p>
-      <w:pPr>
-        <w:pStyle w:val="Heading2"/>
-      </w:pPr>
-      <w:r>
         <w:t xml:space="preserve">References</w:t>
       </w:r>
     </w:p>
-    <w:bookmarkStart w:id="132" w:name="refs"/>
-    <w:bookmarkStart w:id="75" w:name="ref-allen1877"/>
+    <w:bookmarkStart w:id="131" w:name="refs"/>
+    <w:bookmarkStart w:id="74" w:name="ref-allen1877"/>
     <w:p>
       <w:pPr>
         <w:pStyle w:val="Bibliography"/>
@@ -13598,8 +13371,8 @@
         <w:t xml:space="preserve">1: 108–40.</w:t>
       </w:r>
     </w:p>
-    <w:bookmarkEnd w:id="75"/>
-    <w:bookmarkStart w:id="77" w:name="ref-ashton2002a"/>
+    <w:bookmarkEnd w:id="74"/>
+    <w:bookmarkStart w:id="76" w:name="ref-ashton2002a"/>
     <w:p>
       <w:pPr>
         <w:pStyle w:val="Bibliography"/>
@@ -13632,7 +13405,7 @@
       <w:r>
         <w:t xml:space="preserve"> </w:t>
       </w:r>
-      <w:hyperlink r:id="rId76">
+      <w:hyperlink r:id="rId75">
         <w:r>
           <w:rPr>
             <w:rStyle w:val="Hyperlink"/>
@@ -13644,8 +13417,8 @@
         <w:t xml:space="preserve">.</w:t>
       </w:r>
     </w:p>
-    <w:bookmarkEnd w:id="77"/>
-    <w:bookmarkStart w:id="79" w:name="ref-bell2019fixed"/>
+    <w:bookmarkEnd w:id="76"/>
+    <w:bookmarkStart w:id="78" w:name="ref-bell2019fixed"/>
     <w:p>
       <w:pPr>
         <w:pStyle w:val="Bibliography"/>
@@ -13678,7 +13451,7 @@
       <w:r>
         <w:t xml:space="preserve"> </w:t>
       </w:r>
-      <w:hyperlink r:id="rId78">
+      <w:hyperlink r:id="rId77">
         <w:r>
           <w:rPr>
             <w:rStyle w:val="Hyperlink"/>
@@ -13690,8 +13463,8 @@
         <w:t xml:space="preserve">.</w:t>
       </w:r>
     </w:p>
-    <w:bookmarkEnd w:id="79"/>
-    <w:bookmarkStart w:id="81" w:name="ref-bergmann1847"/>
+    <w:bookmarkEnd w:id="78"/>
+    <w:bookmarkStart w:id="80" w:name="ref-bergmann1847"/>
     <w:p>
       <w:pPr>
         <w:pStyle w:val="Bibliography"/>
@@ -13724,7 +13497,7 @@
       <w:r>
         <w:t xml:space="preserve"> </w:t>
       </w:r>
-      <w:hyperlink r:id="rId80">
+      <w:hyperlink r:id="rId79">
         <w:r>
           <w:rPr>
             <w:rStyle w:val="Hyperlink"/>
@@ -13736,8 +13509,8 @@
         <w:t xml:space="preserve">.</w:t>
       </w:r>
     </w:p>
-    <w:bookmarkEnd w:id="81"/>
-    <w:bookmarkStart w:id="83" w:name="ref-gardner_declining_2011"/>
+    <w:bookmarkEnd w:id="80"/>
+    <w:bookmarkStart w:id="82" w:name="ref-gardner_declining_2011"/>
     <w:p>
       <w:pPr>
         <w:pStyle w:val="Bibliography"/>
@@ -13770,7 +13543,7 @@
       <w:r>
         <w:t xml:space="preserve"> </w:t>
       </w:r>
-      <w:hyperlink r:id="rId82">
+      <w:hyperlink r:id="rId81">
         <w:r>
           <w:rPr>
             <w:rStyle w:val="Hyperlink"/>
@@ -13782,8 +13555,8 @@
         <w:t xml:space="preserve">.</w:t>
       </w:r>
     </w:p>
-    <w:bookmarkEnd w:id="83"/>
-    <w:bookmarkStart w:id="85" w:name="ref-harris2020crudata"/>
+    <w:bookmarkEnd w:id="82"/>
+    <w:bookmarkStart w:id="84" w:name="ref-harris2020crudata"/>
     <w:p>
       <w:pPr>
         <w:pStyle w:val="Bibliography"/>
@@ -13828,7 +13601,7 @@
       <w:r>
         <w:t xml:space="preserve"> </w:t>
       </w:r>
-      <w:hyperlink r:id="rId84">
+      <w:hyperlink r:id="rId83">
         <w:r>
           <w:rPr>
             <w:rStyle w:val="Hyperlink"/>
@@ -13840,8 +13613,8 @@
         <w:t xml:space="preserve">.</w:t>
       </w:r>
     </w:p>
-    <w:bookmarkEnd w:id="85"/>
-    <w:bookmarkStart w:id="86" w:name="ref-hudson2017database"/>
+    <w:bookmarkEnd w:id="84"/>
+    <w:bookmarkStart w:id="85" w:name="ref-hudson2017database"/>
     <w:p>
       <w:pPr>
         <w:pStyle w:val="Bibliography"/>
@@ -13875,8 +13648,8 @@
         <w:t xml:space="preserve">7 (1): 145–88.</w:t>
       </w:r>
     </w:p>
-    <w:bookmarkEnd w:id="86"/>
-    <w:bookmarkStart w:id="88" w:name="ref-jirinec2021morphological"/>
+    <w:bookmarkEnd w:id="85"/>
+    <w:bookmarkStart w:id="87" w:name="ref-jirinec2021morphological"/>
     <w:p>
       <w:pPr>
         <w:pStyle w:val="Bibliography"/>
@@ -13921,7 +13694,7 @@
       <w:r>
         <w:t xml:space="preserve"> </w:t>
       </w:r>
-      <w:hyperlink r:id="rId87">
+      <w:hyperlink r:id="rId86">
         <w:r>
           <w:rPr>
             <w:rStyle w:val="Hyperlink"/>
@@ -13933,8 +13706,8 @@
         <w:t xml:space="preserve">.</w:t>
       </w:r>
     </w:p>
-    <w:bookmarkEnd w:id="88"/>
-    <w:bookmarkStart w:id="90" w:name="ref-lenssen2019gistemp"/>
+    <w:bookmarkEnd w:id="87"/>
+    <w:bookmarkStart w:id="89" w:name="ref-lenssen2019gistemp"/>
     <w:p>
       <w:pPr>
         <w:pStyle w:val="Bibliography"/>
@@ -13979,7 +13752,7 @@
       <w:r>
         <w:t xml:space="preserve"> </w:t>
       </w:r>
-      <w:hyperlink r:id="rId89">
+      <w:hyperlink r:id="rId88">
         <w:r>
           <w:rPr>
             <w:rStyle w:val="Hyperlink"/>
@@ -13991,8 +13764,8 @@
         <w:t xml:space="preserve">.</w:t>
       </w:r>
     </w:p>
-    <w:bookmarkEnd w:id="90"/>
-    <w:bookmarkStart w:id="92" w:name="ref-lewinsohn2022insect"/>
+    <w:bookmarkEnd w:id="89"/>
+    <w:bookmarkStart w:id="91" w:name="ref-lewinsohn2022insect"/>
     <w:p>
       <w:pPr>
         <w:pStyle w:val="Bibliography"/>
@@ -14034,7 +13807,7 @@
       <w:r>
         <w:t xml:space="preserve"> </w:t>
       </w:r>
-      <w:hyperlink r:id="rId91">
+      <w:hyperlink r:id="rId90">
         <w:r>
           <w:rPr>
             <w:rStyle w:val="Hyperlink"/>
@@ -14046,8 +13819,8 @@
         <w:t xml:space="preserve">.</w:t>
       </w:r>
     </w:p>
-    <w:bookmarkEnd w:id="92"/>
-    <w:bookmarkStart w:id="94" w:name="ref-mayr1956"/>
+    <w:bookmarkEnd w:id="91"/>
+    <w:bookmarkStart w:id="93" w:name="ref-mayr1956"/>
     <w:p>
       <w:pPr>
         <w:pStyle w:val="Bibliography"/>
@@ -14080,7 +13853,7 @@
       <w:r>
         <w:t xml:space="preserve"> </w:t>
       </w:r>
-      <w:hyperlink r:id="rId93">
+      <w:hyperlink r:id="rId92">
         <w:r>
           <w:rPr>
             <w:rStyle w:val="Hyperlink"/>
@@ -14092,8 +13865,8 @@
         <w:t xml:space="preserve">.</w:t>
       </w:r>
     </w:p>
-    <w:bookmarkEnd w:id="94"/>
-    <w:bookmarkStart w:id="96" w:name="ref-mctavish2025tree"/>
+    <w:bookmarkEnd w:id="93"/>
+    <w:bookmarkStart w:id="95" w:name="ref-mctavish2025tree"/>
     <w:p>
       <w:pPr>
         <w:pStyle w:val="Bibliography"/>
@@ -14126,7 +13899,7 @@
       <w:r>
         <w:t xml:space="preserve"> </w:t>
       </w:r>
-      <w:hyperlink r:id="rId95">
+      <w:hyperlink r:id="rId94">
         <w:r>
           <w:rPr>
             <w:rStyle w:val="Hyperlink"/>
@@ -14138,8 +13911,8 @@
         <w:t xml:space="preserve">.</w:t>
       </w:r>
     </w:p>
-    <w:bookmarkEnd w:id="96"/>
-    <w:bookmarkStart w:id="98" w:name="ref-muggeo2003estimating"/>
+    <w:bookmarkEnd w:id="95"/>
+    <w:bookmarkStart w:id="97" w:name="ref-muggeo2003estimating"/>
     <w:p>
       <w:pPr>
         <w:pStyle w:val="Bibliography"/>
@@ -14172,7 +13945,7 @@
       <w:r>
         <w:t xml:space="preserve"> </w:t>
       </w:r>
-      <w:hyperlink r:id="rId97">
+      <w:hyperlink r:id="rId96">
         <w:r>
           <w:rPr>
             <w:rStyle w:val="Hyperlink"/>
@@ -14184,8 +13957,8 @@
         <w:t xml:space="preserve">.</w:t>
       </w:r>
     </w:p>
-    <w:bookmarkEnd w:id="98"/>
-    <w:bookmarkStart w:id="100" w:name="ref-mundlak1978pooling"/>
+    <w:bookmarkEnd w:id="97"/>
+    <w:bookmarkStart w:id="99" w:name="ref-mundlak1978pooling"/>
     <w:p>
       <w:pPr>
         <w:pStyle w:val="Bibliography"/>
@@ -14218,7 +13991,7 @@
       <w:r>
         <w:t xml:space="preserve"> </w:t>
       </w:r>
-      <w:hyperlink r:id="rId99">
+      <w:hyperlink r:id="rId98">
         <w:r>
           <w:rPr>
             <w:rStyle w:val="Hyperlink"/>
@@ -14230,8 +14003,8 @@
         <w:t xml:space="preserve">.</w:t>
       </w:r>
     </w:p>
-    <w:bookmarkEnd w:id="100"/>
-    <w:bookmarkStart w:id="102" w:name="ref-nakagawa2026prepr4pcm"/>
+    <w:bookmarkEnd w:id="99"/>
+    <w:bookmarkStart w:id="101" w:name="ref-nakagawa2026prepr4pcm"/>
     <w:p>
       <w:pPr>
         <w:pStyle w:val="Bibliography"/>
@@ -14255,7 +14028,7 @@
       <w:r>
         <w:t xml:space="preserve"> </w:t>
       </w:r>
-      <w:hyperlink r:id="rId101">
+      <w:hyperlink r:id="rId100">
         <w:r>
           <w:rPr>
             <w:rStyle w:val="Hyperlink"/>
@@ -14267,8 +14040,8 @@
         <w:t xml:space="preserve">.</w:t>
       </w:r>
     </w:p>
-    <w:bookmarkEnd w:id="102"/>
-    <w:bookmarkStart w:id="104" w:name="ref-nakagawa2015metaanalysis"/>
+    <w:bookmarkEnd w:id="101"/>
+    <w:bookmarkStart w:id="103" w:name="ref-nakagawa2015metaanalysis"/>
     <w:p>
       <w:pPr>
         <w:pStyle w:val="Bibliography"/>
@@ -14301,7 +14074,7 @@
       <w:r>
         <w:t xml:space="preserve"> </w:t>
       </w:r>
-      <w:hyperlink r:id="rId103">
+      <w:hyperlink r:id="rId102">
         <w:r>
           <w:rPr>
             <w:rStyle w:val="Hyperlink"/>
@@ -14313,8 +14086,8 @@
         <w:t xml:space="preserve">.</w:t>
       </w:r>
     </w:p>
-    <w:bookmarkEnd w:id="104"/>
-    <w:bookmarkStart w:id="106" w:name="ref-nakagawa2019rubin"/>
+    <w:bookmarkEnd w:id="103"/>
+    <w:bookmarkStart w:id="105" w:name="ref-nakagawa2019rubin"/>
     <w:p>
       <w:pPr>
         <w:pStyle w:val="Bibliography"/>
@@ -14347,7 +14120,7 @@
       <w:r>
         <w:t xml:space="preserve"> </w:t>
       </w:r>
-      <w:hyperlink r:id="rId105">
+      <w:hyperlink r:id="rId104">
         <w:r>
           <w:rPr>
             <w:rStyle w:val="Hyperlink"/>
@@ -14359,8 +14132,8 @@
         <w:t xml:space="preserve">.</w:t>
       </w:r>
     </w:p>
-    <w:bookmarkEnd w:id="106"/>
-    <w:bookmarkStart w:id="108" w:name="ref-parmesan_globally_2003"/>
+    <w:bookmarkEnd w:id="105"/>
+    <w:bookmarkStart w:id="107" w:name="ref-parmesan_globally_2003"/>
     <w:p>
       <w:pPr>
         <w:pStyle w:val="Bibliography"/>
@@ -14393,7 +14166,7 @@
       <w:r>
         <w:t xml:space="preserve"> </w:t>
       </w:r>
-      <w:hyperlink r:id="rId107">
+      <w:hyperlink r:id="rId106">
         <w:r>
           <w:rPr>
             <w:rStyle w:val="Hyperlink"/>
@@ -14405,8 +14178,8 @@
         <w:t xml:space="preserve">.</w:t>
       </w:r>
     </w:p>
-    <w:bookmarkEnd w:id="108"/>
-    <w:bookmarkStart w:id="110" w:name="ref-ribeiro2009atlantic"/>
+    <w:bookmarkEnd w:id="107"/>
+    <w:bookmarkStart w:id="109" w:name="ref-ribeiro2009atlantic"/>
     <w:p>
       <w:pPr>
         <w:pStyle w:val="Bibliography"/>
@@ -14460,7 +14233,7 @@
       <w:r>
         <w:t xml:space="preserve"> </w:t>
       </w:r>
-      <w:hyperlink r:id="rId109">
+      <w:hyperlink r:id="rId108">
         <w:r>
           <w:rPr>
             <w:rStyle w:val="Hyperlink"/>
@@ -14472,8 +14245,8 @@
         <w:t xml:space="preserve">.</w:t>
       </w:r>
     </w:p>
-    <w:bookmarkEnd w:id="110"/>
-    <w:bookmarkStart w:id="112" w:name="ref-rodrigues_atlantic_2019"/>
+    <w:bookmarkEnd w:id="109"/>
+    <w:bookmarkStart w:id="111" w:name="ref-rodrigues_atlantic_2019"/>
     <w:p>
       <w:pPr>
         <w:pStyle w:val="Bibliography"/>
@@ -14551,7 +14324,7 @@
       <w:r>
         <w:t xml:space="preserve"> </w:t>
       </w:r>
-      <w:hyperlink r:id="rId111">
+      <w:hyperlink r:id="rId110">
         <w:r>
           <w:rPr>
             <w:rStyle w:val="Hyperlink"/>
@@ -14563,8 +14336,8 @@
         <w:t xml:space="preserve">.</w:t>
       </w:r>
     </w:p>
-    <w:bookmarkEnd w:id="112"/>
-    <w:bookmarkStart w:id="114" w:name="ref-ryding2021shape"/>
+    <w:bookmarkEnd w:id="111"/>
+    <w:bookmarkStart w:id="113" w:name="ref-ryding2021shape"/>
     <w:p>
       <w:pPr>
         <w:pStyle w:val="Bibliography"/>
@@ -14597,7 +14370,7 @@
       <w:r>
         <w:t xml:space="preserve"> </w:t>
       </w:r>
-      <w:hyperlink r:id="rId113">
+      <w:hyperlink r:id="rId112">
         <w:r>
           <w:rPr>
             <w:rStyle w:val="Hyperlink"/>
@@ -14609,8 +14382,8 @@
         <w:t xml:space="preserve">.</w:t>
       </w:r>
     </w:p>
-    <w:bookmarkEnd w:id="114"/>
-    <w:bookmarkStart w:id="116" w:name="ref-schmidt_concomitant_2005"/>
+    <w:bookmarkEnd w:id="113"/>
+    <w:bookmarkStart w:id="115" w:name="ref-schmidt_concomitant_2005"/>
     <w:p>
       <w:pPr>
         <w:pStyle w:val="Bibliography"/>
@@ -14706,7 +14479,7 @@
       <w:r>
         <w:t xml:space="preserve"> </w:t>
       </w:r>
-      <w:hyperlink r:id="rId115">
+      <w:hyperlink r:id="rId114">
         <w:r>
           <w:rPr>
             <w:rStyle w:val="Hyperlink"/>
@@ -14718,8 +14491,8 @@
         <w:t xml:space="preserve">.</w:t>
       </w:r>
     </w:p>
-    <w:bookmarkEnd w:id="116"/>
-    <w:bookmarkStart w:id="118" w:name="ref-sheridan_shrinking_2011"/>
+    <w:bookmarkEnd w:id="115"/>
+    <w:bookmarkStart w:id="117" w:name="ref-sheridan_shrinking_2011"/>
     <w:p>
       <w:pPr>
         <w:pStyle w:val="Bibliography"/>
@@ -14752,7 +14525,7 @@
       <w:r>
         <w:t xml:space="preserve"> </w:t>
       </w:r>
-      <w:hyperlink r:id="rId117">
+      <w:hyperlink r:id="rId116">
         <w:r>
           <w:rPr>
             <w:rStyle w:val="Hyperlink"/>
@@ -14764,8 +14537,8 @@
         <w:t xml:space="preserve">.</w:t>
       </w:r>
     </w:p>
-    <w:bookmarkEnd w:id="118"/>
-    <w:bookmarkStart w:id="120" w:name="ref-silva2022atlanticants"/>
+    <w:bookmarkEnd w:id="117"/>
+    <w:bookmarkStart w:id="119" w:name="ref-silva2022atlanticants"/>
     <w:p>
       <w:pPr>
         <w:pStyle w:val="Bibliography"/>
@@ -14801,7 +14574,7 @@
       <w:r>
         <w:t xml:space="preserve"> </w:t>
       </w:r>
-      <w:hyperlink r:id="rId119">
+      <w:hyperlink r:id="rId118">
         <w:r>
           <w:rPr>
             <w:rStyle w:val="Hyperlink"/>
@@ -14813,8 +14586,8 @@
         <w:t xml:space="preserve">.</w:t>
       </w:r>
     </w:p>
-    <w:bookmarkEnd w:id="120"/>
-    <w:bookmarkStart w:id="122" w:name="ref-teplitsky_climate_2014"/>
+    <w:bookmarkEnd w:id="119"/>
+    <w:bookmarkStart w:id="121" w:name="ref-teplitsky_climate_2014"/>
     <w:p>
       <w:pPr>
         <w:pStyle w:val="Bibliography"/>
@@ -14856,7 +14629,7 @@
       <w:r>
         <w:t xml:space="preserve"> </w:t>
       </w:r>
-      <w:hyperlink r:id="rId121">
+      <w:hyperlink r:id="rId120">
         <w:r>
           <w:rPr>
             <w:rStyle w:val="Hyperlink"/>
@@ -14868,8 +14641,8 @@
         <w:t xml:space="preserve">.</w:t>
       </w:r>
     </w:p>
-    <w:bookmarkEnd w:id="122"/>
-    <w:bookmarkStart w:id="124" w:name="ref-teplitsky_bergmanns_2008"/>
+    <w:bookmarkEnd w:id="121"/>
+    <w:bookmarkStart w:id="123" w:name="ref-teplitsky_bergmanns_2008"/>
     <w:p>
       <w:pPr>
         <w:pStyle w:val="Bibliography"/>
@@ -14914,7 +14687,7 @@
       <w:r>
         <w:t xml:space="preserve"> </w:t>
       </w:r>
-      <w:hyperlink r:id="rId123">
+      <w:hyperlink r:id="rId122">
         <w:r>
           <w:rPr>
             <w:rStyle w:val="Hyperlink"/>
@@ -14926,8 +14699,8 @@
         <w:t xml:space="preserve">.</w:t>
       </w:r>
     </w:p>
-    <w:bookmarkEnd w:id="124"/>
-    <w:bookmarkStart w:id="126" w:name="ref-viechtbauer2010metafor"/>
+    <w:bookmarkEnd w:id="123"/>
+    <w:bookmarkStart w:id="125" w:name="ref-viechtbauer2010metafor"/>
     <w:p>
       <w:pPr>
         <w:pStyle w:val="Bibliography"/>
@@ -14984,7 +14757,7 @@
       <w:r>
         <w:t xml:space="preserve"> </w:t>
       </w:r>
-      <w:hyperlink r:id="rId125">
+      <w:hyperlink r:id="rId124">
         <w:r>
           <w:rPr>
             <w:rStyle w:val="Hyperlink"/>
@@ -14996,8 +14769,8 @@
         <w:t xml:space="preserve">.</w:t>
       </w:r>
     </w:p>
-    <w:bookmarkEnd w:id="126"/>
-    <w:bookmarkStart w:id="128" w:name="ref-weeks2020"/>
+    <w:bookmarkEnd w:id="125"/>
+    <w:bookmarkStart w:id="127" w:name="ref-weeks2020"/>
     <w:p>
       <w:pPr>
         <w:pStyle w:val="Bibliography"/>
@@ -15030,7 +14803,7 @@
       <w:r>
         <w:t xml:space="preserve"> </w:t>
       </w:r>
-      <w:hyperlink r:id="rId127">
+      <w:hyperlink r:id="rId126">
         <w:r>
           <w:rPr>
             <w:rStyle w:val="Hyperlink"/>
@@ -15042,8 +14815,8 @@
         <w:t xml:space="preserve">.</w:t>
       </w:r>
     </w:p>
-    <w:bookmarkEnd w:id="128"/>
-    <w:bookmarkStart w:id="130" w:name="ref-williams2025glmmtmb"/>
+    <w:bookmarkEnd w:id="127"/>
+    <w:bookmarkStart w:id="129" w:name="ref-williams2025glmmtmb"/>
     <w:p>
       <w:pPr>
         <w:pStyle w:val="Bibliography"/>
@@ -15073,7 +14846,7 @@
       <w:r>
         <w:t xml:space="preserve"> </w:t>
       </w:r>
-      <w:hyperlink r:id="rId129">
+      <w:hyperlink r:id="rId128">
         <w:r>
           <w:rPr>
             <w:rStyle w:val="Hyperlink"/>
@@ -15085,8 +14858,8 @@
         <w:t xml:space="preserve">.</w:t>
       </w:r>
     </w:p>
-    <w:bookmarkEnd w:id="130"/>
-    <w:bookmarkStart w:id="131" w:name="ref-wilman2014eltontraits"/>
+    <w:bookmarkEnd w:id="129"/>
+    <w:bookmarkStart w:id="130" w:name="ref-wilman2014eltontraits"/>
     <w:p>
       <w:pPr>
         <w:pStyle w:val="Bibliography"/>
@@ -15117,10 +14890,10 @@
         <w:t xml:space="preserve">95 (7): 2027–27.</w:t>
       </w:r>
     </w:p>
+    <w:bookmarkEnd w:id="130"/>
     <w:bookmarkEnd w:id="131"/>
     <w:bookmarkEnd w:id="132"/>
     <w:bookmarkEnd w:id="133"/>
-    <w:bookmarkEnd w:id="134"/>
     <w:sectPr>
       <w:footerReference r:id="rIdFooter1" w:type="default"/>
       <w:footnotePr>

</xml_diff>